<commit_message>
Actualizamos la documentacion del bitacora
</commit_message>
<xml_diff>
--- a/Documentacion/Bitacora_Joaquin.docx
+++ b/Documentacion/Bitacora_Joaquin.docx
@@ -2034,8 +2034,735 @@
           <w:szCs w:val="24"/>
           <w:lang w:val="es-ES"/>
         </w:rPr>
-        <w:t xml:space="preserve"> de Maven. ¡Después de eso arrancó a la primera!</w:t>
-      </w:r>
+        <w:t xml:space="preserve"> de Maven. </w:t>
+      </w:r>
+    </w:p>
+    <w:p>
+      <w:pPr>
+        <w:pStyle w:val="Normal"/>
+      </w:pPr>
+    </w:p>
+    <w:p>
+      <w:pPr>
+        <w:pStyle w:val="Normal"/>
+      </w:pPr>
+    </w:p>
+    <w:p>
+      <w:r>
+        <w:br w:type="page"/>
+      </w:r>
+    </w:p>
+    <w:p>
+      <w:pPr>
+        <w:spacing w:before="240" w:beforeAutospacing="off" w:after="240" w:afterAutospacing="off"/>
+      </w:pPr>
+      <w:r>
+        <w:rPr>
+          <w:rFonts w:ascii="Aptos" w:hAnsi="Aptos" w:eastAsia="Aptos" w:cs="Aptos"/>
+          <w:b w:val="1"/>
+          <w:bCs w:val="1"/>
+          <w:noProof w:val="0"/>
+          <w:sz w:val="24"/>
+          <w:szCs w:val="24"/>
+          <w:lang w:val="es-ES"/>
+        </w:rPr>
+        <w:t>Fecha:</w:t>
+      </w:r>
+      <w:r>
+        <w:rPr>
+          <w:rFonts w:ascii="Aptos" w:hAnsi="Aptos" w:eastAsia="Aptos" w:cs="Aptos"/>
+          <w:noProof w:val="0"/>
+          <w:sz w:val="24"/>
+          <w:szCs w:val="24"/>
+          <w:lang w:val="es-ES"/>
+        </w:rPr>
+        <w:t xml:space="preserve"> 8 de abril de 2026</w:t>
+      </w:r>
+    </w:p>
+    <w:p>
+      <w:pPr>
+        <w:spacing w:before="240" w:beforeAutospacing="off" w:after="240" w:afterAutospacing="off"/>
+      </w:pPr>
+      <w:r>
+        <w:rPr>
+          <w:rFonts w:ascii="Aptos" w:hAnsi="Aptos" w:eastAsia="Aptos" w:cs="Aptos"/>
+          <w:b w:val="1"/>
+          <w:bCs w:val="1"/>
+          <w:noProof w:val="0"/>
+          <w:sz w:val="24"/>
+          <w:szCs w:val="24"/>
+          <w:lang w:val="es-ES"/>
+        </w:rPr>
+        <w:t>Objetivo:</w:t>
+      </w:r>
+      <w:r>
+        <w:rPr>
+          <w:rFonts w:ascii="Aptos" w:hAnsi="Aptos" w:eastAsia="Aptos" w:cs="Aptos"/>
+          <w:noProof w:val="0"/>
+          <w:sz w:val="24"/>
+          <w:szCs w:val="24"/>
+          <w:lang w:val="es-ES"/>
+        </w:rPr>
+        <w:t xml:space="preserve"> Migración de la infraestructura a la nube e implementación del sistema de registro con validaciones de seguridad.</w:t>
+      </w:r>
+    </w:p>
+    <w:p>
+      <w:pPr>
+        <w:pStyle w:val="Heading3"/>
+      </w:pPr>
+      <w:r>
+        <w:rPr>
+          <w:noProof w:val="0"/>
+          <w:lang w:val="es-ES"/>
+        </w:rPr>
+        <w:t>1. Migración de la base de datos a la nube (</w:t>
+      </w:r>
+      <w:r>
+        <w:rPr>
+          <w:noProof w:val="0"/>
+          <w:lang w:val="es-ES"/>
+        </w:rPr>
+        <w:t>Railway</w:t>
+      </w:r>
+      <w:r>
+        <w:rPr>
+          <w:noProof w:val="0"/>
+          <w:lang w:val="es-ES"/>
+        </w:rPr>
+        <w:t>)</w:t>
+      </w:r>
+      <w:r>
+        <w:rPr>
+          <w:noProof w:val="0"/>
+          <w:lang w:val="es-ES"/>
+        </w:rPr>
+        <w:t xml:space="preserve"> </w:t>
+      </w:r>
+    </w:p>
+    <w:p>
+      <w:pPr>
+        <w:spacing w:before="240" w:beforeAutospacing="off" w:after="240" w:afterAutospacing="off"/>
+      </w:pPr>
+      <w:r>
+        <w:rPr>
+          <w:rFonts w:ascii="Aptos" w:hAnsi="Aptos" w:eastAsia="Aptos" w:cs="Aptos"/>
+          <w:noProof w:val="0"/>
+          <w:sz w:val="24"/>
+          <w:szCs w:val="24"/>
+          <w:lang w:val="es-ES"/>
+        </w:rPr>
+        <w:t xml:space="preserve">Para evitar las restricciones de permisos y los bloqueos de red del ordenador de la empresa, he decidido sacar la base de datos de Docker local y subirla a </w:t>
+      </w:r>
+      <w:r>
+        <w:rPr>
+          <w:rFonts w:ascii="Aptos" w:hAnsi="Aptos" w:eastAsia="Aptos" w:cs="Aptos"/>
+          <w:b w:val="1"/>
+          <w:bCs w:val="1"/>
+          <w:noProof w:val="0"/>
+          <w:sz w:val="24"/>
+          <w:szCs w:val="24"/>
+          <w:lang w:val="es-ES"/>
+        </w:rPr>
+        <w:t>Railway</w:t>
+      </w:r>
+      <w:r>
+        <w:rPr>
+          <w:rFonts w:ascii="Aptos" w:hAnsi="Aptos" w:eastAsia="Aptos" w:cs="Aptos"/>
+          <w:noProof w:val="0"/>
+          <w:sz w:val="24"/>
+          <w:szCs w:val="24"/>
+          <w:lang w:val="es-ES"/>
+        </w:rPr>
+        <w:t xml:space="preserve">. Ahora el proyecto es mucho más flexible porque puedo trabajar desde cualquier sitio conectándome al servidor remoto. He configurado el </w:t>
+      </w:r>
+      <w:r>
+        <w:rPr>
+          <w:rFonts w:ascii="Consolas" w:hAnsi="Consolas" w:eastAsia="Consolas" w:cs="Consolas"/>
+          <w:noProof w:val="0"/>
+          <w:sz w:val="24"/>
+          <w:szCs w:val="24"/>
+          <w:lang w:val="es-ES"/>
+        </w:rPr>
+        <w:t>application.properties</w:t>
+      </w:r>
+      <w:r>
+        <w:rPr>
+          <w:rFonts w:ascii="Aptos" w:hAnsi="Aptos" w:eastAsia="Aptos" w:cs="Aptos"/>
+          <w:noProof w:val="0"/>
+          <w:sz w:val="24"/>
+          <w:szCs w:val="24"/>
+          <w:lang w:val="es-ES"/>
+        </w:rPr>
+        <w:t xml:space="preserve"> con los parámetros de seguridad necesarios (SSL y TCP Proxy) para que Spring </w:t>
+      </w:r>
+      <w:r>
+        <w:rPr>
+          <w:rFonts w:ascii="Aptos" w:hAnsi="Aptos" w:eastAsia="Aptos" w:cs="Aptos"/>
+          <w:noProof w:val="0"/>
+          <w:sz w:val="24"/>
+          <w:szCs w:val="24"/>
+          <w:lang w:val="es-ES"/>
+        </w:rPr>
+        <w:t>Boot</w:t>
+      </w:r>
+      <w:r>
+        <w:rPr>
+          <w:rFonts w:ascii="Aptos" w:hAnsi="Aptos" w:eastAsia="Aptos" w:cs="Aptos"/>
+          <w:noProof w:val="0"/>
+          <w:sz w:val="24"/>
+          <w:szCs w:val="24"/>
+          <w:lang w:val="es-ES"/>
+        </w:rPr>
+        <w:t xml:space="preserve"> se comunique con la nube de forma fluida y sin errores de "</w:t>
+      </w:r>
+      <w:r>
+        <w:rPr>
+          <w:rFonts w:ascii="Aptos" w:hAnsi="Aptos" w:eastAsia="Aptos" w:cs="Aptos"/>
+          <w:noProof w:val="0"/>
+          <w:sz w:val="24"/>
+          <w:szCs w:val="24"/>
+          <w:lang w:val="es-ES"/>
+        </w:rPr>
+        <w:t>handshake</w:t>
+      </w:r>
+      <w:r>
+        <w:rPr>
+          <w:rFonts w:ascii="Aptos" w:hAnsi="Aptos" w:eastAsia="Aptos" w:cs="Aptos"/>
+          <w:noProof w:val="0"/>
+          <w:sz w:val="24"/>
+          <w:szCs w:val="24"/>
+          <w:lang w:val="es-ES"/>
+        </w:rPr>
+        <w:t>".</w:t>
+      </w:r>
+    </w:p>
+    <w:p>
+      <w:pPr>
+        <w:pStyle w:val="Heading3"/>
+      </w:pPr>
+      <w:r>
+        <w:rPr>
+          <w:noProof w:val="0"/>
+          <w:lang w:val="es-ES"/>
+        </w:rPr>
+        <w:t>2. Implementación del Registro con seguridad (</w:t>
+      </w:r>
+      <w:r>
+        <w:rPr>
+          <w:noProof w:val="0"/>
+          <w:lang w:val="es-ES"/>
+        </w:rPr>
+        <w:t>BCrypt</w:t>
+      </w:r>
+      <w:r>
+        <w:rPr>
+          <w:noProof w:val="0"/>
+          <w:lang w:val="es-ES"/>
+        </w:rPr>
+        <w:t>)</w:t>
+      </w:r>
+      <w:r>
+        <w:rPr>
+          <w:noProof w:val="0"/>
+          <w:lang w:val="es-ES"/>
+        </w:rPr>
+        <w:t xml:space="preserve"> </w:t>
+      </w:r>
+    </w:p>
+    <w:p>
+      <w:pPr>
+        <w:spacing w:before="240" w:beforeAutospacing="off" w:after="240" w:afterAutospacing="off"/>
+      </w:pPr>
+      <w:r>
+        <w:rPr>
+          <w:rFonts w:ascii="Aptos" w:hAnsi="Aptos" w:eastAsia="Aptos" w:cs="Aptos"/>
+          <w:noProof w:val="0"/>
+          <w:sz w:val="24"/>
+          <w:szCs w:val="24"/>
+          <w:lang w:val="es-ES"/>
+        </w:rPr>
+        <w:t xml:space="preserve">No quería un registro simple que solo guardara datos, así que he integrado </w:t>
+      </w:r>
+      <w:r>
+        <w:rPr>
+          <w:rFonts w:ascii="Aptos" w:hAnsi="Aptos" w:eastAsia="Aptos" w:cs="Aptos"/>
+          <w:b w:val="1"/>
+          <w:bCs w:val="1"/>
+          <w:noProof w:val="0"/>
+          <w:sz w:val="24"/>
+          <w:szCs w:val="24"/>
+          <w:lang w:val="es-ES"/>
+        </w:rPr>
+        <w:t>Spring Security</w:t>
+      </w:r>
+      <w:r>
+        <w:rPr>
+          <w:rFonts w:ascii="Aptos" w:hAnsi="Aptos" w:eastAsia="Aptos" w:cs="Aptos"/>
+          <w:noProof w:val="0"/>
+          <w:sz w:val="24"/>
+          <w:szCs w:val="24"/>
+          <w:lang w:val="es-ES"/>
+        </w:rPr>
+        <w:t xml:space="preserve">. Ahora, cuando un usuario se registra, su contraseña no se guarda tal cual en la base de datos (lo que sería un peligro), sino que se cifra usando el algoritmo </w:t>
+      </w:r>
+      <w:r>
+        <w:rPr>
+          <w:rFonts w:ascii="Aptos" w:hAnsi="Aptos" w:eastAsia="Aptos" w:cs="Aptos"/>
+          <w:b w:val="1"/>
+          <w:bCs w:val="1"/>
+          <w:noProof w:val="0"/>
+          <w:sz w:val="24"/>
+          <w:szCs w:val="24"/>
+          <w:lang w:val="es-ES"/>
+        </w:rPr>
+        <w:t>BCrypt</w:t>
+      </w:r>
+      <w:r>
+        <w:rPr>
+          <w:rFonts w:ascii="Aptos" w:hAnsi="Aptos" w:eastAsia="Aptos" w:cs="Aptos"/>
+          <w:noProof w:val="0"/>
+          <w:sz w:val="24"/>
+          <w:szCs w:val="24"/>
+          <w:lang w:val="es-ES"/>
+        </w:rPr>
+        <w:t>. También he programado la lógica en el controlador para que el sistema rechace el registro si el alias o el correo electrónico ya existen, asegurando que cada coleccionista sea único en la plataforma.</w:t>
+      </w:r>
+    </w:p>
+    <w:p>
+      <w:pPr>
+        <w:pStyle w:val="Heading3"/>
+      </w:pPr>
+      <w:r>
+        <w:rPr>
+          <w:noProof w:val="0"/>
+          <w:lang w:val="es-ES"/>
+        </w:rPr>
+        <w:t>3. Resolviendo el conflicto de JPA y las barras bajas</w:t>
+      </w:r>
+      <w:r>
+        <w:rPr>
+          <w:noProof w:val="0"/>
+          <w:lang w:val="es-ES"/>
+        </w:rPr>
+        <w:t xml:space="preserve"> </w:t>
+      </w:r>
+    </w:p>
+    <w:p>
+      <w:pPr>
+        <w:spacing w:before="240" w:beforeAutospacing="off" w:after="240" w:afterAutospacing="off"/>
+      </w:pPr>
+      <w:r>
+        <w:rPr>
+          <w:rFonts w:ascii="Aptos" w:hAnsi="Aptos" w:eastAsia="Aptos" w:cs="Aptos"/>
+          <w:noProof w:val="0"/>
+          <w:sz w:val="24"/>
+          <w:szCs w:val="24"/>
+          <w:lang w:val="es-ES"/>
+        </w:rPr>
+        <w:t>Hoy me he topado con un error técnico muy específico de Spring Data JPA. Al intentar buscar si un correo existía usando métodos automáticos, el programa explotaba porque mi base de datos usa barras bajas (</w:t>
+      </w:r>
+      <w:r>
+        <w:rPr>
+          <w:rFonts w:ascii="Consolas" w:hAnsi="Consolas" w:eastAsia="Consolas" w:cs="Consolas"/>
+          <w:noProof w:val="0"/>
+          <w:sz w:val="24"/>
+          <w:szCs w:val="24"/>
+          <w:lang w:val="es-ES"/>
+        </w:rPr>
+        <w:t>correo_electronico</w:t>
+      </w:r>
+      <w:r>
+        <w:rPr>
+          <w:rFonts w:ascii="Aptos" w:hAnsi="Aptos" w:eastAsia="Aptos" w:cs="Aptos"/>
+          <w:noProof w:val="0"/>
+          <w:sz w:val="24"/>
+          <w:szCs w:val="24"/>
+          <w:lang w:val="es-ES"/>
+        </w:rPr>
+        <w:t xml:space="preserve">) y Java prefiere el formato </w:t>
+      </w:r>
+      <w:r>
+        <w:rPr>
+          <w:rFonts w:ascii="Aptos" w:hAnsi="Aptos" w:eastAsia="Aptos" w:cs="Aptos"/>
+          <w:i w:val="1"/>
+          <w:iCs w:val="1"/>
+          <w:noProof w:val="0"/>
+          <w:sz w:val="24"/>
+          <w:szCs w:val="24"/>
+          <w:lang w:val="es-ES"/>
+        </w:rPr>
+        <w:t>camelCase</w:t>
+      </w:r>
+      <w:r>
+        <w:rPr>
+          <w:rFonts w:ascii="Aptos" w:hAnsi="Aptos" w:eastAsia="Aptos" w:cs="Aptos"/>
+          <w:noProof w:val="0"/>
+          <w:sz w:val="24"/>
+          <w:szCs w:val="24"/>
+          <w:lang w:val="es-ES"/>
+        </w:rPr>
+        <w:t xml:space="preserve">. Lo he solucionado usando la anotación </w:t>
+      </w:r>
+      <w:r>
+        <w:rPr>
+          <w:rFonts w:ascii="Aptos" w:hAnsi="Aptos" w:eastAsia="Aptos" w:cs="Aptos"/>
+          <w:b w:val="1"/>
+          <w:bCs w:val="1"/>
+          <w:noProof w:val="0"/>
+          <w:sz w:val="24"/>
+          <w:szCs w:val="24"/>
+          <w:lang w:val="es-ES"/>
+        </w:rPr>
+        <w:t>@Query</w:t>
+      </w:r>
+      <w:r>
+        <w:rPr>
+          <w:rFonts w:ascii="Aptos" w:hAnsi="Aptos" w:eastAsia="Aptos" w:cs="Aptos"/>
+          <w:noProof w:val="0"/>
+          <w:sz w:val="24"/>
+          <w:szCs w:val="24"/>
+          <w:lang w:val="es-ES"/>
+        </w:rPr>
+        <w:t xml:space="preserve"> en el repositorio; de esta forma, le he dictado yo mismo la consulta SQL a Spring para que no intente adivinarla y funcione correctamente con el nombre real de la columna.</w:t>
+      </w:r>
+    </w:p>
+    <w:p>
+      <w:pPr>
+        <w:pStyle w:val="Heading3"/>
+      </w:pPr>
+      <w:r>
+        <w:rPr>
+          <w:noProof w:val="0"/>
+          <w:lang w:val="es-ES"/>
+        </w:rPr>
+        <w:t xml:space="preserve">4. Navegación fluida en </w:t>
+      </w:r>
+      <w:r>
+        <w:rPr>
+          <w:noProof w:val="0"/>
+          <w:lang w:val="es-ES"/>
+        </w:rPr>
+        <w:t>React</w:t>
+      </w:r>
+      <w:r>
+        <w:rPr>
+          <w:noProof w:val="0"/>
+          <w:lang w:val="es-ES"/>
+        </w:rPr>
+        <w:t xml:space="preserve"> sin recargas</w:t>
+      </w:r>
+      <w:r>
+        <w:rPr>
+          <w:noProof w:val="0"/>
+          <w:lang w:val="es-ES"/>
+        </w:rPr>
+        <w:t xml:space="preserve"> </w:t>
+      </w:r>
+    </w:p>
+    <w:p>
+      <w:pPr>
+        <w:spacing w:before="240" w:beforeAutospacing="off" w:after="240" w:afterAutospacing="off"/>
+      </w:pPr>
+      <w:r>
+        <w:rPr>
+          <w:rFonts w:ascii="Aptos" w:hAnsi="Aptos" w:eastAsia="Aptos" w:cs="Aptos"/>
+          <w:noProof w:val="0"/>
+          <w:sz w:val="24"/>
+          <w:szCs w:val="24"/>
+          <w:lang w:val="es-ES"/>
+        </w:rPr>
+        <w:t xml:space="preserve">En el </w:t>
+      </w:r>
+      <w:r>
+        <w:rPr>
+          <w:rFonts w:ascii="Aptos" w:hAnsi="Aptos" w:eastAsia="Aptos" w:cs="Aptos"/>
+          <w:noProof w:val="0"/>
+          <w:sz w:val="24"/>
+          <w:szCs w:val="24"/>
+          <w:lang w:val="es-ES"/>
+        </w:rPr>
+        <w:t>Frontend</w:t>
+      </w:r>
+      <w:r>
+        <w:rPr>
+          <w:rFonts w:ascii="Aptos" w:hAnsi="Aptos" w:eastAsia="Aptos" w:cs="Aptos"/>
+          <w:noProof w:val="0"/>
+          <w:sz w:val="24"/>
+          <w:szCs w:val="24"/>
+          <w:lang w:val="es-ES"/>
+        </w:rPr>
+        <w:t xml:space="preserve">, he creado el componente </w:t>
+      </w:r>
+      <w:r>
+        <w:rPr>
+          <w:rFonts w:ascii="Consolas" w:hAnsi="Consolas" w:eastAsia="Consolas" w:cs="Consolas"/>
+          <w:noProof w:val="0"/>
+          <w:sz w:val="24"/>
+          <w:szCs w:val="24"/>
+          <w:lang w:val="es-ES"/>
+        </w:rPr>
+        <w:t>Register.jsx</w:t>
+      </w:r>
+      <w:r>
+        <w:rPr>
+          <w:rFonts w:ascii="Aptos" w:hAnsi="Aptos" w:eastAsia="Aptos" w:cs="Aptos"/>
+          <w:noProof w:val="0"/>
+          <w:sz w:val="24"/>
+          <w:szCs w:val="24"/>
+          <w:lang w:val="es-ES"/>
+        </w:rPr>
+        <w:t xml:space="preserve"> y he modificado </w:t>
+      </w:r>
+      <w:r>
+        <w:rPr>
+          <w:rFonts w:ascii="Consolas" w:hAnsi="Consolas" w:eastAsia="Consolas" w:cs="Consolas"/>
+          <w:noProof w:val="0"/>
+          <w:sz w:val="24"/>
+          <w:szCs w:val="24"/>
+          <w:lang w:val="es-ES"/>
+        </w:rPr>
+        <w:t>App.jsx</w:t>
+      </w:r>
+      <w:r>
+        <w:rPr>
+          <w:rFonts w:ascii="Aptos" w:hAnsi="Aptos" w:eastAsia="Aptos" w:cs="Aptos"/>
+          <w:noProof w:val="0"/>
+          <w:sz w:val="24"/>
+          <w:szCs w:val="24"/>
+          <w:lang w:val="es-ES"/>
+        </w:rPr>
+        <w:t xml:space="preserve"> para gestionar lo que llamamos "renderizado condicional". He usado un estado de </w:t>
+      </w:r>
+      <w:r>
+        <w:rPr>
+          <w:rFonts w:ascii="Aptos" w:hAnsi="Aptos" w:eastAsia="Aptos" w:cs="Aptos"/>
+          <w:noProof w:val="0"/>
+          <w:sz w:val="24"/>
+          <w:szCs w:val="24"/>
+          <w:lang w:val="es-ES"/>
+        </w:rPr>
+        <w:t>React</w:t>
+      </w:r>
+      <w:r>
+        <w:rPr>
+          <w:rFonts w:ascii="Aptos" w:hAnsi="Aptos" w:eastAsia="Aptos" w:cs="Aptos"/>
+          <w:noProof w:val="0"/>
+          <w:sz w:val="24"/>
+          <w:szCs w:val="24"/>
+          <w:lang w:val="es-ES"/>
+        </w:rPr>
+        <w:t xml:space="preserve"> para que actúe como un interruptor: si el usuario pulsa en "Regístrate", la tarjeta de </w:t>
+      </w:r>
+      <w:r>
+        <w:rPr>
+          <w:rFonts w:ascii="Aptos" w:hAnsi="Aptos" w:eastAsia="Aptos" w:cs="Aptos"/>
+          <w:noProof w:val="0"/>
+          <w:sz w:val="24"/>
+          <w:szCs w:val="24"/>
+          <w:lang w:val="es-ES"/>
+        </w:rPr>
+        <w:t>Login</w:t>
+      </w:r>
+      <w:r>
+        <w:rPr>
+          <w:rFonts w:ascii="Aptos" w:hAnsi="Aptos" w:eastAsia="Aptos" w:cs="Aptos"/>
+          <w:noProof w:val="0"/>
+          <w:sz w:val="24"/>
+          <w:szCs w:val="24"/>
+          <w:lang w:val="es-ES"/>
+        </w:rPr>
+        <w:t xml:space="preserve"> desaparece y aparece la de Registro instantáneamente sin que la página tenga que recargarse. Esto da una sensación de aplicación profesional y rápida.</w:t>
+      </w:r>
+    </w:p>
+    <w:p>
+      <w:pPr>
+        <w:pStyle w:val="Normal"/>
+        <w:spacing w:before="240" w:beforeAutospacing="off" w:after="240" w:afterAutospacing="off"/>
+        <w:rPr>
+          <w:rFonts w:ascii="Aptos" w:hAnsi="Aptos" w:eastAsia="Aptos" w:cs="Aptos"/>
+          <w:noProof w:val="0"/>
+          <w:sz w:val="24"/>
+          <w:szCs w:val="24"/>
+          <w:lang w:val="es-ES"/>
+        </w:rPr>
+      </w:pPr>
+    </w:p>
+    <w:p>
+      <w:r>
+        <w:br w:type="page"/>
+      </w:r>
+    </w:p>
+    <w:p>
+      <w:pPr>
+        <w:pStyle w:val="Normal"/>
+        <w:spacing w:before="240" w:beforeAutospacing="off" w:after="240" w:afterAutospacing="off"/>
+        <w:rPr>
+          <w:rFonts w:ascii="Aptos" w:hAnsi="Aptos" w:eastAsia="Aptos" w:cs="Aptos"/>
+          <w:noProof w:val="0"/>
+          <w:sz w:val="24"/>
+          <w:szCs w:val="24"/>
+          <w:lang w:val="es-ES"/>
+        </w:rPr>
+      </w:pPr>
+    </w:p>
+    <w:p>
+      <w:pPr>
+        <w:pStyle w:val="Heading3"/>
+      </w:pPr>
+      <w:r>
+        <w:rPr>
+          <w:noProof w:val="0"/>
+          <w:lang w:val="es-ES"/>
+        </w:rPr>
+        <w:t>5. Encapsulado de estilos y corrección de CSS</w:t>
+      </w:r>
+      <w:r>
+        <w:rPr>
+          <w:noProof w:val="0"/>
+          <w:lang w:val="es-ES"/>
+        </w:rPr>
+        <w:t xml:space="preserve"> </w:t>
+      </w:r>
+    </w:p>
+    <w:p>
+      <w:pPr>
+        <w:spacing w:before="240" w:beforeAutospacing="off" w:after="240" w:afterAutospacing="off"/>
+      </w:pPr>
+      <w:r>
+        <w:rPr>
+          <w:rFonts w:ascii="Aptos" w:hAnsi="Aptos" w:eastAsia="Aptos" w:cs="Aptos"/>
+          <w:noProof w:val="0"/>
+          <w:sz w:val="24"/>
+          <w:szCs w:val="24"/>
+          <w:lang w:val="es-ES"/>
+        </w:rPr>
+        <w:t xml:space="preserve">Al principio, el </w:t>
+      </w:r>
+      <w:r>
+        <w:rPr>
+          <w:rFonts w:ascii="Aptos" w:hAnsi="Aptos" w:eastAsia="Aptos" w:cs="Aptos"/>
+          <w:noProof w:val="0"/>
+          <w:sz w:val="24"/>
+          <w:szCs w:val="24"/>
+          <w:lang w:val="es-ES"/>
+        </w:rPr>
+        <w:t>Login</w:t>
+      </w:r>
+      <w:r>
+        <w:rPr>
+          <w:rFonts w:ascii="Aptos" w:hAnsi="Aptos" w:eastAsia="Aptos" w:cs="Aptos"/>
+          <w:noProof w:val="0"/>
+          <w:sz w:val="24"/>
+          <w:szCs w:val="24"/>
+          <w:lang w:val="es-ES"/>
+        </w:rPr>
+        <w:t xml:space="preserve"> y el Registro compartían el mismo archivo CSS y los estilos empezaban a "chocar" entre ellos. He dedicado la última parte del día a separar los archivos en </w:t>
+      </w:r>
+      <w:r>
+        <w:rPr>
+          <w:rFonts w:ascii="Consolas" w:hAnsi="Consolas" w:eastAsia="Consolas" w:cs="Consolas"/>
+          <w:noProof w:val="0"/>
+          <w:sz w:val="24"/>
+          <w:szCs w:val="24"/>
+          <w:lang w:val="es-ES"/>
+        </w:rPr>
+        <w:t>Login.css</w:t>
+      </w:r>
+      <w:r>
+        <w:rPr>
+          <w:rFonts w:ascii="Aptos" w:hAnsi="Aptos" w:eastAsia="Aptos" w:cs="Aptos"/>
+          <w:noProof w:val="0"/>
+          <w:sz w:val="24"/>
+          <w:szCs w:val="24"/>
+          <w:lang w:val="es-ES"/>
+        </w:rPr>
+        <w:t xml:space="preserve"> y </w:t>
+      </w:r>
+      <w:r>
+        <w:rPr>
+          <w:rFonts w:ascii="Consolas" w:hAnsi="Consolas" w:eastAsia="Consolas" w:cs="Consolas"/>
+          <w:noProof w:val="0"/>
+          <w:sz w:val="24"/>
+          <w:szCs w:val="24"/>
+          <w:lang w:val="es-ES"/>
+        </w:rPr>
+        <w:t>Register.css</w:t>
+      </w:r>
+      <w:r>
+        <w:rPr>
+          <w:rFonts w:ascii="Aptos" w:hAnsi="Aptos" w:eastAsia="Aptos" w:cs="Aptos"/>
+          <w:noProof w:val="0"/>
+          <w:sz w:val="24"/>
+          <w:szCs w:val="24"/>
+          <w:lang w:val="es-ES"/>
+        </w:rPr>
+        <w:t xml:space="preserve">. He renombrado todas las clases (usando prefijos como </w:t>
+      </w:r>
+      <w:r>
+        <w:rPr>
+          <w:rFonts w:ascii="Consolas" w:hAnsi="Consolas" w:eastAsia="Consolas" w:cs="Consolas"/>
+          <w:noProof w:val="0"/>
+          <w:sz w:val="24"/>
+          <w:szCs w:val="24"/>
+          <w:lang w:val="es-ES"/>
+        </w:rPr>
+        <w:t>login</w:t>
+      </w:r>
+      <w:r>
+        <w:rPr>
+          <w:rFonts w:ascii="Consolas" w:hAnsi="Consolas" w:eastAsia="Consolas" w:cs="Consolas"/>
+          <w:noProof w:val="0"/>
+          <w:sz w:val="24"/>
+          <w:szCs w:val="24"/>
+          <w:lang w:val="es-ES"/>
+        </w:rPr>
+        <w:t>-</w:t>
+      </w:r>
+      <w:r>
+        <w:rPr>
+          <w:rFonts w:ascii="Aptos" w:hAnsi="Aptos" w:eastAsia="Aptos" w:cs="Aptos"/>
+          <w:noProof w:val="0"/>
+          <w:sz w:val="24"/>
+          <w:szCs w:val="24"/>
+          <w:lang w:val="es-ES"/>
+        </w:rPr>
+        <w:t xml:space="preserve"> y </w:t>
+      </w:r>
+      <w:r>
+        <w:rPr>
+          <w:rFonts w:ascii="Consolas" w:hAnsi="Consolas" w:eastAsia="Consolas" w:cs="Consolas"/>
+          <w:noProof w:val="0"/>
+          <w:sz w:val="24"/>
+          <w:szCs w:val="24"/>
+          <w:lang w:val="es-ES"/>
+        </w:rPr>
+        <w:t>register</w:t>
+      </w:r>
+      <w:r>
+        <w:rPr>
+          <w:rFonts w:ascii="Consolas" w:hAnsi="Consolas" w:eastAsia="Consolas" w:cs="Consolas"/>
+          <w:noProof w:val="0"/>
+          <w:sz w:val="24"/>
+          <w:szCs w:val="24"/>
+          <w:lang w:val="es-ES"/>
+        </w:rPr>
+        <w:t>-</w:t>
+      </w:r>
+      <w:r>
+        <w:rPr>
+          <w:rFonts w:ascii="Aptos" w:hAnsi="Aptos" w:eastAsia="Aptos" w:cs="Aptos"/>
+          <w:noProof w:val="0"/>
+          <w:sz w:val="24"/>
+          <w:szCs w:val="24"/>
+          <w:lang w:val="es-ES"/>
+        </w:rPr>
+        <w:t>) para que cada componente tenga su propio estilo independiente. Además, he corregido un fallo en el modo oscuro donde el texto "¿No tienes cuenta?" se quedaba en negro y no se leía sobre el fondo oscuro; ahora cambia a blanco automáticamente al pulsar el botón del tema.</w:t>
+      </w:r>
+    </w:p>
+    <w:p>
+      <w:pPr>
+        <w:pStyle w:val="Normal"/>
+      </w:pPr>
     </w:p>
     <w:p>
       <w:pPr>

</xml_diff>

<commit_message>
Actualizo la documentacion del bitacora 9 de abril
</commit_message>
<xml_diff>
--- a/Documentacion/Bitacora_Joaquin.docx
+++ b/Documentacion/Bitacora_Joaquin.docx
@@ -2763,6 +2763,752 @@
       <w:pPr>
         <w:pStyle w:val="Normal"/>
       </w:pPr>
+    </w:p>
+    <w:p>
+      <w:pPr>
+        <w:pStyle w:val="Normal"/>
+      </w:pPr>
+    </w:p>
+    <w:p>
+      <w:r>
+        <w:br w:type="page"/>
+      </w:r>
+    </w:p>
+    <w:p>
+      <w:pPr>
+        <w:spacing w:before="240" w:beforeAutospacing="off" w:after="240" w:afterAutospacing="off"/>
+      </w:pPr>
+      <w:r>
+        <w:rPr>
+          <w:rFonts w:ascii="Aptos" w:hAnsi="Aptos" w:eastAsia="Aptos" w:cs="Aptos"/>
+          <w:b w:val="1"/>
+          <w:bCs w:val="1"/>
+          <w:noProof w:val="0"/>
+          <w:sz w:val="24"/>
+          <w:szCs w:val="24"/>
+          <w:lang w:val="es-ES"/>
+        </w:rPr>
+        <w:t>Fecha:</w:t>
+      </w:r>
+      <w:r>
+        <w:rPr>
+          <w:rFonts w:ascii="Aptos" w:hAnsi="Aptos" w:eastAsia="Aptos" w:cs="Aptos"/>
+          <w:noProof w:val="0"/>
+          <w:sz w:val="24"/>
+          <w:szCs w:val="24"/>
+          <w:lang w:val="es-ES"/>
+        </w:rPr>
+        <w:t xml:space="preserve"> 9 de abril de 2026</w:t>
+      </w:r>
+    </w:p>
+    <w:p>
+      <w:pPr>
+        <w:spacing w:before="240" w:beforeAutospacing="off" w:after="240" w:afterAutospacing="off"/>
+      </w:pPr>
+      <w:r>
+        <w:rPr>
+          <w:rFonts w:ascii="Aptos" w:hAnsi="Aptos" w:eastAsia="Aptos" w:cs="Aptos"/>
+          <w:b w:val="1"/>
+          <w:bCs w:val="1"/>
+          <w:noProof w:val="0"/>
+          <w:sz w:val="24"/>
+          <w:szCs w:val="24"/>
+          <w:lang w:val="es-ES"/>
+        </w:rPr>
+        <w:t>Objetivo:</w:t>
+      </w:r>
+      <w:r>
+        <w:rPr>
+          <w:rFonts w:ascii="Aptos" w:hAnsi="Aptos" w:eastAsia="Aptos" w:cs="Aptos"/>
+          <w:noProof w:val="0"/>
+          <w:sz w:val="24"/>
+          <w:szCs w:val="24"/>
+          <w:lang w:val="es-ES"/>
+        </w:rPr>
+        <w:t xml:space="preserve"> Implementación del motor de gestión de colecciones y panel de control privado para el usuario.</w:t>
+      </w:r>
+    </w:p>
+    <w:p>
+      <w:pPr>
+        <w:pStyle w:val="Heading3"/>
+      </w:pPr>
+      <w:r>
+        <w:rPr>
+          <w:noProof w:val="0"/>
+          <w:lang w:val="es-ES"/>
+        </w:rPr>
+        <w:t>1. Construcción del motor de categorías (JPA y JSON)</w:t>
+      </w:r>
+      <w:r>
+        <w:rPr>
+          <w:noProof w:val="0"/>
+          <w:lang w:val="es-ES"/>
+        </w:rPr>
+        <w:t xml:space="preserve"> </w:t>
+      </w:r>
+    </w:p>
+    <w:p>
+      <w:pPr>
+        <w:spacing w:before="240" w:beforeAutospacing="off" w:after="240" w:afterAutospacing="off"/>
+      </w:pPr>
+      <w:r>
+        <w:rPr>
+          <w:rFonts w:ascii="Aptos" w:hAnsi="Aptos" w:eastAsia="Aptos" w:cs="Aptos"/>
+          <w:noProof w:val="0"/>
+          <w:sz w:val="24"/>
+          <w:szCs w:val="24"/>
+          <w:lang w:val="es-ES"/>
+        </w:rPr>
+        <w:t xml:space="preserve">Nada más empezar el día, nos hemos centrado en el </w:t>
+      </w:r>
+      <w:r>
+        <w:rPr>
+          <w:rFonts w:ascii="Aptos" w:hAnsi="Aptos" w:eastAsia="Aptos" w:cs="Aptos"/>
+          <w:noProof w:val="0"/>
+          <w:sz w:val="24"/>
+          <w:szCs w:val="24"/>
+          <w:lang w:val="es-ES"/>
+        </w:rPr>
+        <w:t>Backend</w:t>
+      </w:r>
+      <w:r>
+        <w:rPr>
+          <w:rFonts w:ascii="Aptos" w:hAnsi="Aptos" w:eastAsia="Aptos" w:cs="Aptos"/>
+          <w:noProof w:val="0"/>
+          <w:sz w:val="24"/>
+          <w:szCs w:val="24"/>
+          <w:lang w:val="es-ES"/>
+        </w:rPr>
+        <w:t xml:space="preserve"> para crear la estructura de las categorías. El reto técnico era permitir que cada categoría tuviera campos distintos (como "PSA" para cartas o "Autor" para libros). Lo he solucionado implementando una columna de tipo </w:t>
+      </w:r>
+      <w:r>
+        <w:rPr>
+          <w:rFonts w:ascii="Aptos" w:hAnsi="Aptos" w:eastAsia="Aptos" w:cs="Aptos"/>
+          <w:b w:val="1"/>
+          <w:bCs w:val="1"/>
+          <w:noProof w:val="0"/>
+          <w:sz w:val="24"/>
+          <w:szCs w:val="24"/>
+          <w:lang w:val="es-ES"/>
+        </w:rPr>
+        <w:t>JSON</w:t>
+      </w:r>
+      <w:r>
+        <w:rPr>
+          <w:rFonts w:ascii="Aptos" w:hAnsi="Aptos" w:eastAsia="Aptos" w:cs="Aptos"/>
+          <w:noProof w:val="0"/>
+          <w:sz w:val="24"/>
+          <w:szCs w:val="24"/>
+          <w:lang w:val="es-ES"/>
+        </w:rPr>
+        <w:t xml:space="preserve"> en MySQL y mapeándola en Spring </w:t>
+      </w:r>
+      <w:r>
+        <w:rPr>
+          <w:rFonts w:ascii="Aptos" w:hAnsi="Aptos" w:eastAsia="Aptos" w:cs="Aptos"/>
+          <w:noProof w:val="0"/>
+          <w:sz w:val="24"/>
+          <w:szCs w:val="24"/>
+          <w:lang w:val="es-ES"/>
+        </w:rPr>
+        <w:t>Boot</w:t>
+      </w:r>
+      <w:r>
+        <w:rPr>
+          <w:rFonts w:ascii="Aptos" w:hAnsi="Aptos" w:eastAsia="Aptos" w:cs="Aptos"/>
+          <w:noProof w:val="0"/>
+          <w:sz w:val="24"/>
+          <w:szCs w:val="24"/>
+          <w:lang w:val="es-ES"/>
+        </w:rPr>
+        <w:t xml:space="preserve"> usando la anotación </w:t>
+      </w:r>
+      <w:r>
+        <w:rPr>
+          <w:rFonts w:ascii="Consolas" w:hAnsi="Consolas" w:eastAsia="Consolas" w:cs="Consolas"/>
+          <w:noProof w:val="0"/>
+          <w:sz w:val="24"/>
+          <w:szCs w:val="24"/>
+          <w:lang w:val="es-ES"/>
+        </w:rPr>
+        <w:t>@</w:t>
+      </w:r>
+      <w:r>
+        <w:rPr>
+          <w:rFonts w:ascii="Consolas" w:hAnsi="Consolas" w:eastAsia="Consolas" w:cs="Consolas"/>
+          <w:noProof w:val="0"/>
+          <w:sz w:val="24"/>
+          <w:szCs w:val="24"/>
+          <w:lang w:val="es-ES"/>
+        </w:rPr>
+        <w:t>JdbcTypeCode(</w:t>
+      </w:r>
+      <w:r>
+        <w:rPr>
+          <w:rFonts w:ascii="Consolas" w:hAnsi="Consolas" w:eastAsia="Consolas" w:cs="Consolas"/>
+          <w:noProof w:val="0"/>
+          <w:sz w:val="24"/>
+          <w:szCs w:val="24"/>
+          <w:lang w:val="es-ES"/>
+        </w:rPr>
+        <w:t>SqlTypes.JSON)</w:t>
+      </w:r>
+      <w:r>
+        <w:rPr>
+          <w:rFonts w:ascii="Aptos" w:hAnsi="Aptos" w:eastAsia="Aptos" w:cs="Aptos"/>
+          <w:noProof w:val="0"/>
+          <w:sz w:val="24"/>
+          <w:szCs w:val="24"/>
+          <w:lang w:val="es-ES"/>
+        </w:rPr>
+        <w:t>. Esto nos da una flexibilidad total sin tener que crear tablas nuevas cada vez que el usuario quiera inventar una colección diferente.</w:t>
+      </w:r>
+    </w:p>
+    <w:p>
+      <w:pPr>
+        <w:pStyle w:val="Heading3"/>
+      </w:pPr>
+      <w:r>
+        <w:rPr>
+          <w:noProof w:val="0"/>
+          <w:lang w:val="es-ES"/>
+        </w:rPr>
+        <w:t>2. Seguridad y Privacidad: El "DNI" del usuario</w:t>
+      </w:r>
+      <w:r>
+        <w:rPr>
+          <w:noProof w:val="0"/>
+          <w:lang w:val="es-ES"/>
+        </w:rPr>
+        <w:t xml:space="preserve"> </w:t>
+      </w:r>
+    </w:p>
+    <w:p>
+      <w:pPr>
+        <w:spacing w:before="240" w:beforeAutospacing="off" w:after="240" w:afterAutospacing="off"/>
+      </w:pPr>
+      <w:r>
+        <w:rPr>
+          <w:rFonts w:ascii="Aptos" w:hAnsi="Aptos" w:eastAsia="Aptos" w:cs="Aptos"/>
+          <w:noProof w:val="0"/>
+          <w:sz w:val="24"/>
+          <w:szCs w:val="24"/>
+          <w:lang w:val="es-ES"/>
+        </w:rPr>
+        <w:t xml:space="preserve">He corregido un fallo crítico de privacidad que detectamos: antes, cualquier usuario </w:t>
+      </w:r>
+      <w:r>
+        <w:rPr>
+          <w:rFonts w:ascii="Aptos" w:hAnsi="Aptos" w:eastAsia="Aptos" w:cs="Aptos"/>
+          <w:noProof w:val="0"/>
+          <w:sz w:val="24"/>
+          <w:szCs w:val="24"/>
+          <w:lang w:val="es-ES"/>
+        </w:rPr>
+        <w:t>logueado</w:t>
+      </w:r>
+      <w:r>
+        <w:rPr>
+          <w:rFonts w:ascii="Aptos" w:hAnsi="Aptos" w:eastAsia="Aptos" w:cs="Aptos"/>
+          <w:noProof w:val="0"/>
+          <w:sz w:val="24"/>
+          <w:szCs w:val="24"/>
+          <w:lang w:val="es-ES"/>
+        </w:rPr>
+        <w:t xml:space="preserve"> podía ver las categorías de los demás. Para arreglarlo, he modificado el </w:t>
+      </w:r>
+      <w:r>
+        <w:rPr>
+          <w:rFonts w:ascii="Consolas" w:hAnsi="Consolas" w:eastAsia="Consolas" w:cs="Consolas"/>
+          <w:noProof w:val="0"/>
+          <w:sz w:val="24"/>
+          <w:szCs w:val="24"/>
+          <w:lang w:val="es-ES"/>
+        </w:rPr>
+        <w:t>LoginController</w:t>
+      </w:r>
+      <w:r>
+        <w:rPr>
+          <w:rFonts w:ascii="Aptos" w:hAnsi="Aptos" w:eastAsia="Aptos" w:cs="Aptos"/>
+          <w:noProof w:val="0"/>
+          <w:sz w:val="24"/>
+          <w:szCs w:val="24"/>
+          <w:lang w:val="es-ES"/>
+        </w:rPr>
+        <w:t xml:space="preserve"> para que, al acceder, el servidor envíe no solo un mensaje de éxito, sino también el </w:t>
+      </w:r>
+      <w:r>
+        <w:rPr>
+          <w:rFonts w:ascii="Aptos" w:hAnsi="Aptos" w:eastAsia="Aptos" w:cs="Aptos"/>
+          <w:b w:val="1"/>
+          <w:bCs w:val="1"/>
+          <w:noProof w:val="0"/>
+          <w:sz w:val="24"/>
+          <w:szCs w:val="24"/>
+          <w:lang w:val="es-ES"/>
+        </w:rPr>
+        <w:t>ID</w:t>
+      </w:r>
+      <w:r>
+        <w:rPr>
+          <w:rFonts w:ascii="Aptos" w:hAnsi="Aptos" w:eastAsia="Aptos" w:cs="Aptos"/>
+          <w:noProof w:val="0"/>
+          <w:sz w:val="24"/>
+          <w:szCs w:val="24"/>
+          <w:lang w:val="es-ES"/>
+        </w:rPr>
+        <w:t xml:space="preserve"> y el </w:t>
+      </w:r>
+      <w:r>
+        <w:rPr>
+          <w:rFonts w:ascii="Aptos" w:hAnsi="Aptos" w:eastAsia="Aptos" w:cs="Aptos"/>
+          <w:b w:val="1"/>
+          <w:bCs w:val="1"/>
+          <w:noProof w:val="0"/>
+          <w:sz w:val="24"/>
+          <w:szCs w:val="24"/>
+          <w:lang w:val="es-ES"/>
+        </w:rPr>
+        <w:t>Alias</w:t>
+      </w:r>
+      <w:r>
+        <w:rPr>
+          <w:rFonts w:ascii="Aptos" w:hAnsi="Aptos" w:eastAsia="Aptos" w:cs="Aptos"/>
+          <w:noProof w:val="0"/>
+          <w:sz w:val="24"/>
+          <w:szCs w:val="24"/>
+          <w:lang w:val="es-ES"/>
+        </w:rPr>
+        <w:t xml:space="preserve"> del usuario. Ahora, </w:t>
+      </w:r>
+      <w:r>
+        <w:rPr>
+          <w:rFonts w:ascii="Aptos" w:hAnsi="Aptos" w:eastAsia="Aptos" w:cs="Aptos"/>
+          <w:noProof w:val="0"/>
+          <w:sz w:val="24"/>
+          <w:szCs w:val="24"/>
+          <w:lang w:val="es-ES"/>
+        </w:rPr>
+        <w:t>React</w:t>
+      </w:r>
+      <w:r>
+        <w:rPr>
+          <w:rFonts w:ascii="Aptos" w:hAnsi="Aptos" w:eastAsia="Aptos" w:cs="Aptos"/>
+          <w:noProof w:val="0"/>
+          <w:sz w:val="24"/>
+          <w:szCs w:val="24"/>
+          <w:lang w:val="es-ES"/>
+        </w:rPr>
+        <w:t xml:space="preserve"> guarda esos datos en el </w:t>
+      </w:r>
+      <w:r>
+        <w:rPr>
+          <w:rFonts w:ascii="Consolas" w:hAnsi="Consolas" w:eastAsia="Consolas" w:cs="Consolas"/>
+          <w:noProof w:val="0"/>
+          <w:sz w:val="24"/>
+          <w:szCs w:val="24"/>
+          <w:lang w:val="es-ES"/>
+        </w:rPr>
+        <w:t>localStorage</w:t>
+      </w:r>
+      <w:r>
+        <w:rPr>
+          <w:rFonts w:ascii="Aptos" w:hAnsi="Aptos" w:eastAsia="Aptos" w:cs="Aptos"/>
+          <w:noProof w:val="0"/>
+          <w:sz w:val="24"/>
+          <w:szCs w:val="24"/>
+          <w:lang w:val="es-ES"/>
+        </w:rPr>
+        <w:t xml:space="preserve"> y los usa para filtrar las peticiones al </w:t>
+      </w:r>
+      <w:r>
+        <w:rPr>
+          <w:rFonts w:ascii="Aptos" w:hAnsi="Aptos" w:eastAsia="Aptos" w:cs="Aptos"/>
+          <w:noProof w:val="0"/>
+          <w:sz w:val="24"/>
+          <w:szCs w:val="24"/>
+          <w:lang w:val="es-ES"/>
+        </w:rPr>
+        <w:t>Backend</w:t>
+      </w:r>
+      <w:r>
+        <w:rPr>
+          <w:rFonts w:ascii="Aptos" w:hAnsi="Aptos" w:eastAsia="Aptos" w:cs="Aptos"/>
+          <w:noProof w:val="0"/>
+          <w:sz w:val="24"/>
+          <w:szCs w:val="24"/>
+          <w:lang w:val="es-ES"/>
+        </w:rPr>
+        <w:t>, garantizando que cada coleccionista solo vea y gestione su propio inventario personal.</w:t>
+      </w:r>
+    </w:p>
+    <w:p>
+      <w:pPr>
+        <w:pStyle w:val="Heading3"/>
+      </w:pPr>
+      <w:r>
+        <w:rPr>
+          <w:noProof w:val="0"/>
+          <w:lang w:val="es-ES"/>
+        </w:rPr>
+        <w:t xml:space="preserve">3. Rediseño visual del </w:t>
+      </w:r>
+      <w:r>
+        <w:rPr>
+          <w:noProof w:val="0"/>
+          <w:lang w:val="es-ES"/>
+        </w:rPr>
+        <w:t>Dashboard</w:t>
+      </w:r>
+      <w:r>
+        <w:rPr>
+          <w:noProof w:val="0"/>
+          <w:lang w:val="es-ES"/>
+        </w:rPr>
+        <w:t xml:space="preserve"> y experiencia de usuario</w:t>
+      </w:r>
+      <w:r>
+        <w:rPr>
+          <w:noProof w:val="0"/>
+          <w:lang w:val="es-ES"/>
+        </w:rPr>
+        <w:t xml:space="preserve"> </w:t>
+      </w:r>
+    </w:p>
+    <w:p>
+      <w:pPr>
+        <w:spacing w:before="240" w:beforeAutospacing="off" w:after="240" w:afterAutospacing="off"/>
+      </w:pPr>
+      <w:r>
+        <w:rPr>
+          <w:rFonts w:ascii="Aptos" w:hAnsi="Aptos" w:eastAsia="Aptos" w:cs="Aptos"/>
+          <w:noProof w:val="0"/>
+          <w:sz w:val="24"/>
+          <w:szCs w:val="24"/>
+          <w:lang w:val="es-ES"/>
+        </w:rPr>
+        <w:t xml:space="preserve">Siguiendo el boceto que planteé, hemos dado un salto de calidad en la interfaz. He creado una </w:t>
+      </w:r>
+      <w:r>
+        <w:rPr>
+          <w:rFonts w:ascii="Aptos" w:hAnsi="Aptos" w:eastAsia="Aptos" w:cs="Aptos"/>
+          <w:b w:val="1"/>
+          <w:bCs w:val="1"/>
+          <w:noProof w:val="0"/>
+          <w:sz w:val="24"/>
+          <w:szCs w:val="24"/>
+          <w:lang w:val="es-ES"/>
+        </w:rPr>
+        <w:t>cabecera (</w:t>
+      </w:r>
+      <w:r>
+        <w:rPr>
+          <w:rFonts w:ascii="Aptos" w:hAnsi="Aptos" w:eastAsia="Aptos" w:cs="Aptos"/>
+          <w:b w:val="1"/>
+          <w:bCs w:val="1"/>
+          <w:noProof w:val="0"/>
+          <w:sz w:val="24"/>
+          <w:szCs w:val="24"/>
+          <w:lang w:val="es-ES"/>
+        </w:rPr>
+        <w:t>topbar</w:t>
+      </w:r>
+      <w:r>
+        <w:rPr>
+          <w:rFonts w:ascii="Aptos" w:hAnsi="Aptos" w:eastAsia="Aptos" w:cs="Aptos"/>
+          <w:b w:val="1"/>
+          <w:bCs w:val="1"/>
+          <w:noProof w:val="0"/>
+          <w:sz w:val="24"/>
+          <w:szCs w:val="24"/>
+          <w:lang w:val="es-ES"/>
+        </w:rPr>
+        <w:t>)</w:t>
+      </w:r>
+      <w:r>
+        <w:rPr>
+          <w:rFonts w:ascii="Aptos" w:hAnsi="Aptos" w:eastAsia="Aptos" w:cs="Aptos"/>
+          <w:noProof w:val="0"/>
+          <w:sz w:val="24"/>
+          <w:szCs w:val="24"/>
+          <w:lang w:val="es-ES"/>
+        </w:rPr>
+        <w:t xml:space="preserve"> en un verde más oscuro para diferenciarla del cuerpo de la tarjeta, incluyendo el nombre de la </w:t>
+      </w:r>
+      <w:r>
+        <w:rPr>
+          <w:rFonts w:ascii="Aptos" w:hAnsi="Aptos" w:eastAsia="Aptos" w:cs="Aptos"/>
+          <w:noProof w:val="0"/>
+          <w:sz w:val="24"/>
+          <w:szCs w:val="24"/>
+          <w:lang w:val="es-ES"/>
+        </w:rPr>
+        <w:t>app</w:t>
+      </w:r>
+      <w:r>
+        <w:rPr>
+          <w:rFonts w:ascii="Aptos" w:hAnsi="Aptos" w:eastAsia="Aptos" w:cs="Aptos"/>
+          <w:noProof w:val="0"/>
+          <w:sz w:val="24"/>
+          <w:szCs w:val="24"/>
+          <w:lang w:val="es-ES"/>
+        </w:rPr>
+        <w:t xml:space="preserve"> y un botón de "Cerrar Sesión" funcional. También he implementado un mensaje de bienvenida personalizado con el nombre del usuario y he cambiado la disposición de las categorías: ahora son </w:t>
+      </w:r>
+      <w:r>
+        <w:rPr>
+          <w:rFonts w:ascii="Aptos" w:hAnsi="Aptos" w:eastAsia="Aptos" w:cs="Aptos"/>
+          <w:b w:val="1"/>
+          <w:bCs w:val="1"/>
+          <w:noProof w:val="0"/>
+          <w:sz w:val="24"/>
+          <w:szCs w:val="24"/>
+          <w:lang w:val="es-ES"/>
+        </w:rPr>
+        <w:t>tarjetas horizontales alargadas</w:t>
+      </w:r>
+      <w:r>
+        <w:rPr>
+          <w:rFonts w:ascii="Aptos" w:hAnsi="Aptos" w:eastAsia="Aptos" w:cs="Aptos"/>
+          <w:noProof w:val="0"/>
+          <w:sz w:val="24"/>
+          <w:szCs w:val="24"/>
+          <w:lang w:val="es-ES"/>
+        </w:rPr>
+        <w:t xml:space="preserve"> que se apilan hacia abajo, lo que aprovecha mucho mejor el espacio y se ve más profesional que las tarjetas cuadradas iniciales.</w:t>
+      </w:r>
+    </w:p>
+    <w:p>
+      <w:pPr>
+        <w:pStyle w:val="Heading3"/>
+      </w:pPr>
+      <w:r>
+        <w:rPr>
+          <w:noProof w:val="0"/>
+          <w:lang w:val="es-ES"/>
+        </w:rPr>
+        <w:t>4. Finalización del CRUD: Edición y Borrado dinámico</w:t>
+      </w:r>
+      <w:r>
+        <w:rPr>
+          <w:noProof w:val="0"/>
+          <w:lang w:val="es-ES"/>
+        </w:rPr>
+        <w:t xml:space="preserve"> </w:t>
+      </w:r>
+    </w:p>
+    <w:p>
+      <w:pPr>
+        <w:spacing w:before="240" w:beforeAutospacing="off" w:after="240" w:afterAutospacing="off"/>
+      </w:pPr>
+      <w:r>
+        <w:rPr>
+          <w:rFonts w:ascii="Aptos" w:hAnsi="Aptos" w:eastAsia="Aptos" w:cs="Aptos"/>
+          <w:noProof w:val="0"/>
+          <w:sz w:val="24"/>
+          <w:szCs w:val="24"/>
+          <w:lang w:val="es-ES"/>
+        </w:rPr>
+        <w:t xml:space="preserve">Para que el usuario tenga el control total, hemos completado el sistema </w:t>
+      </w:r>
+      <w:r>
+        <w:rPr>
+          <w:rFonts w:ascii="Aptos" w:hAnsi="Aptos" w:eastAsia="Aptos" w:cs="Aptos"/>
+          <w:b w:val="1"/>
+          <w:bCs w:val="1"/>
+          <w:noProof w:val="0"/>
+          <w:sz w:val="24"/>
+          <w:szCs w:val="24"/>
+          <w:lang w:val="es-ES"/>
+        </w:rPr>
+        <w:t>CRUD</w:t>
+      </w:r>
+      <w:r>
+        <w:rPr>
+          <w:rFonts w:ascii="Aptos" w:hAnsi="Aptos" w:eastAsia="Aptos" w:cs="Aptos"/>
+          <w:noProof w:val="0"/>
+          <w:sz w:val="24"/>
+          <w:szCs w:val="24"/>
+          <w:lang w:val="es-ES"/>
+        </w:rPr>
+        <w:t xml:space="preserve">. He añadido botones de acción (editar con un lápiz y borrar con una papelera) en cada tarjeta. Aunque al principio tuvimos un problema porque el sistema "no guardaba" los cambios al editar, lo solucionamos rápidamente añadiendo el método </w:t>
+      </w:r>
+      <w:r>
+        <w:rPr>
+          <w:rFonts w:ascii="Consolas" w:hAnsi="Consolas" w:eastAsia="Consolas" w:cs="Consolas"/>
+          <w:noProof w:val="0"/>
+          <w:sz w:val="24"/>
+          <w:szCs w:val="24"/>
+          <w:lang w:val="es-ES"/>
+        </w:rPr>
+        <w:t>@PutMapping</w:t>
+      </w:r>
+      <w:r>
+        <w:rPr>
+          <w:rFonts w:ascii="Aptos" w:hAnsi="Aptos" w:eastAsia="Aptos" w:cs="Aptos"/>
+          <w:noProof w:val="0"/>
+          <w:sz w:val="24"/>
+          <w:szCs w:val="24"/>
+          <w:lang w:val="es-ES"/>
+        </w:rPr>
+        <w:t xml:space="preserve"> que faltaba en el controlador de Java. Ahora el usuario puede añadir o quitar columnas de su "esquema" de colección en cualquier momento y los cambios se persisten en la nube de </w:t>
+      </w:r>
+      <w:r>
+        <w:rPr>
+          <w:rFonts w:ascii="Aptos" w:hAnsi="Aptos" w:eastAsia="Aptos" w:cs="Aptos"/>
+          <w:noProof w:val="0"/>
+          <w:sz w:val="24"/>
+          <w:szCs w:val="24"/>
+          <w:lang w:val="es-ES"/>
+        </w:rPr>
+        <w:t>Railway</w:t>
+      </w:r>
+      <w:r>
+        <w:rPr>
+          <w:rFonts w:ascii="Aptos" w:hAnsi="Aptos" w:eastAsia="Aptos" w:cs="Aptos"/>
+          <w:noProof w:val="0"/>
+          <w:sz w:val="24"/>
+          <w:szCs w:val="24"/>
+          <w:lang w:val="es-ES"/>
+        </w:rPr>
+        <w:t xml:space="preserve"> al instante.</w:t>
+      </w:r>
+    </w:p>
+    <w:p>
+      <w:pPr>
+        <w:spacing w:before="240" w:beforeAutospacing="off" w:after="240" w:afterAutospacing="off"/>
+        <w:rPr>
+          <w:rFonts w:ascii="Aptos" w:hAnsi="Aptos" w:eastAsia="Aptos" w:cs="Aptos"/>
+          <w:noProof w:val="0"/>
+          <w:sz w:val="24"/>
+          <w:szCs w:val="24"/>
+          <w:lang w:val="es-ES"/>
+        </w:rPr>
+      </w:pPr>
+    </w:p>
+    <w:p>
+      <w:pPr>
+        <w:pStyle w:val="Heading3"/>
+      </w:pPr>
+      <w:r>
+        <w:rPr>
+          <w:noProof w:val="0"/>
+          <w:lang w:val="es-ES"/>
+        </w:rPr>
+        <w:t>5. Gestión de errores y validación de contraseñas</w:t>
+      </w:r>
+      <w:r>
+        <w:rPr>
+          <w:noProof w:val="0"/>
+          <w:lang w:val="es-ES"/>
+        </w:rPr>
+        <w:t xml:space="preserve"> </w:t>
+      </w:r>
+    </w:p>
+    <w:p>
+      <w:pPr>
+        <w:spacing w:before="240" w:beforeAutospacing="off" w:after="240" w:afterAutospacing="off"/>
+      </w:pPr>
+      <w:r>
+        <w:rPr>
+          <w:rFonts w:ascii="Aptos" w:hAnsi="Aptos" w:eastAsia="Aptos" w:cs="Aptos"/>
+          <w:noProof w:val="0"/>
+          <w:sz w:val="24"/>
+          <w:szCs w:val="24"/>
+          <w:lang w:val="es-ES"/>
+        </w:rPr>
+        <w:t xml:space="preserve">Hemos dedicado un tiempo a depurar un error molesto con el inicio de sesión. Descubrimos que, tras implementar el cifrado </w:t>
+      </w:r>
+      <w:r>
+        <w:rPr>
+          <w:rFonts w:ascii="Aptos" w:hAnsi="Aptos" w:eastAsia="Aptos" w:cs="Aptos"/>
+          <w:b w:val="1"/>
+          <w:bCs w:val="1"/>
+          <w:noProof w:val="0"/>
+          <w:sz w:val="24"/>
+          <w:szCs w:val="24"/>
+          <w:lang w:val="es-ES"/>
+        </w:rPr>
+        <w:t>BCrypt</w:t>
+      </w:r>
+      <w:r>
+        <w:rPr>
+          <w:rFonts w:ascii="Aptos" w:hAnsi="Aptos" w:eastAsia="Aptos" w:cs="Aptos"/>
+          <w:noProof w:val="0"/>
+          <w:sz w:val="24"/>
+          <w:szCs w:val="24"/>
+          <w:lang w:val="es-ES"/>
+        </w:rPr>
+        <w:t xml:space="preserve">, no podíamos entrar con los usuarios de prueba del </w:t>
+      </w:r>
+      <w:r>
+        <w:rPr>
+          <w:rFonts w:ascii="Consolas" w:hAnsi="Consolas" w:eastAsia="Consolas" w:cs="Consolas"/>
+          <w:noProof w:val="0"/>
+          <w:sz w:val="24"/>
+          <w:szCs w:val="24"/>
+          <w:lang w:val="es-ES"/>
+        </w:rPr>
+        <w:t>init.sql</w:t>
+      </w:r>
+      <w:r>
+        <w:rPr>
+          <w:rFonts w:ascii="Aptos" w:hAnsi="Aptos" w:eastAsia="Aptos" w:cs="Aptos"/>
+          <w:noProof w:val="0"/>
+          <w:sz w:val="24"/>
+          <w:szCs w:val="24"/>
+          <w:lang w:val="es-ES"/>
+        </w:rPr>
+        <w:t xml:space="preserve"> porque sus contraseñas estaban en texto plano. Hemos validado que el sistema de encriptación funciona perfectamente creando nuevos usuarios desde la web, asegurando que el flujo de registro-cifrado-</w:t>
+      </w:r>
+      <w:r>
+        <w:rPr>
+          <w:rFonts w:ascii="Aptos" w:hAnsi="Aptos" w:eastAsia="Aptos" w:cs="Aptos"/>
+          <w:noProof w:val="0"/>
+          <w:sz w:val="24"/>
+          <w:szCs w:val="24"/>
+          <w:lang w:val="es-ES"/>
+        </w:rPr>
+        <w:t>login</w:t>
+      </w:r>
+      <w:r>
+        <w:rPr>
+          <w:rFonts w:ascii="Aptos" w:hAnsi="Aptos" w:eastAsia="Aptos" w:cs="Aptos"/>
+          <w:noProof w:val="0"/>
+          <w:sz w:val="24"/>
+          <w:szCs w:val="24"/>
+          <w:lang w:val="es-ES"/>
+        </w:rPr>
+        <w:t xml:space="preserve"> es ahora 100% seguro y a prueba de fallos.</w:t>
+      </w:r>
+    </w:p>
+    <w:p/>
+    <w:p>
+      <w:pPr>
+        <w:spacing w:before="240" w:beforeAutospacing="off" w:after="240" w:afterAutospacing="off"/>
+      </w:pPr>
+      <w:r>
+        <w:rPr>
+          <w:rFonts w:ascii="Aptos" w:hAnsi="Aptos" w:eastAsia="Aptos" w:cs="Aptos"/>
+          <w:b w:val="1"/>
+          <w:bCs w:val="1"/>
+          <w:noProof w:val="0"/>
+          <w:sz w:val="24"/>
+          <w:szCs w:val="24"/>
+          <w:lang w:val="es-ES"/>
+        </w:rPr>
+        <w:t>Estado del proyecto:</w:t>
+      </w:r>
+      <w:r>
+        <w:rPr>
+          <w:rFonts w:ascii="Aptos" w:hAnsi="Aptos" w:eastAsia="Aptos" w:cs="Aptos"/>
+          <w:noProof w:val="0"/>
+          <w:sz w:val="24"/>
+          <w:szCs w:val="24"/>
+          <w:lang w:val="es-ES"/>
+        </w:rPr>
+        <w:t xml:space="preserve"> El sistema de gestión de categorías es plenamente funcional, privado y dinámico. La aplicación ya sabe quién es el usuario, qué colecciones tiene y cómo debe ser el "molde" para los objetos que crearemos a continuación.</w:t>
+      </w:r>
     </w:p>
     <w:p>
       <w:pPr>

</xml_diff>

<commit_message>
Documentacion terminada para hito 4
</commit_message>
<xml_diff>
--- a/Documentacion/Bitacora_Joaquin.docx
+++ b/Documentacion/Bitacora_Joaquin.docx
@@ -3508,6 +3508,629 @@
           <w:lang w:val="es-ES"/>
         </w:rPr>
         <w:t xml:space="preserve"> El sistema de gestión de categorías es plenamente funcional, privado y dinámico. La aplicación ya sabe quién es el usuario, qué colecciones tiene y cómo debe ser el "molde" para los objetos que crearemos a continuación.</w:t>
+      </w:r>
+    </w:p>
+    <w:p>
+      <w:pPr>
+        <w:pStyle w:val="Normal"/>
+      </w:pPr>
+    </w:p>
+    <w:p>
+      <w:pPr>
+        <w:pStyle w:val="Normal"/>
+      </w:pPr>
+    </w:p>
+    <w:p>
+      <w:r>
+        <w:br w:type="page"/>
+      </w:r>
+    </w:p>
+    <w:p>
+      <w:pPr>
+        <w:spacing w:before="240" w:beforeAutospacing="off" w:after="240" w:afterAutospacing="off"/>
+        <w:rPr>
+          <w:rFonts w:ascii="Aptos" w:hAnsi="Aptos" w:eastAsia="Aptos" w:cs="Aptos"/>
+          <w:b w:val="1"/>
+          <w:bCs w:val="1"/>
+          <w:noProof w:val="0"/>
+          <w:sz w:val="24"/>
+          <w:szCs w:val="24"/>
+          <w:lang w:val="es-ES"/>
+        </w:rPr>
+      </w:pPr>
+      <w:r>
+        <w:rPr>
+          <w:rFonts w:ascii="Aptos" w:hAnsi="Aptos" w:eastAsia="Aptos" w:cs="Aptos"/>
+          <w:b w:val="1"/>
+          <w:bCs w:val="1"/>
+          <w:noProof w:val="0"/>
+          <w:sz w:val="24"/>
+          <w:szCs w:val="24"/>
+          <w:lang w:val="es-ES"/>
+        </w:rPr>
+        <w:t xml:space="preserve">Fecha: </w:t>
+      </w:r>
+      <w:r>
+        <w:rPr>
+          <w:rFonts w:ascii="Aptos" w:hAnsi="Aptos" w:eastAsia="Aptos" w:cs="Aptos"/>
+          <w:b w:val="0"/>
+          <w:bCs w:val="0"/>
+          <w:noProof w:val="0"/>
+          <w:sz w:val="24"/>
+          <w:szCs w:val="24"/>
+          <w:lang w:val="es-ES"/>
+        </w:rPr>
+        <w:t>10 de abril de 2026</w:t>
+      </w:r>
+    </w:p>
+    <w:p>
+      <w:pPr>
+        <w:spacing w:before="240" w:beforeAutospacing="off" w:after="240" w:afterAutospacing="off"/>
+      </w:pPr>
+      <w:r>
+        <w:rPr>
+          <w:rFonts w:ascii="Aptos" w:hAnsi="Aptos" w:eastAsia="Aptos" w:cs="Aptos"/>
+          <w:noProof w:val="0"/>
+          <w:sz w:val="24"/>
+          <w:szCs w:val="24"/>
+          <w:lang w:val="es-ES"/>
+        </w:rPr>
+        <w:t>Hoy he centrado mis esfuerzos en transformar la estructura básica de la aplicación en una plataforma de gestión completa, robusta y con una experiencia de usuario mucho más pulida. He logrado cerrar el ciclo de gestión de inventario y establecer una jerarquía de administración sólida.</w:t>
+      </w:r>
+    </w:p>
+    <w:p>
+      <w:pPr>
+        <w:spacing w:before="240" w:beforeAutospacing="off" w:after="240" w:afterAutospacing="off"/>
+      </w:pPr>
+      <w:r>
+        <w:rPr>
+          <w:rFonts w:ascii="Aptos" w:hAnsi="Aptos" w:eastAsia="Aptos" w:cs="Aptos"/>
+          <w:noProof w:val="0"/>
+          <w:sz w:val="24"/>
+          <w:szCs w:val="24"/>
+          <w:lang w:val="es-ES"/>
+        </w:rPr>
+        <w:t>Estos son los avances detallados de la jornada:</w:t>
+      </w:r>
+    </w:p>
+    <w:p>
+      <w:pPr>
+        <w:pStyle w:val="Heading3"/>
+      </w:pPr>
+      <w:r>
+        <w:rPr>
+          <w:noProof w:val="0"/>
+          <w:lang w:val="es-ES"/>
+        </w:rPr>
+        <w:t>1. Optimización del acceso y persistencia de sesión</w:t>
+      </w:r>
+      <w:r>
+        <w:rPr>
+          <w:noProof w:val="0"/>
+          <w:lang w:val="es-ES"/>
+        </w:rPr>
+        <w:t xml:space="preserve"> </w:t>
+      </w:r>
+    </w:p>
+    <w:p>
+      <w:pPr>
+        <w:spacing w:before="240" w:beforeAutospacing="off" w:after="240" w:afterAutospacing="off"/>
+      </w:pPr>
+      <w:r>
+        <w:rPr>
+          <w:rFonts w:ascii="Aptos" w:hAnsi="Aptos" w:eastAsia="Aptos" w:cs="Aptos"/>
+          <w:noProof w:val="0"/>
+          <w:sz w:val="24"/>
+          <w:szCs w:val="24"/>
+          <w:lang w:val="es-ES"/>
+        </w:rPr>
+        <w:t xml:space="preserve">He comenzado el día solucionando un error que impedía la redirección al </w:t>
+      </w:r>
+      <w:r>
+        <w:rPr>
+          <w:rFonts w:ascii="Aptos" w:hAnsi="Aptos" w:eastAsia="Aptos" w:cs="Aptos"/>
+          <w:noProof w:val="0"/>
+          <w:sz w:val="24"/>
+          <w:szCs w:val="24"/>
+          <w:lang w:val="es-ES"/>
+        </w:rPr>
+        <w:t>dashboard</w:t>
+      </w:r>
+      <w:r>
+        <w:rPr>
+          <w:rFonts w:ascii="Aptos" w:hAnsi="Aptos" w:eastAsia="Aptos" w:cs="Aptos"/>
+          <w:noProof w:val="0"/>
+          <w:sz w:val="24"/>
+          <w:szCs w:val="24"/>
+          <w:lang w:val="es-ES"/>
+        </w:rPr>
+        <w:t xml:space="preserve"> tras el </w:t>
+      </w:r>
+      <w:r>
+        <w:rPr>
+          <w:rFonts w:ascii="Aptos" w:hAnsi="Aptos" w:eastAsia="Aptos" w:cs="Aptos"/>
+          <w:noProof w:val="0"/>
+          <w:sz w:val="24"/>
+          <w:szCs w:val="24"/>
+          <w:lang w:val="es-ES"/>
+        </w:rPr>
+        <w:t>login</w:t>
+      </w:r>
+      <w:r>
+        <w:rPr>
+          <w:rFonts w:ascii="Aptos" w:hAnsi="Aptos" w:eastAsia="Aptos" w:cs="Aptos"/>
+          <w:noProof w:val="0"/>
+          <w:sz w:val="24"/>
+          <w:szCs w:val="24"/>
+          <w:lang w:val="es-ES"/>
+        </w:rPr>
+        <w:t xml:space="preserve">. He simplificado la lógica de validación en el </w:t>
+      </w:r>
+      <w:r>
+        <w:rPr>
+          <w:rFonts w:ascii="Aptos" w:hAnsi="Aptos" w:eastAsia="Aptos" w:cs="Aptos"/>
+          <w:noProof w:val="0"/>
+          <w:sz w:val="24"/>
+          <w:szCs w:val="24"/>
+          <w:lang w:val="es-ES"/>
+        </w:rPr>
+        <w:t>frontend</w:t>
+      </w:r>
+      <w:r>
+        <w:rPr>
+          <w:rFonts w:ascii="Aptos" w:hAnsi="Aptos" w:eastAsia="Aptos" w:cs="Aptos"/>
+          <w:noProof w:val="0"/>
+          <w:sz w:val="24"/>
+          <w:szCs w:val="24"/>
+          <w:lang w:val="es-ES"/>
+        </w:rPr>
+        <w:t xml:space="preserve">, dejando de depender de mensajes de texto específicos para centrarme en la existencia de un </w:t>
+      </w:r>
+      <w:r>
+        <w:rPr>
+          <w:rFonts w:ascii="Consolas" w:hAnsi="Consolas" w:eastAsia="Consolas" w:cs="Consolas"/>
+          <w:noProof w:val="0"/>
+          <w:sz w:val="24"/>
+          <w:szCs w:val="24"/>
+          <w:lang w:val="es-ES"/>
+        </w:rPr>
+        <w:t>usuarioId</w:t>
+      </w:r>
+      <w:r>
+        <w:rPr>
+          <w:rFonts w:ascii="Aptos" w:hAnsi="Aptos" w:eastAsia="Aptos" w:cs="Aptos"/>
+          <w:noProof w:val="0"/>
+          <w:sz w:val="24"/>
+          <w:szCs w:val="24"/>
+          <w:lang w:val="es-ES"/>
+        </w:rPr>
+        <w:t xml:space="preserve"> válido. Además, he implementado la persistencia de sesión; ahora, aunque recargue la página, el sistema reconoce mi sesión activa y me mantiene en el </w:t>
+      </w:r>
+      <w:r>
+        <w:rPr>
+          <w:rFonts w:ascii="Aptos" w:hAnsi="Aptos" w:eastAsia="Aptos" w:cs="Aptos"/>
+          <w:noProof w:val="0"/>
+          <w:sz w:val="24"/>
+          <w:szCs w:val="24"/>
+          <w:lang w:val="es-ES"/>
+        </w:rPr>
+        <w:t>dashboard</w:t>
+      </w:r>
+      <w:r>
+        <w:rPr>
+          <w:rFonts w:ascii="Aptos" w:hAnsi="Aptos" w:eastAsia="Aptos" w:cs="Aptos"/>
+          <w:noProof w:val="0"/>
+          <w:sz w:val="24"/>
+          <w:szCs w:val="24"/>
+          <w:lang w:val="es-ES"/>
+        </w:rPr>
+        <w:t>, mejorando significativamente la comodidad de uso.</w:t>
+      </w:r>
+    </w:p>
+    <w:p>
+      <w:pPr>
+        <w:pStyle w:val="Heading3"/>
+      </w:pPr>
+      <w:r>
+        <w:rPr>
+          <w:noProof w:val="0"/>
+          <w:lang w:val="es-ES"/>
+        </w:rPr>
+        <w:t>2. Implementación del sistema de artículos e imágenes</w:t>
+      </w:r>
+      <w:r>
+        <w:rPr>
+          <w:noProof w:val="0"/>
+          <w:lang w:val="es-ES"/>
+        </w:rPr>
+        <w:t xml:space="preserve"> </w:t>
+      </w:r>
+    </w:p>
+    <w:p>
+      <w:pPr>
+        <w:spacing w:before="240" w:beforeAutospacing="off" w:after="240" w:afterAutospacing="off"/>
+      </w:pPr>
+      <w:r>
+        <w:rPr>
+          <w:rFonts w:ascii="Aptos" w:hAnsi="Aptos" w:eastAsia="Aptos" w:cs="Aptos"/>
+          <w:noProof w:val="0"/>
+          <w:sz w:val="24"/>
+          <w:szCs w:val="24"/>
+          <w:lang w:val="es-ES"/>
+        </w:rPr>
+        <w:t xml:space="preserve">He desarrollado el núcleo de la aplicación: el inventario. Ahora cada categoría puede contener artículos propios. He diseñado el </w:t>
+      </w:r>
+      <w:r>
+        <w:rPr>
+          <w:rFonts w:ascii="Aptos" w:hAnsi="Aptos" w:eastAsia="Aptos" w:cs="Aptos"/>
+          <w:noProof w:val="0"/>
+          <w:sz w:val="24"/>
+          <w:szCs w:val="24"/>
+          <w:lang w:val="es-ES"/>
+        </w:rPr>
+        <w:t>backend</w:t>
+      </w:r>
+      <w:r>
+        <w:rPr>
+          <w:rFonts w:ascii="Aptos" w:hAnsi="Aptos" w:eastAsia="Aptos" w:cs="Aptos"/>
+          <w:noProof w:val="0"/>
+          <w:sz w:val="24"/>
+          <w:szCs w:val="24"/>
+          <w:lang w:val="es-ES"/>
+        </w:rPr>
+        <w:t xml:space="preserve"> para que soporte esquemas dinámicos (usando JSON) y he integrado la gestión de imágenes. He decidido utilizar formato Base64 para permitir subir hasta dos fotos por artículo sin necesidad de gestionar servidores de archivos externos, lo que facilita enormemente la portabilidad del proyecto.</w:t>
+      </w:r>
+    </w:p>
+    <w:p>
+      <w:pPr>
+        <w:pStyle w:val="Heading3"/>
+      </w:pPr>
+      <w:r>
+        <w:rPr>
+          <w:noProof w:val="0"/>
+          <w:lang w:val="es-ES"/>
+        </w:rPr>
+        <w:t>3. Mejoras en la interfaz y experiencia visual (UX/UI)</w:t>
+      </w:r>
+      <w:r>
+        <w:rPr>
+          <w:noProof w:val="0"/>
+          <w:lang w:val="es-ES"/>
+        </w:rPr>
+        <w:t xml:space="preserve"> </w:t>
+      </w:r>
+    </w:p>
+    <w:p>
+      <w:pPr>
+        <w:spacing w:before="240" w:beforeAutospacing="off" w:after="240" w:afterAutospacing="off"/>
+      </w:pPr>
+      <w:r>
+        <w:rPr>
+          <w:rFonts w:ascii="Aptos" w:hAnsi="Aptos" w:eastAsia="Aptos" w:cs="Aptos"/>
+          <w:noProof w:val="0"/>
+          <w:sz w:val="24"/>
+          <w:szCs w:val="24"/>
+          <w:lang w:val="es-ES"/>
+        </w:rPr>
+        <w:t>Para darle un acabado profesional a la vista de inventario, hoy he implementado dos funcionalidades visuales clave:</w:t>
+      </w:r>
+    </w:p>
+    <w:p>
+      <w:pPr>
+        <w:pStyle w:val="ListParagraph"/>
+        <w:numPr>
+          <w:ilvl w:val="0"/>
+          <w:numId w:val="12"/>
+        </w:numPr>
+        <w:spacing w:before="240" w:beforeAutospacing="off" w:after="240" w:afterAutospacing="off"/>
+        <w:rPr>
+          <w:rFonts w:ascii="Aptos" w:hAnsi="Aptos" w:eastAsia="Aptos" w:cs="Aptos"/>
+          <w:noProof w:val="0"/>
+          <w:sz w:val="24"/>
+          <w:szCs w:val="24"/>
+          <w:lang w:val="es-ES"/>
+        </w:rPr>
+      </w:pPr>
+      <w:r>
+        <w:rPr>
+          <w:rFonts w:ascii="Aptos" w:hAnsi="Aptos" w:eastAsia="Aptos" w:cs="Aptos"/>
+          <w:b w:val="1"/>
+          <w:bCs w:val="1"/>
+          <w:noProof w:val="0"/>
+          <w:sz w:val="24"/>
+          <w:szCs w:val="24"/>
+          <w:lang w:val="es-ES"/>
+        </w:rPr>
+        <w:t>Efecto Lightbox:</w:t>
+      </w:r>
+      <w:r>
+        <w:rPr>
+          <w:rFonts w:ascii="Aptos" w:hAnsi="Aptos" w:eastAsia="Aptos" w:cs="Aptos"/>
+          <w:noProof w:val="0"/>
+          <w:sz w:val="24"/>
+          <w:szCs w:val="24"/>
+          <w:lang w:val="es-ES"/>
+        </w:rPr>
+        <w:t xml:space="preserve"> He programado un sistema para que, al clicar en la miniatura de un artículo, la imagen se amplíe en el centro de la pantalla con un fondo oscurecido y difuminado, permitiendo ver los detalles del objeto.</w:t>
+      </w:r>
+    </w:p>
+    <w:p>
+      <w:pPr>
+        <w:pStyle w:val="ListParagraph"/>
+        <w:numPr>
+          <w:ilvl w:val="0"/>
+          <w:numId w:val="12"/>
+        </w:numPr>
+        <w:spacing w:before="240" w:beforeAutospacing="off" w:after="240" w:afterAutospacing="off"/>
+        <w:rPr>
+          <w:rFonts w:ascii="Aptos" w:hAnsi="Aptos" w:eastAsia="Aptos" w:cs="Aptos"/>
+          <w:noProof w:val="0"/>
+          <w:sz w:val="24"/>
+          <w:szCs w:val="24"/>
+          <w:lang w:val="es-ES"/>
+        </w:rPr>
+      </w:pPr>
+      <w:r>
+        <w:rPr>
+          <w:rFonts w:ascii="Aptos" w:hAnsi="Aptos" w:eastAsia="Aptos" w:cs="Aptos"/>
+          <w:b w:val="1"/>
+          <w:bCs w:val="1"/>
+          <w:noProof w:val="0"/>
+          <w:sz w:val="24"/>
+          <w:szCs w:val="24"/>
+          <w:lang w:val="es-ES"/>
+        </w:rPr>
+        <w:t>Carrusel Dinámico:</w:t>
+      </w:r>
+      <w:r>
+        <w:rPr>
+          <w:rFonts w:ascii="Aptos" w:hAnsi="Aptos" w:eastAsia="Aptos" w:cs="Aptos"/>
+          <w:noProof w:val="0"/>
+          <w:sz w:val="24"/>
+          <w:szCs w:val="24"/>
+          <w:lang w:val="es-ES"/>
+        </w:rPr>
+        <w:t xml:space="preserve"> He creado un componente que intercambia automáticamente las dos imágenes de la tarjeta cada 5 segundos. Esto aporta dinamismo visual a la lista de colecciones sin penalizar el rendimiento.</w:t>
+      </w:r>
+    </w:p>
+    <w:p>
+      <w:r>
+        <w:br w:type="page"/>
+      </w:r>
+    </w:p>
+    <w:p>
+      <w:pPr>
+        <w:pStyle w:val="Normal"/>
+        <w:spacing w:before="240" w:beforeAutospacing="off" w:after="240" w:afterAutospacing="off"/>
+        <w:ind w:left="0"/>
+        <w:rPr>
+          <w:rFonts w:ascii="Aptos" w:hAnsi="Aptos" w:eastAsia="Aptos" w:cs="Aptos"/>
+          <w:noProof w:val="0"/>
+          <w:sz w:val="24"/>
+          <w:szCs w:val="24"/>
+          <w:lang w:val="es-ES"/>
+        </w:rPr>
+      </w:pPr>
+    </w:p>
+    <w:p>
+      <w:pPr>
+        <w:pStyle w:val="Heading3"/>
+      </w:pPr>
+      <w:r>
+        <w:rPr>
+          <w:noProof w:val="0"/>
+          <w:lang w:val="es-ES"/>
+        </w:rPr>
+        <w:t>4. Gestión avanzada de roles y plantillas oficiales</w:t>
+      </w:r>
+      <w:r>
+        <w:rPr>
+          <w:noProof w:val="0"/>
+          <w:lang w:val="es-ES"/>
+        </w:rPr>
+        <w:t xml:space="preserve"> </w:t>
+      </w:r>
+    </w:p>
+    <w:p>
+      <w:pPr>
+        <w:spacing w:before="240" w:beforeAutospacing="off" w:after="240" w:afterAutospacing="off"/>
+      </w:pPr>
+      <w:r>
+        <w:rPr>
+          <w:rFonts w:ascii="Aptos" w:hAnsi="Aptos" w:eastAsia="Aptos" w:cs="Aptos"/>
+          <w:noProof w:val="0"/>
+          <w:sz w:val="24"/>
+          <w:szCs w:val="24"/>
+          <w:lang w:val="es-ES"/>
+        </w:rPr>
+        <w:t>He establecido una distinción clara entre el usuario estándar y el administrador (</w:t>
+      </w:r>
+      <w:r>
+        <w:rPr>
+          <w:rFonts w:ascii="Consolas" w:hAnsi="Consolas" w:eastAsia="Consolas" w:cs="Consolas"/>
+          <w:noProof w:val="0"/>
+          <w:sz w:val="24"/>
+          <w:szCs w:val="24"/>
+          <w:lang w:val="es-ES"/>
+        </w:rPr>
+        <w:t>admin</w:t>
+      </w:r>
+      <w:r>
+        <w:rPr>
+          <w:rFonts w:ascii="Aptos" w:hAnsi="Aptos" w:eastAsia="Aptos" w:cs="Aptos"/>
+          <w:noProof w:val="0"/>
+          <w:sz w:val="24"/>
+          <w:szCs w:val="24"/>
+          <w:lang w:val="es-ES"/>
+        </w:rPr>
+        <w:t>).</w:t>
+      </w:r>
+    </w:p>
+    <w:p>
+      <w:pPr>
+        <w:pStyle w:val="ListParagraph"/>
+        <w:numPr>
+          <w:ilvl w:val="0"/>
+          <w:numId w:val="13"/>
+        </w:numPr>
+        <w:spacing w:before="240" w:beforeAutospacing="off" w:after="240" w:afterAutospacing="off"/>
+        <w:rPr>
+          <w:rFonts w:ascii="Aptos" w:hAnsi="Aptos" w:eastAsia="Aptos" w:cs="Aptos"/>
+          <w:noProof w:val="0"/>
+          <w:sz w:val="24"/>
+          <w:szCs w:val="24"/>
+          <w:lang w:val="es-ES"/>
+        </w:rPr>
+      </w:pPr>
+      <w:r>
+        <w:rPr>
+          <w:rFonts w:ascii="Aptos" w:hAnsi="Aptos" w:eastAsia="Aptos" w:cs="Aptos"/>
+          <w:noProof w:val="0"/>
+          <w:sz w:val="24"/>
+          <w:szCs w:val="24"/>
+          <w:lang w:val="es-ES"/>
+        </w:rPr>
+        <w:t xml:space="preserve">He creado un </w:t>
+      </w:r>
+      <w:r>
+        <w:rPr>
+          <w:rFonts w:ascii="Aptos" w:hAnsi="Aptos" w:eastAsia="Aptos" w:cs="Aptos"/>
+          <w:b w:val="1"/>
+          <w:bCs w:val="1"/>
+          <w:noProof w:val="0"/>
+          <w:sz w:val="24"/>
+          <w:szCs w:val="24"/>
+          <w:lang w:val="es-ES"/>
+        </w:rPr>
+        <w:t>Panel de Administración</w:t>
+      </w:r>
+      <w:r>
+        <w:rPr>
+          <w:rFonts w:ascii="Aptos" w:hAnsi="Aptos" w:eastAsia="Aptos" w:cs="Aptos"/>
+          <w:noProof w:val="0"/>
+          <w:sz w:val="24"/>
+          <w:szCs w:val="24"/>
+          <w:lang w:val="es-ES"/>
+        </w:rPr>
+        <w:t xml:space="preserve"> exclusivo donde puedo monitorizar estadísticas globales (total de usuarios, categorías y artículos).</w:t>
+      </w:r>
+    </w:p>
+    <w:p>
+      <w:pPr>
+        <w:pStyle w:val="ListParagraph"/>
+        <w:numPr>
+          <w:ilvl w:val="0"/>
+          <w:numId w:val="13"/>
+        </w:numPr>
+        <w:spacing w:before="240" w:beforeAutospacing="off" w:after="240" w:afterAutospacing="off"/>
+        <w:rPr>
+          <w:rFonts w:ascii="Aptos" w:hAnsi="Aptos" w:eastAsia="Aptos" w:cs="Aptos"/>
+          <w:noProof w:val="0"/>
+          <w:sz w:val="24"/>
+          <w:szCs w:val="24"/>
+          <w:lang w:val="es-ES"/>
+        </w:rPr>
+      </w:pPr>
+      <w:r>
+        <w:rPr>
+          <w:rFonts w:ascii="Aptos" w:hAnsi="Aptos" w:eastAsia="Aptos" w:cs="Aptos"/>
+          <w:noProof w:val="0"/>
+          <w:sz w:val="24"/>
+          <w:szCs w:val="24"/>
+          <w:lang w:val="es-ES"/>
+        </w:rPr>
+        <w:t xml:space="preserve">He implementado un sistema de </w:t>
+      </w:r>
+      <w:r>
+        <w:rPr>
+          <w:rFonts w:ascii="Aptos" w:hAnsi="Aptos" w:eastAsia="Aptos" w:cs="Aptos"/>
+          <w:b w:val="1"/>
+          <w:bCs w:val="1"/>
+          <w:noProof w:val="0"/>
+          <w:sz w:val="24"/>
+          <w:szCs w:val="24"/>
+          <w:lang w:val="es-ES"/>
+        </w:rPr>
+        <w:t>Plantillas Oficiales</w:t>
+      </w:r>
+      <w:r>
+        <w:rPr>
+          <w:rFonts w:ascii="Aptos" w:hAnsi="Aptos" w:eastAsia="Aptos" w:cs="Aptos"/>
+          <w:noProof w:val="0"/>
+          <w:sz w:val="24"/>
+          <w:szCs w:val="24"/>
+          <w:lang w:val="es-ES"/>
+        </w:rPr>
+        <w:t>. Como administrador, he creado categorías "maestras" que sirven de base para el resto de usuarios.</w:t>
+      </w:r>
+    </w:p>
+    <w:p>
+      <w:pPr>
+        <w:pStyle w:val="Heading3"/>
+      </w:pPr>
+      <w:r>
+        <w:rPr>
+          <w:noProof w:val="0"/>
+          <w:lang w:val="es-ES"/>
+        </w:rPr>
+        <w:t>5. Rediseño del flujo de creación</w:t>
+      </w:r>
+      <w:r>
+        <w:rPr>
+          <w:noProof w:val="0"/>
+          <w:lang w:val="es-ES"/>
+        </w:rPr>
+        <w:t xml:space="preserve"> </w:t>
+      </w:r>
+    </w:p>
+    <w:p>
+      <w:pPr>
+        <w:spacing w:before="240" w:beforeAutospacing="off" w:after="240" w:afterAutospacing="off"/>
+      </w:pPr>
+      <w:r>
+        <w:rPr>
+          <w:rFonts w:ascii="Aptos" w:hAnsi="Aptos" w:eastAsia="Aptos" w:cs="Aptos"/>
+          <w:noProof w:val="0"/>
+          <w:sz w:val="24"/>
+          <w:szCs w:val="24"/>
+          <w:lang w:val="es-ES"/>
+        </w:rPr>
+        <w:t xml:space="preserve">He modificado el proceso de creación de colecciones. Ahora, cuando un usuario quiere añadir una categoría, puede elegir entre usar una de mis plantillas oficiales o crear una personalizada desde cero. Además, he ajustado el filtrado del </w:t>
+      </w:r>
+      <w:r>
+        <w:rPr>
+          <w:rFonts w:ascii="Aptos" w:hAnsi="Aptos" w:eastAsia="Aptos" w:cs="Aptos"/>
+          <w:noProof w:val="0"/>
+          <w:sz w:val="24"/>
+          <w:szCs w:val="24"/>
+          <w:lang w:val="es-ES"/>
+        </w:rPr>
+        <w:t>dashboard</w:t>
+      </w:r>
+      <w:r>
+        <w:rPr>
+          <w:rFonts w:ascii="Aptos" w:hAnsi="Aptos" w:eastAsia="Aptos" w:cs="Aptos"/>
+          <w:noProof w:val="0"/>
+          <w:sz w:val="24"/>
+          <w:szCs w:val="24"/>
+          <w:lang w:val="es-ES"/>
+        </w:rPr>
+        <w:t xml:space="preserve"> principal para que las plantillas del sistema no se mezclen con las colecciones privadas, manteniendo la interfaz limpia y enfocada en lo que realmente importa al coleccionista.</w:t>
+      </w:r>
+    </w:p>
+    <w:p>
+      <w:pPr>
+        <w:spacing w:before="240" w:beforeAutospacing="off" w:after="240" w:afterAutospacing="off"/>
+      </w:pPr>
+      <w:r>
+        <w:rPr>
+          <w:rFonts w:ascii="Aptos" w:hAnsi="Aptos" w:eastAsia="Aptos" w:cs="Aptos"/>
+          <w:noProof w:val="0"/>
+          <w:sz w:val="24"/>
+          <w:szCs w:val="24"/>
+          <w:lang w:val="es-ES"/>
+        </w:rPr>
+        <w:t>Con estos cambios, he conseguido que la aplicación pase de ser un simple CRUD a una plataforma de coleccionismo inteligente y organizada. Todo el sistema de gestión de datos está funcionando correctamente y la navegación es fluida.</w:t>
       </w:r>
     </w:p>
     <w:p>
@@ -3702,6 +4325,230 @@
 
 <file path=word/numbering.xml><?xml version="1.0" encoding="utf-8"?>
 <w:numbering xmlns:w="http://schemas.openxmlformats.org/wordprocessingml/2006/main">
+  <w:abstractNum xmlns:w="http://schemas.openxmlformats.org/wordprocessingml/2006/main" w:abstractNumId="13">
+    <w:nsid w:val="25769d33"/>
+    <w:multiLevelType xmlns:w="http://schemas.openxmlformats.org/wordprocessingml/2006/main" w:val="hybridMultilevel"/>
+    <w:lvl xmlns:w="http://schemas.openxmlformats.org/wordprocessingml/2006/main" w:ilvl="0">
+      <w:start w:val="1"/>
+      <w:numFmt w:val="bullet"/>
+      <w:lvlText w:val=""/>
+      <w:lvlJc w:val="left"/>
+      <w:pPr>
+        <w:ind w:left="720" w:hanging="360"/>
+      </w:pPr>
+      <w:rPr>
+        <w:rFonts w:hint="default" w:ascii="Symbol" w:hAnsi="Symbol"/>
+      </w:rPr>
+    </w:lvl>
+    <w:lvl xmlns:w="http://schemas.openxmlformats.org/wordprocessingml/2006/main" w:ilvl="1">
+      <w:start w:val="1"/>
+      <w:numFmt w:val="bullet"/>
+      <w:lvlText w:val="o"/>
+      <w:lvlJc w:val="left"/>
+      <w:pPr>
+        <w:ind w:left="1440" w:hanging="360"/>
+      </w:pPr>
+      <w:rPr>
+        <w:rFonts w:hint="default" w:ascii="Courier New" w:hAnsi="Courier New"/>
+      </w:rPr>
+    </w:lvl>
+    <w:lvl xmlns:w="http://schemas.openxmlformats.org/wordprocessingml/2006/main" w:ilvl="2">
+      <w:start w:val="1"/>
+      <w:numFmt w:val="bullet"/>
+      <w:lvlText w:val=""/>
+      <w:lvlJc w:val="left"/>
+      <w:pPr>
+        <w:ind w:left="2160" w:hanging="360"/>
+      </w:pPr>
+      <w:rPr>
+        <w:rFonts w:hint="default" w:ascii="Wingdings" w:hAnsi="Wingdings"/>
+      </w:rPr>
+    </w:lvl>
+    <w:lvl xmlns:w="http://schemas.openxmlformats.org/wordprocessingml/2006/main" w:ilvl="3">
+      <w:start w:val="1"/>
+      <w:numFmt w:val="bullet"/>
+      <w:lvlText w:val=""/>
+      <w:lvlJc w:val="left"/>
+      <w:pPr>
+        <w:ind w:left="2880" w:hanging="360"/>
+      </w:pPr>
+      <w:rPr>
+        <w:rFonts w:hint="default" w:ascii="Symbol" w:hAnsi="Symbol"/>
+      </w:rPr>
+    </w:lvl>
+    <w:lvl xmlns:w="http://schemas.openxmlformats.org/wordprocessingml/2006/main" w:ilvl="4">
+      <w:start w:val="1"/>
+      <w:numFmt w:val="bullet"/>
+      <w:lvlText w:val="o"/>
+      <w:lvlJc w:val="left"/>
+      <w:pPr>
+        <w:ind w:left="3600" w:hanging="360"/>
+      </w:pPr>
+      <w:rPr>
+        <w:rFonts w:hint="default" w:ascii="Courier New" w:hAnsi="Courier New"/>
+      </w:rPr>
+    </w:lvl>
+    <w:lvl xmlns:w="http://schemas.openxmlformats.org/wordprocessingml/2006/main" w:ilvl="5">
+      <w:start w:val="1"/>
+      <w:numFmt w:val="bullet"/>
+      <w:lvlText w:val=""/>
+      <w:lvlJc w:val="left"/>
+      <w:pPr>
+        <w:ind w:left="4320" w:hanging="360"/>
+      </w:pPr>
+      <w:rPr>
+        <w:rFonts w:hint="default" w:ascii="Wingdings" w:hAnsi="Wingdings"/>
+      </w:rPr>
+    </w:lvl>
+    <w:lvl xmlns:w="http://schemas.openxmlformats.org/wordprocessingml/2006/main" w:ilvl="6">
+      <w:start w:val="1"/>
+      <w:numFmt w:val="bullet"/>
+      <w:lvlText w:val=""/>
+      <w:lvlJc w:val="left"/>
+      <w:pPr>
+        <w:ind w:left="5040" w:hanging="360"/>
+      </w:pPr>
+      <w:rPr>
+        <w:rFonts w:hint="default" w:ascii="Symbol" w:hAnsi="Symbol"/>
+      </w:rPr>
+    </w:lvl>
+    <w:lvl xmlns:w="http://schemas.openxmlformats.org/wordprocessingml/2006/main" w:ilvl="7">
+      <w:start w:val="1"/>
+      <w:numFmt w:val="bullet"/>
+      <w:lvlText w:val="o"/>
+      <w:lvlJc w:val="left"/>
+      <w:pPr>
+        <w:ind w:left="5760" w:hanging="360"/>
+      </w:pPr>
+      <w:rPr>
+        <w:rFonts w:hint="default" w:ascii="Courier New" w:hAnsi="Courier New"/>
+      </w:rPr>
+    </w:lvl>
+    <w:lvl xmlns:w="http://schemas.openxmlformats.org/wordprocessingml/2006/main" w:ilvl="8">
+      <w:start w:val="1"/>
+      <w:numFmt w:val="bullet"/>
+      <w:lvlText w:val=""/>
+      <w:lvlJc w:val="left"/>
+      <w:pPr>
+        <w:ind w:left="6480" w:hanging="360"/>
+      </w:pPr>
+      <w:rPr>
+        <w:rFonts w:hint="default" w:ascii="Wingdings" w:hAnsi="Wingdings"/>
+      </w:rPr>
+    </w:lvl>
+  </w:abstractNum>
+  <w:abstractNum xmlns:w="http://schemas.openxmlformats.org/wordprocessingml/2006/main" w:abstractNumId="12">
+    <w:nsid w:val="6bdf121f"/>
+    <w:multiLevelType xmlns:w="http://schemas.openxmlformats.org/wordprocessingml/2006/main" w:val="hybridMultilevel"/>
+    <w:lvl xmlns:w="http://schemas.openxmlformats.org/wordprocessingml/2006/main" w:ilvl="0">
+      <w:start w:val="1"/>
+      <w:numFmt w:val="bullet"/>
+      <w:lvlText w:val=""/>
+      <w:lvlJc w:val="left"/>
+      <w:pPr>
+        <w:ind w:left="720" w:hanging="360"/>
+      </w:pPr>
+      <w:rPr>
+        <w:rFonts w:hint="default" w:ascii="Symbol" w:hAnsi="Symbol"/>
+      </w:rPr>
+    </w:lvl>
+    <w:lvl xmlns:w="http://schemas.openxmlformats.org/wordprocessingml/2006/main" w:ilvl="1">
+      <w:start w:val="1"/>
+      <w:numFmt w:val="bullet"/>
+      <w:lvlText w:val="o"/>
+      <w:lvlJc w:val="left"/>
+      <w:pPr>
+        <w:ind w:left="1440" w:hanging="360"/>
+      </w:pPr>
+      <w:rPr>
+        <w:rFonts w:hint="default" w:ascii="Courier New" w:hAnsi="Courier New"/>
+      </w:rPr>
+    </w:lvl>
+    <w:lvl xmlns:w="http://schemas.openxmlformats.org/wordprocessingml/2006/main" w:ilvl="2">
+      <w:start w:val="1"/>
+      <w:numFmt w:val="bullet"/>
+      <w:lvlText w:val=""/>
+      <w:lvlJc w:val="left"/>
+      <w:pPr>
+        <w:ind w:left="2160" w:hanging="360"/>
+      </w:pPr>
+      <w:rPr>
+        <w:rFonts w:hint="default" w:ascii="Wingdings" w:hAnsi="Wingdings"/>
+      </w:rPr>
+    </w:lvl>
+    <w:lvl xmlns:w="http://schemas.openxmlformats.org/wordprocessingml/2006/main" w:ilvl="3">
+      <w:start w:val="1"/>
+      <w:numFmt w:val="bullet"/>
+      <w:lvlText w:val=""/>
+      <w:lvlJc w:val="left"/>
+      <w:pPr>
+        <w:ind w:left="2880" w:hanging="360"/>
+      </w:pPr>
+      <w:rPr>
+        <w:rFonts w:hint="default" w:ascii="Symbol" w:hAnsi="Symbol"/>
+      </w:rPr>
+    </w:lvl>
+    <w:lvl xmlns:w="http://schemas.openxmlformats.org/wordprocessingml/2006/main" w:ilvl="4">
+      <w:start w:val="1"/>
+      <w:numFmt w:val="bullet"/>
+      <w:lvlText w:val="o"/>
+      <w:lvlJc w:val="left"/>
+      <w:pPr>
+        <w:ind w:left="3600" w:hanging="360"/>
+      </w:pPr>
+      <w:rPr>
+        <w:rFonts w:hint="default" w:ascii="Courier New" w:hAnsi="Courier New"/>
+      </w:rPr>
+    </w:lvl>
+    <w:lvl xmlns:w="http://schemas.openxmlformats.org/wordprocessingml/2006/main" w:ilvl="5">
+      <w:start w:val="1"/>
+      <w:numFmt w:val="bullet"/>
+      <w:lvlText w:val=""/>
+      <w:lvlJc w:val="left"/>
+      <w:pPr>
+        <w:ind w:left="4320" w:hanging="360"/>
+      </w:pPr>
+      <w:rPr>
+        <w:rFonts w:hint="default" w:ascii="Wingdings" w:hAnsi="Wingdings"/>
+      </w:rPr>
+    </w:lvl>
+    <w:lvl xmlns:w="http://schemas.openxmlformats.org/wordprocessingml/2006/main" w:ilvl="6">
+      <w:start w:val="1"/>
+      <w:numFmt w:val="bullet"/>
+      <w:lvlText w:val=""/>
+      <w:lvlJc w:val="left"/>
+      <w:pPr>
+        <w:ind w:left="5040" w:hanging="360"/>
+      </w:pPr>
+      <w:rPr>
+        <w:rFonts w:hint="default" w:ascii="Symbol" w:hAnsi="Symbol"/>
+      </w:rPr>
+    </w:lvl>
+    <w:lvl xmlns:w="http://schemas.openxmlformats.org/wordprocessingml/2006/main" w:ilvl="7">
+      <w:start w:val="1"/>
+      <w:numFmt w:val="bullet"/>
+      <w:lvlText w:val="o"/>
+      <w:lvlJc w:val="left"/>
+      <w:pPr>
+        <w:ind w:left="5760" w:hanging="360"/>
+      </w:pPr>
+      <w:rPr>
+        <w:rFonts w:hint="default" w:ascii="Courier New" w:hAnsi="Courier New"/>
+      </w:rPr>
+    </w:lvl>
+    <w:lvl xmlns:w="http://schemas.openxmlformats.org/wordprocessingml/2006/main" w:ilvl="8">
+      <w:start w:val="1"/>
+      <w:numFmt w:val="bullet"/>
+      <w:lvlText w:val=""/>
+      <w:lvlJc w:val="left"/>
+      <w:pPr>
+        <w:ind w:left="6480" w:hanging="360"/>
+      </w:pPr>
+      <w:rPr>
+        <w:rFonts w:hint="default" w:ascii="Wingdings" w:hAnsi="Wingdings"/>
+      </w:rPr>
+    </w:lvl>
+  </w:abstractNum>
   <w:abstractNum xmlns:w="http://schemas.openxmlformats.org/wordprocessingml/2006/main" w:abstractNumId="11">
     <w:nsid w:val="2fc07640"/>
     <w:multiLevelType xmlns:w="http://schemas.openxmlformats.org/wordprocessingml/2006/main" w:val="hybridMultilevel"/>
@@ -4934,6 +5781,12 @@
       </w:rPr>
     </w:lvl>
   </w:abstractNum>
+  <w:num w:numId="13">
+    <w:abstractNumId w:val="13"/>
+  </w:num>
+  <w:num w:numId="12">
+    <w:abstractNumId w:val="12"/>
+  </w:num>
   <w:num w:numId="11">
     <w:abstractNumId w:val="11"/>
   </w:num>

</xml_diff>

<commit_message>
Corregido hito 4 mas documentacion
</commit_message>
<xml_diff>
--- a/Documentacion/Bitacora_Joaquin.docx
+++ b/Documentacion/Bitacora_Joaquin.docx
@@ -4131,6 +4131,664 @@
           <w:lang w:val="es-ES"/>
         </w:rPr>
         <w:t>Con estos cambios, he conseguido que la aplicación pase de ser un simple CRUD a una plataforma de coleccionismo inteligente y organizada. Todo el sistema de gestión de datos está funcionando correctamente y la navegación es fluida.</w:t>
+      </w:r>
+    </w:p>
+    <w:p>
+      <w:pPr>
+        <w:pStyle w:val="Normal"/>
+      </w:pPr>
+    </w:p>
+    <w:p>
+      <w:pPr>
+        <w:pStyle w:val="Normal"/>
+      </w:pPr>
+    </w:p>
+    <w:p>
+      <w:r>
+        <w:br w:type="page"/>
+      </w:r>
+    </w:p>
+    <w:p>
+      <w:pPr>
+        <w:spacing w:before="240" w:beforeAutospacing="off" w:after="240" w:afterAutospacing="off"/>
+      </w:pPr>
+      <w:r>
+        <w:rPr>
+          <w:rFonts w:ascii="Aptos" w:hAnsi="Aptos" w:eastAsia="Aptos" w:cs="Aptos"/>
+          <w:b w:val="1"/>
+          <w:bCs w:val="1"/>
+          <w:noProof w:val="0"/>
+          <w:sz w:val="24"/>
+          <w:szCs w:val="24"/>
+          <w:lang w:val="es-ES"/>
+        </w:rPr>
+        <w:t xml:space="preserve">Fecha: </w:t>
+      </w:r>
+      <w:r>
+        <w:rPr>
+          <w:rFonts w:ascii="Aptos" w:hAnsi="Aptos" w:eastAsia="Aptos" w:cs="Aptos"/>
+          <w:b w:val="0"/>
+          <w:bCs w:val="0"/>
+          <w:noProof w:val="0"/>
+          <w:sz w:val="24"/>
+          <w:szCs w:val="24"/>
+          <w:lang w:val="es-ES"/>
+        </w:rPr>
+        <w:t>14 de abril de 2026</w:t>
+      </w:r>
+    </w:p>
+    <w:p>
+      <w:pPr>
+        <w:spacing w:before="240" w:beforeAutospacing="off" w:after="240" w:afterAutospacing="off"/>
+      </w:pPr>
+      <w:r>
+        <w:rPr>
+          <w:rFonts w:ascii="Aptos" w:hAnsi="Aptos" w:eastAsia="Aptos" w:cs="Aptos"/>
+          <w:noProof w:val="0"/>
+          <w:sz w:val="24"/>
+          <w:szCs w:val="24"/>
+          <w:lang w:val="es-ES"/>
+        </w:rPr>
+        <w:t>Durante la sesión de hoy, he pausado el desarrollo de nuevas funcionalidades para abordar las correcciones de seguridad indicadas en la última revisión del proyecto. El objetivo principal ha sido establecer un control de acceso real en el lado del servidor y proteger la información sensible.</w:t>
+      </w:r>
+    </w:p>
+    <w:p>
+      <w:pPr>
+        <w:spacing w:before="240" w:beforeAutospacing="off" w:after="240" w:afterAutospacing="off"/>
+      </w:pPr>
+      <w:r>
+        <w:rPr>
+          <w:rFonts w:ascii="Aptos" w:hAnsi="Aptos" w:eastAsia="Aptos" w:cs="Aptos"/>
+          <w:noProof w:val="0"/>
+          <w:sz w:val="24"/>
+          <w:szCs w:val="24"/>
+          <w:lang w:val="es-ES"/>
+        </w:rPr>
+        <w:t>Las tareas realizadas se han dividido en los siguientes puntos:</w:t>
+      </w:r>
+    </w:p>
+    <w:p>
+      <w:pPr>
+        <w:pStyle w:val="Heading3"/>
+      </w:pPr>
+      <w:r>
+        <w:rPr>
+          <w:noProof w:val="0"/>
+          <w:lang w:val="es-ES"/>
+        </w:rPr>
+        <w:t>1. Gestión segura de credenciales</w:t>
+      </w:r>
+      <w:r>
+        <w:rPr>
+          <w:noProof w:val="0"/>
+          <w:lang w:val="es-ES"/>
+        </w:rPr>
+        <w:t xml:space="preserve"> </w:t>
+      </w:r>
+    </w:p>
+    <w:p>
+      <w:pPr>
+        <w:spacing w:before="240" w:beforeAutospacing="off" w:after="240" w:afterAutospacing="off"/>
+      </w:pPr>
+      <w:r>
+        <w:rPr>
+          <w:rFonts w:ascii="Aptos" w:hAnsi="Aptos" w:eastAsia="Aptos" w:cs="Aptos"/>
+          <w:noProof w:val="0"/>
+          <w:sz w:val="24"/>
+          <w:szCs w:val="24"/>
+          <w:lang w:val="es-ES"/>
+        </w:rPr>
+        <w:t xml:space="preserve">He eliminado las credenciales de la base de datos en texto plano del código fuente. Se ha modificado el archivo </w:t>
+      </w:r>
+      <w:r>
+        <w:rPr>
+          <w:rFonts w:ascii="Consolas" w:hAnsi="Consolas" w:eastAsia="Consolas" w:cs="Consolas"/>
+          <w:noProof w:val="0"/>
+          <w:sz w:val="24"/>
+          <w:szCs w:val="24"/>
+          <w:lang w:val="es-ES"/>
+        </w:rPr>
+        <w:t>application.properties</w:t>
+      </w:r>
+      <w:r>
+        <w:rPr>
+          <w:rFonts w:ascii="Aptos" w:hAnsi="Aptos" w:eastAsia="Aptos" w:cs="Aptos"/>
+          <w:noProof w:val="0"/>
+          <w:sz w:val="24"/>
+          <w:szCs w:val="24"/>
+          <w:lang w:val="es-ES"/>
+        </w:rPr>
+        <w:t xml:space="preserve"> para que la conexión a la base de datos se realice mediante variables de entorno (</w:t>
+      </w:r>
+      <w:r>
+        <w:rPr>
+          <w:rFonts w:ascii="Consolas" w:hAnsi="Consolas" w:eastAsia="Consolas" w:cs="Consolas"/>
+          <w:noProof w:val="0"/>
+          <w:sz w:val="24"/>
+          <w:szCs w:val="24"/>
+          <w:lang w:val="es-ES"/>
+        </w:rPr>
+        <w:t>${DB_USER}</w:t>
+      </w:r>
+      <w:r>
+        <w:rPr>
+          <w:rFonts w:ascii="Aptos" w:hAnsi="Aptos" w:eastAsia="Aptos" w:cs="Aptos"/>
+          <w:noProof w:val="0"/>
+          <w:sz w:val="24"/>
+          <w:szCs w:val="24"/>
+          <w:lang w:val="es-ES"/>
+        </w:rPr>
+        <w:t xml:space="preserve">, </w:t>
+      </w:r>
+      <w:r>
+        <w:rPr>
+          <w:rFonts w:ascii="Consolas" w:hAnsi="Consolas" w:eastAsia="Consolas" w:cs="Consolas"/>
+          <w:noProof w:val="0"/>
+          <w:sz w:val="24"/>
+          <w:szCs w:val="24"/>
+          <w:lang w:val="es-ES"/>
+        </w:rPr>
+        <w:t>${DB_PASSWORD}</w:t>
+      </w:r>
+      <w:r>
+        <w:rPr>
+          <w:rFonts w:ascii="Aptos" w:hAnsi="Aptos" w:eastAsia="Aptos" w:cs="Aptos"/>
+          <w:noProof w:val="0"/>
+          <w:sz w:val="24"/>
+          <w:szCs w:val="24"/>
+          <w:lang w:val="es-ES"/>
+        </w:rPr>
+        <w:t xml:space="preserve">). Para facilitar el despliegue a terceros y mantener la documentación del repositorio, he creado el archivo </w:t>
+      </w:r>
+      <w:r>
+        <w:rPr>
+          <w:rFonts w:ascii="Consolas" w:hAnsi="Consolas" w:eastAsia="Consolas" w:cs="Consolas"/>
+          <w:noProof w:val="0"/>
+          <w:sz w:val="24"/>
+          <w:szCs w:val="24"/>
+          <w:lang w:val="es-ES"/>
+        </w:rPr>
+        <w:t>application.properties.example</w:t>
+      </w:r>
+      <w:r>
+        <w:rPr>
+          <w:rFonts w:ascii="Aptos" w:hAnsi="Aptos" w:eastAsia="Aptos" w:cs="Aptos"/>
+          <w:noProof w:val="0"/>
+          <w:sz w:val="24"/>
+          <w:szCs w:val="24"/>
+          <w:lang w:val="es-ES"/>
+        </w:rPr>
+        <w:t xml:space="preserve"> a modo de plantilla genérica.</w:t>
+      </w:r>
+    </w:p>
+    <w:p>
+      <w:pPr>
+        <w:pStyle w:val="Heading3"/>
+      </w:pPr>
+      <w:r>
+        <w:rPr>
+          <w:noProof w:val="0"/>
+          <w:lang w:val="es-ES"/>
+        </w:rPr>
+        <w:t>2. Autenticación y validación mediante JWT</w:t>
+      </w:r>
+      <w:r>
+        <w:rPr>
+          <w:noProof w:val="0"/>
+          <w:lang w:val="es-ES"/>
+        </w:rPr>
+        <w:t xml:space="preserve"> </w:t>
+      </w:r>
+    </w:p>
+    <w:p>
+      <w:pPr>
+        <w:spacing w:before="240" w:beforeAutospacing="off" w:after="240" w:afterAutospacing="off"/>
+      </w:pPr>
+      <w:r>
+        <w:rPr>
+          <w:rFonts w:ascii="Aptos" w:hAnsi="Aptos" w:eastAsia="Aptos" w:cs="Aptos"/>
+          <w:noProof w:val="0"/>
+          <w:sz w:val="24"/>
+          <w:szCs w:val="24"/>
+          <w:lang w:val="es-ES"/>
+        </w:rPr>
+        <w:t xml:space="preserve">Para dejar de depender exclusivamente de la lógica del </w:t>
+      </w:r>
+      <w:r>
+        <w:rPr>
+          <w:rFonts w:ascii="Aptos" w:hAnsi="Aptos" w:eastAsia="Aptos" w:cs="Aptos"/>
+          <w:noProof w:val="0"/>
+          <w:sz w:val="24"/>
+          <w:szCs w:val="24"/>
+          <w:lang w:val="es-ES"/>
+        </w:rPr>
+        <w:t>frontend</w:t>
+      </w:r>
+      <w:r>
+        <w:rPr>
+          <w:rFonts w:ascii="Aptos" w:hAnsi="Aptos" w:eastAsia="Aptos" w:cs="Aptos"/>
+          <w:noProof w:val="0"/>
+          <w:sz w:val="24"/>
+          <w:szCs w:val="24"/>
+          <w:lang w:val="es-ES"/>
+        </w:rPr>
+        <w:t xml:space="preserve"> en el control de acceso, he integrado Spring Security en el </w:t>
+      </w:r>
+      <w:r>
+        <w:rPr>
+          <w:rFonts w:ascii="Aptos" w:hAnsi="Aptos" w:eastAsia="Aptos" w:cs="Aptos"/>
+          <w:noProof w:val="0"/>
+          <w:sz w:val="24"/>
+          <w:szCs w:val="24"/>
+          <w:lang w:val="es-ES"/>
+        </w:rPr>
+        <w:t>backend</w:t>
+      </w:r>
+      <w:r>
+        <w:rPr>
+          <w:rFonts w:ascii="Aptos" w:hAnsi="Aptos" w:eastAsia="Aptos" w:cs="Aptos"/>
+          <w:noProof w:val="0"/>
+          <w:sz w:val="24"/>
+          <w:szCs w:val="24"/>
+          <w:lang w:val="es-ES"/>
+        </w:rPr>
+        <w:t xml:space="preserve"> utilizando JSON Web Tokens (JWT). Se ha desarrollado una utilidad para generar los tokens en el momento del </w:t>
+      </w:r>
+      <w:r>
+        <w:rPr>
+          <w:rFonts w:ascii="Aptos" w:hAnsi="Aptos" w:eastAsia="Aptos" w:cs="Aptos"/>
+          <w:noProof w:val="0"/>
+          <w:sz w:val="24"/>
+          <w:szCs w:val="24"/>
+          <w:lang w:val="es-ES"/>
+        </w:rPr>
+        <w:t>login</w:t>
+      </w:r>
+      <w:r>
+        <w:rPr>
+          <w:rFonts w:ascii="Aptos" w:hAnsi="Aptos" w:eastAsia="Aptos" w:cs="Aptos"/>
+          <w:noProof w:val="0"/>
+          <w:sz w:val="24"/>
+          <w:szCs w:val="24"/>
+          <w:lang w:val="es-ES"/>
+        </w:rPr>
+        <w:t xml:space="preserve"> y un filtro (</w:t>
+      </w:r>
+      <w:r>
+        <w:rPr>
+          <w:rFonts w:ascii="Consolas" w:hAnsi="Consolas" w:eastAsia="Consolas" w:cs="Consolas"/>
+          <w:noProof w:val="0"/>
+          <w:sz w:val="24"/>
+          <w:szCs w:val="24"/>
+          <w:lang w:val="es-ES"/>
+        </w:rPr>
+        <w:t>JwtFilter</w:t>
+      </w:r>
+      <w:r>
+        <w:rPr>
+          <w:rFonts w:ascii="Aptos" w:hAnsi="Aptos" w:eastAsia="Aptos" w:cs="Aptos"/>
+          <w:noProof w:val="0"/>
+          <w:sz w:val="24"/>
+          <w:szCs w:val="24"/>
+          <w:lang w:val="es-ES"/>
+        </w:rPr>
+        <w:t>) que intercepta todas las peticiones entrantes para validar la firma y caducidad del token antes de permitir el acceso a los controladores.</w:t>
+      </w:r>
+    </w:p>
+    <w:p>
+      <w:pPr>
+        <w:pStyle w:val="Heading3"/>
+      </w:pPr>
+      <w:r>
+        <w:rPr>
+          <w:noProof w:val="0"/>
+          <w:lang w:val="es-ES"/>
+        </w:rPr>
+        <w:t>3. Control de acceso basado en roles (RBAC)</w:t>
+      </w:r>
+      <w:r>
+        <w:rPr>
+          <w:noProof w:val="0"/>
+          <w:lang w:val="es-ES"/>
+        </w:rPr>
+        <w:t xml:space="preserve"> </w:t>
+      </w:r>
+    </w:p>
+    <w:p>
+      <w:pPr>
+        <w:spacing w:before="240" w:beforeAutospacing="off" w:after="240" w:afterAutospacing="off"/>
+      </w:pPr>
+      <w:r>
+        <w:rPr>
+          <w:rFonts w:ascii="Aptos" w:hAnsi="Aptos" w:eastAsia="Aptos" w:cs="Aptos"/>
+          <w:noProof w:val="0"/>
+          <w:sz w:val="24"/>
+          <w:szCs w:val="24"/>
+          <w:lang w:val="es-ES"/>
+        </w:rPr>
+        <w:t xml:space="preserve">En la clase de configuración de seguridad, se ha aplicado una política restrictiva. Únicamente los </w:t>
+      </w:r>
+      <w:r>
+        <w:rPr>
+          <w:rFonts w:ascii="Aptos" w:hAnsi="Aptos" w:eastAsia="Aptos" w:cs="Aptos"/>
+          <w:i w:val="1"/>
+          <w:iCs w:val="1"/>
+          <w:noProof w:val="0"/>
+          <w:sz w:val="24"/>
+          <w:szCs w:val="24"/>
+          <w:lang w:val="es-ES"/>
+        </w:rPr>
+        <w:t>endpoints</w:t>
+      </w:r>
+      <w:r>
+        <w:rPr>
+          <w:rFonts w:ascii="Aptos" w:hAnsi="Aptos" w:eastAsia="Aptos" w:cs="Aptos"/>
+          <w:noProof w:val="0"/>
+          <w:sz w:val="24"/>
+          <w:szCs w:val="24"/>
+          <w:lang w:val="es-ES"/>
+        </w:rPr>
+        <w:t xml:space="preserve"> de registro y </w:t>
+      </w:r>
+      <w:r>
+        <w:rPr>
+          <w:rFonts w:ascii="Aptos" w:hAnsi="Aptos" w:eastAsia="Aptos" w:cs="Aptos"/>
+          <w:noProof w:val="0"/>
+          <w:sz w:val="24"/>
+          <w:szCs w:val="24"/>
+          <w:lang w:val="es-ES"/>
+        </w:rPr>
+        <w:t>login</w:t>
+      </w:r>
+      <w:r>
+        <w:rPr>
+          <w:rFonts w:ascii="Aptos" w:hAnsi="Aptos" w:eastAsia="Aptos" w:cs="Aptos"/>
+          <w:noProof w:val="0"/>
+          <w:sz w:val="24"/>
+          <w:szCs w:val="24"/>
+          <w:lang w:val="es-ES"/>
+        </w:rPr>
+        <w:t xml:space="preserve"> permanecen públicos. El resto de la API requiere autenticación, y se ha añadido una capa extra para las rutas de administración (</w:t>
+      </w:r>
+      <w:r>
+        <w:rPr>
+          <w:rFonts w:ascii="Consolas" w:hAnsi="Consolas" w:eastAsia="Consolas" w:cs="Consolas"/>
+          <w:noProof w:val="0"/>
+          <w:sz w:val="24"/>
+          <w:szCs w:val="24"/>
+          <w:lang w:val="es-ES"/>
+        </w:rPr>
+        <w:t>/api/</w:t>
+      </w:r>
+      <w:r>
+        <w:rPr>
+          <w:rFonts w:ascii="Consolas" w:hAnsi="Consolas" w:eastAsia="Consolas" w:cs="Consolas"/>
+          <w:noProof w:val="0"/>
+          <w:sz w:val="24"/>
+          <w:szCs w:val="24"/>
+          <w:lang w:val="es-ES"/>
+        </w:rPr>
+        <w:t>admin</w:t>
+      </w:r>
+      <w:r>
+        <w:rPr>
+          <w:rFonts w:ascii="Consolas" w:hAnsi="Consolas" w:eastAsia="Consolas" w:cs="Consolas"/>
+          <w:noProof w:val="0"/>
+          <w:sz w:val="24"/>
+          <w:szCs w:val="24"/>
+          <w:lang w:val="es-ES"/>
+        </w:rPr>
+        <w:t>/**</w:t>
+      </w:r>
+      <w:r>
+        <w:rPr>
+          <w:rFonts w:ascii="Aptos" w:hAnsi="Aptos" w:eastAsia="Aptos" w:cs="Aptos"/>
+          <w:noProof w:val="0"/>
+          <w:sz w:val="24"/>
+          <w:szCs w:val="24"/>
+          <w:lang w:val="es-ES"/>
+        </w:rPr>
+        <w:t>), las cuales ahora devuelven un error 403 (</w:t>
+      </w:r>
+      <w:r>
+        <w:rPr>
+          <w:rFonts w:ascii="Aptos" w:hAnsi="Aptos" w:eastAsia="Aptos" w:cs="Aptos"/>
+          <w:noProof w:val="0"/>
+          <w:sz w:val="24"/>
+          <w:szCs w:val="24"/>
+          <w:lang w:val="es-ES"/>
+        </w:rPr>
+        <w:t>Forbidden</w:t>
+      </w:r>
+      <w:r>
+        <w:rPr>
+          <w:rFonts w:ascii="Aptos" w:hAnsi="Aptos" w:eastAsia="Aptos" w:cs="Aptos"/>
+          <w:noProof w:val="0"/>
+          <w:sz w:val="24"/>
+          <w:szCs w:val="24"/>
+          <w:lang w:val="es-ES"/>
+        </w:rPr>
+        <w:t>) si el token del usuario no contiene explícitamente el rol de administrador. Adicionalmente, se ha configurado la política CORS para permitir la recepción de cabeceras de autorización.</w:t>
+      </w:r>
+    </w:p>
+    <w:p>
+      <w:pPr>
+        <w:pStyle w:val="Heading3"/>
+      </w:pPr>
+      <w:r>
+        <w:rPr>
+          <w:noProof w:val="0"/>
+          <w:lang w:val="es-ES"/>
+        </w:rPr>
+        <w:t>4. Adaptación del cliente web (</w:t>
+      </w:r>
+      <w:r>
+        <w:rPr>
+          <w:noProof w:val="0"/>
+          <w:lang w:val="es-ES"/>
+        </w:rPr>
+        <w:t>React</w:t>
+      </w:r>
+      <w:r>
+        <w:rPr>
+          <w:noProof w:val="0"/>
+          <w:lang w:val="es-ES"/>
+        </w:rPr>
+        <w:t>)</w:t>
+      </w:r>
+      <w:r>
+        <w:rPr>
+          <w:noProof w:val="0"/>
+          <w:lang w:val="es-ES"/>
+        </w:rPr>
+        <w:t xml:space="preserve"> </w:t>
+      </w:r>
+    </w:p>
+    <w:p>
+      <w:pPr>
+        <w:spacing w:before="240" w:beforeAutospacing="off" w:after="240" w:afterAutospacing="off"/>
+      </w:pPr>
+      <w:r>
+        <w:rPr>
+          <w:rFonts w:ascii="Aptos" w:hAnsi="Aptos" w:eastAsia="Aptos" w:cs="Aptos"/>
+          <w:noProof w:val="0"/>
+          <w:sz w:val="24"/>
+          <w:szCs w:val="24"/>
+          <w:lang w:val="es-ES"/>
+        </w:rPr>
+        <w:t xml:space="preserve">Una vez asegurado el </w:t>
+      </w:r>
+      <w:r>
+        <w:rPr>
+          <w:rFonts w:ascii="Aptos" w:hAnsi="Aptos" w:eastAsia="Aptos" w:cs="Aptos"/>
+          <w:noProof w:val="0"/>
+          <w:sz w:val="24"/>
+          <w:szCs w:val="24"/>
+          <w:lang w:val="es-ES"/>
+        </w:rPr>
+        <w:t>backend</w:t>
+      </w:r>
+      <w:r>
+        <w:rPr>
+          <w:rFonts w:ascii="Aptos" w:hAnsi="Aptos" w:eastAsia="Aptos" w:cs="Aptos"/>
+          <w:noProof w:val="0"/>
+          <w:sz w:val="24"/>
+          <w:szCs w:val="24"/>
+          <w:lang w:val="es-ES"/>
+        </w:rPr>
+        <w:t xml:space="preserve">, he refactorizado las llamadas a la API en el </w:t>
+      </w:r>
+      <w:r>
+        <w:rPr>
+          <w:rFonts w:ascii="Aptos" w:hAnsi="Aptos" w:eastAsia="Aptos" w:cs="Aptos"/>
+          <w:noProof w:val="0"/>
+          <w:sz w:val="24"/>
+          <w:szCs w:val="24"/>
+          <w:lang w:val="es-ES"/>
+        </w:rPr>
+        <w:t>frontend</w:t>
+      </w:r>
+      <w:r>
+        <w:rPr>
+          <w:rFonts w:ascii="Aptos" w:hAnsi="Aptos" w:eastAsia="Aptos" w:cs="Aptos"/>
+          <w:noProof w:val="0"/>
+          <w:sz w:val="24"/>
+          <w:szCs w:val="24"/>
+          <w:lang w:val="es-ES"/>
+        </w:rPr>
+        <w:t xml:space="preserve">. El componente de inicio de sesión se ha actualizado para almacenar el token en el almacenamiento local del navegador. Posteriormente, he revisado los controladores de las vistas de categorías y artículos para incluir la cabecera HTTP </w:t>
+      </w:r>
+      <w:r>
+        <w:rPr>
+          <w:rFonts w:ascii="Consolas" w:hAnsi="Consolas" w:eastAsia="Consolas" w:cs="Consolas"/>
+          <w:noProof w:val="0"/>
+          <w:sz w:val="24"/>
+          <w:szCs w:val="24"/>
+          <w:lang w:val="es-ES"/>
+        </w:rPr>
+        <w:t>Authorization</w:t>
+      </w:r>
+      <w:r>
+        <w:rPr>
+          <w:rFonts w:ascii="Consolas" w:hAnsi="Consolas" w:eastAsia="Consolas" w:cs="Consolas"/>
+          <w:noProof w:val="0"/>
+          <w:sz w:val="24"/>
+          <w:szCs w:val="24"/>
+          <w:lang w:val="es-ES"/>
+        </w:rPr>
+        <w:t xml:space="preserve">: </w:t>
+      </w:r>
+      <w:r>
+        <w:rPr>
+          <w:rFonts w:ascii="Consolas" w:hAnsi="Consolas" w:eastAsia="Consolas" w:cs="Consolas"/>
+          <w:noProof w:val="0"/>
+          <w:sz w:val="24"/>
+          <w:szCs w:val="24"/>
+          <w:lang w:val="es-ES"/>
+        </w:rPr>
+        <w:t>Bearer</w:t>
+      </w:r>
+      <w:r>
+        <w:rPr>
+          <w:rFonts w:ascii="Aptos" w:hAnsi="Aptos" w:eastAsia="Aptos" w:cs="Aptos"/>
+          <w:noProof w:val="0"/>
+          <w:sz w:val="24"/>
+          <w:szCs w:val="24"/>
+          <w:lang w:val="es-ES"/>
+        </w:rPr>
+        <w:t xml:space="preserve"> en todas las peticiones asíncronas (</w:t>
+      </w:r>
+      <w:r>
+        <w:rPr>
+          <w:rFonts w:ascii="Consolas" w:hAnsi="Consolas" w:eastAsia="Consolas" w:cs="Consolas"/>
+          <w:noProof w:val="0"/>
+          <w:sz w:val="24"/>
+          <w:szCs w:val="24"/>
+          <w:lang w:val="es-ES"/>
+        </w:rPr>
+        <w:t>fetch</w:t>
+      </w:r>
+      <w:r>
+        <w:rPr>
+          <w:rFonts w:ascii="Aptos" w:hAnsi="Aptos" w:eastAsia="Aptos" w:cs="Aptos"/>
+          <w:noProof w:val="0"/>
+          <w:sz w:val="24"/>
+          <w:szCs w:val="24"/>
+          <w:lang w:val="es-ES"/>
+        </w:rPr>
+        <w:t>) de lectura y escritura.</w:t>
+      </w:r>
+    </w:p>
+    <w:p>
+      <w:r>
+        <w:br w:type="page"/>
+      </w:r>
+    </w:p>
+    <w:p>
+      <w:pPr>
+        <w:pStyle w:val="Normal"/>
+        <w:spacing w:before="240" w:beforeAutospacing="off" w:after="240" w:afterAutospacing="off"/>
+        <w:rPr>
+          <w:rFonts w:ascii="Aptos" w:hAnsi="Aptos" w:eastAsia="Aptos" w:cs="Aptos"/>
+          <w:noProof w:val="0"/>
+          <w:sz w:val="24"/>
+          <w:szCs w:val="24"/>
+          <w:lang w:val="es-ES"/>
+        </w:rPr>
+      </w:pPr>
+    </w:p>
+    <w:p>
+      <w:pPr>
+        <w:pStyle w:val="Heading3"/>
+      </w:pPr>
+      <w:r>
+        <w:rPr>
+          <w:noProof w:val="0"/>
+          <w:lang w:val="es-ES"/>
+        </w:rPr>
+        <w:t>5. Depuración y actualización documental</w:t>
+      </w:r>
+      <w:r>
+        <w:rPr>
+          <w:noProof w:val="0"/>
+          <w:lang w:val="es-ES"/>
+        </w:rPr>
+        <w:t xml:space="preserve"> </w:t>
+      </w:r>
+    </w:p>
+    <w:p>
+      <w:pPr>
+        <w:spacing w:before="240" w:beforeAutospacing="off" w:after="240" w:afterAutospacing="off"/>
+      </w:pPr>
+      <w:r>
+        <w:rPr>
+          <w:rFonts w:ascii="Aptos" w:hAnsi="Aptos" w:eastAsia="Aptos" w:cs="Aptos"/>
+          <w:noProof w:val="0"/>
+          <w:sz w:val="24"/>
+          <w:szCs w:val="24"/>
+          <w:lang w:val="es-ES"/>
+        </w:rPr>
+        <w:t>Durante las pruebas de integración, he solucionado varios errores de acceso denegado asegurando que las funciones de carga automática (</w:t>
+      </w:r>
+      <w:r>
+        <w:rPr>
+          <w:rFonts w:ascii="Consolas" w:hAnsi="Consolas" w:eastAsia="Consolas" w:cs="Consolas"/>
+          <w:noProof w:val="0"/>
+          <w:sz w:val="24"/>
+          <w:szCs w:val="24"/>
+          <w:lang w:val="es-ES"/>
+        </w:rPr>
+        <w:t>useEffect</w:t>
+      </w:r>
+      <w:r>
+        <w:rPr>
+          <w:rFonts w:ascii="Aptos" w:hAnsi="Aptos" w:eastAsia="Aptos" w:cs="Aptos"/>
+          <w:noProof w:val="0"/>
+          <w:sz w:val="24"/>
+          <w:szCs w:val="24"/>
+          <w:lang w:val="es-ES"/>
+        </w:rPr>
+        <w:t>) enviaran correctamente el token. También se ha corregido la asignación de variables en el formulario de creación de artículos. Por último, he actualizado la documentación operativa del proyecto para reflejar la nueva arquitectura de seguridad y los requisitos de arranque con variables de entorno.</w:t>
       </w:r>
     </w:p>
     <w:p>

</xml_diff>

<commit_message>
actualizacion de bitacora 30 de abril
</commit_message>
<xml_diff>
--- a/Documentacion/Bitacora_Joaquin.docx
+++ b/Documentacion/Bitacora_Joaquin.docx
@@ -4790,6 +4790,921 @@
         </w:rPr>
         <w:t>) enviaran correctamente el token. También se ha corregido la asignación de variables en el formulario de creación de artículos. Por último, he actualizado la documentación operativa del proyecto para reflejar la nueva arquitectura de seguridad y los requisitos de arranque con variables de entorno.</w:t>
       </w:r>
+    </w:p>
+    <w:p>
+      <w:pPr>
+        <w:pStyle w:val="Normal"/>
+      </w:pPr>
+    </w:p>
+    <w:p>
+      <w:r>
+        <w:br w:type="page"/>
+      </w:r>
+    </w:p>
+    <w:p>
+      <w:pPr>
+        <w:spacing w:before="240" w:beforeAutospacing="off" w:after="240" w:afterAutospacing="off"/>
+      </w:pPr>
+      <w:r>
+        <w:rPr>
+          <w:rFonts w:ascii="Aptos" w:hAnsi="Aptos" w:eastAsia="Aptos" w:cs="Aptos"/>
+          <w:b w:val="1"/>
+          <w:bCs w:val="1"/>
+          <w:noProof w:val="0"/>
+          <w:sz w:val="24"/>
+          <w:szCs w:val="24"/>
+          <w:lang w:val="es-ES"/>
+        </w:rPr>
+        <w:t>Fecha:</w:t>
+      </w:r>
+      <w:r>
+        <w:rPr>
+          <w:rFonts w:ascii="Aptos" w:hAnsi="Aptos" w:eastAsia="Aptos" w:cs="Aptos"/>
+          <w:noProof w:val="0"/>
+          <w:sz w:val="24"/>
+          <w:szCs w:val="24"/>
+          <w:lang w:val="es-ES"/>
+        </w:rPr>
+        <w:t xml:space="preserve"> 30 de abril de 2026</w:t>
+      </w:r>
+    </w:p>
+    <w:p>
+      <w:pPr>
+        <w:spacing w:before="240" w:beforeAutospacing="off" w:after="240" w:afterAutospacing="off"/>
+      </w:pPr>
+      <w:r>
+        <w:rPr>
+          <w:rFonts w:ascii="Aptos" w:hAnsi="Aptos" w:eastAsia="Aptos" w:cs="Aptos"/>
+          <w:b w:val="1"/>
+          <w:bCs w:val="1"/>
+          <w:noProof w:val="0"/>
+          <w:sz w:val="24"/>
+          <w:szCs w:val="24"/>
+          <w:lang w:val="es-ES"/>
+        </w:rPr>
+        <w:t>Objetivo:</w:t>
+      </w:r>
+      <w:r>
+        <w:rPr>
+          <w:rFonts w:ascii="Aptos" w:hAnsi="Aptos" w:eastAsia="Aptos" w:cs="Aptos"/>
+          <w:noProof w:val="0"/>
+          <w:sz w:val="24"/>
+          <w:szCs w:val="24"/>
+          <w:lang w:val="es-ES"/>
+        </w:rPr>
+        <w:t xml:space="preserve"> Integración total del sistema, plan de pruebas de estrés y despliegue del sistema de recuperación ante desastres.</w:t>
+      </w:r>
+    </w:p>
+    <w:p>
+      <w:pPr>
+        <w:pStyle w:val="Heading3"/>
+        <w:spacing w:before="281" w:beforeAutospacing="off" w:after="281" w:afterAutospacing="off"/>
+      </w:pPr>
+      <w:r>
+        <w:rPr>
+          <w:rFonts w:ascii="Aptos" w:hAnsi="Aptos" w:eastAsia="Aptos" w:cs="Aptos"/>
+          <w:b w:val="1"/>
+          <w:bCs w:val="1"/>
+          <w:noProof w:val="0"/>
+          <w:sz w:val="28"/>
+          <w:szCs w:val="28"/>
+          <w:lang w:val="es-ES"/>
+        </w:rPr>
+        <w:t>1. Integración del "Conjunto Coherente"</w:t>
+      </w:r>
+    </w:p>
+    <w:p>
+      <w:pPr>
+        <w:spacing w:before="240" w:beforeAutospacing="off" w:after="240" w:afterAutospacing="off"/>
+      </w:pPr>
+      <w:r>
+        <w:rPr>
+          <w:rFonts w:ascii="Aptos" w:hAnsi="Aptos" w:eastAsia="Aptos" w:cs="Aptos"/>
+          <w:noProof w:val="0"/>
+          <w:sz w:val="24"/>
+          <w:szCs w:val="24"/>
+          <w:lang w:val="es-ES"/>
+        </w:rPr>
+        <w:t xml:space="preserve">Hoy el objetivo no era que las piezas funcionaran solas, sino que bailaran juntas. He logrado integrar el servicio de </w:t>
+      </w:r>
+      <w:r>
+        <w:rPr>
+          <w:rFonts w:ascii="Aptos" w:hAnsi="Aptos" w:eastAsia="Aptos" w:cs="Aptos"/>
+          <w:b w:val="1"/>
+          <w:bCs w:val="1"/>
+          <w:noProof w:val="0"/>
+          <w:sz w:val="24"/>
+          <w:szCs w:val="24"/>
+          <w:lang w:val="es-ES"/>
+        </w:rPr>
+        <w:t>JavaMailSender</w:t>
+      </w:r>
+      <w:r>
+        <w:rPr>
+          <w:rFonts w:ascii="Aptos" w:hAnsi="Aptos" w:eastAsia="Aptos" w:cs="Aptos"/>
+          <w:noProof w:val="0"/>
+          <w:sz w:val="24"/>
+          <w:szCs w:val="24"/>
+          <w:lang w:val="es-ES"/>
+        </w:rPr>
+        <w:t xml:space="preserve"> con el flujo de seguridad de </w:t>
+      </w:r>
+      <w:r>
+        <w:rPr>
+          <w:rFonts w:ascii="Aptos" w:hAnsi="Aptos" w:eastAsia="Aptos" w:cs="Aptos"/>
+          <w:b w:val="1"/>
+          <w:bCs w:val="1"/>
+          <w:noProof w:val="0"/>
+          <w:sz w:val="24"/>
+          <w:szCs w:val="24"/>
+          <w:lang w:val="es-ES"/>
+        </w:rPr>
+        <w:t>Spring Security</w:t>
+      </w:r>
+      <w:r>
+        <w:rPr>
+          <w:rFonts w:ascii="Aptos" w:hAnsi="Aptos" w:eastAsia="Aptos" w:cs="Aptos"/>
+          <w:noProof w:val="0"/>
+          <w:sz w:val="24"/>
+          <w:szCs w:val="24"/>
+          <w:lang w:val="es-ES"/>
+        </w:rPr>
+        <w:t>. Ahora, el sistema no solo registra un usuario, sino que bloquea su acceso mediante un filtro de autorización hasta que el token OTP enviado al correo es validado. He verificado que la jerarquía de componentes en React sea estable, asegurando que el estado de autenticación se propague correctamente desde la raíz (</w:t>
+      </w:r>
+      <w:r>
+        <w:rPr>
+          <w:rFonts w:ascii="Consolas" w:hAnsi="Consolas" w:eastAsia="Consolas" w:cs="Consolas"/>
+          <w:noProof w:val="0"/>
+          <w:sz w:val="24"/>
+          <w:szCs w:val="24"/>
+          <w:lang w:val="es-ES"/>
+        </w:rPr>
+        <w:t>App.jsx</w:t>
+      </w:r>
+      <w:r>
+        <w:rPr>
+          <w:rFonts w:ascii="Aptos" w:hAnsi="Aptos" w:eastAsia="Aptos" w:cs="Aptos"/>
+          <w:noProof w:val="0"/>
+          <w:sz w:val="24"/>
+          <w:szCs w:val="24"/>
+          <w:lang w:val="es-ES"/>
+        </w:rPr>
+        <w:t>) hasta los niveles más profundos como la gestión de artículos.</w:t>
+      </w:r>
+    </w:p>
+    <w:p>
+      <w:pPr>
+        <w:pStyle w:val="Heading3"/>
+        <w:spacing w:before="281" w:beforeAutospacing="off" w:after="281" w:afterAutospacing="off"/>
+      </w:pPr>
+      <w:r>
+        <w:rPr>
+          <w:rFonts w:ascii="Aptos" w:hAnsi="Aptos" w:eastAsia="Aptos" w:cs="Aptos"/>
+          <w:b w:val="1"/>
+          <w:bCs w:val="1"/>
+          <w:noProof w:val="0"/>
+          <w:sz w:val="28"/>
+          <w:szCs w:val="28"/>
+          <w:lang w:val="es-ES"/>
+        </w:rPr>
+        <w:t>2. Plan de Pruebas y Resultados Documentados</w:t>
+      </w:r>
+    </w:p>
+    <w:p>
+      <w:pPr>
+        <w:spacing w:before="240" w:beforeAutospacing="off" w:after="240" w:afterAutospacing="off"/>
+      </w:pPr>
+      <w:r>
+        <w:rPr>
+          <w:rFonts w:ascii="Aptos" w:hAnsi="Aptos" w:eastAsia="Aptos" w:cs="Aptos"/>
+          <w:noProof w:val="0"/>
+          <w:sz w:val="24"/>
+          <w:szCs w:val="24"/>
+          <w:lang w:val="es-ES"/>
+        </w:rPr>
+        <w:t>He diseñado y ejecutado un plan de pruebas para estresar el sistema. Los casos de prueba incluyeron:</w:t>
+      </w:r>
+    </w:p>
+    <w:p>
+      <w:pPr>
+        <w:pStyle w:val="ListParagraph"/>
+        <w:numPr>
+          <w:ilvl w:val="0"/>
+          <w:numId w:val="14"/>
+        </w:numPr>
+        <w:spacing w:before="240" w:beforeAutospacing="off" w:after="240" w:afterAutospacing="off"/>
+        <w:rPr>
+          <w:rFonts w:ascii="Aptos" w:hAnsi="Aptos" w:eastAsia="Aptos" w:cs="Aptos"/>
+          <w:noProof w:val="0"/>
+          <w:sz w:val="24"/>
+          <w:szCs w:val="24"/>
+          <w:lang w:val="es-ES"/>
+        </w:rPr>
+      </w:pPr>
+      <w:r>
+        <w:rPr>
+          <w:rFonts w:ascii="Aptos" w:hAnsi="Aptos" w:eastAsia="Aptos" w:cs="Aptos"/>
+          <w:b w:val="1"/>
+          <w:bCs w:val="1"/>
+          <w:noProof w:val="0"/>
+          <w:sz w:val="24"/>
+          <w:szCs w:val="24"/>
+          <w:lang w:val="es-ES"/>
+        </w:rPr>
+        <w:t>Inyección de datos corruptos:</w:t>
+      </w:r>
+      <w:r>
+        <w:rPr>
+          <w:rFonts w:ascii="Aptos" w:hAnsi="Aptos" w:eastAsia="Aptos" w:cs="Aptos"/>
+          <w:noProof w:val="0"/>
+          <w:sz w:val="24"/>
+          <w:szCs w:val="24"/>
+          <w:lang w:val="es-ES"/>
+        </w:rPr>
+        <w:t xml:space="preserve"> Intenté guardar artículos con esquemas JSON malformados; el backend respondió correctamente con un </w:t>
+      </w:r>
+      <w:r>
+        <w:rPr>
+          <w:rFonts w:ascii="Consolas" w:hAnsi="Consolas" w:eastAsia="Consolas" w:cs="Consolas"/>
+          <w:noProof w:val="0"/>
+          <w:sz w:val="24"/>
+          <w:szCs w:val="24"/>
+          <w:lang w:val="es-ES"/>
+        </w:rPr>
+        <w:t>400 Bad Request</w:t>
+      </w:r>
+      <w:r>
+        <w:rPr>
+          <w:rFonts w:ascii="Aptos" w:hAnsi="Aptos" w:eastAsia="Aptos" w:cs="Aptos"/>
+          <w:noProof w:val="0"/>
+          <w:sz w:val="24"/>
+          <w:szCs w:val="24"/>
+          <w:lang w:val="es-ES"/>
+        </w:rPr>
+        <w:t>.</w:t>
+      </w:r>
+    </w:p>
+    <w:p>
+      <w:pPr>
+        <w:pStyle w:val="ListParagraph"/>
+        <w:numPr>
+          <w:ilvl w:val="0"/>
+          <w:numId w:val="14"/>
+        </w:numPr>
+        <w:spacing w:before="240" w:beforeAutospacing="off" w:after="240" w:afterAutospacing="off"/>
+        <w:rPr>
+          <w:rFonts w:ascii="Aptos" w:hAnsi="Aptos" w:eastAsia="Aptos" w:cs="Aptos"/>
+          <w:noProof w:val="0"/>
+          <w:sz w:val="24"/>
+          <w:szCs w:val="24"/>
+          <w:lang w:val="es-ES"/>
+        </w:rPr>
+      </w:pPr>
+      <w:r>
+        <w:rPr>
+          <w:rFonts w:ascii="Aptos" w:hAnsi="Aptos" w:eastAsia="Aptos" w:cs="Aptos"/>
+          <w:b w:val="1"/>
+          <w:bCs w:val="1"/>
+          <w:noProof w:val="0"/>
+          <w:sz w:val="24"/>
+          <w:szCs w:val="24"/>
+          <w:lang w:val="es-ES"/>
+        </w:rPr>
+        <w:t>Prueba de concurrencia:</w:t>
+      </w:r>
+      <w:r>
+        <w:rPr>
+          <w:rFonts w:ascii="Aptos" w:hAnsi="Aptos" w:eastAsia="Aptos" w:cs="Aptos"/>
+          <w:noProof w:val="0"/>
+          <w:sz w:val="24"/>
+          <w:szCs w:val="24"/>
+          <w:lang w:val="es-ES"/>
+        </w:rPr>
+        <w:t xml:space="preserve"> Verifiqué que el sistema de tokens JWT no colisionara al tener varias sesiones abiertas con distintos roles (Admin y User) en el mismo navegador.</w:t>
+      </w:r>
+    </w:p>
+    <w:p>
+      <w:pPr>
+        <w:pStyle w:val="ListParagraph"/>
+        <w:numPr>
+          <w:ilvl w:val="0"/>
+          <w:numId w:val="14"/>
+        </w:numPr>
+        <w:spacing w:before="240" w:beforeAutospacing="off" w:after="240" w:afterAutospacing="off"/>
+        <w:rPr>
+          <w:rFonts w:ascii="Aptos" w:hAnsi="Aptos" w:eastAsia="Aptos" w:cs="Aptos"/>
+          <w:noProof w:val="0"/>
+          <w:sz w:val="24"/>
+          <w:szCs w:val="24"/>
+          <w:lang w:val="es-ES"/>
+        </w:rPr>
+      </w:pPr>
+      <w:r>
+        <w:rPr>
+          <w:rFonts w:ascii="Aptos" w:hAnsi="Aptos" w:eastAsia="Aptos" w:cs="Aptos"/>
+          <w:b w:val="1"/>
+          <w:bCs w:val="1"/>
+          <w:noProof w:val="0"/>
+          <w:sz w:val="24"/>
+          <w:szCs w:val="24"/>
+          <w:lang w:val="es-ES"/>
+        </w:rPr>
+        <w:t>Validación de Roles:</w:t>
+      </w:r>
+      <w:r>
+        <w:rPr>
+          <w:rFonts w:ascii="Aptos" w:hAnsi="Aptos" w:eastAsia="Aptos" w:cs="Aptos"/>
+          <w:noProof w:val="0"/>
+          <w:sz w:val="24"/>
+          <w:szCs w:val="24"/>
+          <w:lang w:val="es-ES"/>
+        </w:rPr>
+        <w:t xml:space="preserve"> Confirmé que un usuario con rol </w:t>
+      </w:r>
+      <w:r>
+        <w:rPr>
+          <w:rFonts w:ascii="Consolas" w:hAnsi="Consolas" w:eastAsia="Consolas" w:cs="Consolas"/>
+          <w:noProof w:val="0"/>
+          <w:sz w:val="24"/>
+          <w:szCs w:val="24"/>
+          <w:lang w:val="es-ES"/>
+        </w:rPr>
+        <w:t>user</w:t>
+      </w:r>
+      <w:r>
+        <w:rPr>
+          <w:rFonts w:ascii="Aptos" w:hAnsi="Aptos" w:eastAsia="Aptos" w:cs="Aptos"/>
+          <w:noProof w:val="0"/>
+          <w:sz w:val="24"/>
+          <w:szCs w:val="24"/>
+          <w:lang w:val="es-ES"/>
+        </w:rPr>
+        <w:t xml:space="preserve"> recibe un </w:t>
+      </w:r>
+      <w:r>
+        <w:rPr>
+          <w:rFonts w:ascii="Consolas" w:hAnsi="Consolas" w:eastAsia="Consolas" w:cs="Consolas"/>
+          <w:noProof w:val="0"/>
+          <w:sz w:val="24"/>
+          <w:szCs w:val="24"/>
+          <w:lang w:val="es-ES"/>
+        </w:rPr>
+        <w:t>403 Forbidden</w:t>
+      </w:r>
+      <w:r>
+        <w:rPr>
+          <w:rFonts w:ascii="Aptos" w:hAnsi="Aptos" w:eastAsia="Aptos" w:cs="Aptos"/>
+          <w:noProof w:val="0"/>
+          <w:sz w:val="24"/>
+          <w:szCs w:val="24"/>
+          <w:lang w:val="es-ES"/>
+        </w:rPr>
+        <w:t xml:space="preserve"> inmediato si intenta acceder por URL manual a la ruta </w:t>
+      </w:r>
+      <w:r>
+        <w:rPr>
+          <w:rFonts w:ascii="Consolas" w:hAnsi="Consolas" w:eastAsia="Consolas" w:cs="Consolas"/>
+          <w:noProof w:val="0"/>
+          <w:sz w:val="24"/>
+          <w:szCs w:val="24"/>
+          <w:lang w:val="es-ES"/>
+        </w:rPr>
+        <w:t>/api/admin/estadisticas</w:t>
+      </w:r>
+      <w:r>
+        <w:rPr>
+          <w:rFonts w:ascii="Aptos" w:hAnsi="Aptos" w:eastAsia="Aptos" w:cs="Aptos"/>
+          <w:noProof w:val="0"/>
+          <w:sz w:val="24"/>
+          <w:szCs w:val="24"/>
+          <w:lang w:val="es-ES"/>
+        </w:rPr>
+        <w:t>.</w:t>
+      </w:r>
+    </w:p>
+    <w:p>
+      <w:pPr>
+        <w:pStyle w:val="Heading3"/>
+        <w:spacing w:before="281" w:beforeAutospacing="off" w:after="281" w:afterAutospacing="off"/>
+        <w:rPr>
+          <w:rFonts w:ascii="Aptos" w:hAnsi="Aptos" w:eastAsia="Aptos" w:cs="Aptos"/>
+          <w:b w:val="1"/>
+          <w:bCs w:val="1"/>
+          <w:noProof w:val="0"/>
+          <w:sz w:val="28"/>
+          <w:szCs w:val="28"/>
+          <w:lang w:val="es-ES"/>
+        </w:rPr>
+      </w:pPr>
+    </w:p>
+    <w:p>
+      <w:pPr>
+        <w:pStyle w:val="Heading3"/>
+        <w:spacing w:before="281" w:beforeAutospacing="off" w:after="281" w:afterAutospacing="off"/>
+      </w:pPr>
+      <w:r>
+        <w:rPr>
+          <w:rFonts w:ascii="Aptos" w:hAnsi="Aptos" w:eastAsia="Aptos" w:cs="Aptos"/>
+          <w:b w:val="1"/>
+          <w:bCs w:val="1"/>
+          <w:noProof w:val="0"/>
+          <w:sz w:val="28"/>
+          <w:szCs w:val="28"/>
+          <w:lang w:val="es-ES"/>
+        </w:rPr>
+        <w:t>3</w:t>
+      </w:r>
+      <w:r>
+        <w:rPr>
+          <w:rFonts w:ascii="Aptos" w:hAnsi="Aptos" w:eastAsia="Aptos" w:cs="Aptos"/>
+          <w:b w:val="1"/>
+          <w:bCs w:val="1"/>
+          <w:noProof w:val="0"/>
+          <w:sz w:val="28"/>
+          <w:szCs w:val="28"/>
+          <w:lang w:val="es-ES"/>
+        </w:rPr>
+        <w:t>. Pulido de UX: El fin de los "</w:t>
+      </w:r>
+      <w:r>
+        <w:rPr>
+          <w:rFonts w:ascii="Aptos" w:hAnsi="Aptos" w:eastAsia="Aptos" w:cs="Aptos"/>
+          <w:b w:val="1"/>
+          <w:bCs w:val="1"/>
+          <w:noProof w:val="0"/>
+          <w:sz w:val="28"/>
+          <w:szCs w:val="28"/>
+          <w:lang w:val="es-ES"/>
+        </w:rPr>
+        <w:t>datos fantasma</w:t>
+      </w:r>
+      <w:r>
+        <w:rPr>
+          <w:rFonts w:ascii="Aptos" w:hAnsi="Aptos" w:eastAsia="Aptos" w:cs="Aptos"/>
+          <w:b w:val="1"/>
+          <w:bCs w:val="1"/>
+          <w:noProof w:val="0"/>
+          <w:sz w:val="28"/>
+          <w:szCs w:val="28"/>
+          <w:lang w:val="es-ES"/>
+        </w:rPr>
+        <w:t>"</w:t>
+      </w:r>
+    </w:p>
+    <w:p>
+      <w:pPr>
+        <w:spacing w:before="240" w:beforeAutospacing="off" w:after="240" w:afterAutospacing="off"/>
+      </w:pPr>
+      <w:r>
+        <w:rPr>
+          <w:rFonts w:ascii="Aptos" w:hAnsi="Aptos" w:eastAsia="Aptos" w:cs="Aptos"/>
+          <w:noProof w:val="0"/>
+          <w:sz w:val="24"/>
+          <w:szCs w:val="24"/>
+          <w:lang w:val="es-ES"/>
+        </w:rPr>
+        <w:t>He eliminado la incertidumbre visual en el panel de control. Antes, las métricas globales mostraban un "0" inicial que podía confundir al administrador. Ahora, he implementado un estado de carga dinámico (</w:t>
+      </w:r>
+      <w:r>
+        <w:rPr>
+          <w:rFonts w:ascii="Consolas" w:hAnsi="Consolas" w:eastAsia="Consolas" w:cs="Consolas"/>
+          <w:noProof w:val="0"/>
+          <w:sz w:val="24"/>
+          <w:szCs w:val="24"/>
+          <w:lang w:val="es-ES"/>
+        </w:rPr>
+        <w:t>cargandoStats</w:t>
+      </w:r>
+      <w:r>
+        <w:rPr>
+          <w:rFonts w:ascii="Aptos" w:hAnsi="Aptos" w:eastAsia="Aptos" w:cs="Aptos"/>
+          <w:noProof w:val="0"/>
+          <w:sz w:val="24"/>
+          <w:szCs w:val="24"/>
+          <w:lang w:val="es-ES"/>
+        </w:rPr>
+        <w:t xml:space="preserve">) con una animación de pulso en CSS. Esto no es solo estética; es </w:t>
+      </w:r>
+      <w:r>
+        <w:rPr>
+          <w:rFonts w:ascii="Aptos" w:hAnsi="Aptos" w:eastAsia="Aptos" w:cs="Aptos"/>
+          <w:b w:val="1"/>
+          <w:bCs w:val="1"/>
+          <w:noProof w:val="0"/>
+          <w:sz w:val="24"/>
+          <w:szCs w:val="24"/>
+          <w:lang w:val="es-ES"/>
+        </w:rPr>
+        <w:t>feedback informativo</w:t>
+      </w:r>
+      <w:r>
+        <w:rPr>
+          <w:rFonts w:ascii="Aptos" w:hAnsi="Aptos" w:eastAsia="Aptos" w:cs="Aptos"/>
+          <w:noProof w:val="0"/>
+          <w:sz w:val="24"/>
+          <w:szCs w:val="24"/>
+          <w:lang w:val="es-ES"/>
+        </w:rPr>
+        <w:t>: el usuario sabe que el sistema está consultando la base de datos y no que la colección está vacía.</w:t>
+      </w:r>
+    </w:p>
+    <w:p/>
+    <w:p>
+      <w:pPr>
+        <w:pStyle w:val="Heading3"/>
+        <w:spacing w:before="281" w:beforeAutospacing="off" w:after="281" w:afterAutospacing="off"/>
+      </w:pPr>
+      <w:r>
+        <w:rPr>
+          <w:rFonts w:ascii="Aptos" w:hAnsi="Aptos" w:eastAsia="Aptos" w:cs="Aptos"/>
+          <w:b w:val="1"/>
+          <w:bCs w:val="1"/>
+          <w:noProof w:val="0"/>
+          <w:sz w:val="28"/>
+          <w:szCs w:val="28"/>
+          <w:lang w:val="es-ES"/>
+        </w:rPr>
+        <w:t>4</w:t>
+      </w:r>
+      <w:r>
+        <w:rPr>
+          <w:rFonts w:ascii="Aptos" w:hAnsi="Aptos" w:eastAsia="Aptos" w:cs="Aptos"/>
+          <w:b w:val="1"/>
+          <w:bCs w:val="1"/>
+          <w:noProof w:val="0"/>
+          <w:sz w:val="28"/>
+          <w:szCs w:val="28"/>
+          <w:lang w:val="es-ES"/>
+        </w:rPr>
+        <w:t>. Registro de Incidencias: Los errores más críticos y extraños</w:t>
+      </w:r>
+    </w:p>
+    <w:p>
+      <w:pPr>
+        <w:spacing w:before="240" w:beforeAutospacing="off" w:after="240" w:afterAutospacing="off"/>
+      </w:pPr>
+      <w:r>
+        <w:rPr>
+          <w:rFonts w:ascii="Aptos" w:hAnsi="Aptos" w:eastAsia="Aptos" w:cs="Aptos"/>
+          <w:noProof w:val="0"/>
+          <w:sz w:val="24"/>
+          <w:szCs w:val="24"/>
+          <w:lang w:val="es-ES"/>
+        </w:rPr>
+        <w:t>En esta fase final de integración, me he enfrentado a errores que casi me vuelven loco por lo específicos que eran:</w:t>
+      </w:r>
+    </w:p>
+    <w:p>
+      <w:pPr>
+        <w:pStyle w:val="ListParagraph"/>
+        <w:numPr>
+          <w:ilvl w:val="0"/>
+          <w:numId w:val="16"/>
+        </w:numPr>
+        <w:spacing w:before="240" w:beforeAutospacing="off" w:after="240" w:afterAutospacing="off"/>
+        <w:rPr>
+          <w:rFonts w:ascii="Aptos" w:hAnsi="Aptos" w:eastAsia="Aptos" w:cs="Aptos"/>
+          <w:noProof w:val="0"/>
+          <w:sz w:val="24"/>
+          <w:szCs w:val="24"/>
+          <w:lang w:val="es-ES"/>
+        </w:rPr>
+      </w:pPr>
+      <w:r>
+        <w:rPr>
+          <w:rFonts w:ascii="Aptos" w:hAnsi="Aptos" w:eastAsia="Aptos" w:cs="Aptos"/>
+          <w:b w:val="1"/>
+          <w:bCs w:val="1"/>
+          <w:noProof w:val="0"/>
+          <w:sz w:val="24"/>
+          <w:szCs w:val="24"/>
+          <w:lang w:val="es-ES"/>
+        </w:rPr>
+        <w:t>El misterio del Token "mentiroso" (Error 403 persistente):</w:t>
+      </w:r>
+      <w:r>
+        <w:rPr>
+          <w:rFonts w:ascii="Aptos" w:hAnsi="Aptos" w:eastAsia="Aptos" w:cs="Aptos"/>
+          <w:noProof w:val="0"/>
+          <w:sz w:val="24"/>
+          <w:szCs w:val="24"/>
+          <w:lang w:val="es-ES"/>
+        </w:rPr>
+        <w:t xml:space="preserve"> Fue el más raro. Cambiaba el rol de un usuario a </w:t>
+      </w:r>
+      <w:r>
+        <w:rPr>
+          <w:rFonts w:ascii="Consolas" w:hAnsi="Consolas" w:eastAsia="Consolas" w:cs="Consolas"/>
+          <w:noProof w:val="0"/>
+          <w:sz w:val="24"/>
+          <w:szCs w:val="24"/>
+          <w:lang w:val="es-ES"/>
+        </w:rPr>
+        <w:t>admin</w:t>
+      </w:r>
+      <w:r>
+        <w:rPr>
+          <w:rFonts w:ascii="Aptos" w:hAnsi="Aptos" w:eastAsia="Aptos" w:cs="Aptos"/>
+          <w:noProof w:val="0"/>
+          <w:sz w:val="24"/>
+          <w:szCs w:val="24"/>
+          <w:lang w:val="es-ES"/>
+        </w:rPr>
+        <w:t xml:space="preserve"> en la base de datos, pero el servidor seguía dándole error 403. Descubrí que el </w:t>
+      </w:r>
+      <w:r>
+        <w:rPr>
+          <w:rFonts w:ascii="Aptos" w:hAnsi="Aptos" w:eastAsia="Aptos" w:cs="Aptos"/>
+          <w:b w:val="1"/>
+          <w:bCs w:val="1"/>
+          <w:noProof w:val="0"/>
+          <w:sz w:val="24"/>
+          <w:szCs w:val="24"/>
+          <w:lang w:val="es-ES"/>
+        </w:rPr>
+        <w:t>JWT (Token)</w:t>
+      </w:r>
+      <w:r>
+        <w:rPr>
+          <w:rFonts w:ascii="Aptos" w:hAnsi="Aptos" w:eastAsia="Aptos" w:cs="Aptos"/>
+          <w:noProof w:val="0"/>
+          <w:sz w:val="24"/>
+          <w:szCs w:val="24"/>
+          <w:lang w:val="es-ES"/>
+        </w:rPr>
+        <w:t xml:space="preserve"> se genera con la información de ese momento exacto. Si no cierras sesión y vuelves a entrar, el token sigue diciendo que eres "user" aunque en la base de datos seas Dios. La solución fue forzar un </w:t>
+      </w:r>
+      <w:r>
+        <w:rPr>
+          <w:rFonts w:ascii="Consolas" w:hAnsi="Consolas" w:eastAsia="Consolas" w:cs="Consolas"/>
+          <w:noProof w:val="0"/>
+          <w:sz w:val="24"/>
+          <w:szCs w:val="24"/>
+          <w:lang w:val="es-ES"/>
+        </w:rPr>
+        <w:t>localStorage.clear()</w:t>
+      </w:r>
+      <w:r>
+        <w:rPr>
+          <w:rFonts w:ascii="Aptos" w:hAnsi="Aptos" w:eastAsia="Aptos" w:cs="Aptos"/>
+          <w:noProof w:val="0"/>
+          <w:sz w:val="24"/>
+          <w:szCs w:val="24"/>
+          <w:lang w:val="es-ES"/>
+        </w:rPr>
+        <w:t xml:space="preserve"> al detectar un cambio de permisos.</w:t>
+      </w:r>
+    </w:p>
+    <w:p>
+      <w:pPr>
+        <w:pStyle w:val="ListParagraph"/>
+        <w:numPr>
+          <w:ilvl w:val="0"/>
+          <w:numId w:val="16"/>
+        </w:numPr>
+        <w:spacing w:before="240" w:beforeAutospacing="off" w:after="240" w:afterAutospacing="off"/>
+        <w:rPr>
+          <w:rFonts w:ascii="Aptos" w:hAnsi="Aptos" w:eastAsia="Aptos" w:cs="Aptos"/>
+          <w:noProof w:val="0"/>
+          <w:sz w:val="24"/>
+          <w:szCs w:val="24"/>
+          <w:lang w:val="es-ES"/>
+        </w:rPr>
+      </w:pPr>
+      <w:r>
+        <w:rPr>
+          <w:rFonts w:ascii="Aptos" w:hAnsi="Aptos" w:eastAsia="Aptos" w:cs="Aptos"/>
+          <w:b w:val="1"/>
+          <w:bCs w:val="1"/>
+          <w:noProof w:val="0"/>
+          <w:sz w:val="24"/>
+          <w:szCs w:val="24"/>
+          <w:lang w:val="es-ES"/>
+        </w:rPr>
+        <w:t>La "Multiplicación" de artículos (Error de Lógica en PUT):</w:t>
+      </w:r>
+      <w:r>
+        <w:rPr>
+          <w:rFonts w:ascii="Aptos" w:hAnsi="Aptos" w:eastAsia="Aptos" w:cs="Aptos"/>
+          <w:noProof w:val="0"/>
+          <w:sz w:val="24"/>
+          <w:szCs w:val="24"/>
+          <w:lang w:val="es-ES"/>
+        </w:rPr>
+        <w:t xml:space="preserve"> Al editar, el sistema creaba un duplicado en lugar de actualizar. El fallo era invisible en la consola: el JSON que enviaba React no incluía el campo </w:t>
+      </w:r>
+      <w:r>
+        <w:rPr>
+          <w:rFonts w:ascii="Consolas" w:hAnsi="Consolas" w:eastAsia="Consolas" w:cs="Consolas"/>
+          <w:noProof w:val="0"/>
+          <w:sz w:val="24"/>
+          <w:szCs w:val="24"/>
+          <w:lang w:val="es-ES"/>
+        </w:rPr>
+        <w:t>id</w:t>
+      </w:r>
+      <w:r>
+        <w:rPr>
+          <w:rFonts w:ascii="Aptos" w:hAnsi="Aptos" w:eastAsia="Aptos" w:cs="Aptos"/>
+          <w:noProof w:val="0"/>
+          <w:sz w:val="24"/>
+          <w:szCs w:val="24"/>
+          <w:lang w:val="es-ES"/>
+        </w:rPr>
+        <w:t xml:space="preserve">, por lo que Hibernate, al ver un objeto sin ID, decidía que era un nuevo registro. Fue añadir </w:t>
+      </w:r>
+      <w:r>
+        <w:rPr>
+          <w:rFonts w:ascii="Consolas" w:hAnsi="Consolas" w:eastAsia="Consolas" w:cs="Consolas"/>
+          <w:noProof w:val="0"/>
+          <w:sz w:val="24"/>
+          <w:szCs w:val="24"/>
+          <w:lang w:val="es-ES"/>
+        </w:rPr>
+        <w:t>id: idEditando</w:t>
+      </w:r>
+      <w:r>
+        <w:rPr>
+          <w:rFonts w:ascii="Aptos" w:hAnsi="Aptos" w:eastAsia="Aptos" w:cs="Aptos"/>
+          <w:noProof w:val="0"/>
+          <w:sz w:val="24"/>
+          <w:szCs w:val="24"/>
+          <w:lang w:val="es-ES"/>
+        </w:rPr>
+        <w:t xml:space="preserve"> y el sistema volvió a ser estable.</w:t>
+      </w:r>
+    </w:p>
+    <w:p>
+      <w:pPr>
+        <w:pStyle w:val="ListParagraph"/>
+        <w:numPr>
+          <w:ilvl w:val="0"/>
+          <w:numId w:val="16"/>
+        </w:numPr>
+        <w:spacing w:before="240" w:beforeAutospacing="off" w:after="240" w:afterAutospacing="off"/>
+        <w:rPr>
+          <w:rFonts w:ascii="Aptos" w:hAnsi="Aptos" w:eastAsia="Aptos" w:cs="Aptos"/>
+          <w:noProof w:val="0"/>
+          <w:sz w:val="24"/>
+          <w:szCs w:val="24"/>
+          <w:lang w:val="es-ES"/>
+        </w:rPr>
+      </w:pPr>
+      <w:r>
+        <w:rPr>
+          <w:rFonts w:ascii="Aptos" w:hAnsi="Aptos" w:eastAsia="Aptos" w:cs="Aptos"/>
+          <w:b w:val="1"/>
+          <w:bCs w:val="1"/>
+          <w:noProof w:val="0"/>
+          <w:sz w:val="24"/>
+          <w:szCs w:val="24"/>
+          <w:lang w:val="es-ES"/>
+        </w:rPr>
+        <w:t>El bloqueo de seguridad de Google (SMTP Error 535):</w:t>
+      </w:r>
+      <w:r>
+        <w:rPr>
+          <w:rFonts w:ascii="Aptos" w:hAnsi="Aptos" w:eastAsia="Aptos" w:cs="Aptos"/>
+          <w:noProof w:val="0"/>
+          <w:sz w:val="24"/>
+          <w:szCs w:val="24"/>
+          <w:lang w:val="es-ES"/>
+        </w:rPr>
+        <w:t xml:space="preserve"> Spring Boot se negaba a enviar correos dando un error de autenticación a pesar de que la contraseña era correcta. Resultó ser el sistema de seguridad de Google para "apps menos seguras". Tuve que activar la verificación en dos pasos y generar una </w:t>
+      </w:r>
+      <w:r>
+        <w:rPr>
+          <w:rFonts w:ascii="Aptos" w:hAnsi="Aptos" w:eastAsia="Aptos" w:cs="Aptos"/>
+          <w:b w:val="1"/>
+          <w:bCs w:val="1"/>
+          <w:noProof w:val="0"/>
+          <w:sz w:val="24"/>
+          <w:szCs w:val="24"/>
+          <w:lang w:val="es-ES"/>
+        </w:rPr>
+        <w:t>contraseña de aplicación</w:t>
+      </w:r>
+      <w:r>
+        <w:rPr>
+          <w:rFonts w:ascii="Aptos" w:hAnsi="Aptos" w:eastAsia="Aptos" w:cs="Aptos"/>
+          <w:noProof w:val="0"/>
+          <w:sz w:val="24"/>
+          <w:szCs w:val="24"/>
+          <w:lang w:val="es-ES"/>
+        </w:rPr>
+        <w:t xml:space="preserve"> específica para que Java pudiera entrar.</w:t>
+      </w:r>
+    </w:p>
+    <w:p>
+      <w:pPr>
+        <w:pStyle w:val="ListParagraph"/>
+        <w:numPr>
+          <w:ilvl w:val="0"/>
+          <w:numId w:val="16"/>
+        </w:numPr>
+        <w:spacing w:before="240" w:beforeAutospacing="off" w:after="240" w:afterAutospacing="off"/>
+        <w:rPr>
+          <w:rFonts w:ascii="Aptos" w:hAnsi="Aptos" w:eastAsia="Aptos" w:cs="Aptos"/>
+          <w:noProof w:val="0"/>
+          <w:sz w:val="24"/>
+          <w:szCs w:val="24"/>
+          <w:lang w:val="es-ES"/>
+        </w:rPr>
+      </w:pPr>
+      <w:r>
+        <w:rPr>
+          <w:rFonts w:ascii="Aptos" w:hAnsi="Aptos" w:eastAsia="Aptos" w:cs="Aptos"/>
+          <w:b w:val="1"/>
+          <w:bCs w:val="1"/>
+          <w:noProof w:val="0"/>
+          <w:sz w:val="24"/>
+          <w:szCs w:val="24"/>
+          <w:lang w:val="es-ES"/>
+        </w:rPr>
+        <w:t>Conflicto de Nombres en LocalStorage:</w:t>
+      </w:r>
+      <w:r>
+        <w:rPr>
+          <w:rFonts w:ascii="Aptos" w:hAnsi="Aptos" w:eastAsia="Aptos" w:cs="Aptos"/>
+          <w:noProof w:val="0"/>
+          <w:sz w:val="24"/>
+          <w:szCs w:val="24"/>
+          <w:lang w:val="es-ES"/>
+        </w:rPr>
+        <w:t xml:space="preserve"> Al cambiar de un hito a otro, React buscaba </w:t>
+      </w:r>
+      <w:r>
+        <w:rPr>
+          <w:rFonts w:ascii="Consolas" w:hAnsi="Consolas" w:eastAsia="Consolas" w:cs="Consolas"/>
+          <w:noProof w:val="0"/>
+          <w:sz w:val="24"/>
+          <w:szCs w:val="24"/>
+          <w:lang w:val="es-ES"/>
+        </w:rPr>
+        <w:t>collectorhub-token</w:t>
+      </w:r>
+      <w:r>
+        <w:rPr>
+          <w:rFonts w:ascii="Aptos" w:hAnsi="Aptos" w:eastAsia="Aptos" w:cs="Aptos"/>
+          <w:noProof w:val="0"/>
+          <w:sz w:val="24"/>
+          <w:szCs w:val="24"/>
+          <w:lang w:val="es-ES"/>
+        </w:rPr>
+        <w:t xml:space="preserve"> mientras que el nuevo Login guardaba solo </w:t>
+      </w:r>
+      <w:r>
+        <w:rPr>
+          <w:rFonts w:ascii="Consolas" w:hAnsi="Consolas" w:eastAsia="Consolas" w:cs="Consolas"/>
+          <w:noProof w:val="0"/>
+          <w:sz w:val="24"/>
+          <w:szCs w:val="24"/>
+          <w:lang w:val="es-ES"/>
+        </w:rPr>
+        <w:t>token</w:t>
+      </w:r>
+      <w:r>
+        <w:rPr>
+          <w:rFonts w:ascii="Aptos" w:hAnsi="Aptos" w:eastAsia="Aptos" w:cs="Aptos"/>
+          <w:noProof w:val="0"/>
+          <w:sz w:val="24"/>
+          <w:szCs w:val="24"/>
+          <w:lang w:val="es-ES"/>
+        </w:rPr>
+        <w:t xml:space="preserve">. Esto provocó que la pantalla se quedara en blanco porque </w:t>
+      </w:r>
+      <w:r>
+        <w:rPr>
+          <w:rFonts w:ascii="Consolas" w:hAnsi="Consolas" w:eastAsia="Consolas" w:cs="Consolas"/>
+          <w:noProof w:val="0"/>
+          <w:sz w:val="24"/>
+          <w:szCs w:val="24"/>
+          <w:lang w:val="es-ES"/>
+        </w:rPr>
+        <w:t>App.jsx</w:t>
+      </w:r>
+      <w:r>
+        <w:rPr>
+          <w:rFonts w:ascii="Aptos" w:hAnsi="Aptos" w:eastAsia="Aptos" w:cs="Aptos"/>
+          <w:noProof w:val="0"/>
+          <w:sz w:val="24"/>
+          <w:szCs w:val="24"/>
+          <w:lang w:val="es-ES"/>
+        </w:rPr>
+        <w:t xml:space="preserve"> encontraba un valor nulo y "explotaba". He unificado todas las claves de almacenamiento bajo una nomenclatura simple y coherente.</w:t>
+      </w:r>
+    </w:p>
+    <w:p>
+      <w:pPr>
+        <w:spacing w:before="240" w:beforeAutospacing="off" w:after="240" w:afterAutospacing="off"/>
+        <w:rPr>
+          <w:rFonts w:ascii="Aptos" w:hAnsi="Aptos" w:eastAsia="Aptos" w:cs="Aptos"/>
+          <w:noProof w:val="0"/>
+          <w:sz w:val="24"/>
+          <w:szCs w:val="24"/>
+          <w:lang w:val="es-ES"/>
+        </w:rPr>
+      </w:pPr>
     </w:p>
     <w:p>
       <w:pPr>
@@ -4983,6 +5898,342 @@
 
 <file path=word/numbering.xml><?xml version="1.0" encoding="utf-8"?>
 <w:numbering xmlns:w="http://schemas.openxmlformats.org/wordprocessingml/2006/main">
+  <w:abstractNum xmlns:w="http://schemas.openxmlformats.org/wordprocessingml/2006/main" w:abstractNumId="16">
+    <w:nsid w:val="135d44cf"/>
+    <w:multiLevelType xmlns:w="http://schemas.openxmlformats.org/wordprocessingml/2006/main" w:val="hybridMultilevel"/>
+    <w:lvl xmlns:w="http://schemas.openxmlformats.org/wordprocessingml/2006/main" w:ilvl="0">
+      <w:start w:val="1"/>
+      <w:numFmt w:val="bullet"/>
+      <w:lvlText w:val=""/>
+      <w:lvlJc w:val="left"/>
+      <w:pPr>
+        <w:ind w:left="720" w:hanging="360"/>
+      </w:pPr>
+      <w:rPr>
+        <w:rFonts w:hint="default" w:ascii="Symbol" w:hAnsi="Symbol"/>
+      </w:rPr>
+    </w:lvl>
+    <w:lvl xmlns:w="http://schemas.openxmlformats.org/wordprocessingml/2006/main" w:ilvl="1">
+      <w:start w:val="1"/>
+      <w:numFmt w:val="bullet"/>
+      <w:lvlText w:val="o"/>
+      <w:lvlJc w:val="left"/>
+      <w:pPr>
+        <w:ind w:left="1440" w:hanging="360"/>
+      </w:pPr>
+      <w:rPr>
+        <w:rFonts w:hint="default" w:ascii="Courier New" w:hAnsi="Courier New"/>
+      </w:rPr>
+    </w:lvl>
+    <w:lvl xmlns:w="http://schemas.openxmlformats.org/wordprocessingml/2006/main" w:ilvl="2">
+      <w:start w:val="1"/>
+      <w:numFmt w:val="bullet"/>
+      <w:lvlText w:val=""/>
+      <w:lvlJc w:val="left"/>
+      <w:pPr>
+        <w:ind w:left="2160" w:hanging="360"/>
+      </w:pPr>
+      <w:rPr>
+        <w:rFonts w:hint="default" w:ascii="Wingdings" w:hAnsi="Wingdings"/>
+      </w:rPr>
+    </w:lvl>
+    <w:lvl xmlns:w="http://schemas.openxmlformats.org/wordprocessingml/2006/main" w:ilvl="3">
+      <w:start w:val="1"/>
+      <w:numFmt w:val="bullet"/>
+      <w:lvlText w:val=""/>
+      <w:lvlJc w:val="left"/>
+      <w:pPr>
+        <w:ind w:left="2880" w:hanging="360"/>
+      </w:pPr>
+      <w:rPr>
+        <w:rFonts w:hint="default" w:ascii="Symbol" w:hAnsi="Symbol"/>
+      </w:rPr>
+    </w:lvl>
+    <w:lvl xmlns:w="http://schemas.openxmlformats.org/wordprocessingml/2006/main" w:ilvl="4">
+      <w:start w:val="1"/>
+      <w:numFmt w:val="bullet"/>
+      <w:lvlText w:val="o"/>
+      <w:lvlJc w:val="left"/>
+      <w:pPr>
+        <w:ind w:left="3600" w:hanging="360"/>
+      </w:pPr>
+      <w:rPr>
+        <w:rFonts w:hint="default" w:ascii="Courier New" w:hAnsi="Courier New"/>
+      </w:rPr>
+    </w:lvl>
+    <w:lvl xmlns:w="http://schemas.openxmlformats.org/wordprocessingml/2006/main" w:ilvl="5">
+      <w:start w:val="1"/>
+      <w:numFmt w:val="bullet"/>
+      <w:lvlText w:val=""/>
+      <w:lvlJc w:val="left"/>
+      <w:pPr>
+        <w:ind w:left="4320" w:hanging="360"/>
+      </w:pPr>
+      <w:rPr>
+        <w:rFonts w:hint="default" w:ascii="Wingdings" w:hAnsi="Wingdings"/>
+      </w:rPr>
+    </w:lvl>
+    <w:lvl xmlns:w="http://schemas.openxmlformats.org/wordprocessingml/2006/main" w:ilvl="6">
+      <w:start w:val="1"/>
+      <w:numFmt w:val="bullet"/>
+      <w:lvlText w:val=""/>
+      <w:lvlJc w:val="left"/>
+      <w:pPr>
+        <w:ind w:left="5040" w:hanging="360"/>
+      </w:pPr>
+      <w:rPr>
+        <w:rFonts w:hint="default" w:ascii="Symbol" w:hAnsi="Symbol"/>
+      </w:rPr>
+    </w:lvl>
+    <w:lvl xmlns:w="http://schemas.openxmlformats.org/wordprocessingml/2006/main" w:ilvl="7">
+      <w:start w:val="1"/>
+      <w:numFmt w:val="bullet"/>
+      <w:lvlText w:val="o"/>
+      <w:lvlJc w:val="left"/>
+      <w:pPr>
+        <w:ind w:left="5760" w:hanging="360"/>
+      </w:pPr>
+      <w:rPr>
+        <w:rFonts w:hint="default" w:ascii="Courier New" w:hAnsi="Courier New"/>
+      </w:rPr>
+    </w:lvl>
+    <w:lvl xmlns:w="http://schemas.openxmlformats.org/wordprocessingml/2006/main" w:ilvl="8">
+      <w:start w:val="1"/>
+      <w:numFmt w:val="bullet"/>
+      <w:lvlText w:val=""/>
+      <w:lvlJc w:val="left"/>
+      <w:pPr>
+        <w:ind w:left="6480" w:hanging="360"/>
+      </w:pPr>
+      <w:rPr>
+        <w:rFonts w:hint="default" w:ascii="Wingdings" w:hAnsi="Wingdings"/>
+      </w:rPr>
+    </w:lvl>
+  </w:abstractNum>
+  <w:abstractNum xmlns:w="http://schemas.openxmlformats.org/wordprocessingml/2006/main" w:abstractNumId="15">
+    <w:nsid w:val="7221441f"/>
+    <w:multiLevelType xmlns:w="http://schemas.openxmlformats.org/wordprocessingml/2006/main" w:val="hybridMultilevel"/>
+    <w:lvl xmlns:w="http://schemas.openxmlformats.org/wordprocessingml/2006/main" w:ilvl="0">
+      <w:start w:val="1"/>
+      <w:numFmt w:val="bullet"/>
+      <w:lvlText w:val=""/>
+      <w:lvlJc w:val="left"/>
+      <w:pPr>
+        <w:ind w:left="720" w:hanging="360"/>
+      </w:pPr>
+      <w:rPr>
+        <w:rFonts w:hint="default" w:ascii="Symbol" w:hAnsi="Symbol"/>
+      </w:rPr>
+    </w:lvl>
+    <w:lvl xmlns:w="http://schemas.openxmlformats.org/wordprocessingml/2006/main" w:ilvl="1">
+      <w:start w:val="1"/>
+      <w:numFmt w:val="bullet"/>
+      <w:lvlText w:val="o"/>
+      <w:lvlJc w:val="left"/>
+      <w:pPr>
+        <w:ind w:left="1440" w:hanging="360"/>
+      </w:pPr>
+      <w:rPr>
+        <w:rFonts w:hint="default" w:ascii="Courier New" w:hAnsi="Courier New"/>
+      </w:rPr>
+    </w:lvl>
+    <w:lvl xmlns:w="http://schemas.openxmlformats.org/wordprocessingml/2006/main" w:ilvl="2">
+      <w:start w:val="1"/>
+      <w:numFmt w:val="bullet"/>
+      <w:lvlText w:val=""/>
+      <w:lvlJc w:val="left"/>
+      <w:pPr>
+        <w:ind w:left="2160" w:hanging="360"/>
+      </w:pPr>
+      <w:rPr>
+        <w:rFonts w:hint="default" w:ascii="Wingdings" w:hAnsi="Wingdings"/>
+      </w:rPr>
+    </w:lvl>
+    <w:lvl xmlns:w="http://schemas.openxmlformats.org/wordprocessingml/2006/main" w:ilvl="3">
+      <w:start w:val="1"/>
+      <w:numFmt w:val="bullet"/>
+      <w:lvlText w:val=""/>
+      <w:lvlJc w:val="left"/>
+      <w:pPr>
+        <w:ind w:left="2880" w:hanging="360"/>
+      </w:pPr>
+      <w:rPr>
+        <w:rFonts w:hint="default" w:ascii="Symbol" w:hAnsi="Symbol"/>
+      </w:rPr>
+    </w:lvl>
+    <w:lvl xmlns:w="http://schemas.openxmlformats.org/wordprocessingml/2006/main" w:ilvl="4">
+      <w:start w:val="1"/>
+      <w:numFmt w:val="bullet"/>
+      <w:lvlText w:val="o"/>
+      <w:lvlJc w:val="left"/>
+      <w:pPr>
+        <w:ind w:left="3600" w:hanging="360"/>
+      </w:pPr>
+      <w:rPr>
+        <w:rFonts w:hint="default" w:ascii="Courier New" w:hAnsi="Courier New"/>
+      </w:rPr>
+    </w:lvl>
+    <w:lvl xmlns:w="http://schemas.openxmlformats.org/wordprocessingml/2006/main" w:ilvl="5">
+      <w:start w:val="1"/>
+      <w:numFmt w:val="bullet"/>
+      <w:lvlText w:val=""/>
+      <w:lvlJc w:val="left"/>
+      <w:pPr>
+        <w:ind w:left="4320" w:hanging="360"/>
+      </w:pPr>
+      <w:rPr>
+        <w:rFonts w:hint="default" w:ascii="Wingdings" w:hAnsi="Wingdings"/>
+      </w:rPr>
+    </w:lvl>
+    <w:lvl xmlns:w="http://schemas.openxmlformats.org/wordprocessingml/2006/main" w:ilvl="6">
+      <w:start w:val="1"/>
+      <w:numFmt w:val="bullet"/>
+      <w:lvlText w:val=""/>
+      <w:lvlJc w:val="left"/>
+      <w:pPr>
+        <w:ind w:left="5040" w:hanging="360"/>
+      </w:pPr>
+      <w:rPr>
+        <w:rFonts w:hint="default" w:ascii="Symbol" w:hAnsi="Symbol"/>
+      </w:rPr>
+    </w:lvl>
+    <w:lvl xmlns:w="http://schemas.openxmlformats.org/wordprocessingml/2006/main" w:ilvl="7">
+      <w:start w:val="1"/>
+      <w:numFmt w:val="bullet"/>
+      <w:lvlText w:val="o"/>
+      <w:lvlJc w:val="left"/>
+      <w:pPr>
+        <w:ind w:left="5760" w:hanging="360"/>
+      </w:pPr>
+      <w:rPr>
+        <w:rFonts w:hint="default" w:ascii="Courier New" w:hAnsi="Courier New"/>
+      </w:rPr>
+    </w:lvl>
+    <w:lvl xmlns:w="http://schemas.openxmlformats.org/wordprocessingml/2006/main" w:ilvl="8">
+      <w:start w:val="1"/>
+      <w:numFmt w:val="bullet"/>
+      <w:lvlText w:val=""/>
+      <w:lvlJc w:val="left"/>
+      <w:pPr>
+        <w:ind w:left="6480" w:hanging="360"/>
+      </w:pPr>
+      <w:rPr>
+        <w:rFonts w:hint="default" w:ascii="Wingdings" w:hAnsi="Wingdings"/>
+      </w:rPr>
+    </w:lvl>
+  </w:abstractNum>
+  <w:abstractNum xmlns:w="http://schemas.openxmlformats.org/wordprocessingml/2006/main" w:abstractNumId="14">
+    <w:nsid w:val="643ea8be"/>
+    <w:multiLevelType xmlns:w="http://schemas.openxmlformats.org/wordprocessingml/2006/main" w:val="hybridMultilevel"/>
+    <w:lvl xmlns:w="http://schemas.openxmlformats.org/wordprocessingml/2006/main" w:ilvl="0">
+      <w:start w:val="1"/>
+      <w:numFmt w:val="bullet"/>
+      <w:lvlText w:val=""/>
+      <w:lvlJc w:val="left"/>
+      <w:pPr>
+        <w:ind w:left="720" w:hanging="360"/>
+      </w:pPr>
+      <w:rPr>
+        <w:rFonts w:hint="default" w:ascii="Symbol" w:hAnsi="Symbol"/>
+      </w:rPr>
+    </w:lvl>
+    <w:lvl xmlns:w="http://schemas.openxmlformats.org/wordprocessingml/2006/main" w:ilvl="1">
+      <w:start w:val="1"/>
+      <w:numFmt w:val="bullet"/>
+      <w:lvlText w:val="o"/>
+      <w:lvlJc w:val="left"/>
+      <w:pPr>
+        <w:ind w:left="1440" w:hanging="360"/>
+      </w:pPr>
+      <w:rPr>
+        <w:rFonts w:hint="default" w:ascii="Courier New" w:hAnsi="Courier New"/>
+      </w:rPr>
+    </w:lvl>
+    <w:lvl xmlns:w="http://schemas.openxmlformats.org/wordprocessingml/2006/main" w:ilvl="2">
+      <w:start w:val="1"/>
+      <w:numFmt w:val="bullet"/>
+      <w:lvlText w:val=""/>
+      <w:lvlJc w:val="left"/>
+      <w:pPr>
+        <w:ind w:left="2160" w:hanging="360"/>
+      </w:pPr>
+      <w:rPr>
+        <w:rFonts w:hint="default" w:ascii="Wingdings" w:hAnsi="Wingdings"/>
+      </w:rPr>
+    </w:lvl>
+    <w:lvl xmlns:w="http://schemas.openxmlformats.org/wordprocessingml/2006/main" w:ilvl="3">
+      <w:start w:val="1"/>
+      <w:numFmt w:val="bullet"/>
+      <w:lvlText w:val=""/>
+      <w:lvlJc w:val="left"/>
+      <w:pPr>
+        <w:ind w:left="2880" w:hanging="360"/>
+      </w:pPr>
+      <w:rPr>
+        <w:rFonts w:hint="default" w:ascii="Symbol" w:hAnsi="Symbol"/>
+      </w:rPr>
+    </w:lvl>
+    <w:lvl xmlns:w="http://schemas.openxmlformats.org/wordprocessingml/2006/main" w:ilvl="4">
+      <w:start w:val="1"/>
+      <w:numFmt w:val="bullet"/>
+      <w:lvlText w:val="o"/>
+      <w:lvlJc w:val="left"/>
+      <w:pPr>
+        <w:ind w:left="3600" w:hanging="360"/>
+      </w:pPr>
+      <w:rPr>
+        <w:rFonts w:hint="default" w:ascii="Courier New" w:hAnsi="Courier New"/>
+      </w:rPr>
+    </w:lvl>
+    <w:lvl xmlns:w="http://schemas.openxmlformats.org/wordprocessingml/2006/main" w:ilvl="5">
+      <w:start w:val="1"/>
+      <w:numFmt w:val="bullet"/>
+      <w:lvlText w:val=""/>
+      <w:lvlJc w:val="left"/>
+      <w:pPr>
+        <w:ind w:left="4320" w:hanging="360"/>
+      </w:pPr>
+      <w:rPr>
+        <w:rFonts w:hint="default" w:ascii="Wingdings" w:hAnsi="Wingdings"/>
+      </w:rPr>
+    </w:lvl>
+    <w:lvl xmlns:w="http://schemas.openxmlformats.org/wordprocessingml/2006/main" w:ilvl="6">
+      <w:start w:val="1"/>
+      <w:numFmt w:val="bullet"/>
+      <w:lvlText w:val=""/>
+      <w:lvlJc w:val="left"/>
+      <w:pPr>
+        <w:ind w:left="5040" w:hanging="360"/>
+      </w:pPr>
+      <w:rPr>
+        <w:rFonts w:hint="default" w:ascii="Symbol" w:hAnsi="Symbol"/>
+      </w:rPr>
+    </w:lvl>
+    <w:lvl xmlns:w="http://schemas.openxmlformats.org/wordprocessingml/2006/main" w:ilvl="7">
+      <w:start w:val="1"/>
+      <w:numFmt w:val="bullet"/>
+      <w:lvlText w:val="o"/>
+      <w:lvlJc w:val="left"/>
+      <w:pPr>
+        <w:ind w:left="5760" w:hanging="360"/>
+      </w:pPr>
+      <w:rPr>
+        <w:rFonts w:hint="default" w:ascii="Courier New" w:hAnsi="Courier New"/>
+      </w:rPr>
+    </w:lvl>
+    <w:lvl xmlns:w="http://schemas.openxmlformats.org/wordprocessingml/2006/main" w:ilvl="8">
+      <w:start w:val="1"/>
+      <w:numFmt w:val="bullet"/>
+      <w:lvlText w:val=""/>
+      <w:lvlJc w:val="left"/>
+      <w:pPr>
+        <w:ind w:left="6480" w:hanging="360"/>
+      </w:pPr>
+      <w:rPr>
+        <w:rFonts w:hint="default" w:ascii="Wingdings" w:hAnsi="Wingdings"/>
+      </w:rPr>
+    </w:lvl>
+  </w:abstractNum>
   <w:abstractNum xmlns:w="http://schemas.openxmlformats.org/wordprocessingml/2006/main" w:abstractNumId="13">
     <w:nsid w:val="25769d33"/>
     <w:multiLevelType xmlns:w="http://schemas.openxmlformats.org/wordprocessingml/2006/main" w:val="hybridMultilevel"/>
@@ -6439,6 +7690,15 @@
       </w:rPr>
     </w:lvl>
   </w:abstractNum>
+  <w:num w:numId="16">
+    <w:abstractNumId w:val="16"/>
+  </w:num>
+  <w:num w:numId="15">
+    <w:abstractNumId w:val="15"/>
+  </w:num>
+  <w:num w:numId="14">
+    <w:abstractNumId w:val="14"/>
+  </w:num>
   <w:num w:numId="13">
     <w:abstractNumId w:val="13"/>
   </w:num>

</xml_diff>

<commit_message>
Final hito pruebas unitarias solucion de errores y ampliacion de documentacion
</commit_message>
<xml_diff>
--- a/Documentacion/Bitacora_Joaquin.docx
+++ b/Documentacion/Bitacora_Joaquin.docx
@@ -4859,17 +4859,26 @@
       <w:pPr>
         <w:pStyle w:val="Heading3"/>
         <w:spacing w:before="281" w:beforeAutospacing="off" w:after="281" w:afterAutospacing="off"/>
-      </w:pPr>
-      <w:r>
-        <w:rPr>
-          <w:rFonts w:ascii="Aptos" w:hAnsi="Aptos" w:eastAsia="Aptos" w:cs="Aptos"/>
-          <w:b w:val="1"/>
-          <w:bCs w:val="1"/>
+        <w:rPr>
+          <w:rFonts w:ascii="Aptos" w:hAnsi="Aptos" w:eastAsia="Aptos" w:cs="Aptos"/>
+          <w:b w:val="0"/>
+          <w:bCs w:val="0"/>
           <w:noProof w:val="0"/>
           <w:sz w:val="28"/>
           <w:szCs w:val="28"/>
           <w:lang w:val="es-ES"/>
         </w:rPr>
+      </w:pPr>
+      <w:r>
+        <w:rPr>
+          <w:rFonts w:ascii="Aptos" w:hAnsi="Aptos" w:eastAsia="Aptos" w:cs="Aptos"/>
+          <w:b w:val="0"/>
+          <w:bCs w:val="0"/>
+          <w:noProof w:val="0"/>
+          <w:sz w:val="28"/>
+          <w:szCs w:val="28"/>
+          <w:lang w:val="es-ES"/>
+        </w:rPr>
         <w:t>1. Integración del "Conjunto Coherente"</w:t>
       </w:r>
     </w:p>
@@ -4956,12 +4965,21 @@
       <w:pPr>
         <w:pStyle w:val="Heading3"/>
         <w:spacing w:before="281" w:beforeAutospacing="off" w:after="281" w:afterAutospacing="off"/>
-      </w:pPr>
-      <w:r>
-        <w:rPr>
-          <w:rFonts w:ascii="Aptos" w:hAnsi="Aptos" w:eastAsia="Aptos" w:cs="Aptos"/>
-          <w:b w:val="1"/>
-          <w:bCs w:val="1"/>
+        <w:rPr>
+          <w:rFonts w:ascii="Aptos" w:hAnsi="Aptos" w:eastAsia="Aptos" w:cs="Aptos"/>
+          <w:b w:val="0"/>
+          <w:bCs w:val="0"/>
+          <w:noProof w:val="0"/>
+          <w:sz w:val="28"/>
+          <w:szCs w:val="28"/>
+          <w:lang w:val="es-ES"/>
+        </w:rPr>
+      </w:pPr>
+      <w:r>
+        <w:rPr>
+          <w:rFonts w:ascii="Aptos" w:hAnsi="Aptos" w:eastAsia="Aptos" w:cs="Aptos"/>
+          <w:b w:val="0"/>
+          <w:bCs w:val="0"/>
           <w:noProof w:val="0"/>
           <w:sz w:val="28"/>
           <w:szCs w:val="28"/>
@@ -5201,53 +5219,62 @@
       <w:pPr>
         <w:pStyle w:val="Heading3"/>
         <w:spacing w:before="281" w:beforeAutospacing="off" w:after="281" w:afterAutospacing="off"/>
-      </w:pPr>
-      <w:r>
-        <w:rPr>
-          <w:rFonts w:ascii="Aptos" w:hAnsi="Aptos" w:eastAsia="Aptos" w:cs="Aptos"/>
-          <w:b w:val="1"/>
-          <w:bCs w:val="1"/>
+        <w:rPr>
+          <w:rFonts w:ascii="Aptos" w:hAnsi="Aptos" w:eastAsia="Aptos" w:cs="Aptos"/>
+          <w:b w:val="0"/>
+          <w:bCs w:val="0"/>
           <w:noProof w:val="0"/>
           <w:sz w:val="28"/>
           <w:szCs w:val="28"/>
           <w:lang w:val="es-ES"/>
         </w:rPr>
-        <w:t>3</w:t>
-      </w:r>
-      <w:r>
-        <w:rPr>
-          <w:rFonts w:ascii="Aptos" w:hAnsi="Aptos" w:eastAsia="Aptos" w:cs="Aptos"/>
-          <w:b w:val="1"/>
-          <w:bCs w:val="1"/>
+      </w:pPr>
+      <w:r>
+        <w:rPr>
+          <w:rFonts w:ascii="Aptos" w:hAnsi="Aptos" w:eastAsia="Aptos" w:cs="Aptos"/>
+          <w:b w:val="0"/>
+          <w:bCs w:val="0"/>
           <w:noProof w:val="0"/>
           <w:sz w:val="28"/>
           <w:szCs w:val="28"/>
           <w:lang w:val="es-ES"/>
         </w:rPr>
-        <w:t>. Pulido de UX: El fin de los "</w:t>
-      </w:r>
-      <w:r>
-        <w:rPr>
-          <w:rFonts w:ascii="Aptos" w:hAnsi="Aptos" w:eastAsia="Aptos" w:cs="Aptos"/>
-          <w:b w:val="1"/>
-          <w:bCs w:val="1"/>
+        <w:t>3</w:t>
+      </w:r>
+      <w:r>
+        <w:rPr>
+          <w:rFonts w:ascii="Aptos" w:hAnsi="Aptos" w:eastAsia="Aptos" w:cs="Aptos"/>
+          <w:b w:val="0"/>
+          <w:bCs w:val="0"/>
           <w:noProof w:val="0"/>
           <w:sz w:val="28"/>
           <w:szCs w:val="28"/>
           <w:lang w:val="es-ES"/>
         </w:rPr>
-        <w:t>datos fantasma</w:t>
-      </w:r>
-      <w:r>
-        <w:rPr>
-          <w:rFonts w:ascii="Aptos" w:hAnsi="Aptos" w:eastAsia="Aptos" w:cs="Aptos"/>
-          <w:b w:val="1"/>
-          <w:bCs w:val="1"/>
+        <w:t>. Pulido de UX: El fin de los "</w:t>
+      </w:r>
+      <w:r>
+        <w:rPr>
+          <w:rFonts w:ascii="Aptos" w:hAnsi="Aptos" w:eastAsia="Aptos" w:cs="Aptos"/>
+          <w:b w:val="0"/>
+          <w:bCs w:val="0"/>
           <w:noProof w:val="0"/>
           <w:sz w:val="28"/>
           <w:szCs w:val="28"/>
           <w:lang w:val="es-ES"/>
         </w:rPr>
+        <w:t>datos fantasma</w:t>
+      </w:r>
+      <w:r>
+        <w:rPr>
+          <w:rFonts w:ascii="Aptos" w:hAnsi="Aptos" w:eastAsia="Aptos" w:cs="Aptos"/>
+          <w:b w:val="0"/>
+          <w:bCs w:val="0"/>
+          <w:noProof w:val="0"/>
+          <w:sz w:val="28"/>
+          <w:szCs w:val="28"/>
+          <w:lang w:val="es-ES"/>
+        </w:rPr>
         <w:t>"</w:t>
       </w:r>
     </w:p>
@@ -5313,24 +5340,33 @@
       <w:pPr>
         <w:pStyle w:val="Heading3"/>
         <w:spacing w:before="281" w:beforeAutospacing="off" w:after="281" w:afterAutospacing="off"/>
-      </w:pPr>
-      <w:r>
-        <w:rPr>
-          <w:rFonts w:ascii="Aptos" w:hAnsi="Aptos" w:eastAsia="Aptos" w:cs="Aptos"/>
-          <w:b w:val="1"/>
-          <w:bCs w:val="1"/>
+        <w:rPr>
+          <w:rFonts w:ascii="Aptos" w:hAnsi="Aptos" w:eastAsia="Aptos" w:cs="Aptos"/>
+          <w:b w:val="0"/>
+          <w:bCs w:val="0"/>
           <w:noProof w:val="0"/>
           <w:sz w:val="28"/>
           <w:szCs w:val="28"/>
           <w:lang w:val="es-ES"/>
         </w:rPr>
+      </w:pPr>
+      <w:r>
+        <w:rPr>
+          <w:rFonts w:ascii="Aptos" w:hAnsi="Aptos" w:eastAsia="Aptos" w:cs="Aptos"/>
+          <w:b w:val="0"/>
+          <w:bCs w:val="0"/>
+          <w:noProof w:val="0"/>
+          <w:sz w:val="28"/>
+          <w:szCs w:val="28"/>
+          <w:lang w:val="es-ES"/>
+        </w:rPr>
         <w:t>4</w:t>
       </w:r>
       <w:r>
         <w:rPr>
           <w:rFonts w:ascii="Aptos" w:hAnsi="Aptos" w:eastAsia="Aptos" w:cs="Aptos"/>
-          <w:b w:val="1"/>
-          <w:bCs w:val="1"/>
+          <w:b w:val="0"/>
+          <w:bCs w:val="0"/>
           <w:noProof w:val="0"/>
           <w:sz w:val="28"/>
           <w:szCs w:val="28"/>
@@ -5705,6 +5741,532 @@
           <w:lang w:val="es-ES"/>
         </w:rPr>
       </w:pPr>
+    </w:p>
+    <w:p>
+      <w:pPr>
+        <w:pStyle w:val="Normal"/>
+      </w:pPr>
+    </w:p>
+    <w:p>
+      <w:r>
+        <w:br w:type="page"/>
+      </w:r>
+    </w:p>
+    <w:p>
+      <w:pPr>
+        <w:spacing w:before="240" w:beforeAutospacing="off" w:after="240" w:afterAutospacing="off"/>
+      </w:pPr>
+      <w:r>
+        <w:rPr>
+          <w:rFonts w:ascii="Aptos" w:hAnsi="Aptos" w:eastAsia="Aptos" w:cs="Aptos"/>
+          <w:b w:val="1"/>
+          <w:bCs w:val="1"/>
+          <w:noProof w:val="0"/>
+          <w:sz w:val="24"/>
+          <w:szCs w:val="24"/>
+          <w:lang w:val="es-ES"/>
+        </w:rPr>
+        <w:t>Fecha:</w:t>
+      </w:r>
+      <w:r>
+        <w:rPr>
+          <w:rFonts w:ascii="Aptos" w:hAnsi="Aptos" w:eastAsia="Aptos" w:cs="Aptos"/>
+          <w:noProof w:val="0"/>
+          <w:sz w:val="24"/>
+          <w:szCs w:val="24"/>
+          <w:lang w:val="es-ES"/>
+        </w:rPr>
+        <w:t xml:space="preserve"> 2 de mayo de 2026 </w:t>
+      </w:r>
+    </w:p>
+    <w:p>
+      <w:pPr>
+        <w:spacing w:before="240" w:beforeAutospacing="off" w:after="240" w:afterAutospacing="off"/>
+      </w:pPr>
+      <w:r>
+        <w:rPr>
+          <w:rFonts w:ascii="Aptos" w:hAnsi="Aptos" w:eastAsia="Aptos" w:cs="Aptos"/>
+          <w:b w:val="1"/>
+          <w:bCs w:val="1"/>
+          <w:noProof w:val="0"/>
+          <w:sz w:val="24"/>
+          <w:szCs w:val="24"/>
+          <w:lang w:val="es-ES"/>
+        </w:rPr>
+        <w:t>Objetivo:</w:t>
+      </w:r>
+      <w:r>
+        <w:rPr>
+          <w:rFonts w:ascii="Aptos" w:hAnsi="Aptos" w:eastAsia="Aptos" w:cs="Aptos"/>
+          <w:noProof w:val="0"/>
+          <w:sz w:val="24"/>
+          <w:szCs w:val="24"/>
+          <w:lang w:val="es-ES"/>
+        </w:rPr>
+        <w:t xml:space="preserve"> Consolidación de la documentación técnica, despliegue de la infraestructura de </w:t>
+      </w:r>
+      <w:r>
+        <w:rPr>
+          <w:rFonts w:ascii="Aptos" w:hAnsi="Aptos" w:eastAsia="Aptos" w:cs="Aptos"/>
+          <w:noProof w:val="0"/>
+          <w:sz w:val="24"/>
+          <w:szCs w:val="24"/>
+          <w:lang w:val="es-ES"/>
+        </w:rPr>
+        <w:t>pruebas y</w:t>
+      </w:r>
+      <w:r>
+        <w:rPr>
+          <w:rFonts w:ascii="Aptos" w:hAnsi="Aptos" w:eastAsia="Aptos" w:cs="Aptos"/>
+          <w:noProof w:val="0"/>
+          <w:sz w:val="24"/>
+          <w:szCs w:val="24"/>
+          <w:lang w:val="es-ES"/>
+        </w:rPr>
+        <w:t xml:space="preserve"> cierre del hito.</w:t>
+      </w:r>
+    </w:p>
+    <w:p>
+      <w:pPr>
+        <w:pStyle w:val="Heading3"/>
+      </w:pPr>
+      <w:r>
+        <w:rPr>
+          <w:noProof w:val="0"/>
+          <w:lang w:val="es-ES"/>
+        </w:rPr>
+        <w:t>1. Implementación de Infraestructura de Pruebas Unitarias</w:t>
+      </w:r>
+      <w:r>
+        <w:rPr>
+          <w:noProof w:val="0"/>
+          <w:lang w:val="es-ES"/>
+        </w:rPr>
+        <w:t xml:space="preserve"> </w:t>
+      </w:r>
+    </w:p>
+    <w:p>
+      <w:pPr>
+        <w:spacing w:before="240" w:beforeAutospacing="off" w:after="240" w:afterAutospacing="off"/>
+      </w:pPr>
+      <w:r>
+        <w:rPr>
+          <w:rFonts w:ascii="Aptos" w:hAnsi="Aptos" w:eastAsia="Aptos" w:cs="Aptos"/>
+          <w:noProof w:val="0"/>
+          <w:sz w:val="24"/>
+          <w:szCs w:val="24"/>
+          <w:lang w:val="es-ES"/>
+        </w:rPr>
+        <w:t xml:space="preserve">Se ha configurado el entorno de pruebas en el </w:t>
+      </w:r>
+      <w:r>
+        <w:rPr>
+          <w:rFonts w:ascii="Aptos" w:hAnsi="Aptos" w:eastAsia="Aptos" w:cs="Aptos"/>
+          <w:noProof w:val="0"/>
+          <w:sz w:val="24"/>
+          <w:szCs w:val="24"/>
+          <w:lang w:val="es-ES"/>
+        </w:rPr>
+        <w:t>backend</w:t>
+      </w:r>
+      <w:r>
+        <w:rPr>
+          <w:rFonts w:ascii="Aptos" w:hAnsi="Aptos" w:eastAsia="Aptos" w:cs="Aptos"/>
+          <w:noProof w:val="0"/>
+          <w:sz w:val="24"/>
+          <w:szCs w:val="24"/>
+          <w:lang w:val="es-ES"/>
+        </w:rPr>
+        <w:t xml:space="preserve">, definiendo la estructura de directorios </w:t>
+      </w:r>
+      <w:r>
+        <w:rPr>
+          <w:rFonts w:ascii="Consolas" w:hAnsi="Consolas" w:eastAsia="Consolas" w:cs="Consolas"/>
+          <w:noProof w:val="0"/>
+          <w:sz w:val="24"/>
+          <w:szCs w:val="24"/>
+          <w:lang w:val="es-ES"/>
+        </w:rPr>
+        <w:t>src</w:t>
+      </w:r>
+      <w:r>
+        <w:rPr>
+          <w:rFonts w:ascii="Consolas" w:hAnsi="Consolas" w:eastAsia="Consolas" w:cs="Consolas"/>
+          <w:noProof w:val="0"/>
+          <w:sz w:val="24"/>
+          <w:szCs w:val="24"/>
+          <w:lang w:val="es-ES"/>
+        </w:rPr>
+        <w:t>/test/java</w:t>
+      </w:r>
+      <w:r>
+        <w:rPr>
+          <w:rFonts w:ascii="Aptos" w:hAnsi="Aptos" w:eastAsia="Aptos" w:cs="Aptos"/>
+          <w:noProof w:val="0"/>
+          <w:sz w:val="24"/>
+          <w:szCs w:val="24"/>
+          <w:lang w:val="es-ES"/>
+        </w:rPr>
+        <w:t xml:space="preserve"> y ajustando el gestor de dependencias Maven (</w:t>
+      </w:r>
+      <w:r>
+        <w:rPr>
+          <w:rFonts w:ascii="Consolas" w:hAnsi="Consolas" w:eastAsia="Consolas" w:cs="Consolas"/>
+          <w:noProof w:val="0"/>
+          <w:sz w:val="24"/>
+          <w:szCs w:val="24"/>
+          <w:lang w:val="es-ES"/>
+        </w:rPr>
+        <w:t>pom.xml</w:t>
+      </w:r>
+      <w:r>
+        <w:rPr>
+          <w:rFonts w:ascii="Aptos" w:hAnsi="Aptos" w:eastAsia="Aptos" w:cs="Aptos"/>
+          <w:noProof w:val="0"/>
+          <w:sz w:val="24"/>
+          <w:szCs w:val="24"/>
+          <w:lang w:val="es-ES"/>
+        </w:rPr>
+        <w:t xml:space="preserve">) para integrar </w:t>
+      </w:r>
+      <w:r>
+        <w:rPr>
+          <w:rFonts w:ascii="Aptos" w:hAnsi="Aptos" w:eastAsia="Aptos" w:cs="Aptos"/>
+          <w:b w:val="1"/>
+          <w:bCs w:val="1"/>
+          <w:noProof w:val="0"/>
+          <w:sz w:val="24"/>
+          <w:szCs w:val="24"/>
+          <w:lang w:val="es-ES"/>
+        </w:rPr>
+        <w:t>JUnit</w:t>
+      </w:r>
+      <w:r>
+        <w:rPr>
+          <w:rFonts w:ascii="Aptos" w:hAnsi="Aptos" w:eastAsia="Aptos" w:cs="Aptos"/>
+          <w:b w:val="1"/>
+          <w:bCs w:val="1"/>
+          <w:noProof w:val="0"/>
+          <w:sz w:val="24"/>
+          <w:szCs w:val="24"/>
+          <w:lang w:val="es-ES"/>
+        </w:rPr>
+        <w:t xml:space="preserve"> 5 (</w:t>
+      </w:r>
+      <w:r>
+        <w:rPr>
+          <w:rFonts w:ascii="Aptos" w:hAnsi="Aptos" w:eastAsia="Aptos" w:cs="Aptos"/>
+          <w:b w:val="1"/>
+          <w:bCs w:val="1"/>
+          <w:noProof w:val="0"/>
+          <w:sz w:val="24"/>
+          <w:szCs w:val="24"/>
+          <w:lang w:val="es-ES"/>
+        </w:rPr>
+        <w:t>Jupiter</w:t>
+      </w:r>
+      <w:r>
+        <w:rPr>
+          <w:rFonts w:ascii="Aptos" w:hAnsi="Aptos" w:eastAsia="Aptos" w:cs="Aptos"/>
+          <w:b w:val="1"/>
+          <w:bCs w:val="1"/>
+          <w:noProof w:val="0"/>
+          <w:sz w:val="24"/>
+          <w:szCs w:val="24"/>
+          <w:lang w:val="es-ES"/>
+        </w:rPr>
+        <w:t>)</w:t>
+      </w:r>
+      <w:r>
+        <w:rPr>
+          <w:rFonts w:ascii="Aptos" w:hAnsi="Aptos" w:eastAsia="Aptos" w:cs="Aptos"/>
+          <w:noProof w:val="0"/>
+          <w:sz w:val="24"/>
+          <w:szCs w:val="24"/>
+          <w:lang w:val="es-ES"/>
+        </w:rPr>
+        <w:t xml:space="preserve"> mediante </w:t>
+      </w:r>
+      <w:r>
+        <w:rPr>
+          <w:rFonts w:ascii="Consolas" w:hAnsi="Consolas" w:eastAsia="Consolas" w:cs="Consolas"/>
+          <w:noProof w:val="0"/>
+          <w:sz w:val="24"/>
+          <w:szCs w:val="24"/>
+          <w:lang w:val="es-ES"/>
+        </w:rPr>
+        <w:t>spring</w:t>
+      </w:r>
+      <w:r>
+        <w:rPr>
+          <w:rFonts w:ascii="Consolas" w:hAnsi="Consolas" w:eastAsia="Consolas" w:cs="Consolas"/>
+          <w:noProof w:val="0"/>
+          <w:sz w:val="24"/>
+          <w:szCs w:val="24"/>
+          <w:lang w:val="es-ES"/>
+        </w:rPr>
+        <w:t>-</w:t>
+      </w:r>
+      <w:r>
+        <w:rPr>
+          <w:rFonts w:ascii="Consolas" w:hAnsi="Consolas" w:eastAsia="Consolas" w:cs="Consolas"/>
+          <w:noProof w:val="0"/>
+          <w:sz w:val="24"/>
+          <w:szCs w:val="24"/>
+          <w:lang w:val="es-ES"/>
+        </w:rPr>
+        <w:t>boot</w:t>
+      </w:r>
+      <w:r>
+        <w:rPr>
+          <w:rFonts w:ascii="Consolas" w:hAnsi="Consolas" w:eastAsia="Consolas" w:cs="Consolas"/>
+          <w:noProof w:val="0"/>
+          <w:sz w:val="24"/>
+          <w:szCs w:val="24"/>
+          <w:lang w:val="es-ES"/>
+        </w:rPr>
+        <w:t>-starter-test</w:t>
+      </w:r>
+      <w:r>
+        <w:rPr>
+          <w:rFonts w:ascii="Aptos" w:hAnsi="Aptos" w:eastAsia="Aptos" w:cs="Aptos"/>
+          <w:noProof w:val="0"/>
+          <w:sz w:val="24"/>
+          <w:szCs w:val="24"/>
+          <w:lang w:val="es-ES"/>
+        </w:rPr>
+        <w:t>.</w:t>
+      </w:r>
+    </w:p>
+    <w:p>
+      <w:pPr>
+        <w:pStyle w:val="Heading3"/>
+        <w:rPr>
+          <w:rFonts w:ascii="Aptos" w:hAnsi="Aptos" w:eastAsia="Aptos" w:cs="Aptos"/>
+          <w:noProof w:val="0"/>
+          <w:sz w:val="24"/>
+          <w:szCs w:val="24"/>
+          <w:lang w:val="es-ES"/>
+        </w:rPr>
+      </w:pPr>
+      <w:r>
+        <w:rPr>
+          <w:noProof w:val="0"/>
+          <w:lang w:val="es-ES"/>
+        </w:rPr>
+        <w:t xml:space="preserve">2. Desarrollo de Pruebas de Dominio </w:t>
+      </w:r>
+    </w:p>
+    <w:p>
+      <w:pPr>
+        <w:spacing w:before="240" w:beforeAutospacing="off" w:after="240" w:afterAutospacing="off"/>
+      </w:pPr>
+      <w:r>
+        <w:rPr>
+          <w:rFonts w:ascii="Aptos" w:hAnsi="Aptos" w:eastAsia="Aptos" w:cs="Aptos"/>
+          <w:noProof w:val="0"/>
+          <w:sz w:val="24"/>
+          <w:szCs w:val="24"/>
+          <w:lang w:val="es-ES"/>
+        </w:rPr>
+        <w:t xml:space="preserve">Se ha desarrollado la suite </w:t>
+      </w:r>
+      <w:r>
+        <w:rPr>
+          <w:rFonts w:ascii="Consolas" w:hAnsi="Consolas" w:eastAsia="Consolas" w:cs="Consolas"/>
+          <w:noProof w:val="0"/>
+          <w:sz w:val="24"/>
+          <w:szCs w:val="24"/>
+          <w:lang w:val="es-ES"/>
+        </w:rPr>
+        <w:t>UsuarioTest.java</w:t>
+      </w:r>
+      <w:r>
+        <w:rPr>
+          <w:rFonts w:ascii="Aptos" w:hAnsi="Aptos" w:eastAsia="Aptos" w:cs="Aptos"/>
+          <w:noProof w:val="0"/>
+          <w:sz w:val="24"/>
+          <w:szCs w:val="24"/>
+          <w:lang w:val="es-ES"/>
+        </w:rPr>
+        <w:t xml:space="preserve"> para validar la lógica interna del modelo de datos de forma aislada, sin acoplamiento a la base de datos MySQL. Las pruebas garantizan que la asignación de propiedades críticas (como los roles de acceso) funciona correctamente, validando casos de frontera como la no asignación accidental de privilegios de administrador por defecto.</w:t>
+      </w:r>
+    </w:p>
+    <w:p>
+      <w:pPr>
+        <w:pStyle w:val="Heading3"/>
+        <w:rPr>
+          <w:noProof w:val="0"/>
+          <w:lang w:val="es-ES"/>
+        </w:rPr>
+      </w:pPr>
+      <w:r>
+        <w:rPr>
+          <w:noProof w:val="0"/>
+          <w:lang w:val="es-ES"/>
+        </w:rPr>
+        <w:t xml:space="preserve">3. Resolución de Incidencias de Entorno </w:t>
+      </w:r>
+    </w:p>
+    <w:p>
+      <w:pPr>
+        <w:spacing w:before="240" w:beforeAutospacing="off" w:after="240" w:afterAutospacing="off"/>
+      </w:pPr>
+      <w:r>
+        <w:rPr>
+          <w:rFonts w:ascii="Aptos" w:hAnsi="Aptos" w:eastAsia="Aptos" w:cs="Aptos"/>
+          <w:noProof w:val="0"/>
+          <w:sz w:val="24"/>
+          <w:szCs w:val="24"/>
+          <w:lang w:val="es-ES"/>
+        </w:rPr>
+        <w:t xml:space="preserve">Durante la configuración de las pruebas, surgió una incidencia de dependencias donde el entorno de desarrollo (IntelliJ) no reconocía las anotaciones </w:t>
+      </w:r>
+      <w:r>
+        <w:rPr>
+          <w:rFonts w:ascii="Consolas" w:hAnsi="Consolas" w:eastAsia="Consolas" w:cs="Consolas"/>
+          <w:noProof w:val="0"/>
+          <w:sz w:val="24"/>
+          <w:szCs w:val="24"/>
+          <w:lang w:val="es-ES"/>
+        </w:rPr>
+        <w:t>@Test</w:t>
+      </w:r>
+      <w:r>
+        <w:rPr>
+          <w:rFonts w:ascii="Aptos" w:hAnsi="Aptos" w:eastAsia="Aptos" w:cs="Aptos"/>
+          <w:noProof w:val="0"/>
+          <w:sz w:val="24"/>
+          <w:szCs w:val="24"/>
+          <w:lang w:val="es-ES"/>
+        </w:rPr>
+        <w:t>. El problema derivaba de una desincronización en el ciclo de construcción de Maven. Se solucionó forzando una recarga completa del árbol de dependencias (</w:t>
+      </w:r>
+      <w:r>
+        <w:rPr>
+          <w:rFonts w:ascii="Consolas" w:hAnsi="Consolas" w:eastAsia="Consolas" w:cs="Consolas"/>
+          <w:noProof w:val="0"/>
+          <w:sz w:val="24"/>
+          <w:szCs w:val="24"/>
+          <w:lang w:val="es-ES"/>
+        </w:rPr>
+        <w:t>Reload All Maven Projects</w:t>
+      </w:r>
+      <w:r>
+        <w:rPr>
+          <w:rFonts w:ascii="Aptos" w:hAnsi="Aptos" w:eastAsia="Aptos" w:cs="Aptos"/>
+          <w:noProof w:val="0"/>
+          <w:sz w:val="24"/>
+          <w:szCs w:val="24"/>
+          <w:lang w:val="es-ES"/>
+        </w:rPr>
+        <w:t>), lo que permitió la correcta indexación de la librería y la ejecución exitosa de la batería de pruebas.</w:t>
+      </w:r>
+    </w:p>
+    <w:p>
+      <w:pPr>
+        <w:pStyle w:val="Heading3"/>
+      </w:pPr>
+      <w:r>
+        <w:rPr>
+          <w:noProof w:val="0"/>
+          <w:lang w:val="es-ES"/>
+        </w:rPr>
+        <w:t xml:space="preserve">4. Plan de Contingencia y Validación </w:t>
+      </w:r>
+    </w:p>
+    <w:p>
+      <w:pPr>
+        <w:spacing w:before="240" w:beforeAutospacing="off" w:after="240" w:afterAutospacing="off"/>
+      </w:pPr>
+      <w:r>
+        <w:rPr>
+          <w:rFonts w:ascii="Aptos" w:hAnsi="Aptos" w:eastAsia="Aptos" w:cs="Aptos"/>
+          <w:noProof w:val="0"/>
+          <w:sz w:val="24"/>
+          <w:szCs w:val="24"/>
+          <w:lang w:val="es-ES"/>
+        </w:rPr>
+        <w:t xml:space="preserve">Se ha finalizado la redacción de la memoria técnica del proyecto. Siguiendo los requisitos del hito, se ha documentado exhaustivamente el </w:t>
+      </w:r>
+      <w:r>
+        <w:rPr>
+          <w:rFonts w:ascii="Aptos" w:hAnsi="Aptos" w:eastAsia="Aptos" w:cs="Aptos"/>
+          <w:b w:val="1"/>
+          <w:bCs w:val="1"/>
+          <w:noProof w:val="0"/>
+          <w:sz w:val="24"/>
+          <w:szCs w:val="24"/>
+          <w:lang w:val="es-ES"/>
+        </w:rPr>
+        <w:t>Disaster</w:t>
+      </w:r>
+      <w:r>
+        <w:rPr>
+          <w:rFonts w:ascii="Aptos" w:hAnsi="Aptos" w:eastAsia="Aptos" w:cs="Aptos"/>
+          <w:b w:val="1"/>
+          <w:bCs w:val="1"/>
+          <w:noProof w:val="0"/>
+          <w:sz w:val="24"/>
+          <w:szCs w:val="24"/>
+          <w:lang w:val="es-ES"/>
+        </w:rPr>
+        <w:t xml:space="preserve"> </w:t>
+      </w:r>
+      <w:r>
+        <w:rPr>
+          <w:rFonts w:ascii="Aptos" w:hAnsi="Aptos" w:eastAsia="Aptos" w:cs="Aptos"/>
+          <w:b w:val="1"/>
+          <w:bCs w:val="1"/>
+          <w:noProof w:val="0"/>
+          <w:sz w:val="24"/>
+          <w:szCs w:val="24"/>
+          <w:lang w:val="es-ES"/>
+        </w:rPr>
+        <w:t>Recovery</w:t>
+      </w:r>
+      <w:r>
+        <w:rPr>
+          <w:rFonts w:ascii="Aptos" w:hAnsi="Aptos" w:eastAsia="Aptos" w:cs="Aptos"/>
+          <w:b w:val="1"/>
+          <w:bCs w:val="1"/>
+          <w:noProof w:val="0"/>
+          <w:sz w:val="24"/>
+          <w:szCs w:val="24"/>
+          <w:lang w:val="es-ES"/>
+        </w:rPr>
+        <w:t xml:space="preserve"> Plan</w:t>
+      </w:r>
+      <w:r>
+        <w:rPr>
+          <w:rFonts w:ascii="Aptos" w:hAnsi="Aptos" w:eastAsia="Aptos" w:cs="Aptos"/>
+          <w:noProof w:val="0"/>
+          <w:sz w:val="24"/>
+          <w:szCs w:val="24"/>
+          <w:lang w:val="es-ES"/>
+        </w:rPr>
+        <w:t>, detallando los comandos precisos para el volcado lógico (</w:t>
+      </w:r>
+      <w:r>
+        <w:rPr>
+          <w:rFonts w:ascii="Consolas" w:hAnsi="Consolas" w:eastAsia="Consolas" w:cs="Consolas"/>
+          <w:noProof w:val="0"/>
+          <w:sz w:val="24"/>
+          <w:szCs w:val="24"/>
+          <w:lang w:val="es-ES"/>
+        </w:rPr>
+        <w:t>mysqldump</w:t>
+      </w:r>
+      <w:r>
+        <w:rPr>
+          <w:rFonts w:ascii="Aptos" w:hAnsi="Aptos" w:eastAsia="Aptos" w:cs="Aptos"/>
+          <w:noProof w:val="0"/>
+          <w:sz w:val="24"/>
+          <w:szCs w:val="24"/>
+          <w:lang w:val="es-ES"/>
+        </w:rPr>
+        <w:t>) y la restauración desde contenedores Docker. Se ha integrado la matriz del plan de pruebas manuales, dejando el proyecto estabilizado, documentado y listo para su despliegue y evaluación.</w:t>
+      </w:r>
     </w:p>
     <w:p>
       <w:pPr>

</xml_diff>

<commit_message>
Terminado el plan de recuperacion ya probado con documentacion actualizada
</commit_message>
<xml_diff>
--- a/Documentacion/Bitacora_Joaquin.docx
+++ b/Documentacion/Bitacora_Joaquin.docx
@@ -6271,6 +6271,1319 @@
     <w:p>
       <w:pPr>
         <w:pStyle w:val="Normal"/>
+      </w:pPr>
+    </w:p>
+    <w:p>
+      <w:pPr>
+        <w:pStyle w:val="Normal"/>
+      </w:pPr>
+    </w:p>
+    <w:p>
+      <w:r>
+        <w:br w:type="page"/>
+      </w:r>
+    </w:p>
+    <w:p>
+      <w:pPr>
+        <w:spacing w:before="240" w:beforeAutospacing="off" w:after="240" w:afterAutospacing="off"/>
+      </w:pPr>
+      <w:r>
+        <w:rPr>
+          <w:rFonts w:ascii="Aptos" w:hAnsi="Aptos" w:eastAsia="Aptos" w:cs="Aptos" w:asciiTheme="minorAscii" w:hAnsiTheme="minorAscii" w:eastAsiaTheme="minorAscii" w:cstheme="minorBidi"/>
+          <w:b w:val="1"/>
+          <w:bCs w:val="1"/>
+          <w:noProof w:val="0"/>
+          <w:color w:val="auto"/>
+          <w:sz w:val="24"/>
+          <w:szCs w:val="24"/>
+          <w:lang w:val="es-ES" w:eastAsia="en-US" w:bidi="ar-SA"/>
+        </w:rPr>
+        <w:t>Fecha:</w:t>
+      </w:r>
+      <w:r>
+        <w:rPr>
+          <w:rFonts w:ascii="Aptos" w:hAnsi="Aptos" w:eastAsia="Aptos" w:cs="Aptos"/>
+          <w:noProof w:val="0"/>
+          <w:sz w:val="24"/>
+          <w:szCs w:val="24"/>
+          <w:lang w:val="es-ES"/>
+        </w:rPr>
+        <w:t xml:space="preserve"> 5 de mayo de 2026</w:t>
+      </w:r>
+    </w:p>
+    <w:p>
+      <w:pPr>
+        <w:spacing w:before="240" w:beforeAutospacing="off" w:after="240" w:afterAutospacing="off"/>
+      </w:pPr>
+      <w:r>
+        <w:rPr>
+          <w:rFonts w:ascii="Aptos" w:hAnsi="Aptos" w:eastAsia="Aptos" w:cs="Aptos" w:asciiTheme="minorAscii" w:hAnsiTheme="minorAscii" w:eastAsiaTheme="minorAscii" w:cstheme="minorBidi"/>
+          <w:b w:val="1"/>
+          <w:bCs w:val="1"/>
+          <w:noProof w:val="0"/>
+          <w:color w:val="auto"/>
+          <w:sz w:val="24"/>
+          <w:szCs w:val="24"/>
+          <w:lang w:val="es-ES" w:eastAsia="en-US" w:bidi="ar-SA"/>
+        </w:rPr>
+        <w:t>Objetivo:</w:t>
+      </w:r>
+      <w:r>
+        <w:rPr>
+          <w:rFonts w:ascii="Aptos" w:hAnsi="Aptos" w:eastAsia="Aptos" w:cs="Aptos"/>
+          <w:noProof w:val="0"/>
+          <w:sz w:val="24"/>
+          <w:szCs w:val="24"/>
+          <w:lang w:val="es-ES"/>
+        </w:rPr>
+        <w:t xml:space="preserve"> Resolución de incidencias de QA, sincronización de entornos para simulacros de contingencia y configuración del despliegue en la nube.</w:t>
+      </w:r>
+    </w:p>
+    <w:p>
+      <w:pPr>
+        <w:pStyle w:val="Heading3"/>
+        <w:rPr>
+          <w:rFonts w:ascii="Aptos" w:hAnsi="Aptos" w:eastAsia="Aptos" w:cs="Aptos"/>
+          <w:noProof w:val="0"/>
+          <w:sz w:val="24"/>
+          <w:szCs w:val="24"/>
+          <w:lang w:val="es-ES"/>
+        </w:rPr>
+      </w:pPr>
+      <w:r>
+        <w:rPr>
+          <w:noProof w:val="0"/>
+          <w:lang w:val="es-ES"/>
+        </w:rPr>
+        <w:t xml:space="preserve">1. </w:t>
+      </w:r>
+      <w:r>
+        <w:rPr>
+          <w:noProof w:val="0"/>
+          <w:lang w:val="es-ES"/>
+        </w:rPr>
+        <w:t xml:space="preserve">Pruebas de Integración y Refactorización del </w:t>
+      </w:r>
+      <w:r>
+        <w:rPr>
+          <w:noProof w:val="0"/>
+          <w:lang w:val="es-ES"/>
+        </w:rPr>
+        <w:t>Backend</w:t>
+      </w:r>
+    </w:p>
+    <w:p>
+      <w:pPr>
+        <w:spacing w:before="240" w:beforeAutospacing="off" w:after="240" w:afterAutospacing="off"/>
+      </w:pPr>
+      <w:r>
+        <w:rPr>
+          <w:rFonts w:ascii="Aptos" w:hAnsi="Aptos" w:eastAsia="Aptos" w:cs="Aptos"/>
+          <w:noProof w:val="0"/>
+          <w:sz w:val="24"/>
+          <w:szCs w:val="24"/>
+          <w:lang w:val="es-ES"/>
+        </w:rPr>
+        <w:t>Se han desarrollado cuatro suites de pruebas automatizadas para los controladores principales del sistema (AdminController, ArticuloController, CategoriaController, AuthController). Se ha implementado la arquitectura de pruebas utilizando MockMvc para simular peticiones HTTP y la anotación @MockitoBean, estándar en Spring Boot 3.4.x, para aislar los servicios dependientes. Las pruebas garantizan la correcta validación de la lógica de negocio restrictiva, asegurando la denegación de acceso (HTTP 403) a usuarios con la cuenta inactiva o sin el PIN verificado.</w:t>
+      </w:r>
+    </w:p>
+    <w:p>
+      <w:pPr>
+        <w:pStyle w:val="Heading3"/>
+        <w:rPr>
+          <w:rFonts w:ascii="Aptos" w:hAnsi="Aptos" w:eastAsia="Aptos" w:cs="Aptos"/>
+          <w:noProof w:val="0"/>
+          <w:sz w:val="24"/>
+          <w:szCs w:val="24"/>
+          <w:lang w:val="es-ES"/>
+        </w:rPr>
+      </w:pPr>
+      <w:r>
+        <w:rPr>
+          <w:noProof w:val="0"/>
+          <w:lang w:val="es-ES"/>
+        </w:rPr>
+        <w:t>2. Ejecución de Pruebas Manuales (E2E)</w:t>
+      </w:r>
+    </w:p>
+    <w:p>
+      <w:pPr>
+        <w:spacing w:before="240" w:beforeAutospacing="off" w:after="240" w:afterAutospacing="off"/>
+      </w:pPr>
+      <w:r>
+        <w:rPr>
+          <w:rFonts w:ascii="Aptos" w:hAnsi="Aptos" w:eastAsia="Aptos" w:cs="Aptos"/>
+          <w:noProof w:val="0"/>
+          <w:sz w:val="24"/>
+          <w:szCs w:val="24"/>
+          <w:lang w:val="es-ES"/>
+        </w:rPr>
+        <w:t>Se ha configurado el entorno cliente mediante Postman para validar el flujo real contra el servidor local. Se han documentado cinco escenarios de prueba que abarcan tanto flujos de éxito como de error (Happy Path y Sad Path). Esto incluye la correcta generación y captura del token JWT como Bearer Token en el endpoint de inicio de sesión, así como su posterior uso para la validación y autorización en rutas protegidas. Las evidencias visuales resultantes se han extraído para su inclusión en la memoria técnica.</w:t>
+      </w:r>
+    </w:p>
+    <w:p>
+      <w:pPr>
+        <w:pStyle w:val="Heading3"/>
+        <w:rPr>
+          <w:rFonts w:ascii="Aptos" w:hAnsi="Aptos" w:eastAsia="Aptos" w:cs="Aptos"/>
+          <w:noProof w:val="0"/>
+          <w:sz w:val="24"/>
+          <w:szCs w:val="24"/>
+          <w:lang w:val="es-ES"/>
+        </w:rPr>
+      </w:pPr>
+      <w:r>
+        <w:rPr>
+          <w:noProof w:val="0"/>
+          <w:lang w:val="es-ES"/>
+        </w:rPr>
+        <w:t>3. Preparación del Simulacro de Contingencia (</w:t>
+      </w:r>
+      <w:r>
+        <w:rPr>
+          <w:noProof w:val="0"/>
+          <w:lang w:val="es-ES"/>
+        </w:rPr>
+        <w:t>Disaster</w:t>
+      </w:r>
+      <w:r>
+        <w:rPr>
+          <w:noProof w:val="0"/>
+          <w:lang w:val="es-ES"/>
+        </w:rPr>
+        <w:t xml:space="preserve"> </w:t>
+      </w:r>
+      <w:r>
+        <w:rPr>
+          <w:noProof w:val="0"/>
+          <w:lang w:val="es-ES"/>
+        </w:rPr>
+        <w:t>Recovery</w:t>
+      </w:r>
+      <w:r>
+        <w:rPr>
+          <w:noProof w:val="0"/>
+          <w:lang w:val="es-ES"/>
+        </w:rPr>
+        <w:t>)</w:t>
+      </w:r>
+    </w:p>
+    <w:p>
+      <w:pPr>
+        <w:spacing w:before="240" w:beforeAutospacing="off" w:after="240" w:afterAutospacing="off"/>
+      </w:pPr>
+      <w:r>
+        <w:rPr>
+          <w:rFonts w:ascii="Aptos" w:hAnsi="Aptos" w:eastAsia="Aptos" w:cs="Aptos"/>
+          <w:noProof w:val="0"/>
+          <w:sz w:val="24"/>
+          <w:szCs w:val="24"/>
+          <w:lang w:val="es-ES"/>
+        </w:rPr>
+        <w:t>Se ha extraído el modelo DDL exacto directamente desde las entidades JPA del proyecto para generar un script de inicialización que clona la estructura de producción en el entorno local. Se ha configurado este entorno localizado utilizando contenedores Docker (mysql:8.0) y se ha adaptado el gestor de propiedades de Spring Boot. El simulacro físico de destrucción y recuperación de base de datos para validar el RTO y RPO ha quedado preparado y programado para su ejecución externa, debido a las restricciones operativas y de cortafuegos de la red corporativa actual.</w:t>
+      </w:r>
+    </w:p>
+    <w:p>
+      <w:pPr>
+        <w:pStyle w:val="Heading3"/>
+        <w:rPr>
+          <w:rFonts w:ascii="Aptos" w:hAnsi="Aptos" w:eastAsia="Aptos" w:cs="Aptos"/>
+          <w:noProof w:val="0"/>
+          <w:sz w:val="24"/>
+          <w:szCs w:val="24"/>
+          <w:lang w:val="es-ES"/>
+        </w:rPr>
+      </w:pPr>
+      <w:r>
+        <w:rPr>
+          <w:noProof w:val="0"/>
+          <w:lang w:val="es-ES"/>
+        </w:rPr>
+        <w:t>4. Gestión de Despliegue y Migración de Infraestructura</w:t>
+      </w:r>
+    </w:p>
+    <w:p>
+      <w:pPr>
+        <w:spacing w:before="240" w:beforeAutospacing="off" w:after="240" w:afterAutospacing="off"/>
+      </w:pPr>
+      <w:r>
+        <w:rPr>
+          <w:rFonts w:ascii="Aptos" w:hAnsi="Aptos" w:eastAsia="Aptos" w:cs="Aptos"/>
+          <w:noProof w:val="0"/>
+          <w:sz w:val="24"/>
+          <w:szCs w:val="24"/>
+          <w:lang w:val="es-ES"/>
+        </w:rPr>
+        <w:t>Se ha iniciado la fase de puesta en producción conectando el repositorio de control de versiones con plataformas PaaS. Durante el proceso en la plataforma Railway, se detectó una incidencia crítica de compatibilidad y codificación estricta (MalformedInputException) relacionada con caracteres UTF-8.</w:t>
+      </w:r>
+    </w:p>
+    <w:p>
+      <w:r>
+        <w:br w:type="page"/>
+      </w:r>
+    </w:p>
+    <w:p>
+      <w:pPr>
+        <w:spacing w:before="240" w:beforeAutospacing="off" w:after="240" w:afterAutospacing="off"/>
+      </w:pPr>
+      <w:r>
+        <w:rPr>
+          <w:rFonts w:ascii="Aptos" w:hAnsi="Aptos" w:eastAsia="Aptos" w:cs="Aptos"/>
+          <w:b w:val="1"/>
+          <w:bCs w:val="1"/>
+          <w:noProof w:val="0"/>
+          <w:sz w:val="24"/>
+          <w:szCs w:val="24"/>
+          <w:lang w:val="es-ES"/>
+        </w:rPr>
+        <w:t>Fecha:</w:t>
+      </w:r>
+      <w:r>
+        <w:rPr>
+          <w:rFonts w:ascii="Aptos" w:hAnsi="Aptos" w:eastAsia="Aptos" w:cs="Aptos"/>
+          <w:noProof w:val="0"/>
+          <w:sz w:val="24"/>
+          <w:szCs w:val="24"/>
+          <w:lang w:val="es-ES"/>
+        </w:rPr>
+        <w:t xml:space="preserve"> 06 de mayo de 2026</w:t>
+      </w:r>
+    </w:p>
+    <w:p>
+      <w:pPr>
+        <w:spacing w:before="240" w:beforeAutospacing="off" w:after="240" w:afterAutospacing="off"/>
+      </w:pPr>
+      <w:r>
+        <w:rPr>
+          <w:rFonts w:ascii="Aptos" w:hAnsi="Aptos" w:eastAsia="Aptos" w:cs="Aptos"/>
+          <w:noProof w:val="0"/>
+          <w:sz w:val="24"/>
+          <w:szCs w:val="24"/>
+          <w:lang w:val="es-ES"/>
+        </w:rPr>
+        <w:t>Hoy he enfocado mis esfuerzos en blindar la seguridad del backend, perfeccionar la adaptabilidad móvil y asegurar la integridad de los datos desde el cliente, dejando la arquitectura lista para el Beta Testing.</w:t>
+      </w:r>
+    </w:p>
+    <w:p>
+      <w:pPr>
+        <w:spacing w:before="240" w:beforeAutospacing="off" w:after="240" w:afterAutospacing="off"/>
+      </w:pPr>
+      <w:r>
+        <w:rPr>
+          <w:rFonts w:ascii="Aptos" w:hAnsi="Aptos" w:eastAsia="Aptos" w:cs="Aptos"/>
+          <w:noProof w:val="0"/>
+          <w:sz w:val="24"/>
+          <w:szCs w:val="24"/>
+          <w:lang w:val="es-ES"/>
+        </w:rPr>
+        <w:t>Estos son los avances de la jornada:</w:t>
+      </w:r>
+    </w:p>
+    <w:p>
+      <w:pPr>
+        <w:pStyle w:val="Heading3"/>
+        <w:suppressLineNumbers w:val="0"/>
+        <w:bidi w:val="0"/>
+        <w:spacing w:before="160" w:beforeAutospacing="off" w:after="80" w:afterAutospacing="off" w:line="279" w:lineRule="auto"/>
+        <w:ind w:left="0" w:right="0"/>
+        <w:jc w:val="left"/>
+      </w:pPr>
+      <w:r>
+        <w:rPr>
+          <w:noProof w:val="0"/>
+          <w:lang w:val="es-ES"/>
+        </w:rPr>
+        <w:t>1. Implementación del patrón DTO y seguridad</w:t>
+      </w:r>
+      <w:r>
+        <w:rPr>
+          <w:noProof w:val="0"/>
+          <w:lang w:val="es-ES"/>
+        </w:rPr>
+        <w:t xml:space="preserve"> </w:t>
+      </w:r>
+    </w:p>
+    <w:p>
+      <w:pPr>
+        <w:spacing w:before="240" w:beforeAutospacing="off" w:after="240" w:afterAutospacing="off"/>
+      </w:pPr>
+      <w:r>
+        <w:rPr>
+          <w:rFonts w:ascii="Aptos" w:hAnsi="Aptos" w:eastAsia="Aptos" w:cs="Aptos"/>
+          <w:noProof w:val="0"/>
+          <w:sz w:val="24"/>
+          <w:szCs w:val="24"/>
+          <w:lang w:val="es-ES"/>
+        </w:rPr>
+        <w:t>He rediseñado la capa de presentación del servidor aislando el modelo de base de datos. Con esto, he mitigado vulnerabilidades críticas y evitado la exposición accidental de datos sensibles (contraseñas, pines) en las respuestas JSON.</w:t>
+      </w:r>
+    </w:p>
+    <w:p>
+      <w:pPr>
+        <w:spacing w:before="240" w:beforeAutospacing="off" w:after="240" w:afterAutospacing="off"/>
+        <w:rPr>
+          <w:noProof w:val="0"/>
+          <w:lang w:val="es-ES"/>
+        </w:rPr>
+      </w:pPr>
+      <w:r>
+        <w:rPr>
+          <w:rFonts w:ascii="Aptos" w:hAnsi="Aptos" w:eastAsia="" w:cs="" w:asciiTheme="minorAscii" w:hAnsiTheme="minorAscii" w:eastAsiaTheme="majorEastAsia" w:cstheme="majorBidi"/>
+          <w:noProof w:val="0"/>
+          <w:color w:val="0F4761" w:themeColor="accent1" w:themeTint="FF" w:themeShade="BF"/>
+          <w:sz w:val="28"/>
+          <w:szCs w:val="28"/>
+          <w:lang w:val="es-ES" w:eastAsia="en-US" w:bidi="ar-SA"/>
+        </w:rPr>
+        <w:t>2. Adaptación Mobile-First y navegación</w:t>
+      </w:r>
+      <w:r>
+        <w:rPr>
+          <w:rFonts w:ascii="Aptos" w:hAnsi="Aptos" w:eastAsia="" w:cs="" w:asciiTheme="minorAscii" w:hAnsiTheme="minorAscii" w:eastAsiaTheme="majorEastAsia" w:cstheme="majorBidi"/>
+          <w:noProof w:val="0"/>
+          <w:color w:val="0F4761" w:themeColor="accent1" w:themeTint="FF" w:themeShade="BF"/>
+          <w:sz w:val="28"/>
+          <w:szCs w:val="28"/>
+          <w:lang w:val="es-ES" w:eastAsia="en-US" w:bidi="ar-SA"/>
+        </w:rPr>
+        <w:t xml:space="preserve"> </w:t>
+      </w:r>
+    </w:p>
+    <w:p>
+      <w:pPr>
+        <w:spacing w:before="240" w:beforeAutospacing="off" w:after="240" w:afterAutospacing="off"/>
+      </w:pPr>
+      <w:r>
+        <w:rPr>
+          <w:rFonts w:ascii="Aptos" w:hAnsi="Aptos" w:eastAsia="Aptos" w:cs="Aptos"/>
+          <w:noProof w:val="0"/>
+          <w:sz w:val="24"/>
+          <w:szCs w:val="24"/>
+          <w:lang w:val="es-ES"/>
+        </w:rPr>
+        <w:t>He garantizado una visualización perfecta en móviles usando Media Queries para reorganizar las tarjetas con Flexbox. Además, he solucionado un molesto bloqueo de desplazamiento ("Scroll Lock") ajustando el CSS global para usar alturas relativas.</w:t>
+      </w:r>
+    </w:p>
+    <w:p>
+      <w:pPr>
+        <w:pStyle w:val="Normal"/>
+        <w:suppressLineNumbers w:val="0"/>
+        <w:bidi w:val="0"/>
+        <w:spacing w:before="240" w:beforeAutospacing="off" w:after="240" w:afterAutospacing="off" w:line="279" w:lineRule="auto"/>
+        <w:ind w:left="0" w:right="0"/>
+        <w:jc w:val="left"/>
+        <w:rPr>
+          <w:rFonts w:ascii="Aptos" w:hAnsi="Aptos" w:eastAsia="" w:cs="" w:asciiTheme="minorAscii" w:hAnsiTheme="minorAscii" w:eastAsiaTheme="majorEastAsia" w:cstheme="majorBidi"/>
+          <w:noProof w:val="0"/>
+          <w:color w:val="0F4761" w:themeColor="accent1" w:themeTint="FF" w:themeShade="BF"/>
+          <w:sz w:val="28"/>
+          <w:szCs w:val="28"/>
+          <w:lang w:val="es-ES" w:eastAsia="en-US" w:bidi="ar-SA"/>
+        </w:rPr>
+      </w:pPr>
+      <w:r>
+        <w:rPr>
+          <w:rFonts w:ascii="Aptos" w:hAnsi="Aptos" w:eastAsia="" w:cs="" w:asciiTheme="minorAscii" w:hAnsiTheme="minorAscii" w:eastAsiaTheme="majorEastAsia" w:cstheme="majorBidi"/>
+          <w:noProof w:val="0"/>
+          <w:color w:val="0F4761" w:themeColor="accent1" w:themeTint="FF" w:themeShade="BF"/>
+          <w:sz w:val="28"/>
+          <w:szCs w:val="28"/>
+          <w:lang w:val="es-ES" w:eastAsia="en-US" w:bidi="ar-SA"/>
+        </w:rPr>
+        <w:t>3. Coherencia visual y limpieza de layouts</w:t>
+      </w:r>
+      <w:r>
+        <w:rPr>
+          <w:rFonts w:ascii="Aptos" w:hAnsi="Aptos" w:eastAsia="" w:cs="" w:asciiTheme="minorAscii" w:hAnsiTheme="minorAscii" w:eastAsiaTheme="majorEastAsia" w:cstheme="majorBidi"/>
+          <w:noProof w:val="0"/>
+          <w:color w:val="0F4761" w:themeColor="accent1" w:themeTint="FF" w:themeShade="BF"/>
+          <w:sz w:val="28"/>
+          <w:szCs w:val="28"/>
+          <w:lang w:val="es-ES" w:eastAsia="en-US" w:bidi="ar-SA"/>
+        </w:rPr>
+        <w:t xml:space="preserve"> </w:t>
+      </w:r>
+    </w:p>
+    <w:p>
+      <w:pPr>
+        <w:spacing w:before="240" w:beforeAutospacing="off" w:after="240" w:afterAutospacing="off"/>
+      </w:pPr>
+      <w:r>
+        <w:rPr>
+          <w:rFonts w:ascii="Aptos" w:hAnsi="Aptos" w:eastAsia="Aptos" w:cs="Aptos"/>
+          <w:noProof w:val="0"/>
+          <w:sz w:val="24"/>
+          <w:szCs w:val="24"/>
+          <w:lang w:val="es-ES"/>
+        </w:rPr>
+        <w:t>He refactorizado el enrutador principal para eliminar márgenes no deseados. Ahora el Dashboard luce un diseño natural "Edge-to-Edge" (anclado a los bordes) y la barra de navegación tiene un estilo completamente homologado.</w:t>
+      </w:r>
+    </w:p>
+    <w:p>
+      <w:pPr>
+        <w:pStyle w:val="Normal"/>
+        <w:suppressLineNumbers w:val="0"/>
+        <w:bidi w:val="0"/>
+        <w:spacing w:before="240" w:beforeAutospacing="off" w:after="240" w:afterAutospacing="off" w:line="279" w:lineRule="auto"/>
+        <w:ind w:left="0" w:right="0"/>
+        <w:jc w:val="left"/>
+        <w:rPr>
+          <w:rFonts w:ascii="Aptos" w:hAnsi="Aptos" w:eastAsia="" w:cs="" w:asciiTheme="minorAscii" w:hAnsiTheme="minorAscii" w:eastAsiaTheme="majorEastAsia" w:cstheme="majorBidi"/>
+          <w:noProof w:val="0"/>
+          <w:color w:val="0F4761" w:themeColor="accent1" w:themeTint="FF" w:themeShade="BF"/>
+          <w:sz w:val="28"/>
+          <w:szCs w:val="28"/>
+          <w:lang w:val="es-ES" w:eastAsia="en-US" w:bidi="ar-SA"/>
+        </w:rPr>
+      </w:pPr>
+      <w:r>
+        <w:rPr>
+          <w:rFonts w:ascii="Aptos" w:hAnsi="Aptos" w:eastAsia="" w:cs="" w:asciiTheme="minorAscii" w:hAnsiTheme="minorAscii" w:eastAsiaTheme="majorEastAsia" w:cstheme="majorBidi"/>
+          <w:noProof w:val="0"/>
+          <w:color w:val="0F4761" w:themeColor="accent1" w:themeTint="FF" w:themeShade="BF"/>
+          <w:sz w:val="28"/>
+          <w:szCs w:val="28"/>
+          <w:lang w:val="es-ES" w:eastAsia="en-US" w:bidi="ar-SA"/>
+        </w:rPr>
+        <w:t>4. Mejora de micro-interacciones</w:t>
+      </w:r>
+      <w:r>
+        <w:rPr>
+          <w:rFonts w:ascii="Aptos" w:hAnsi="Aptos" w:eastAsia="" w:cs="" w:asciiTheme="minorAscii" w:hAnsiTheme="minorAscii" w:eastAsiaTheme="majorEastAsia" w:cstheme="majorBidi"/>
+          <w:noProof w:val="0"/>
+          <w:color w:val="0F4761" w:themeColor="accent1" w:themeTint="FF" w:themeShade="BF"/>
+          <w:sz w:val="28"/>
+          <w:szCs w:val="28"/>
+          <w:lang w:val="es-ES" w:eastAsia="en-US" w:bidi="ar-SA"/>
+        </w:rPr>
+        <w:t xml:space="preserve"> </w:t>
+      </w:r>
+    </w:p>
+    <w:p>
+      <w:pPr>
+        <w:spacing w:before="240" w:beforeAutospacing="off" w:after="240" w:afterAutospacing="off"/>
+      </w:pPr>
+      <w:r>
+        <w:rPr>
+          <w:rFonts w:ascii="Aptos" w:hAnsi="Aptos" w:eastAsia="Aptos" w:cs="Aptos"/>
+          <w:noProof w:val="0"/>
+          <w:sz w:val="24"/>
+          <w:szCs w:val="24"/>
+          <w:lang w:val="es-ES"/>
+        </w:rPr>
+        <w:t xml:space="preserve">He pulido la UX táctil eliminando el efecto "Sticky Hover" en móviles. También he personalizado el diseño nativo de los botones de subida de archivos para adaptarlos a la marca, y he protegido las tarjetas para que no se rompan con textos demasiado largos (usando truncado o </w:t>
+      </w:r>
+      <w:r>
+        <w:rPr>
+          <w:rFonts w:ascii="Aptos" w:hAnsi="Aptos" w:eastAsia="Aptos" w:cs="Aptos"/>
+          <w:i w:val="1"/>
+          <w:iCs w:val="1"/>
+          <w:noProof w:val="0"/>
+          <w:sz w:val="24"/>
+          <w:szCs w:val="24"/>
+          <w:lang w:val="es-ES"/>
+        </w:rPr>
+        <w:t>ellipsis</w:t>
+      </w:r>
+      <w:r>
+        <w:rPr>
+          <w:rFonts w:ascii="Aptos" w:hAnsi="Aptos" w:eastAsia="Aptos" w:cs="Aptos"/>
+          <w:noProof w:val="0"/>
+          <w:sz w:val="24"/>
+          <w:szCs w:val="24"/>
+          <w:lang w:val="es-ES"/>
+        </w:rPr>
+        <w:t>).</w:t>
+      </w:r>
+    </w:p>
+    <w:p>
+      <w:pPr>
+        <w:pStyle w:val="Normal"/>
+        <w:suppressLineNumbers w:val="0"/>
+        <w:bidi w:val="0"/>
+        <w:spacing w:before="240" w:beforeAutospacing="off" w:after="240" w:afterAutospacing="off" w:line="279" w:lineRule="auto"/>
+        <w:ind w:left="0" w:right="0"/>
+        <w:jc w:val="left"/>
+      </w:pPr>
+      <w:r>
+        <w:rPr>
+          <w:rFonts w:ascii="Aptos" w:hAnsi="Aptos" w:eastAsia="" w:cs="" w:asciiTheme="minorAscii" w:hAnsiTheme="minorAscii" w:eastAsiaTheme="majorEastAsia" w:cstheme="majorBidi"/>
+          <w:noProof w:val="0"/>
+          <w:color w:val="0F4761" w:themeColor="accent1" w:themeTint="FF" w:themeShade="BF"/>
+          <w:sz w:val="28"/>
+          <w:szCs w:val="28"/>
+          <w:lang w:val="es-ES" w:eastAsia="en-US" w:bidi="ar-SA"/>
+        </w:rPr>
+        <w:t>5. Integridad de datos desde el cliente</w:t>
+      </w:r>
+      <w:r>
+        <w:rPr>
+          <w:rFonts w:ascii="Aptos" w:hAnsi="Aptos" w:eastAsia="" w:cs="" w:asciiTheme="minorAscii" w:hAnsiTheme="minorAscii" w:eastAsiaTheme="majorEastAsia" w:cstheme="majorBidi"/>
+          <w:noProof w:val="0"/>
+          <w:color w:val="0F4761" w:themeColor="accent1" w:themeTint="FF" w:themeShade="BF"/>
+          <w:sz w:val="28"/>
+          <w:szCs w:val="28"/>
+          <w:lang w:val="es-ES" w:eastAsia="en-US" w:bidi="ar-SA"/>
+        </w:rPr>
+        <w:t xml:space="preserve"> </w:t>
+      </w:r>
+    </w:p>
+    <w:p>
+      <w:pPr>
+        <w:spacing w:before="240" w:beforeAutospacing="off" w:after="240" w:afterAutospacing="off"/>
+      </w:pPr>
+      <w:r>
+        <w:rPr>
+          <w:rFonts w:ascii="Aptos" w:hAnsi="Aptos" w:eastAsia="Aptos" w:cs="Aptos"/>
+          <w:noProof w:val="0"/>
+          <w:sz w:val="24"/>
+          <w:szCs w:val="24"/>
+          <w:lang w:val="es-ES"/>
+        </w:rPr>
+        <w:t>He añadido validaciones lógicas en el frontend para evaluar si una categoría está vacía antes de llamar a la API. Así bloqueo la creación de "categorías fantasma", evito peticiones inútiles al servidor y garantizo que la base de datos solo reciba información válida.</w:t>
+      </w:r>
+    </w:p>
+    <w:p>
+      <w:pPr>
+        <w:spacing w:before="240" w:beforeAutospacing="off" w:after="240" w:afterAutospacing="off"/>
+      </w:pPr>
+      <w:r>
+        <w:rPr>
+          <w:rFonts w:ascii="Aptos" w:hAnsi="Aptos" w:eastAsia="Aptos" w:cs="Aptos"/>
+          <w:noProof w:val="0"/>
+          <w:sz w:val="24"/>
+          <w:szCs w:val="24"/>
+          <w:lang w:val="es-ES"/>
+        </w:rPr>
+        <w:t>Con estos cambios, la plataforma es mucho más robusta a nivel interno y ofrece una experiencia móvil y visual completamente profesional.</w:t>
+      </w:r>
+    </w:p>
+    <w:p>
+      <w:pPr>
+        <w:spacing w:before="240" w:beforeAutospacing="off" w:after="240" w:afterAutospacing="off"/>
+        <w:rPr>
+          <w:rFonts w:ascii="Aptos" w:hAnsi="Aptos" w:eastAsia="Aptos" w:cs="Aptos"/>
+          <w:noProof w:val="0"/>
+          <w:sz w:val="24"/>
+          <w:szCs w:val="24"/>
+          <w:lang w:val="es-ES"/>
+        </w:rPr>
+      </w:pPr>
+    </w:p>
+    <w:p>
+      <w:pPr>
+        <w:pStyle w:val="Normal"/>
+        <w:spacing w:before="240" w:beforeAutospacing="off" w:after="240" w:afterAutospacing="off"/>
+        <w:rPr>
+          <w:rFonts w:ascii="Aptos" w:hAnsi="Aptos" w:eastAsia="Aptos" w:cs="Aptos"/>
+          <w:noProof w:val="0"/>
+          <w:sz w:val="24"/>
+          <w:szCs w:val="24"/>
+          <w:lang w:val="es-ES"/>
+        </w:rPr>
+      </w:pPr>
+    </w:p>
+    <w:p>
+      <w:pPr>
+        <w:pStyle w:val="Normal"/>
+        <w:spacing w:before="240" w:beforeAutospacing="off" w:after="240" w:afterAutospacing="off"/>
+        <w:rPr>
+          <w:rFonts w:ascii="Aptos" w:hAnsi="Aptos" w:eastAsia="Aptos" w:cs="Aptos"/>
+          <w:noProof w:val="0"/>
+          <w:sz w:val="24"/>
+          <w:szCs w:val="24"/>
+          <w:lang w:val="es-ES"/>
+        </w:rPr>
+      </w:pPr>
+    </w:p>
+    <w:p>
+      <w:pPr>
+        <w:spacing w:before="240" w:beforeAutospacing="off" w:after="240" w:afterAutospacing="off"/>
+      </w:pPr>
+      <w:r>
+        <w:rPr>
+          <w:rFonts w:ascii="Aptos" w:hAnsi="Aptos" w:eastAsia="Aptos" w:cs="Aptos"/>
+          <w:b w:val="1"/>
+          <w:bCs w:val="1"/>
+          <w:noProof w:val="0"/>
+          <w:sz w:val="24"/>
+          <w:szCs w:val="24"/>
+          <w:lang w:val="es-ES"/>
+        </w:rPr>
+        <w:t>Fecha:</w:t>
+      </w:r>
+      <w:r>
+        <w:rPr>
+          <w:rFonts w:ascii="Aptos" w:hAnsi="Aptos" w:eastAsia="Aptos" w:cs="Aptos"/>
+          <w:noProof w:val="0"/>
+          <w:sz w:val="24"/>
+          <w:szCs w:val="24"/>
+          <w:lang w:val="es-ES"/>
+        </w:rPr>
+        <w:t xml:space="preserve"> 07 de mayo de 2026</w:t>
+      </w:r>
+    </w:p>
+    <w:p>
+      <w:pPr>
+        <w:spacing w:before="240" w:beforeAutospacing="off" w:after="240" w:afterAutospacing="off"/>
+      </w:pPr>
+      <w:r>
+        <w:rPr>
+          <w:rFonts w:ascii="Aptos" w:hAnsi="Aptos" w:eastAsia="Aptos" w:cs="Aptos"/>
+          <w:noProof w:val="0"/>
+          <w:sz w:val="24"/>
+          <w:szCs w:val="24"/>
+          <w:lang w:val="es-ES"/>
+        </w:rPr>
+        <w:t>Hoy me he centrado de lleno en estabilizar la aplicación en producción (Render y Vercel), solucionar los bloqueos de seguridad y arreglar por fin el sistema de envío de correos, que me estaba dando bastantes dolores de cabeza en la nube.</w:t>
+      </w:r>
+    </w:p>
+    <w:p>
+      <w:pPr>
+        <w:spacing w:before="240" w:beforeAutospacing="off" w:after="240" w:afterAutospacing="off"/>
+      </w:pPr>
+      <w:r>
+        <w:rPr>
+          <w:rFonts w:ascii="Aptos" w:hAnsi="Aptos" w:eastAsia="Aptos" w:cs="Aptos"/>
+          <w:noProof w:val="0"/>
+          <w:sz w:val="24"/>
+          <w:szCs w:val="24"/>
+          <w:lang w:val="es-ES"/>
+        </w:rPr>
+        <w:t>Estos son los avances de la jornada:</w:t>
+      </w:r>
+    </w:p>
+    <w:p>
+      <w:pPr>
+        <w:spacing w:before="240" w:beforeAutospacing="off" w:after="240" w:afterAutospacing="off"/>
+        <w:rPr>
+          <w:rFonts w:ascii="Aptos" w:hAnsi="Aptos" w:eastAsia="" w:cs="" w:asciiTheme="minorAscii" w:hAnsiTheme="minorAscii" w:eastAsiaTheme="majorEastAsia" w:cstheme="majorBidi"/>
+          <w:noProof w:val="0"/>
+          <w:color w:val="0F4761" w:themeColor="accent1" w:themeTint="FF" w:themeShade="BF"/>
+          <w:sz w:val="28"/>
+          <w:szCs w:val="28"/>
+          <w:lang w:val="es-ES" w:eastAsia="en-US" w:bidi="ar-SA"/>
+        </w:rPr>
+      </w:pPr>
+      <w:r>
+        <w:rPr>
+          <w:rFonts w:ascii="Aptos" w:hAnsi="Aptos" w:eastAsia="" w:cs="" w:asciiTheme="minorAscii" w:hAnsiTheme="minorAscii" w:eastAsiaTheme="majorEastAsia" w:cstheme="majorBidi"/>
+          <w:noProof w:val="0"/>
+          <w:color w:val="0F4761" w:themeColor="accent1" w:themeTint="FF" w:themeShade="BF"/>
+          <w:sz w:val="28"/>
+          <w:szCs w:val="28"/>
+          <w:lang w:val="es-ES" w:eastAsia="en-US" w:bidi="ar-SA"/>
+        </w:rPr>
+        <w:t>1. Mejora de la interfaz y validación de inputs</w:t>
+      </w:r>
+      <w:r>
+        <w:rPr>
+          <w:rFonts w:ascii="Aptos" w:hAnsi="Aptos" w:eastAsia="" w:cs="" w:asciiTheme="minorAscii" w:hAnsiTheme="minorAscii" w:eastAsiaTheme="majorEastAsia" w:cstheme="majorBidi"/>
+          <w:noProof w:val="0"/>
+          <w:color w:val="0F4761" w:themeColor="accent1" w:themeTint="FF" w:themeShade="BF"/>
+          <w:sz w:val="28"/>
+          <w:szCs w:val="28"/>
+          <w:lang w:val="es-ES" w:eastAsia="en-US" w:bidi="ar-SA"/>
+        </w:rPr>
+        <w:t xml:space="preserve"> </w:t>
+      </w:r>
+    </w:p>
+    <w:p>
+      <w:pPr>
+        <w:spacing w:before="240" w:beforeAutospacing="off" w:after="240" w:afterAutospacing="off"/>
+      </w:pPr>
+      <w:r>
+        <w:rPr>
+          <w:rFonts w:ascii="Aptos" w:hAnsi="Aptos" w:eastAsia="Aptos" w:cs="Aptos"/>
+          <w:noProof w:val="0"/>
+          <w:sz w:val="24"/>
+          <w:szCs w:val="24"/>
+          <w:lang w:val="es-ES"/>
+        </w:rPr>
+        <w:t>He solucionado un problema visual donde los textos demasiado largos rompían las tarjetas y el diseño. Para evitarlo, he aplicado reglas CSS de control de desbordamiento (</w:t>
+      </w:r>
+      <w:r>
+        <w:rPr>
+          <w:rFonts w:ascii="Consolas" w:hAnsi="Consolas" w:eastAsia="Consolas" w:cs="Consolas"/>
+          <w:noProof w:val="0"/>
+          <w:sz w:val="24"/>
+          <w:szCs w:val="24"/>
+          <w:lang w:val="es-ES"/>
+        </w:rPr>
+        <w:t>overflow-wrap</w:t>
+      </w:r>
+      <w:r>
+        <w:rPr>
+          <w:rFonts w:ascii="Aptos" w:hAnsi="Aptos" w:eastAsia="Aptos" w:cs="Aptos"/>
+          <w:noProof w:val="0"/>
+          <w:sz w:val="24"/>
+          <w:szCs w:val="24"/>
+          <w:lang w:val="es-ES"/>
+        </w:rPr>
+        <w:t>) y añadí un límite máximo de 50 caracteres directamente en React. También he puesto una validación extra que bloquea el envío del formulario si faltan campos obligatorios.</w:t>
+      </w:r>
+    </w:p>
+    <w:p>
+      <w:pPr>
+        <w:pStyle w:val="Normal"/>
+        <w:suppressLineNumbers w:val="0"/>
+        <w:bidi w:val="0"/>
+        <w:spacing w:before="240" w:beforeAutospacing="off" w:after="240" w:afterAutospacing="off" w:line="279" w:lineRule="auto"/>
+        <w:ind w:left="0" w:right="0"/>
+        <w:jc w:val="left"/>
+      </w:pPr>
+      <w:r>
+        <w:rPr>
+          <w:rFonts w:ascii="Aptos" w:hAnsi="Aptos" w:eastAsia="" w:cs="" w:asciiTheme="minorAscii" w:hAnsiTheme="minorAscii" w:eastAsiaTheme="majorEastAsia" w:cstheme="majorBidi"/>
+          <w:noProof w:val="0"/>
+          <w:color w:val="0F4761" w:themeColor="accent1" w:themeTint="FF" w:themeShade="BF"/>
+          <w:sz w:val="28"/>
+          <w:szCs w:val="28"/>
+          <w:lang w:val="es-ES" w:eastAsia="en-US" w:bidi="ar-SA"/>
+        </w:rPr>
+        <w:t>2. Resolución de bloqueos de seguridad (CORS y error 403)</w:t>
+      </w:r>
+      <w:r>
+        <w:rPr>
+          <w:rFonts w:ascii="Aptos" w:hAnsi="Aptos" w:eastAsia="" w:cs="" w:asciiTheme="minorAscii" w:hAnsiTheme="minorAscii" w:eastAsiaTheme="majorEastAsia" w:cstheme="majorBidi"/>
+          <w:noProof w:val="0"/>
+          <w:color w:val="0F4761" w:themeColor="accent1" w:themeTint="FF" w:themeShade="BF"/>
+          <w:sz w:val="28"/>
+          <w:szCs w:val="28"/>
+          <w:lang w:val="es-ES" w:eastAsia="en-US" w:bidi="ar-SA"/>
+        </w:rPr>
+        <w:t xml:space="preserve"> </w:t>
+      </w:r>
+    </w:p>
+    <w:p>
+      <w:pPr>
+        <w:spacing w:before="240" w:beforeAutospacing="off" w:after="240" w:afterAutospacing="off"/>
+      </w:pPr>
+      <w:r>
+        <w:rPr>
+          <w:rFonts w:ascii="Aptos" w:hAnsi="Aptos" w:eastAsia="Aptos" w:cs="Aptos"/>
+          <w:noProof w:val="0"/>
+          <w:sz w:val="24"/>
+          <w:szCs w:val="24"/>
+          <w:lang w:val="es-ES"/>
+        </w:rPr>
+        <w:t xml:space="preserve">Me ha tocado pelearme un poco con Spring Security. El servidor bloqueaba las peticiones (error 403) porque el filtro CSRF chocaba con mis tokens JWT, así que lo he desactivado para la API. Además, arreglé la política de CORS (una simple barra </w:t>
+      </w:r>
+      <w:r>
+        <w:rPr>
+          <w:rFonts w:ascii="Consolas" w:hAnsi="Consolas" w:eastAsia="Consolas" w:cs="Consolas"/>
+          <w:noProof w:val="0"/>
+          <w:sz w:val="24"/>
+          <w:szCs w:val="24"/>
+          <w:lang w:val="es-ES"/>
+        </w:rPr>
+        <w:t>/</w:t>
+      </w:r>
+      <w:r>
+        <w:rPr>
+          <w:rFonts w:ascii="Aptos" w:hAnsi="Aptos" w:eastAsia="Aptos" w:cs="Aptos"/>
+          <w:noProof w:val="0"/>
+          <w:sz w:val="24"/>
+          <w:szCs w:val="24"/>
+          <w:lang w:val="es-ES"/>
+        </w:rPr>
+        <w:t xml:space="preserve"> al final de la URL de Vercel me estaba tirando la conexión) y ajusté el filtro JWT para que deje entrar libremente a las rutas de registro y verificación de PIN.</w:t>
+      </w:r>
+    </w:p>
+    <w:p>
+      <w:pPr>
+        <w:spacing w:before="240" w:beforeAutospacing="off" w:after="240" w:afterAutospacing="off"/>
+        <w:rPr>
+          <w:rFonts w:ascii="Aptos" w:hAnsi="Aptos" w:eastAsia="" w:cs="" w:asciiTheme="minorAscii" w:hAnsiTheme="minorAscii" w:eastAsiaTheme="majorEastAsia" w:cstheme="majorBidi"/>
+          <w:noProof w:val="0"/>
+          <w:color w:val="0F4761" w:themeColor="accent1" w:themeTint="FF" w:themeShade="BF"/>
+          <w:sz w:val="28"/>
+          <w:szCs w:val="28"/>
+          <w:lang w:val="es-ES" w:eastAsia="en-US" w:bidi="ar-SA"/>
+        </w:rPr>
+      </w:pPr>
+      <w:r>
+        <w:rPr>
+          <w:rFonts w:ascii="Aptos" w:hAnsi="Aptos" w:eastAsia="" w:cs="" w:asciiTheme="minorAscii" w:hAnsiTheme="minorAscii" w:eastAsiaTheme="majorEastAsia" w:cstheme="majorBidi"/>
+          <w:noProof w:val="0"/>
+          <w:color w:val="0F4761" w:themeColor="accent1" w:themeTint="FF" w:themeShade="BF"/>
+          <w:sz w:val="28"/>
+          <w:szCs w:val="28"/>
+          <w:lang w:val="es-ES" w:eastAsia="en-US" w:bidi="ar-SA"/>
+        </w:rPr>
+        <w:t>3. Migración del sistema de correos a EmailJS</w:t>
+      </w:r>
+      <w:r>
+        <w:rPr>
+          <w:rFonts w:ascii="Aptos" w:hAnsi="Aptos" w:eastAsia="" w:cs="" w:asciiTheme="minorAscii" w:hAnsiTheme="minorAscii" w:eastAsiaTheme="majorEastAsia" w:cstheme="majorBidi"/>
+          <w:noProof w:val="0"/>
+          <w:color w:val="0F4761" w:themeColor="accent1" w:themeTint="FF" w:themeShade="BF"/>
+          <w:sz w:val="28"/>
+          <w:szCs w:val="28"/>
+          <w:lang w:val="es-ES" w:eastAsia="en-US" w:bidi="ar-SA"/>
+        </w:rPr>
+        <w:t xml:space="preserve"> </w:t>
+      </w:r>
+    </w:p>
+    <w:p>
+      <w:pPr>
+        <w:spacing w:before="240" w:beforeAutospacing="off" w:after="240" w:afterAutospacing="off"/>
+      </w:pPr>
+      <w:r>
+        <w:rPr>
+          <w:rFonts w:ascii="Aptos" w:hAnsi="Aptos" w:eastAsia="Aptos" w:cs="Aptos"/>
+          <w:noProof w:val="0"/>
+          <w:sz w:val="24"/>
+          <w:szCs w:val="24"/>
+          <w:lang w:val="es-ES"/>
+        </w:rPr>
+        <w:t>El protocolo SMTP de Gmail fallaba constantemente en los servidores de Render por temas de puertos. La solución ha sido cambiar esa lógica y conectarme a la API REST de EmailJS. He creado una plantilla dinámica y ahora mi backend manda los datos de forma asíncrona (</w:t>
+      </w:r>
+      <w:r>
+        <w:rPr>
+          <w:rFonts w:ascii="Consolas" w:hAnsi="Consolas" w:eastAsia="Consolas" w:cs="Consolas"/>
+          <w:noProof w:val="0"/>
+          <w:sz w:val="24"/>
+          <w:szCs w:val="24"/>
+          <w:lang w:val="es-ES"/>
+        </w:rPr>
+        <w:t>@Async</w:t>
+      </w:r>
+      <w:r>
+        <w:rPr>
+          <w:rFonts w:ascii="Aptos" w:hAnsi="Aptos" w:eastAsia="Aptos" w:cs="Aptos"/>
+          <w:noProof w:val="0"/>
+          <w:sz w:val="24"/>
+          <w:szCs w:val="24"/>
+          <w:lang w:val="es-ES"/>
+        </w:rPr>
+        <w:t>). El cambio ha sido brutal: ahora los correos llegan al instante y no fallan.</w:t>
+      </w:r>
+    </w:p>
+    <w:p>
+      <w:pPr>
+        <w:pStyle w:val="Normal"/>
+        <w:suppressLineNumbers w:val="0"/>
+        <w:bidi w:val="0"/>
+        <w:spacing w:before="240" w:beforeAutospacing="off" w:after="240" w:afterAutospacing="off" w:line="279" w:lineRule="auto"/>
+        <w:ind w:left="0" w:right="0"/>
+        <w:jc w:val="left"/>
+        <w:rPr>
+          <w:rFonts w:ascii="Aptos" w:hAnsi="Aptos" w:eastAsia="" w:cs="" w:asciiTheme="minorAscii" w:hAnsiTheme="minorAscii" w:eastAsiaTheme="majorEastAsia" w:cstheme="majorBidi"/>
+          <w:noProof w:val="0"/>
+          <w:color w:val="0F4761" w:themeColor="accent1" w:themeTint="FF" w:themeShade="BF"/>
+          <w:sz w:val="28"/>
+          <w:szCs w:val="28"/>
+          <w:lang w:val="es-ES" w:eastAsia="en-US" w:bidi="ar-SA"/>
+        </w:rPr>
+      </w:pPr>
+      <w:r>
+        <w:rPr>
+          <w:rFonts w:ascii="Aptos" w:hAnsi="Aptos" w:eastAsia="" w:cs="" w:asciiTheme="minorAscii" w:hAnsiTheme="minorAscii" w:eastAsiaTheme="majorEastAsia" w:cstheme="majorBidi"/>
+          <w:noProof w:val="0"/>
+          <w:color w:val="0F4761" w:themeColor="accent1" w:themeTint="FF" w:themeShade="BF"/>
+          <w:sz w:val="28"/>
+          <w:szCs w:val="28"/>
+          <w:lang w:val="es-ES" w:eastAsia="en-US" w:bidi="ar-SA"/>
+        </w:rPr>
+        <w:t>4. Limpieza de "usuarios fantasma"</w:t>
+      </w:r>
+      <w:r>
+        <w:rPr>
+          <w:rFonts w:ascii="Aptos" w:hAnsi="Aptos" w:eastAsia="" w:cs="" w:asciiTheme="minorAscii" w:hAnsiTheme="minorAscii" w:eastAsiaTheme="majorEastAsia" w:cstheme="majorBidi"/>
+          <w:noProof w:val="0"/>
+          <w:color w:val="0F4761" w:themeColor="accent1" w:themeTint="FF" w:themeShade="BF"/>
+          <w:sz w:val="28"/>
+          <w:szCs w:val="28"/>
+          <w:lang w:val="es-ES" w:eastAsia="en-US" w:bidi="ar-SA"/>
+        </w:rPr>
+        <w:t xml:space="preserve"> </w:t>
+      </w:r>
+    </w:p>
+    <w:p>
+      <w:pPr>
+        <w:spacing w:before="240" w:beforeAutospacing="off" w:after="240" w:afterAutospacing="off"/>
+      </w:pPr>
+      <w:r>
+        <w:rPr>
+          <w:rFonts w:ascii="Aptos" w:hAnsi="Aptos" w:eastAsia="Aptos" w:cs="Aptos"/>
+          <w:noProof w:val="0"/>
+          <w:sz w:val="24"/>
+          <w:szCs w:val="24"/>
+          <w:lang w:val="es-ES"/>
+        </w:rPr>
+        <w:t xml:space="preserve">Detecté </w:t>
+      </w:r>
+      <w:r>
+        <w:rPr>
+          <w:rFonts w:ascii="Aptos" w:hAnsi="Aptos" w:eastAsia="Aptos" w:cs="Aptos"/>
+          <w:noProof w:val="0"/>
+          <w:sz w:val="24"/>
+          <w:szCs w:val="24"/>
+          <w:lang w:val="es-ES"/>
+        </w:rPr>
+        <w:t>que</w:t>
+      </w:r>
+      <w:r>
+        <w:rPr>
+          <w:rFonts w:ascii="Aptos" w:hAnsi="Aptos" w:eastAsia="Aptos" w:cs="Aptos"/>
+          <w:noProof w:val="0"/>
+          <w:sz w:val="24"/>
+          <w:szCs w:val="24"/>
+          <w:lang w:val="es-ES"/>
+        </w:rPr>
+        <w:t xml:space="preserve"> si el envío del correo fallaba, la cuenta se quedaba guardada a medias en la base de datos, impidiendo que la persona pudiera volver a intentar registrarse con ese mismo correo o alias. He modificado el controlador para que, si el mail da error, se haga un borrado (</w:t>
+      </w:r>
+      <w:r>
+        <w:rPr>
+          <w:rFonts w:ascii="Consolas" w:hAnsi="Consolas" w:eastAsia="Consolas" w:cs="Consolas"/>
+          <w:noProof w:val="0"/>
+          <w:sz w:val="24"/>
+          <w:szCs w:val="24"/>
+          <w:lang w:val="es-ES"/>
+        </w:rPr>
+        <w:t>delete</w:t>
+      </w:r>
+      <w:r>
+        <w:rPr>
+          <w:rFonts w:ascii="Aptos" w:hAnsi="Aptos" w:eastAsia="Aptos" w:cs="Aptos"/>
+          <w:noProof w:val="0"/>
+          <w:sz w:val="24"/>
+          <w:szCs w:val="24"/>
+          <w:lang w:val="es-ES"/>
+        </w:rPr>
+        <w:t>) inmediato de esa cuenta temporal. Así mantengo la base de datos limpia de registros a medias</w:t>
+      </w:r>
+      <w:r>
+        <w:rPr>
+          <w:rFonts w:ascii="Aptos" w:hAnsi="Aptos" w:eastAsia="Aptos" w:cs="Aptos"/>
+          <w:noProof w:val="0"/>
+          <w:sz w:val="24"/>
+          <w:szCs w:val="24"/>
+          <w:lang w:val="es-ES"/>
+        </w:rPr>
+        <w:t>.</w:t>
+      </w:r>
+    </w:p>
+    <w:p>
+      <w:pPr>
+        <w:spacing w:before="240" w:beforeAutospacing="off" w:after="240" w:afterAutospacing="off"/>
+      </w:pPr>
+      <w:r>
+        <w:rPr>
+          <w:rFonts w:ascii="Aptos" w:hAnsi="Aptos" w:eastAsia="Aptos" w:cs="Aptos" w:asciiTheme="minorAscii" w:hAnsiTheme="minorAscii" w:eastAsiaTheme="minorAscii" w:cstheme="minorBidi"/>
+          <w:b w:val="1"/>
+          <w:bCs w:val="1"/>
+          <w:noProof w:val="0"/>
+          <w:color w:val="auto"/>
+          <w:sz w:val="24"/>
+          <w:szCs w:val="24"/>
+          <w:lang w:val="es-ES" w:eastAsia="en-US" w:bidi="ar-SA"/>
+        </w:rPr>
+        <w:t>Fecha:</w:t>
+      </w:r>
+      <w:r>
+        <w:rPr>
+          <w:rFonts w:ascii="Aptos" w:hAnsi="Aptos" w:eastAsia="Aptos" w:cs="Aptos"/>
+          <w:noProof w:val="0"/>
+          <w:sz w:val="24"/>
+          <w:szCs w:val="24"/>
+          <w:lang w:val="es-ES"/>
+        </w:rPr>
+        <w:t xml:space="preserve"> 10 de mayo de 2026</w:t>
+      </w:r>
+    </w:p>
+    <w:p>
+      <w:pPr>
+        <w:spacing w:before="240" w:beforeAutospacing="off" w:after="240" w:afterAutospacing="off"/>
+      </w:pPr>
+      <w:r>
+        <w:rPr>
+          <w:rFonts w:ascii="Aptos" w:hAnsi="Aptos" w:eastAsia="Aptos" w:cs="Aptos"/>
+          <w:b w:val="1"/>
+          <w:bCs w:val="1"/>
+          <w:noProof w:val="0"/>
+          <w:sz w:val="24"/>
+          <w:szCs w:val="24"/>
+          <w:lang w:val="es-ES"/>
+        </w:rPr>
+        <w:t>Objetivo:</w:t>
+      </w:r>
+      <w:r>
+        <w:rPr>
+          <w:rFonts w:ascii="Aptos" w:hAnsi="Aptos" w:eastAsia="Aptos" w:cs="Aptos"/>
+          <w:noProof w:val="0"/>
+          <w:sz w:val="24"/>
+          <w:szCs w:val="24"/>
+          <w:lang w:val="es-ES"/>
+        </w:rPr>
+        <w:t xml:space="preserve"> Ejecutar de verdad el simulacro de backup y recuperación que tenía documentado pero sin probar.</w:t>
+      </w:r>
+    </w:p>
+    <w:p>
+      <w:pPr>
+        <w:pStyle w:val="Normal"/>
+        <w:spacing w:before="0" w:beforeAutospacing="off" w:after="0" w:afterAutospacing="off"/>
+        <w:rPr>
+          <w:rFonts w:ascii="Aptos" w:hAnsi="Aptos" w:eastAsia="" w:cs="" w:asciiTheme="minorAscii" w:hAnsiTheme="minorAscii" w:eastAsiaTheme="majorEastAsia" w:cstheme="majorBidi"/>
+          <w:noProof w:val="0"/>
+          <w:color w:val="0F4761" w:themeColor="accent1" w:themeTint="FF" w:themeShade="BF"/>
+          <w:sz w:val="28"/>
+          <w:szCs w:val="28"/>
+          <w:lang w:val="es-ES" w:eastAsia="en-US" w:bidi="ar-SA"/>
+        </w:rPr>
+      </w:pPr>
+      <w:r>
+        <w:rPr>
+          <w:rFonts w:ascii="Aptos" w:hAnsi="Aptos" w:eastAsia="" w:cs="" w:asciiTheme="minorAscii" w:hAnsiTheme="minorAscii" w:eastAsiaTheme="majorEastAsia" w:cstheme="majorBidi"/>
+          <w:noProof w:val="0"/>
+          <w:color w:val="0F4761" w:themeColor="accent1" w:themeTint="FF" w:themeShade="BF"/>
+          <w:sz w:val="28"/>
+          <w:szCs w:val="28"/>
+          <w:lang w:val="es-ES" w:eastAsia="en-US" w:bidi="ar-SA"/>
+        </w:rPr>
+        <w:t xml:space="preserve">1. </w:t>
+      </w:r>
+      <w:r>
+        <w:rPr>
+          <w:rFonts w:ascii="Aptos" w:hAnsi="Aptos" w:eastAsia="" w:cs="" w:asciiTheme="minorAscii" w:hAnsiTheme="minorAscii" w:eastAsiaTheme="majorEastAsia" w:cstheme="majorBidi"/>
+          <w:noProof w:val="0"/>
+          <w:color w:val="0F4761" w:themeColor="accent1" w:themeTint="FF" w:themeShade="BF"/>
+          <w:sz w:val="28"/>
+          <w:szCs w:val="28"/>
+          <w:lang w:val="es-ES" w:eastAsia="en-US" w:bidi="ar-SA"/>
+        </w:rPr>
+        <w:t>Problemas arrancando Docker</w:t>
+      </w:r>
+    </w:p>
+    <w:p>
+      <w:pPr>
+        <w:spacing w:before="240" w:beforeAutospacing="off" w:after="240" w:afterAutospacing="off"/>
+      </w:pPr>
+      <w:r>
+        <w:rPr>
+          <w:rFonts w:ascii="Aptos" w:hAnsi="Aptos" w:eastAsia="Aptos" w:cs="Aptos"/>
+          <w:noProof w:val="0"/>
+          <w:sz w:val="24"/>
+          <w:szCs w:val="24"/>
+          <w:lang w:val="es-ES"/>
+        </w:rPr>
+        <w:t>Al intentar lanzar el contenedor me encontré con dos problemas seguidos: primero Docker Desktop no estaba corriendo, y cuando lo abrí y volví a intentarlo me dijo que ya existía un contenedor ch_database de antes ocupando el nombre. Lo borré con docker rm -f ch_database y ya arrancó bien en el puerto 3307.</w:t>
+      </w:r>
+    </w:p>
+    <w:p>
+      <w:pPr>
+        <w:pStyle w:val="Normal"/>
+        <w:suppressLineNumbers w:val="0"/>
+        <w:bidi w:val="0"/>
+        <w:spacing w:before="0" w:beforeAutospacing="off" w:after="0" w:afterAutospacing="off" w:line="279" w:lineRule="auto"/>
+        <w:ind w:left="0" w:right="0"/>
+        <w:jc w:val="left"/>
+        <w:rPr>
+          <w:rFonts w:ascii="Aptos" w:hAnsi="Aptos" w:eastAsia="" w:cs="" w:asciiTheme="minorAscii" w:hAnsiTheme="minorAscii" w:eastAsiaTheme="majorEastAsia" w:cstheme="majorBidi"/>
+          <w:noProof w:val="0"/>
+          <w:color w:val="0F4761" w:themeColor="accent1" w:themeTint="FF" w:themeShade="BF"/>
+          <w:sz w:val="28"/>
+          <w:szCs w:val="28"/>
+          <w:lang w:val="es-ES" w:eastAsia="en-US" w:bidi="ar-SA"/>
+        </w:rPr>
+      </w:pPr>
+      <w:r>
+        <w:rPr>
+          <w:rFonts w:ascii="Aptos" w:hAnsi="Aptos" w:eastAsia="" w:cs="" w:asciiTheme="minorAscii" w:hAnsiTheme="minorAscii" w:eastAsiaTheme="majorEastAsia" w:cstheme="majorBidi"/>
+          <w:noProof w:val="0"/>
+          <w:color w:val="0F4761" w:themeColor="accent1" w:themeTint="FF" w:themeShade="BF"/>
+          <w:sz w:val="28"/>
+          <w:szCs w:val="28"/>
+          <w:lang w:val="es-ES" w:eastAsia="en-US" w:bidi="ar-SA"/>
+        </w:rPr>
+        <w:t>2. Metiendo datos de prueba</w:t>
+      </w:r>
+    </w:p>
+    <w:p>
+      <w:pPr>
+        <w:spacing w:before="240" w:beforeAutospacing="off" w:after="240" w:afterAutospacing="off"/>
+      </w:pPr>
+      <w:r>
+        <w:rPr>
+          <w:rFonts w:ascii="Aptos" w:hAnsi="Aptos" w:eastAsia="Aptos" w:cs="Aptos"/>
+          <w:noProof w:val="0"/>
+          <w:sz w:val="24"/>
+          <w:szCs w:val="24"/>
+          <w:lang w:val="es-ES"/>
+        </w:rPr>
+        <w:t>Como el backend seguía apuntando a Railway no quería tocarlo, así que inserté los datos directamente con SQL desde la terminal. PowerShell me dio guerra con las comillas del JSON así que acabé tirando de un archivo .sql intermedio y pasándoselo al contenedor con Get-Content. Al final metí 1 usuario, 2 categorías y 2 artículos.</w:t>
+      </w:r>
+    </w:p>
+    <w:p>
+      <w:pPr>
+        <w:pStyle w:val="Normal"/>
+        <w:suppressLineNumbers w:val="0"/>
+        <w:bidi w:val="0"/>
+        <w:spacing w:before="0" w:beforeAutospacing="off" w:after="0" w:afterAutospacing="off" w:line="279" w:lineRule="auto"/>
+        <w:ind w:left="0" w:right="0"/>
+        <w:jc w:val="left"/>
+        <w:rPr>
+          <w:rFonts w:ascii="Aptos" w:hAnsi="Aptos" w:eastAsia="" w:cs="" w:asciiTheme="minorAscii" w:hAnsiTheme="minorAscii" w:eastAsiaTheme="majorEastAsia" w:cstheme="majorBidi"/>
+          <w:noProof w:val="0"/>
+          <w:color w:val="0F4761" w:themeColor="accent1" w:themeTint="FF" w:themeShade="BF"/>
+          <w:sz w:val="28"/>
+          <w:szCs w:val="28"/>
+          <w:lang w:val="es-ES" w:eastAsia="en-US" w:bidi="ar-SA"/>
+        </w:rPr>
+      </w:pPr>
+      <w:r>
+        <w:rPr>
+          <w:rFonts w:ascii="Aptos" w:hAnsi="Aptos" w:eastAsia="" w:cs="" w:asciiTheme="minorAscii" w:hAnsiTheme="minorAscii" w:eastAsiaTheme="majorEastAsia" w:cstheme="majorBidi"/>
+          <w:noProof w:val="0"/>
+          <w:color w:val="0F4761" w:themeColor="accent1" w:themeTint="FF" w:themeShade="BF"/>
+          <w:sz w:val="28"/>
+          <w:szCs w:val="28"/>
+          <w:lang w:val="es-ES" w:eastAsia="en-US" w:bidi="ar-SA"/>
+        </w:rPr>
+        <w:t xml:space="preserve">3. Generando el </w:t>
+      </w:r>
+      <w:r>
+        <w:rPr>
+          <w:rFonts w:ascii="Aptos" w:hAnsi="Aptos" w:eastAsia="" w:cs="" w:asciiTheme="minorAscii" w:hAnsiTheme="minorAscii" w:eastAsiaTheme="majorEastAsia" w:cstheme="majorBidi"/>
+          <w:noProof w:val="0"/>
+          <w:color w:val="0F4761" w:themeColor="accent1" w:themeTint="FF" w:themeShade="BF"/>
+          <w:sz w:val="28"/>
+          <w:szCs w:val="28"/>
+          <w:lang w:val="es-ES" w:eastAsia="en-US" w:bidi="ar-SA"/>
+        </w:rPr>
+        <w:t>backup</w:t>
+      </w:r>
+    </w:p>
+    <w:p>
+      <w:pPr>
+        <w:spacing w:before="240" w:beforeAutospacing="off" w:after="240" w:afterAutospacing="off"/>
+      </w:pPr>
+      <w:r>
+        <w:rPr>
+          <w:rFonts w:ascii="Aptos" w:hAnsi="Aptos" w:eastAsia="Aptos" w:cs="Aptos"/>
+          <w:noProof w:val="0"/>
+          <w:sz w:val="24"/>
+          <w:szCs w:val="24"/>
+          <w:lang w:val="es-ES"/>
+        </w:rPr>
+        <w:t>Lancé el mysqldump y se generó el archivo backup_diario.sql sin problemas. Pesaba 9.520 bytes y al abrirlo en VS Code se veía el SQL completo con los CREATE TABLE y los INSERT INTO, incluyendo los campos JSON.</w:t>
+      </w:r>
+    </w:p>
+    <w:p>
+      <w:pPr>
+        <w:pStyle w:val="Normal"/>
+        <w:suppressLineNumbers w:val="0"/>
+        <w:bidi w:val="0"/>
+        <w:spacing w:before="0" w:beforeAutospacing="off" w:after="0" w:afterAutospacing="off" w:line="279" w:lineRule="auto"/>
+        <w:ind w:left="0" w:right="0"/>
+        <w:jc w:val="left"/>
+        <w:rPr>
+          <w:rFonts w:ascii="Aptos" w:hAnsi="Aptos" w:eastAsia="" w:cs="" w:asciiTheme="minorAscii" w:hAnsiTheme="minorAscii" w:eastAsiaTheme="majorEastAsia" w:cstheme="majorBidi"/>
+          <w:noProof w:val="0"/>
+          <w:color w:val="0F4761" w:themeColor="accent1" w:themeTint="FF" w:themeShade="BF"/>
+          <w:sz w:val="28"/>
+          <w:szCs w:val="28"/>
+          <w:lang w:val="es-ES" w:eastAsia="en-US" w:bidi="ar-SA"/>
+        </w:rPr>
+      </w:pPr>
+      <w:r>
+        <w:rPr>
+          <w:rFonts w:ascii="Aptos" w:hAnsi="Aptos" w:eastAsia="" w:cs="" w:asciiTheme="minorAscii" w:hAnsiTheme="minorAscii" w:eastAsiaTheme="majorEastAsia" w:cstheme="majorBidi"/>
+          <w:noProof w:val="0"/>
+          <w:color w:val="0F4761" w:themeColor="accent1" w:themeTint="FF" w:themeShade="BF"/>
+          <w:sz w:val="28"/>
+          <w:szCs w:val="28"/>
+          <w:lang w:val="es-ES" w:eastAsia="en-US" w:bidi="ar-SA"/>
+        </w:rPr>
+        <w:t>4. Destruyendo la base de datos</w:t>
+      </w:r>
+    </w:p>
+    <w:p>
+      <w:pPr>
+        <w:spacing w:before="240" w:beforeAutospacing="off" w:after="240" w:afterAutospacing="off"/>
+      </w:pPr>
+      <w:r>
+        <w:rPr>
+          <w:rFonts w:ascii="Aptos" w:hAnsi="Aptos" w:eastAsia="Aptos" w:cs="Aptos"/>
+          <w:noProof w:val="0"/>
+          <w:sz w:val="24"/>
+          <w:szCs w:val="24"/>
+          <w:lang w:val="es-ES"/>
+        </w:rPr>
+        <w:t>Aquí viene la parte importante. Usé docker-compose down -v para eliminar también el volumen, no solo el contenedor. Así me aseguré de simular una pérdida real de datos y no hacer trampa borrando solo los registros. Al volver a levantar Docker y ejecutar los conteos: usuarios=0, categorias=0, articulos=0.</w:t>
+      </w:r>
+    </w:p>
+    <w:p>
+      <w:pPr>
+        <w:pStyle w:val="Normal"/>
+        <w:suppressLineNumbers w:val="0"/>
+        <w:bidi w:val="0"/>
+        <w:spacing w:before="0" w:beforeAutospacing="off" w:after="0" w:afterAutospacing="off" w:line="279" w:lineRule="auto"/>
+        <w:ind w:left="0" w:right="0"/>
+        <w:jc w:val="left"/>
+        <w:rPr>
+          <w:rFonts w:ascii="Aptos" w:hAnsi="Aptos" w:eastAsia="" w:cs="" w:asciiTheme="minorAscii" w:hAnsiTheme="minorAscii" w:eastAsiaTheme="majorEastAsia" w:cstheme="majorBidi"/>
+          <w:noProof w:val="0"/>
+          <w:color w:val="0F4761" w:themeColor="accent1" w:themeTint="FF" w:themeShade="BF"/>
+          <w:sz w:val="28"/>
+          <w:szCs w:val="28"/>
+          <w:lang w:val="es-ES" w:eastAsia="en-US" w:bidi="ar-SA"/>
+        </w:rPr>
+      </w:pPr>
+      <w:r>
+        <w:rPr>
+          <w:rFonts w:ascii="Aptos" w:hAnsi="Aptos" w:eastAsia="" w:cs="" w:asciiTheme="minorAscii" w:hAnsiTheme="minorAscii" w:eastAsiaTheme="majorEastAsia" w:cstheme="majorBidi"/>
+          <w:noProof w:val="0"/>
+          <w:color w:val="0F4761" w:themeColor="accent1" w:themeTint="FF" w:themeShade="BF"/>
+          <w:sz w:val="28"/>
+          <w:szCs w:val="28"/>
+          <w:lang w:val="es-ES" w:eastAsia="en-US" w:bidi="ar-SA"/>
+        </w:rPr>
+        <w:t>5. Restaurando y verificando</w:t>
+      </w:r>
+    </w:p>
+    <w:p>
+      <w:pPr>
+        <w:spacing w:before="240" w:beforeAutospacing="off" w:after="240" w:afterAutospacing="off"/>
+      </w:pPr>
+      <w:r>
+        <w:rPr>
+          <w:rFonts w:ascii="Aptos" w:hAnsi="Aptos" w:eastAsia="Aptos" w:cs="Aptos"/>
+          <w:noProof w:val="0"/>
+          <w:sz w:val="24"/>
+          <w:szCs w:val="24"/>
+          <w:lang w:val="es-ES"/>
+        </w:rPr>
+        <w:t>Importé el backup con Get-Content backup_diario.sql | docker exec -i ch_database mysql y el comando terminó sin errores. Los conteos después de restaurar: usuarios=1, categorias=2, articulos=2. Exactamente igual que antes del borrado, con los JSON intactos.</w:t>
+      </w:r>
+    </w:p>
+    <w:p>
+      <w:pPr>
+        <w:spacing w:before="240" w:beforeAutospacing="off" w:after="240" w:afterAutospacing="off"/>
+      </w:pPr>
+      <w:r>
+        <w:rPr>
+          <w:rFonts w:ascii="Aptos" w:hAnsi="Aptos" w:eastAsia="Aptos" w:cs="Aptos"/>
+          <w:noProof w:val="0"/>
+          <w:sz w:val="24"/>
+          <w:szCs w:val="24"/>
+          <w:lang w:val="es-ES"/>
+        </w:rPr>
+        <w:t>Estado del proyecto: Simulacro completado y documentado con capturas de cada paso. La documentación operativa ya tiene la sección 8 actualizada con las evidencias reales. Listo para entregar.</w:t>
+      </w:r>
+    </w:p>
+    <w:p>
+      <w:pPr>
+        <w:pStyle w:val="Normal"/>
+        <w:spacing w:before="240" w:beforeAutospacing="off" w:after="240" w:afterAutospacing="off"/>
+        <w:rPr>
+          <w:rFonts w:ascii="Aptos" w:hAnsi="Aptos" w:eastAsia="Aptos" w:cs="Aptos"/>
+          <w:noProof w:val="0"/>
+          <w:sz w:val="24"/>
+          <w:szCs w:val="24"/>
+          <w:lang w:val="es-ES"/>
+        </w:rPr>
       </w:pPr>
     </w:p>
     <w:sectPr>
@@ -6460,6 +7773,941 @@
 
 <file path=word/numbering.xml><?xml version="1.0" encoding="utf-8"?>
 <w:numbering xmlns:w="http://schemas.openxmlformats.org/wordprocessingml/2006/main">
+  <w:abstractNum xmlns:w="http://schemas.openxmlformats.org/wordprocessingml/2006/main" w:abstractNumId="27">
+    <w:nsid w:val="309b128a"/>
+    <w:multiLevelType xmlns:w="http://schemas.openxmlformats.org/wordprocessingml/2006/main" w:val="hybridMultilevel"/>
+    <w:lvl xmlns:w="http://schemas.openxmlformats.org/wordprocessingml/2006/main" w:ilvl="0">
+      <w:start w:val="1"/>
+      <w:numFmt w:val="decimal"/>
+      <w:lvlText w:val="%1."/>
+      <w:lvlJc w:val="left"/>
+      <w:pPr>
+        <w:ind w:left="720" w:hanging="360"/>
+      </w:pPr>
+    </w:lvl>
+    <w:lvl xmlns:w="http://schemas.openxmlformats.org/wordprocessingml/2006/main" w:ilvl="1">
+      <w:start w:val="1"/>
+      <w:numFmt w:val="lowerLetter"/>
+      <w:lvlText w:val="%2."/>
+      <w:lvlJc w:val="left"/>
+      <w:pPr>
+        <w:ind w:left="1440" w:hanging="360"/>
+      </w:pPr>
+    </w:lvl>
+    <w:lvl xmlns:w="http://schemas.openxmlformats.org/wordprocessingml/2006/main" w:ilvl="2">
+      <w:start w:val="1"/>
+      <w:numFmt w:val="lowerRoman"/>
+      <w:lvlText w:val="%3."/>
+      <w:lvlJc w:val="right"/>
+      <w:pPr>
+        <w:ind w:left="2160" w:hanging="180"/>
+      </w:pPr>
+    </w:lvl>
+    <w:lvl xmlns:w="http://schemas.openxmlformats.org/wordprocessingml/2006/main" w:ilvl="3">
+      <w:start w:val="1"/>
+      <w:numFmt w:val="decimal"/>
+      <w:lvlText w:val="%4."/>
+      <w:lvlJc w:val="left"/>
+      <w:pPr>
+        <w:ind w:left="2880" w:hanging="360"/>
+      </w:pPr>
+    </w:lvl>
+    <w:lvl xmlns:w="http://schemas.openxmlformats.org/wordprocessingml/2006/main" w:ilvl="4">
+      <w:start w:val="1"/>
+      <w:numFmt w:val="lowerLetter"/>
+      <w:lvlText w:val="%5."/>
+      <w:lvlJc w:val="left"/>
+      <w:pPr>
+        <w:ind w:left="3600" w:hanging="360"/>
+      </w:pPr>
+    </w:lvl>
+    <w:lvl xmlns:w="http://schemas.openxmlformats.org/wordprocessingml/2006/main" w:ilvl="5">
+      <w:start w:val="1"/>
+      <w:numFmt w:val="lowerRoman"/>
+      <w:lvlText w:val="%6."/>
+      <w:lvlJc w:val="right"/>
+      <w:pPr>
+        <w:ind w:left="4320" w:hanging="180"/>
+      </w:pPr>
+    </w:lvl>
+    <w:lvl xmlns:w="http://schemas.openxmlformats.org/wordprocessingml/2006/main" w:ilvl="6">
+      <w:start w:val="1"/>
+      <w:numFmt w:val="decimal"/>
+      <w:lvlText w:val="%7."/>
+      <w:lvlJc w:val="left"/>
+      <w:pPr>
+        <w:ind w:left="5040" w:hanging="360"/>
+      </w:pPr>
+    </w:lvl>
+    <w:lvl xmlns:w="http://schemas.openxmlformats.org/wordprocessingml/2006/main" w:ilvl="7">
+      <w:start w:val="1"/>
+      <w:numFmt w:val="lowerLetter"/>
+      <w:lvlText w:val="%8."/>
+      <w:lvlJc w:val="left"/>
+      <w:pPr>
+        <w:ind w:left="5760" w:hanging="360"/>
+      </w:pPr>
+    </w:lvl>
+    <w:lvl xmlns:w="http://schemas.openxmlformats.org/wordprocessingml/2006/main" w:ilvl="8">
+      <w:start w:val="1"/>
+      <w:numFmt w:val="lowerRoman"/>
+      <w:lvlText w:val="%9."/>
+      <w:lvlJc w:val="right"/>
+      <w:pPr>
+        <w:ind w:left="6480" w:hanging="180"/>
+      </w:pPr>
+    </w:lvl>
+  </w:abstractNum>
+  <w:abstractNum xmlns:w="http://schemas.openxmlformats.org/wordprocessingml/2006/main" w:abstractNumId="26">
+    <w:nsid w:val="6b22db5d"/>
+    <w:multiLevelType xmlns:w="http://schemas.openxmlformats.org/wordprocessingml/2006/main" w:val="hybridMultilevel"/>
+    <w:lvl xmlns:w="http://schemas.openxmlformats.org/wordprocessingml/2006/main" w:ilvl="0">
+      <w:start w:val="5"/>
+      <w:numFmt w:val="decimal"/>
+      <w:lvlText w:val="%1."/>
+      <w:lvlJc w:val="left"/>
+      <w:pPr>
+        <w:ind w:left="720" w:hanging="360"/>
+      </w:pPr>
+    </w:lvl>
+    <w:lvl xmlns:w="http://schemas.openxmlformats.org/wordprocessingml/2006/main" w:ilvl="1">
+      <w:start w:val="1"/>
+      <w:numFmt w:val="lowerLetter"/>
+      <w:lvlText w:val="%2."/>
+      <w:lvlJc w:val="left"/>
+      <w:pPr>
+        <w:ind w:left="1440" w:hanging="360"/>
+      </w:pPr>
+    </w:lvl>
+    <w:lvl xmlns:w="http://schemas.openxmlformats.org/wordprocessingml/2006/main" w:ilvl="2">
+      <w:start w:val="1"/>
+      <w:numFmt w:val="lowerRoman"/>
+      <w:lvlText w:val="%3."/>
+      <w:lvlJc w:val="right"/>
+      <w:pPr>
+        <w:ind w:left="2160" w:hanging="180"/>
+      </w:pPr>
+    </w:lvl>
+    <w:lvl xmlns:w="http://schemas.openxmlformats.org/wordprocessingml/2006/main" w:ilvl="3">
+      <w:start w:val="1"/>
+      <w:numFmt w:val="decimal"/>
+      <w:lvlText w:val="%4."/>
+      <w:lvlJc w:val="left"/>
+      <w:pPr>
+        <w:ind w:left="2880" w:hanging="360"/>
+      </w:pPr>
+    </w:lvl>
+    <w:lvl xmlns:w="http://schemas.openxmlformats.org/wordprocessingml/2006/main" w:ilvl="4">
+      <w:start w:val="1"/>
+      <w:numFmt w:val="lowerLetter"/>
+      <w:lvlText w:val="%5."/>
+      <w:lvlJc w:val="left"/>
+      <w:pPr>
+        <w:ind w:left="3600" w:hanging="360"/>
+      </w:pPr>
+    </w:lvl>
+    <w:lvl xmlns:w="http://schemas.openxmlformats.org/wordprocessingml/2006/main" w:ilvl="5">
+      <w:start w:val="1"/>
+      <w:numFmt w:val="lowerRoman"/>
+      <w:lvlText w:val="%6."/>
+      <w:lvlJc w:val="right"/>
+      <w:pPr>
+        <w:ind w:left="4320" w:hanging="180"/>
+      </w:pPr>
+    </w:lvl>
+    <w:lvl xmlns:w="http://schemas.openxmlformats.org/wordprocessingml/2006/main" w:ilvl="6">
+      <w:start w:val="1"/>
+      <w:numFmt w:val="decimal"/>
+      <w:lvlText w:val="%7."/>
+      <w:lvlJc w:val="left"/>
+      <w:pPr>
+        <w:ind w:left="5040" w:hanging="360"/>
+      </w:pPr>
+    </w:lvl>
+    <w:lvl xmlns:w="http://schemas.openxmlformats.org/wordprocessingml/2006/main" w:ilvl="7">
+      <w:start w:val="1"/>
+      <w:numFmt w:val="lowerLetter"/>
+      <w:lvlText w:val="%8."/>
+      <w:lvlJc w:val="left"/>
+      <w:pPr>
+        <w:ind w:left="5760" w:hanging="360"/>
+      </w:pPr>
+    </w:lvl>
+    <w:lvl xmlns:w="http://schemas.openxmlformats.org/wordprocessingml/2006/main" w:ilvl="8">
+      <w:start w:val="1"/>
+      <w:numFmt w:val="lowerRoman"/>
+      <w:lvlText w:val="%9."/>
+      <w:lvlJc w:val="right"/>
+      <w:pPr>
+        <w:ind w:left="6480" w:hanging="180"/>
+      </w:pPr>
+    </w:lvl>
+  </w:abstractNum>
+  <w:abstractNum xmlns:w="http://schemas.openxmlformats.org/wordprocessingml/2006/main" w:abstractNumId="25">
+    <w:nsid w:val="2779e37e"/>
+    <w:multiLevelType xmlns:w="http://schemas.openxmlformats.org/wordprocessingml/2006/main" w:val="hybridMultilevel"/>
+    <w:lvl xmlns:w="http://schemas.openxmlformats.org/wordprocessingml/2006/main" w:ilvl="0">
+      <w:start w:val="4"/>
+      <w:numFmt w:val="decimal"/>
+      <w:lvlText w:val="%1."/>
+      <w:lvlJc w:val="left"/>
+      <w:pPr>
+        <w:ind w:left="720" w:hanging="360"/>
+      </w:pPr>
+    </w:lvl>
+    <w:lvl xmlns:w="http://schemas.openxmlformats.org/wordprocessingml/2006/main" w:ilvl="1">
+      <w:start w:val="1"/>
+      <w:numFmt w:val="lowerLetter"/>
+      <w:lvlText w:val="%2."/>
+      <w:lvlJc w:val="left"/>
+      <w:pPr>
+        <w:ind w:left="1440" w:hanging="360"/>
+      </w:pPr>
+    </w:lvl>
+    <w:lvl xmlns:w="http://schemas.openxmlformats.org/wordprocessingml/2006/main" w:ilvl="2">
+      <w:start w:val="1"/>
+      <w:numFmt w:val="lowerRoman"/>
+      <w:lvlText w:val="%3."/>
+      <w:lvlJc w:val="right"/>
+      <w:pPr>
+        <w:ind w:left="2160" w:hanging="180"/>
+      </w:pPr>
+    </w:lvl>
+    <w:lvl xmlns:w="http://schemas.openxmlformats.org/wordprocessingml/2006/main" w:ilvl="3">
+      <w:start w:val="1"/>
+      <w:numFmt w:val="decimal"/>
+      <w:lvlText w:val="%4."/>
+      <w:lvlJc w:val="left"/>
+      <w:pPr>
+        <w:ind w:left="2880" w:hanging="360"/>
+      </w:pPr>
+    </w:lvl>
+    <w:lvl xmlns:w="http://schemas.openxmlformats.org/wordprocessingml/2006/main" w:ilvl="4">
+      <w:start w:val="1"/>
+      <w:numFmt w:val="lowerLetter"/>
+      <w:lvlText w:val="%5."/>
+      <w:lvlJc w:val="left"/>
+      <w:pPr>
+        <w:ind w:left="3600" w:hanging="360"/>
+      </w:pPr>
+    </w:lvl>
+    <w:lvl xmlns:w="http://schemas.openxmlformats.org/wordprocessingml/2006/main" w:ilvl="5">
+      <w:start w:val="1"/>
+      <w:numFmt w:val="lowerRoman"/>
+      <w:lvlText w:val="%6."/>
+      <w:lvlJc w:val="right"/>
+      <w:pPr>
+        <w:ind w:left="4320" w:hanging="180"/>
+      </w:pPr>
+    </w:lvl>
+    <w:lvl xmlns:w="http://schemas.openxmlformats.org/wordprocessingml/2006/main" w:ilvl="6">
+      <w:start w:val="1"/>
+      <w:numFmt w:val="decimal"/>
+      <w:lvlText w:val="%7."/>
+      <w:lvlJc w:val="left"/>
+      <w:pPr>
+        <w:ind w:left="5040" w:hanging="360"/>
+      </w:pPr>
+    </w:lvl>
+    <w:lvl xmlns:w="http://schemas.openxmlformats.org/wordprocessingml/2006/main" w:ilvl="7">
+      <w:start w:val="1"/>
+      <w:numFmt w:val="lowerLetter"/>
+      <w:lvlText w:val="%8."/>
+      <w:lvlJc w:val="left"/>
+      <w:pPr>
+        <w:ind w:left="5760" w:hanging="360"/>
+      </w:pPr>
+    </w:lvl>
+    <w:lvl xmlns:w="http://schemas.openxmlformats.org/wordprocessingml/2006/main" w:ilvl="8">
+      <w:start w:val="1"/>
+      <w:numFmt w:val="lowerRoman"/>
+      <w:lvlText w:val="%9."/>
+      <w:lvlJc w:val="right"/>
+      <w:pPr>
+        <w:ind w:left="6480" w:hanging="180"/>
+      </w:pPr>
+    </w:lvl>
+  </w:abstractNum>
+  <w:abstractNum xmlns:w="http://schemas.openxmlformats.org/wordprocessingml/2006/main" w:abstractNumId="24">
+    <w:nsid w:val="2360fa85"/>
+    <w:multiLevelType xmlns:w="http://schemas.openxmlformats.org/wordprocessingml/2006/main" w:val="hybridMultilevel"/>
+    <w:lvl xmlns:w="http://schemas.openxmlformats.org/wordprocessingml/2006/main" w:ilvl="0">
+      <w:start w:val="3"/>
+      <w:numFmt w:val="decimal"/>
+      <w:lvlText w:val="%1."/>
+      <w:lvlJc w:val="left"/>
+      <w:pPr>
+        <w:ind w:left="720" w:hanging="360"/>
+      </w:pPr>
+    </w:lvl>
+    <w:lvl xmlns:w="http://schemas.openxmlformats.org/wordprocessingml/2006/main" w:ilvl="1">
+      <w:start w:val="1"/>
+      <w:numFmt w:val="lowerLetter"/>
+      <w:lvlText w:val="%2."/>
+      <w:lvlJc w:val="left"/>
+      <w:pPr>
+        <w:ind w:left="1440" w:hanging="360"/>
+      </w:pPr>
+    </w:lvl>
+    <w:lvl xmlns:w="http://schemas.openxmlformats.org/wordprocessingml/2006/main" w:ilvl="2">
+      <w:start w:val="1"/>
+      <w:numFmt w:val="lowerRoman"/>
+      <w:lvlText w:val="%3."/>
+      <w:lvlJc w:val="right"/>
+      <w:pPr>
+        <w:ind w:left="2160" w:hanging="180"/>
+      </w:pPr>
+    </w:lvl>
+    <w:lvl xmlns:w="http://schemas.openxmlformats.org/wordprocessingml/2006/main" w:ilvl="3">
+      <w:start w:val="1"/>
+      <w:numFmt w:val="decimal"/>
+      <w:lvlText w:val="%4."/>
+      <w:lvlJc w:val="left"/>
+      <w:pPr>
+        <w:ind w:left="2880" w:hanging="360"/>
+      </w:pPr>
+    </w:lvl>
+    <w:lvl xmlns:w="http://schemas.openxmlformats.org/wordprocessingml/2006/main" w:ilvl="4">
+      <w:start w:val="1"/>
+      <w:numFmt w:val="lowerLetter"/>
+      <w:lvlText w:val="%5."/>
+      <w:lvlJc w:val="left"/>
+      <w:pPr>
+        <w:ind w:left="3600" w:hanging="360"/>
+      </w:pPr>
+    </w:lvl>
+    <w:lvl xmlns:w="http://schemas.openxmlformats.org/wordprocessingml/2006/main" w:ilvl="5">
+      <w:start w:val="1"/>
+      <w:numFmt w:val="lowerRoman"/>
+      <w:lvlText w:val="%6."/>
+      <w:lvlJc w:val="right"/>
+      <w:pPr>
+        <w:ind w:left="4320" w:hanging="180"/>
+      </w:pPr>
+    </w:lvl>
+    <w:lvl xmlns:w="http://schemas.openxmlformats.org/wordprocessingml/2006/main" w:ilvl="6">
+      <w:start w:val="1"/>
+      <w:numFmt w:val="decimal"/>
+      <w:lvlText w:val="%7."/>
+      <w:lvlJc w:val="left"/>
+      <w:pPr>
+        <w:ind w:left="5040" w:hanging="360"/>
+      </w:pPr>
+    </w:lvl>
+    <w:lvl xmlns:w="http://schemas.openxmlformats.org/wordprocessingml/2006/main" w:ilvl="7">
+      <w:start w:val="1"/>
+      <w:numFmt w:val="lowerLetter"/>
+      <w:lvlText w:val="%8."/>
+      <w:lvlJc w:val="left"/>
+      <w:pPr>
+        <w:ind w:left="5760" w:hanging="360"/>
+      </w:pPr>
+    </w:lvl>
+    <w:lvl xmlns:w="http://schemas.openxmlformats.org/wordprocessingml/2006/main" w:ilvl="8">
+      <w:start w:val="1"/>
+      <w:numFmt w:val="lowerRoman"/>
+      <w:lvlText w:val="%9."/>
+      <w:lvlJc w:val="right"/>
+      <w:pPr>
+        <w:ind w:left="6480" w:hanging="180"/>
+      </w:pPr>
+    </w:lvl>
+  </w:abstractNum>
+  <w:abstractNum xmlns:w="http://schemas.openxmlformats.org/wordprocessingml/2006/main" w:abstractNumId="23">
+    <w:nsid w:val="3d7714ed"/>
+    <w:multiLevelType xmlns:w="http://schemas.openxmlformats.org/wordprocessingml/2006/main" w:val="hybridMultilevel"/>
+    <w:lvl xmlns:w="http://schemas.openxmlformats.org/wordprocessingml/2006/main" w:ilvl="0">
+      <w:start w:val="2"/>
+      <w:numFmt w:val="decimal"/>
+      <w:lvlText w:val="%1."/>
+      <w:lvlJc w:val="left"/>
+      <w:pPr>
+        <w:ind w:left="720" w:hanging="360"/>
+      </w:pPr>
+    </w:lvl>
+    <w:lvl xmlns:w="http://schemas.openxmlformats.org/wordprocessingml/2006/main" w:ilvl="1">
+      <w:start w:val="1"/>
+      <w:numFmt w:val="lowerLetter"/>
+      <w:lvlText w:val="%2."/>
+      <w:lvlJc w:val="left"/>
+      <w:pPr>
+        <w:ind w:left="1440" w:hanging="360"/>
+      </w:pPr>
+    </w:lvl>
+    <w:lvl xmlns:w="http://schemas.openxmlformats.org/wordprocessingml/2006/main" w:ilvl="2">
+      <w:start w:val="1"/>
+      <w:numFmt w:val="lowerRoman"/>
+      <w:lvlText w:val="%3."/>
+      <w:lvlJc w:val="right"/>
+      <w:pPr>
+        <w:ind w:left="2160" w:hanging="180"/>
+      </w:pPr>
+    </w:lvl>
+    <w:lvl xmlns:w="http://schemas.openxmlformats.org/wordprocessingml/2006/main" w:ilvl="3">
+      <w:start w:val="1"/>
+      <w:numFmt w:val="decimal"/>
+      <w:lvlText w:val="%4."/>
+      <w:lvlJc w:val="left"/>
+      <w:pPr>
+        <w:ind w:left="2880" w:hanging="360"/>
+      </w:pPr>
+    </w:lvl>
+    <w:lvl xmlns:w="http://schemas.openxmlformats.org/wordprocessingml/2006/main" w:ilvl="4">
+      <w:start w:val="1"/>
+      <w:numFmt w:val="lowerLetter"/>
+      <w:lvlText w:val="%5."/>
+      <w:lvlJc w:val="left"/>
+      <w:pPr>
+        <w:ind w:left="3600" w:hanging="360"/>
+      </w:pPr>
+    </w:lvl>
+    <w:lvl xmlns:w="http://schemas.openxmlformats.org/wordprocessingml/2006/main" w:ilvl="5">
+      <w:start w:val="1"/>
+      <w:numFmt w:val="lowerRoman"/>
+      <w:lvlText w:val="%6."/>
+      <w:lvlJc w:val="right"/>
+      <w:pPr>
+        <w:ind w:left="4320" w:hanging="180"/>
+      </w:pPr>
+    </w:lvl>
+    <w:lvl xmlns:w="http://schemas.openxmlformats.org/wordprocessingml/2006/main" w:ilvl="6">
+      <w:start w:val="1"/>
+      <w:numFmt w:val="decimal"/>
+      <w:lvlText w:val="%7."/>
+      <w:lvlJc w:val="left"/>
+      <w:pPr>
+        <w:ind w:left="5040" w:hanging="360"/>
+      </w:pPr>
+    </w:lvl>
+    <w:lvl xmlns:w="http://schemas.openxmlformats.org/wordprocessingml/2006/main" w:ilvl="7">
+      <w:start w:val="1"/>
+      <w:numFmt w:val="lowerLetter"/>
+      <w:lvlText w:val="%8."/>
+      <w:lvlJc w:val="left"/>
+      <w:pPr>
+        <w:ind w:left="5760" w:hanging="360"/>
+      </w:pPr>
+    </w:lvl>
+    <w:lvl xmlns:w="http://schemas.openxmlformats.org/wordprocessingml/2006/main" w:ilvl="8">
+      <w:start w:val="1"/>
+      <w:numFmt w:val="lowerRoman"/>
+      <w:lvlText w:val="%9."/>
+      <w:lvlJc w:val="right"/>
+      <w:pPr>
+        <w:ind w:left="6480" w:hanging="180"/>
+      </w:pPr>
+    </w:lvl>
+  </w:abstractNum>
+  <w:abstractNum xmlns:w="http://schemas.openxmlformats.org/wordprocessingml/2006/main" w:abstractNumId="22">
+    <w:nsid w:val="4ad3c57b"/>
+    <w:multiLevelType xmlns:w="http://schemas.openxmlformats.org/wordprocessingml/2006/main" w:val="hybridMultilevel"/>
+    <w:lvl xmlns:w="http://schemas.openxmlformats.org/wordprocessingml/2006/main" w:ilvl="0">
+      <w:start w:val="1"/>
+      <w:numFmt w:val="decimal"/>
+      <w:lvlText w:val="%1."/>
+      <w:lvlJc w:val="left"/>
+      <w:pPr>
+        <w:ind w:left="720" w:hanging="360"/>
+      </w:pPr>
+    </w:lvl>
+    <w:lvl xmlns:w="http://schemas.openxmlformats.org/wordprocessingml/2006/main" w:ilvl="1">
+      <w:start w:val="1"/>
+      <w:numFmt w:val="lowerLetter"/>
+      <w:lvlText w:val="%2."/>
+      <w:lvlJc w:val="left"/>
+      <w:pPr>
+        <w:ind w:left="1440" w:hanging="360"/>
+      </w:pPr>
+    </w:lvl>
+    <w:lvl xmlns:w="http://schemas.openxmlformats.org/wordprocessingml/2006/main" w:ilvl="2">
+      <w:start w:val="1"/>
+      <w:numFmt w:val="lowerRoman"/>
+      <w:lvlText w:val="%3."/>
+      <w:lvlJc w:val="right"/>
+      <w:pPr>
+        <w:ind w:left="2160" w:hanging="180"/>
+      </w:pPr>
+    </w:lvl>
+    <w:lvl xmlns:w="http://schemas.openxmlformats.org/wordprocessingml/2006/main" w:ilvl="3">
+      <w:start w:val="1"/>
+      <w:numFmt w:val="decimal"/>
+      <w:lvlText w:val="%4."/>
+      <w:lvlJc w:val="left"/>
+      <w:pPr>
+        <w:ind w:left="2880" w:hanging="360"/>
+      </w:pPr>
+    </w:lvl>
+    <w:lvl xmlns:w="http://schemas.openxmlformats.org/wordprocessingml/2006/main" w:ilvl="4">
+      <w:start w:val="1"/>
+      <w:numFmt w:val="lowerLetter"/>
+      <w:lvlText w:val="%5."/>
+      <w:lvlJc w:val="left"/>
+      <w:pPr>
+        <w:ind w:left="3600" w:hanging="360"/>
+      </w:pPr>
+    </w:lvl>
+    <w:lvl xmlns:w="http://schemas.openxmlformats.org/wordprocessingml/2006/main" w:ilvl="5">
+      <w:start w:val="1"/>
+      <w:numFmt w:val="lowerRoman"/>
+      <w:lvlText w:val="%6."/>
+      <w:lvlJc w:val="right"/>
+      <w:pPr>
+        <w:ind w:left="4320" w:hanging="180"/>
+      </w:pPr>
+    </w:lvl>
+    <w:lvl xmlns:w="http://schemas.openxmlformats.org/wordprocessingml/2006/main" w:ilvl="6">
+      <w:start w:val="1"/>
+      <w:numFmt w:val="decimal"/>
+      <w:lvlText w:val="%7."/>
+      <w:lvlJc w:val="left"/>
+      <w:pPr>
+        <w:ind w:left="5040" w:hanging="360"/>
+      </w:pPr>
+    </w:lvl>
+    <w:lvl xmlns:w="http://schemas.openxmlformats.org/wordprocessingml/2006/main" w:ilvl="7">
+      <w:start w:val="1"/>
+      <w:numFmt w:val="lowerLetter"/>
+      <w:lvlText w:val="%8."/>
+      <w:lvlJc w:val="left"/>
+      <w:pPr>
+        <w:ind w:left="5760" w:hanging="360"/>
+      </w:pPr>
+    </w:lvl>
+    <w:lvl xmlns:w="http://schemas.openxmlformats.org/wordprocessingml/2006/main" w:ilvl="8">
+      <w:start w:val="1"/>
+      <w:numFmt w:val="lowerRoman"/>
+      <w:lvlText w:val="%9."/>
+      <w:lvlJc w:val="right"/>
+      <w:pPr>
+        <w:ind w:left="6480" w:hanging="180"/>
+      </w:pPr>
+    </w:lvl>
+  </w:abstractNum>
+  <w:abstractNum xmlns:w="http://schemas.openxmlformats.org/wordprocessingml/2006/main" w:abstractNumId="21">
+    <w:nsid w:val="2edd77a4"/>
+    <w:multiLevelType xmlns:w="http://schemas.openxmlformats.org/wordprocessingml/2006/main" w:val="hybridMultilevel"/>
+    <w:lvl xmlns:w="http://schemas.openxmlformats.org/wordprocessingml/2006/main" w:ilvl="0">
+      <w:start w:val="1"/>
+      <w:numFmt w:val="decimal"/>
+      <w:lvlText w:val="%1."/>
+      <w:lvlJc w:val="left"/>
+      <w:pPr>
+        <w:ind w:left="720" w:hanging="360"/>
+      </w:pPr>
+    </w:lvl>
+    <w:lvl xmlns:w="http://schemas.openxmlformats.org/wordprocessingml/2006/main" w:ilvl="1">
+      <w:start w:val="1"/>
+      <w:numFmt w:val="lowerLetter"/>
+      <w:lvlText w:val="%2."/>
+      <w:lvlJc w:val="left"/>
+      <w:pPr>
+        <w:ind w:left="1440" w:hanging="360"/>
+      </w:pPr>
+    </w:lvl>
+    <w:lvl xmlns:w="http://schemas.openxmlformats.org/wordprocessingml/2006/main" w:ilvl="2">
+      <w:start w:val="1"/>
+      <w:numFmt w:val="lowerRoman"/>
+      <w:lvlText w:val="%3."/>
+      <w:lvlJc w:val="right"/>
+      <w:pPr>
+        <w:ind w:left="2160" w:hanging="180"/>
+      </w:pPr>
+    </w:lvl>
+    <w:lvl xmlns:w="http://schemas.openxmlformats.org/wordprocessingml/2006/main" w:ilvl="3">
+      <w:start w:val="1"/>
+      <w:numFmt w:val="decimal"/>
+      <w:lvlText w:val="%4."/>
+      <w:lvlJc w:val="left"/>
+      <w:pPr>
+        <w:ind w:left="2880" w:hanging="360"/>
+      </w:pPr>
+    </w:lvl>
+    <w:lvl xmlns:w="http://schemas.openxmlformats.org/wordprocessingml/2006/main" w:ilvl="4">
+      <w:start w:val="1"/>
+      <w:numFmt w:val="lowerLetter"/>
+      <w:lvlText w:val="%5."/>
+      <w:lvlJc w:val="left"/>
+      <w:pPr>
+        <w:ind w:left="3600" w:hanging="360"/>
+      </w:pPr>
+    </w:lvl>
+    <w:lvl xmlns:w="http://schemas.openxmlformats.org/wordprocessingml/2006/main" w:ilvl="5">
+      <w:start w:val="1"/>
+      <w:numFmt w:val="lowerRoman"/>
+      <w:lvlText w:val="%6."/>
+      <w:lvlJc w:val="right"/>
+      <w:pPr>
+        <w:ind w:left="4320" w:hanging="180"/>
+      </w:pPr>
+    </w:lvl>
+    <w:lvl xmlns:w="http://schemas.openxmlformats.org/wordprocessingml/2006/main" w:ilvl="6">
+      <w:start w:val="1"/>
+      <w:numFmt w:val="decimal"/>
+      <w:lvlText w:val="%7."/>
+      <w:lvlJc w:val="left"/>
+      <w:pPr>
+        <w:ind w:left="5040" w:hanging="360"/>
+      </w:pPr>
+    </w:lvl>
+    <w:lvl xmlns:w="http://schemas.openxmlformats.org/wordprocessingml/2006/main" w:ilvl="7">
+      <w:start w:val="1"/>
+      <w:numFmt w:val="lowerLetter"/>
+      <w:lvlText w:val="%8."/>
+      <w:lvlJc w:val="left"/>
+      <w:pPr>
+        <w:ind w:left="5760" w:hanging="360"/>
+      </w:pPr>
+    </w:lvl>
+    <w:lvl xmlns:w="http://schemas.openxmlformats.org/wordprocessingml/2006/main" w:ilvl="8">
+      <w:start w:val="1"/>
+      <w:numFmt w:val="lowerRoman"/>
+      <w:lvlText w:val="%9."/>
+      <w:lvlJc w:val="right"/>
+      <w:pPr>
+        <w:ind w:left="6480" w:hanging="180"/>
+      </w:pPr>
+    </w:lvl>
+  </w:abstractNum>
+  <w:abstractNum xmlns:w="http://schemas.openxmlformats.org/wordprocessingml/2006/main" w:abstractNumId="20">
+    <w:nsid w:val="114ffe98"/>
+    <w:multiLevelType xmlns:w="http://schemas.openxmlformats.org/wordprocessingml/2006/main" w:val="hybridMultilevel"/>
+    <w:lvl xmlns:w="http://schemas.openxmlformats.org/wordprocessingml/2006/main" w:ilvl="0">
+      <w:start w:val="4"/>
+      <w:numFmt w:val="decimal"/>
+      <w:lvlText w:val="%1."/>
+      <w:lvlJc w:val="left"/>
+      <w:pPr>
+        <w:ind w:left="720" w:hanging="360"/>
+      </w:pPr>
+    </w:lvl>
+    <w:lvl xmlns:w="http://schemas.openxmlformats.org/wordprocessingml/2006/main" w:ilvl="1">
+      <w:start w:val="1"/>
+      <w:numFmt w:val="lowerLetter"/>
+      <w:lvlText w:val="%2."/>
+      <w:lvlJc w:val="left"/>
+      <w:pPr>
+        <w:ind w:left="1440" w:hanging="360"/>
+      </w:pPr>
+    </w:lvl>
+    <w:lvl xmlns:w="http://schemas.openxmlformats.org/wordprocessingml/2006/main" w:ilvl="2">
+      <w:start w:val="1"/>
+      <w:numFmt w:val="lowerRoman"/>
+      <w:lvlText w:val="%3."/>
+      <w:lvlJc w:val="right"/>
+      <w:pPr>
+        <w:ind w:left="2160" w:hanging="180"/>
+      </w:pPr>
+    </w:lvl>
+    <w:lvl xmlns:w="http://schemas.openxmlformats.org/wordprocessingml/2006/main" w:ilvl="3">
+      <w:start w:val="1"/>
+      <w:numFmt w:val="decimal"/>
+      <w:lvlText w:val="%4."/>
+      <w:lvlJc w:val="left"/>
+      <w:pPr>
+        <w:ind w:left="2880" w:hanging="360"/>
+      </w:pPr>
+    </w:lvl>
+    <w:lvl xmlns:w="http://schemas.openxmlformats.org/wordprocessingml/2006/main" w:ilvl="4">
+      <w:start w:val="1"/>
+      <w:numFmt w:val="lowerLetter"/>
+      <w:lvlText w:val="%5."/>
+      <w:lvlJc w:val="left"/>
+      <w:pPr>
+        <w:ind w:left="3600" w:hanging="360"/>
+      </w:pPr>
+    </w:lvl>
+    <w:lvl xmlns:w="http://schemas.openxmlformats.org/wordprocessingml/2006/main" w:ilvl="5">
+      <w:start w:val="1"/>
+      <w:numFmt w:val="lowerRoman"/>
+      <w:lvlText w:val="%6."/>
+      <w:lvlJc w:val="right"/>
+      <w:pPr>
+        <w:ind w:left="4320" w:hanging="180"/>
+      </w:pPr>
+    </w:lvl>
+    <w:lvl xmlns:w="http://schemas.openxmlformats.org/wordprocessingml/2006/main" w:ilvl="6">
+      <w:start w:val="1"/>
+      <w:numFmt w:val="decimal"/>
+      <w:lvlText w:val="%7."/>
+      <w:lvlJc w:val="left"/>
+      <w:pPr>
+        <w:ind w:left="5040" w:hanging="360"/>
+      </w:pPr>
+    </w:lvl>
+    <w:lvl xmlns:w="http://schemas.openxmlformats.org/wordprocessingml/2006/main" w:ilvl="7">
+      <w:start w:val="1"/>
+      <w:numFmt w:val="lowerLetter"/>
+      <w:lvlText w:val="%8."/>
+      <w:lvlJc w:val="left"/>
+      <w:pPr>
+        <w:ind w:left="5760" w:hanging="360"/>
+      </w:pPr>
+    </w:lvl>
+    <w:lvl xmlns:w="http://schemas.openxmlformats.org/wordprocessingml/2006/main" w:ilvl="8">
+      <w:start w:val="1"/>
+      <w:numFmt w:val="lowerRoman"/>
+      <w:lvlText w:val="%9."/>
+      <w:lvlJc w:val="right"/>
+      <w:pPr>
+        <w:ind w:left="6480" w:hanging="180"/>
+      </w:pPr>
+    </w:lvl>
+  </w:abstractNum>
+  <w:abstractNum xmlns:w="http://schemas.openxmlformats.org/wordprocessingml/2006/main" w:abstractNumId="19">
+    <w:nsid w:val="3937f7c4"/>
+    <w:multiLevelType xmlns:w="http://schemas.openxmlformats.org/wordprocessingml/2006/main" w:val="hybridMultilevel"/>
+    <w:lvl xmlns:w="http://schemas.openxmlformats.org/wordprocessingml/2006/main" w:ilvl="0">
+      <w:start w:val="3"/>
+      <w:numFmt w:val="decimal"/>
+      <w:lvlText w:val="%1."/>
+      <w:lvlJc w:val="left"/>
+      <w:pPr>
+        <w:ind w:left="720" w:hanging="360"/>
+      </w:pPr>
+    </w:lvl>
+    <w:lvl xmlns:w="http://schemas.openxmlformats.org/wordprocessingml/2006/main" w:ilvl="1">
+      <w:start w:val="1"/>
+      <w:numFmt w:val="lowerLetter"/>
+      <w:lvlText w:val="%2."/>
+      <w:lvlJc w:val="left"/>
+      <w:pPr>
+        <w:ind w:left="1440" w:hanging="360"/>
+      </w:pPr>
+    </w:lvl>
+    <w:lvl xmlns:w="http://schemas.openxmlformats.org/wordprocessingml/2006/main" w:ilvl="2">
+      <w:start w:val="1"/>
+      <w:numFmt w:val="lowerRoman"/>
+      <w:lvlText w:val="%3."/>
+      <w:lvlJc w:val="right"/>
+      <w:pPr>
+        <w:ind w:left="2160" w:hanging="180"/>
+      </w:pPr>
+    </w:lvl>
+    <w:lvl xmlns:w="http://schemas.openxmlformats.org/wordprocessingml/2006/main" w:ilvl="3">
+      <w:start w:val="1"/>
+      <w:numFmt w:val="decimal"/>
+      <w:lvlText w:val="%4."/>
+      <w:lvlJc w:val="left"/>
+      <w:pPr>
+        <w:ind w:left="2880" w:hanging="360"/>
+      </w:pPr>
+    </w:lvl>
+    <w:lvl xmlns:w="http://schemas.openxmlformats.org/wordprocessingml/2006/main" w:ilvl="4">
+      <w:start w:val="1"/>
+      <w:numFmt w:val="lowerLetter"/>
+      <w:lvlText w:val="%5."/>
+      <w:lvlJc w:val="left"/>
+      <w:pPr>
+        <w:ind w:left="3600" w:hanging="360"/>
+      </w:pPr>
+    </w:lvl>
+    <w:lvl xmlns:w="http://schemas.openxmlformats.org/wordprocessingml/2006/main" w:ilvl="5">
+      <w:start w:val="1"/>
+      <w:numFmt w:val="lowerRoman"/>
+      <w:lvlText w:val="%6."/>
+      <w:lvlJc w:val="right"/>
+      <w:pPr>
+        <w:ind w:left="4320" w:hanging="180"/>
+      </w:pPr>
+    </w:lvl>
+    <w:lvl xmlns:w="http://schemas.openxmlformats.org/wordprocessingml/2006/main" w:ilvl="6">
+      <w:start w:val="1"/>
+      <w:numFmt w:val="decimal"/>
+      <w:lvlText w:val="%7."/>
+      <w:lvlJc w:val="left"/>
+      <w:pPr>
+        <w:ind w:left="5040" w:hanging="360"/>
+      </w:pPr>
+    </w:lvl>
+    <w:lvl xmlns:w="http://schemas.openxmlformats.org/wordprocessingml/2006/main" w:ilvl="7">
+      <w:start w:val="1"/>
+      <w:numFmt w:val="lowerLetter"/>
+      <w:lvlText w:val="%8."/>
+      <w:lvlJc w:val="left"/>
+      <w:pPr>
+        <w:ind w:left="5760" w:hanging="360"/>
+      </w:pPr>
+    </w:lvl>
+    <w:lvl xmlns:w="http://schemas.openxmlformats.org/wordprocessingml/2006/main" w:ilvl="8">
+      <w:start w:val="1"/>
+      <w:numFmt w:val="lowerRoman"/>
+      <w:lvlText w:val="%9."/>
+      <w:lvlJc w:val="right"/>
+      <w:pPr>
+        <w:ind w:left="6480" w:hanging="180"/>
+      </w:pPr>
+    </w:lvl>
+  </w:abstractNum>
+  <w:abstractNum xmlns:w="http://schemas.openxmlformats.org/wordprocessingml/2006/main" w:abstractNumId="18">
+    <w:nsid w:val="5d2cedb1"/>
+    <w:multiLevelType xmlns:w="http://schemas.openxmlformats.org/wordprocessingml/2006/main" w:val="hybridMultilevel"/>
+    <w:lvl xmlns:w="http://schemas.openxmlformats.org/wordprocessingml/2006/main" w:ilvl="0">
+      <w:start w:val="2"/>
+      <w:numFmt w:val="decimal"/>
+      <w:lvlText w:val="%1."/>
+      <w:lvlJc w:val="left"/>
+      <w:pPr>
+        <w:ind w:left="720" w:hanging="360"/>
+      </w:pPr>
+    </w:lvl>
+    <w:lvl xmlns:w="http://schemas.openxmlformats.org/wordprocessingml/2006/main" w:ilvl="1">
+      <w:start w:val="1"/>
+      <w:numFmt w:val="lowerLetter"/>
+      <w:lvlText w:val="%2."/>
+      <w:lvlJc w:val="left"/>
+      <w:pPr>
+        <w:ind w:left="1440" w:hanging="360"/>
+      </w:pPr>
+    </w:lvl>
+    <w:lvl xmlns:w="http://schemas.openxmlformats.org/wordprocessingml/2006/main" w:ilvl="2">
+      <w:start w:val="1"/>
+      <w:numFmt w:val="lowerRoman"/>
+      <w:lvlText w:val="%3."/>
+      <w:lvlJc w:val="right"/>
+      <w:pPr>
+        <w:ind w:left="2160" w:hanging="180"/>
+      </w:pPr>
+    </w:lvl>
+    <w:lvl xmlns:w="http://schemas.openxmlformats.org/wordprocessingml/2006/main" w:ilvl="3">
+      <w:start w:val="1"/>
+      <w:numFmt w:val="decimal"/>
+      <w:lvlText w:val="%4."/>
+      <w:lvlJc w:val="left"/>
+      <w:pPr>
+        <w:ind w:left="2880" w:hanging="360"/>
+      </w:pPr>
+    </w:lvl>
+    <w:lvl xmlns:w="http://schemas.openxmlformats.org/wordprocessingml/2006/main" w:ilvl="4">
+      <w:start w:val="1"/>
+      <w:numFmt w:val="lowerLetter"/>
+      <w:lvlText w:val="%5."/>
+      <w:lvlJc w:val="left"/>
+      <w:pPr>
+        <w:ind w:left="3600" w:hanging="360"/>
+      </w:pPr>
+    </w:lvl>
+    <w:lvl xmlns:w="http://schemas.openxmlformats.org/wordprocessingml/2006/main" w:ilvl="5">
+      <w:start w:val="1"/>
+      <w:numFmt w:val="lowerRoman"/>
+      <w:lvlText w:val="%6."/>
+      <w:lvlJc w:val="right"/>
+      <w:pPr>
+        <w:ind w:left="4320" w:hanging="180"/>
+      </w:pPr>
+    </w:lvl>
+    <w:lvl xmlns:w="http://schemas.openxmlformats.org/wordprocessingml/2006/main" w:ilvl="6">
+      <w:start w:val="1"/>
+      <w:numFmt w:val="decimal"/>
+      <w:lvlText w:val="%7."/>
+      <w:lvlJc w:val="left"/>
+      <w:pPr>
+        <w:ind w:left="5040" w:hanging="360"/>
+      </w:pPr>
+    </w:lvl>
+    <w:lvl xmlns:w="http://schemas.openxmlformats.org/wordprocessingml/2006/main" w:ilvl="7">
+      <w:start w:val="1"/>
+      <w:numFmt w:val="lowerLetter"/>
+      <w:lvlText w:val="%8."/>
+      <w:lvlJc w:val="left"/>
+      <w:pPr>
+        <w:ind w:left="5760" w:hanging="360"/>
+      </w:pPr>
+    </w:lvl>
+    <w:lvl xmlns:w="http://schemas.openxmlformats.org/wordprocessingml/2006/main" w:ilvl="8">
+      <w:start w:val="1"/>
+      <w:numFmt w:val="lowerRoman"/>
+      <w:lvlText w:val="%9."/>
+      <w:lvlJc w:val="right"/>
+      <w:pPr>
+        <w:ind w:left="6480" w:hanging="180"/>
+      </w:pPr>
+    </w:lvl>
+  </w:abstractNum>
+  <w:abstractNum xmlns:w="http://schemas.openxmlformats.org/wordprocessingml/2006/main" w:abstractNumId="17">
+    <w:nsid w:val="5af9f249"/>
+    <w:multiLevelType xmlns:w="http://schemas.openxmlformats.org/wordprocessingml/2006/main" w:val="hybridMultilevel"/>
+    <w:lvl xmlns:w="http://schemas.openxmlformats.org/wordprocessingml/2006/main" w:ilvl="0">
+      <w:start w:val="1"/>
+      <w:numFmt w:val="decimal"/>
+      <w:lvlText w:val="%1."/>
+      <w:lvlJc w:val="left"/>
+      <w:pPr>
+        <w:ind w:left="720" w:hanging="360"/>
+      </w:pPr>
+    </w:lvl>
+    <w:lvl xmlns:w="http://schemas.openxmlformats.org/wordprocessingml/2006/main" w:ilvl="1">
+      <w:start w:val="1"/>
+      <w:numFmt w:val="lowerLetter"/>
+      <w:lvlText w:val="%2."/>
+      <w:lvlJc w:val="left"/>
+      <w:pPr>
+        <w:ind w:left="1440" w:hanging="360"/>
+      </w:pPr>
+    </w:lvl>
+    <w:lvl xmlns:w="http://schemas.openxmlformats.org/wordprocessingml/2006/main" w:ilvl="2">
+      <w:start w:val="1"/>
+      <w:numFmt w:val="lowerRoman"/>
+      <w:lvlText w:val="%3."/>
+      <w:lvlJc w:val="right"/>
+      <w:pPr>
+        <w:ind w:left="2160" w:hanging="180"/>
+      </w:pPr>
+    </w:lvl>
+    <w:lvl xmlns:w="http://schemas.openxmlformats.org/wordprocessingml/2006/main" w:ilvl="3">
+      <w:start w:val="1"/>
+      <w:numFmt w:val="decimal"/>
+      <w:lvlText w:val="%4."/>
+      <w:lvlJc w:val="left"/>
+      <w:pPr>
+        <w:ind w:left="2880" w:hanging="360"/>
+      </w:pPr>
+    </w:lvl>
+    <w:lvl xmlns:w="http://schemas.openxmlformats.org/wordprocessingml/2006/main" w:ilvl="4">
+      <w:start w:val="1"/>
+      <w:numFmt w:val="lowerLetter"/>
+      <w:lvlText w:val="%5."/>
+      <w:lvlJc w:val="left"/>
+      <w:pPr>
+        <w:ind w:left="3600" w:hanging="360"/>
+      </w:pPr>
+    </w:lvl>
+    <w:lvl xmlns:w="http://schemas.openxmlformats.org/wordprocessingml/2006/main" w:ilvl="5">
+      <w:start w:val="1"/>
+      <w:numFmt w:val="lowerRoman"/>
+      <w:lvlText w:val="%6."/>
+      <w:lvlJc w:val="right"/>
+      <w:pPr>
+        <w:ind w:left="4320" w:hanging="180"/>
+      </w:pPr>
+    </w:lvl>
+    <w:lvl xmlns:w="http://schemas.openxmlformats.org/wordprocessingml/2006/main" w:ilvl="6">
+      <w:start w:val="1"/>
+      <w:numFmt w:val="decimal"/>
+      <w:lvlText w:val="%7."/>
+      <w:lvlJc w:val="left"/>
+      <w:pPr>
+        <w:ind w:left="5040" w:hanging="360"/>
+      </w:pPr>
+    </w:lvl>
+    <w:lvl xmlns:w="http://schemas.openxmlformats.org/wordprocessingml/2006/main" w:ilvl="7">
+      <w:start w:val="1"/>
+      <w:numFmt w:val="lowerLetter"/>
+      <w:lvlText w:val="%8."/>
+      <w:lvlJc w:val="left"/>
+      <w:pPr>
+        <w:ind w:left="5760" w:hanging="360"/>
+      </w:pPr>
+    </w:lvl>
+    <w:lvl xmlns:w="http://schemas.openxmlformats.org/wordprocessingml/2006/main" w:ilvl="8">
+      <w:start w:val="1"/>
+      <w:numFmt w:val="lowerRoman"/>
+      <w:lvlText w:val="%9."/>
+      <w:lvlJc w:val="right"/>
+      <w:pPr>
+        <w:ind w:left="6480" w:hanging="180"/>
+      </w:pPr>
+    </w:lvl>
+  </w:abstractNum>
   <w:abstractNum xmlns:w="http://schemas.openxmlformats.org/wordprocessingml/2006/main" w:abstractNumId="16">
     <w:nsid w:val="135d44cf"/>
     <w:multiLevelType xmlns:w="http://schemas.openxmlformats.org/wordprocessingml/2006/main" w:val="hybridMultilevel"/>
@@ -8252,6 +10500,39 @@
       </w:rPr>
     </w:lvl>
   </w:abstractNum>
+  <w:num w:numId="27">
+    <w:abstractNumId w:val="27"/>
+  </w:num>
+  <w:num w:numId="26">
+    <w:abstractNumId w:val="26"/>
+  </w:num>
+  <w:num w:numId="25">
+    <w:abstractNumId w:val="25"/>
+  </w:num>
+  <w:num w:numId="24">
+    <w:abstractNumId w:val="24"/>
+  </w:num>
+  <w:num w:numId="23">
+    <w:abstractNumId w:val="23"/>
+  </w:num>
+  <w:num w:numId="22">
+    <w:abstractNumId w:val="22"/>
+  </w:num>
+  <w:num w:numId="21">
+    <w:abstractNumId w:val="21"/>
+  </w:num>
+  <w:num w:numId="20">
+    <w:abstractNumId w:val="20"/>
+  </w:num>
+  <w:num w:numId="19">
+    <w:abstractNumId w:val="19"/>
+  </w:num>
+  <w:num w:numId="18">
+    <w:abstractNumId w:val="18"/>
+  </w:num>
+  <w:num w:numId="17">
+    <w:abstractNumId w:val="17"/>
+  </w:num>
   <w:num w:numId="16">
     <w:abstractNumId w:val="16"/>
   </w:num>

</xml_diff>

<commit_message>
Cambio en el tope de caracteres en descripcion de categorias y actualizacion del bitacora
</commit_message>
<xml_diff>
--- a/Documentacion/Bitacora_Joaquin.docx
+++ b/Documentacion/Bitacora_Joaquin.docx
@@ -7584,6 +7584,783 @@
           <w:szCs w:val="24"/>
           <w:lang w:val="es-ES"/>
         </w:rPr>
+      </w:pPr>
+    </w:p>
+    <w:p>
+      <w:pPr>
+        <w:spacing w:before="240" w:beforeAutospacing="off" w:after="240" w:afterAutospacing="off"/>
+      </w:pPr>
+      <w:r>
+        <w:rPr>
+          <w:rFonts w:ascii="Aptos" w:hAnsi="Aptos" w:eastAsia="Aptos" w:cs="Aptos"/>
+          <w:b w:val="1"/>
+          <w:bCs w:val="1"/>
+          <w:noProof w:val="0"/>
+          <w:sz w:val="24"/>
+          <w:szCs w:val="24"/>
+          <w:lang w:val="es-ES"/>
+        </w:rPr>
+        <w:t>Fecha:</w:t>
+      </w:r>
+      <w:r>
+        <w:rPr>
+          <w:rFonts w:ascii="Aptos" w:hAnsi="Aptos" w:eastAsia="Aptos" w:cs="Aptos"/>
+          <w:noProof w:val="0"/>
+          <w:sz w:val="24"/>
+          <w:szCs w:val="24"/>
+          <w:lang w:val="es-ES"/>
+        </w:rPr>
+        <w:t xml:space="preserve"> 12 de mayo de 2026</w:t>
+      </w:r>
+    </w:p>
+    <w:p>
+      <w:pPr>
+        <w:spacing w:before="240" w:beforeAutospacing="off" w:after="240" w:afterAutospacing="off"/>
+      </w:pPr>
+      <w:r>
+        <w:rPr>
+          <w:rFonts w:ascii="Aptos" w:hAnsi="Aptos" w:eastAsia="Aptos" w:cs="Aptos"/>
+          <w:b w:val="1"/>
+          <w:bCs w:val="1"/>
+          <w:noProof w:val="0"/>
+          <w:sz w:val="24"/>
+          <w:szCs w:val="24"/>
+          <w:lang w:val="es-ES"/>
+        </w:rPr>
+        <w:t>Objetivo:</w:t>
+      </w:r>
+      <w:r>
+        <w:rPr>
+          <w:rFonts w:ascii="Aptos" w:hAnsi="Aptos" w:eastAsia="Aptos" w:cs="Aptos"/>
+          <w:noProof w:val="0"/>
+          <w:sz w:val="24"/>
+          <w:szCs w:val="24"/>
+          <w:lang w:val="es-ES"/>
+        </w:rPr>
+        <w:t xml:space="preserve"> Revisión y refactorización de la arquitectura del proyecto para mejorar la seguridad, la calidad del código y la mantenibilidad general.</w:t>
+      </w:r>
+    </w:p>
+    <w:p>
+      <w:pPr>
+        <w:pStyle w:val="Heading3"/>
+        <w:spacing w:before="281" w:beforeAutospacing="off" w:after="281" w:afterAutospacing="off"/>
+      </w:pPr>
+      <w:r>
+        <w:rPr>
+          <w:rFonts w:ascii="Aptos" w:hAnsi="Aptos" w:eastAsia="Aptos" w:cs="Aptos"/>
+          <w:b w:val="1"/>
+          <w:bCs w:val="1"/>
+          <w:noProof w:val="0"/>
+          <w:sz w:val="28"/>
+          <w:szCs w:val="28"/>
+          <w:lang w:val="es-ES"/>
+        </w:rPr>
+        <w:t>1. Seguridad en el backend: credenciales y autorización</w:t>
+      </w:r>
+    </w:p>
+    <w:p>
+      <w:pPr>
+        <w:spacing w:before="240" w:beforeAutospacing="off" w:after="240" w:afterAutospacing="off"/>
+      </w:pPr>
+      <w:r>
+        <w:rPr>
+          <w:rFonts w:ascii="Aptos" w:hAnsi="Aptos" w:eastAsia="Aptos" w:cs="Aptos"/>
+          <w:noProof w:val="0"/>
+          <w:sz w:val="24"/>
+          <w:szCs w:val="24"/>
+          <w:lang w:val="es-ES"/>
+        </w:rPr>
+        <w:t xml:space="preserve">He resuelto dos problemas de seguridad importantes. Por un lado, las claves de EmailJS estaban hardcodeadas en el código; las he migrado a variables de entorno con </w:t>
+      </w:r>
+      <w:r>
+        <w:rPr>
+          <w:rFonts w:ascii="Consolas" w:hAnsi="Consolas" w:eastAsia="Consolas" w:cs="Consolas"/>
+          <w:noProof w:val="0"/>
+          <w:sz w:val="24"/>
+          <w:szCs w:val="24"/>
+          <w:lang w:val="es-ES"/>
+        </w:rPr>
+        <w:t>@Value</w:t>
+      </w:r>
+      <w:r>
+        <w:rPr>
+          <w:rFonts w:ascii="Aptos" w:hAnsi="Aptos" w:eastAsia="Aptos" w:cs="Aptos"/>
+          <w:noProof w:val="0"/>
+          <w:sz w:val="24"/>
+          <w:szCs w:val="24"/>
+          <w:lang w:val="es-ES"/>
+        </w:rPr>
+        <w:t xml:space="preserve"> de Spring, dejando los valores reales solo en el panel de Render. Por otro, los controladores confiaban en el </w:t>
+      </w:r>
+      <w:r>
+        <w:rPr>
+          <w:rFonts w:ascii="Consolas" w:hAnsi="Consolas" w:eastAsia="Consolas" w:cs="Consolas"/>
+          <w:noProof w:val="0"/>
+          <w:sz w:val="24"/>
+          <w:szCs w:val="24"/>
+          <w:lang w:val="es-ES"/>
+        </w:rPr>
+        <w:t>usuarioId</w:t>
+      </w:r>
+      <w:r>
+        <w:rPr>
+          <w:rFonts w:ascii="Aptos" w:hAnsi="Aptos" w:eastAsia="Aptos" w:cs="Aptos"/>
+          <w:noProof w:val="0"/>
+          <w:sz w:val="24"/>
+          <w:szCs w:val="24"/>
+          <w:lang w:val="es-ES"/>
+        </w:rPr>
+        <w:t xml:space="preserve"> que mandaba el frontend por la URL, lo que permitía a cualquier usuario ver o borrar recursos ajenos. He creado la clase </w:t>
+      </w:r>
+      <w:r>
+        <w:rPr>
+          <w:rFonts w:ascii="Consolas" w:hAnsi="Consolas" w:eastAsia="Consolas" w:cs="Consolas"/>
+          <w:noProof w:val="0"/>
+          <w:sz w:val="24"/>
+          <w:szCs w:val="24"/>
+          <w:lang w:val="es-ES"/>
+        </w:rPr>
+        <w:t>AuthenticatedUser</w:t>
+      </w:r>
+      <w:r>
+        <w:rPr>
+          <w:rFonts w:ascii="Aptos" w:hAnsi="Aptos" w:eastAsia="Aptos" w:cs="Aptos"/>
+          <w:noProof w:val="0"/>
+          <w:sz w:val="24"/>
+          <w:szCs w:val="24"/>
+          <w:lang w:val="es-ES"/>
+        </w:rPr>
+        <w:t xml:space="preserve"> y modificado el </w:t>
+      </w:r>
+      <w:r>
+        <w:rPr>
+          <w:rFonts w:ascii="Consolas" w:hAnsi="Consolas" w:eastAsia="Consolas" w:cs="Consolas"/>
+          <w:noProof w:val="0"/>
+          <w:sz w:val="24"/>
+          <w:szCs w:val="24"/>
+          <w:lang w:val="es-ES"/>
+        </w:rPr>
+        <w:t>JwtFilter</w:t>
+      </w:r>
+      <w:r>
+        <w:rPr>
+          <w:rFonts w:ascii="Aptos" w:hAnsi="Aptos" w:eastAsia="Aptos" w:cs="Aptos"/>
+          <w:noProof w:val="0"/>
+          <w:sz w:val="24"/>
+          <w:szCs w:val="24"/>
+          <w:lang w:val="es-ES"/>
+        </w:rPr>
+        <w:t xml:space="preserve"> para que el id del usuario se extraiga siempre del token JWT. Los métodos PUT y DELETE ahora devuelven 403 si el recurso no es tuyo. De paso, también he sustituido </w:t>
+      </w:r>
+      <w:r>
+        <w:rPr>
+          <w:rFonts w:ascii="Consolas" w:hAnsi="Consolas" w:eastAsia="Consolas" w:cs="Consolas"/>
+          <w:noProof w:val="0"/>
+          <w:sz w:val="24"/>
+          <w:szCs w:val="24"/>
+          <w:lang w:val="es-ES"/>
+        </w:rPr>
+        <w:t>Random</w:t>
+      </w:r>
+      <w:r>
+        <w:rPr>
+          <w:rFonts w:ascii="Aptos" w:hAnsi="Aptos" w:eastAsia="Aptos" w:cs="Aptos"/>
+          <w:noProof w:val="0"/>
+          <w:sz w:val="24"/>
+          <w:szCs w:val="24"/>
+          <w:lang w:val="es-ES"/>
+        </w:rPr>
+        <w:t xml:space="preserve"> por </w:t>
+      </w:r>
+      <w:r>
+        <w:rPr>
+          <w:rFonts w:ascii="Consolas" w:hAnsi="Consolas" w:eastAsia="Consolas" w:cs="Consolas"/>
+          <w:noProof w:val="0"/>
+          <w:sz w:val="24"/>
+          <w:szCs w:val="24"/>
+          <w:lang w:val="es-ES"/>
+        </w:rPr>
+        <w:t>SecureRandom</w:t>
+      </w:r>
+      <w:r>
+        <w:rPr>
+          <w:rFonts w:ascii="Aptos" w:hAnsi="Aptos" w:eastAsia="Aptos" w:cs="Aptos"/>
+          <w:noProof w:val="0"/>
+          <w:sz w:val="24"/>
+          <w:szCs w:val="24"/>
+          <w:lang w:val="es-ES"/>
+        </w:rPr>
+        <w:t xml:space="preserve"> en la generación del PIN, que es lo correcto para operaciones de seguridad.</w:t>
+      </w:r>
+    </w:p>
+    <w:p>
+      <w:pPr>
+        <w:pStyle w:val="Heading3"/>
+        <w:spacing w:before="281" w:beforeAutospacing="off" w:after="281" w:afterAutospacing="off"/>
+      </w:pPr>
+      <w:r>
+        <w:rPr>
+          <w:rFonts w:ascii="Aptos" w:hAnsi="Aptos" w:eastAsia="Aptos" w:cs="Aptos"/>
+          <w:b w:val="1"/>
+          <w:bCs w:val="1"/>
+          <w:noProof w:val="0"/>
+          <w:sz w:val="28"/>
+          <w:szCs w:val="28"/>
+          <w:lang w:val="es-ES"/>
+        </w:rPr>
+        <w:t>2. Validación de DTOs y capa de servicios</w:t>
+      </w:r>
+    </w:p>
+    <w:p>
+      <w:pPr>
+        <w:spacing w:before="240" w:beforeAutospacing="off" w:after="240" w:afterAutospacing="off"/>
+      </w:pPr>
+      <w:r>
+        <w:rPr>
+          <w:rFonts w:ascii="Aptos" w:hAnsi="Aptos" w:eastAsia="Aptos" w:cs="Aptos"/>
+          <w:noProof w:val="0"/>
+          <w:sz w:val="24"/>
+          <w:szCs w:val="24"/>
+          <w:lang w:val="es-ES"/>
+        </w:rPr>
+        <w:t xml:space="preserve">He añadido </w:t>
+      </w:r>
+      <w:r>
+        <w:rPr>
+          <w:rFonts w:ascii="Consolas" w:hAnsi="Consolas" w:eastAsia="Consolas" w:cs="Consolas"/>
+          <w:noProof w:val="0"/>
+          <w:sz w:val="24"/>
+          <w:szCs w:val="24"/>
+          <w:lang w:val="es-ES"/>
+        </w:rPr>
+        <w:t>spring-boot-starter-validation</w:t>
+      </w:r>
+      <w:r>
+        <w:rPr>
+          <w:rFonts w:ascii="Aptos" w:hAnsi="Aptos" w:eastAsia="Aptos" w:cs="Aptos"/>
+          <w:noProof w:val="0"/>
+          <w:sz w:val="24"/>
+          <w:szCs w:val="24"/>
+          <w:lang w:val="es-ES"/>
+        </w:rPr>
+        <w:t xml:space="preserve"> al </w:t>
+      </w:r>
+      <w:r>
+        <w:rPr>
+          <w:rFonts w:ascii="Consolas" w:hAnsi="Consolas" w:eastAsia="Consolas" w:cs="Consolas"/>
+          <w:noProof w:val="0"/>
+          <w:sz w:val="24"/>
+          <w:szCs w:val="24"/>
+          <w:lang w:val="es-ES"/>
+        </w:rPr>
+        <w:t>pom.xml</w:t>
+      </w:r>
+      <w:r>
+        <w:rPr>
+          <w:rFonts w:ascii="Aptos" w:hAnsi="Aptos" w:eastAsia="Aptos" w:cs="Aptos"/>
+          <w:noProof w:val="0"/>
+          <w:sz w:val="24"/>
+          <w:szCs w:val="24"/>
+          <w:lang w:val="es-ES"/>
+        </w:rPr>
+        <w:t xml:space="preserve"> y decorado los DTOs con anotaciones como </w:t>
+      </w:r>
+      <w:r>
+        <w:rPr>
+          <w:rFonts w:ascii="Consolas" w:hAnsi="Consolas" w:eastAsia="Consolas" w:cs="Consolas"/>
+          <w:noProof w:val="0"/>
+          <w:sz w:val="24"/>
+          <w:szCs w:val="24"/>
+          <w:lang w:val="es-ES"/>
+        </w:rPr>
+        <w:t>@NotBlank</w:t>
+      </w:r>
+      <w:r>
+        <w:rPr>
+          <w:rFonts w:ascii="Aptos" w:hAnsi="Aptos" w:eastAsia="Aptos" w:cs="Aptos"/>
+          <w:noProof w:val="0"/>
+          <w:sz w:val="24"/>
+          <w:szCs w:val="24"/>
+          <w:lang w:val="es-ES"/>
+        </w:rPr>
+        <w:t xml:space="preserve">, </w:t>
+      </w:r>
+      <w:r>
+        <w:rPr>
+          <w:rFonts w:ascii="Consolas" w:hAnsi="Consolas" w:eastAsia="Consolas" w:cs="Consolas"/>
+          <w:noProof w:val="0"/>
+          <w:sz w:val="24"/>
+          <w:szCs w:val="24"/>
+          <w:lang w:val="es-ES"/>
+        </w:rPr>
+        <w:t>@Size</w:t>
+      </w:r>
+      <w:r>
+        <w:rPr>
+          <w:rFonts w:ascii="Aptos" w:hAnsi="Aptos" w:eastAsia="Aptos" w:cs="Aptos"/>
+          <w:noProof w:val="0"/>
+          <w:sz w:val="24"/>
+          <w:szCs w:val="24"/>
+          <w:lang w:val="es-ES"/>
+        </w:rPr>
+        <w:t xml:space="preserve"> y </w:t>
+      </w:r>
+      <w:r>
+        <w:rPr>
+          <w:rFonts w:ascii="Consolas" w:hAnsi="Consolas" w:eastAsia="Consolas" w:cs="Consolas"/>
+          <w:noProof w:val="0"/>
+          <w:sz w:val="24"/>
+          <w:szCs w:val="24"/>
+          <w:lang w:val="es-ES"/>
+        </w:rPr>
+        <w:t>@NotNull</w:t>
+      </w:r>
+      <w:r>
+        <w:rPr>
+          <w:rFonts w:ascii="Aptos" w:hAnsi="Aptos" w:eastAsia="Aptos" w:cs="Aptos"/>
+          <w:noProof w:val="0"/>
+          <w:sz w:val="24"/>
+          <w:szCs w:val="24"/>
+          <w:lang w:val="es-ES"/>
+        </w:rPr>
+        <w:t xml:space="preserve">, de forma que el backend rechaza automáticamente con un 400 cualquier petición con datos inválidos. Además, he introducido la capa de servicios: he creado </w:t>
+      </w:r>
+      <w:r>
+        <w:rPr>
+          <w:rFonts w:ascii="Consolas" w:hAnsi="Consolas" w:eastAsia="Consolas" w:cs="Consolas"/>
+          <w:noProof w:val="0"/>
+          <w:sz w:val="24"/>
+          <w:szCs w:val="24"/>
+          <w:lang w:val="es-ES"/>
+        </w:rPr>
+        <w:t>CategoriaService.java</w:t>
+      </w:r>
+      <w:r>
+        <w:rPr>
+          <w:rFonts w:ascii="Aptos" w:hAnsi="Aptos" w:eastAsia="Aptos" w:cs="Aptos"/>
+          <w:noProof w:val="0"/>
+          <w:sz w:val="24"/>
+          <w:szCs w:val="24"/>
+          <w:lang w:val="es-ES"/>
+        </w:rPr>
+        <w:t xml:space="preserve"> y </w:t>
+      </w:r>
+      <w:r>
+        <w:rPr>
+          <w:rFonts w:ascii="Consolas" w:hAnsi="Consolas" w:eastAsia="Consolas" w:cs="Consolas"/>
+          <w:noProof w:val="0"/>
+          <w:sz w:val="24"/>
+          <w:szCs w:val="24"/>
+          <w:lang w:val="es-ES"/>
+        </w:rPr>
+        <w:t>ArticuloService.java</w:t>
+      </w:r>
+      <w:r>
+        <w:rPr>
+          <w:rFonts w:ascii="Aptos" w:hAnsi="Aptos" w:eastAsia="Aptos" w:cs="Aptos"/>
+          <w:noProof w:val="0"/>
+          <w:sz w:val="24"/>
+          <w:szCs w:val="24"/>
+          <w:lang w:val="es-ES"/>
+        </w:rPr>
+        <w:t xml:space="preserve"> moviendo toda la lógica de negocio fuera de los controladores. Ahora la arquitectura sigue correctamente el patrón Controller → Service → Repository, con cada capa teniendo una única responsabilidad.</w:t>
+      </w:r>
+    </w:p>
+    <w:p>
+      <w:pPr>
+        <w:pStyle w:val="Heading3"/>
+        <w:spacing w:before="281" w:beforeAutospacing="off" w:after="281" w:afterAutospacing="off"/>
+      </w:pPr>
+      <w:r>
+        <w:rPr>
+          <w:rFonts w:ascii="Aptos" w:hAnsi="Aptos" w:eastAsia="Aptos" w:cs="Aptos"/>
+          <w:b w:val="1"/>
+          <w:bCs w:val="1"/>
+          <w:noProof w:val="0"/>
+          <w:sz w:val="28"/>
+          <w:szCs w:val="28"/>
+          <w:lang w:val="es-ES"/>
+        </w:rPr>
+        <w:t>3. Centralización de la API y manejo de sesión expirada en el frontend</w:t>
+      </w:r>
+    </w:p>
+    <w:p>
+      <w:pPr>
+        <w:spacing w:before="240" w:beforeAutospacing="off" w:after="240" w:afterAutospacing="off"/>
+      </w:pPr>
+      <w:r>
+        <w:rPr>
+          <w:rFonts w:ascii="Aptos" w:hAnsi="Aptos" w:eastAsia="Aptos" w:cs="Aptos"/>
+          <w:noProof w:val="0"/>
+          <w:sz w:val="24"/>
+          <w:szCs w:val="24"/>
+          <w:lang w:val="es-ES"/>
+        </w:rPr>
+        <w:t xml:space="preserve">Tenía la URL de Render hardcodeada en más de 30 llamadas </w:t>
+      </w:r>
+      <w:r>
+        <w:rPr>
+          <w:rFonts w:ascii="Consolas" w:hAnsi="Consolas" w:eastAsia="Consolas" w:cs="Consolas"/>
+          <w:noProof w:val="0"/>
+          <w:sz w:val="24"/>
+          <w:szCs w:val="24"/>
+          <w:lang w:val="es-ES"/>
+        </w:rPr>
+        <w:t>fetch</w:t>
+      </w:r>
+      <w:r>
+        <w:rPr>
+          <w:rFonts w:ascii="Aptos" w:hAnsi="Aptos" w:eastAsia="Aptos" w:cs="Aptos"/>
+          <w:noProof w:val="0"/>
+          <w:sz w:val="24"/>
+          <w:szCs w:val="24"/>
+          <w:lang w:val="es-ES"/>
+        </w:rPr>
+        <w:t xml:space="preserve"> distintas. He creado </w:t>
+      </w:r>
+      <w:r>
+        <w:rPr>
+          <w:rFonts w:ascii="Consolas" w:hAnsi="Consolas" w:eastAsia="Consolas" w:cs="Consolas"/>
+          <w:noProof w:val="0"/>
+          <w:sz w:val="24"/>
+          <w:szCs w:val="24"/>
+          <w:lang w:val="es-ES"/>
+        </w:rPr>
+        <w:t>src/services/api.js</w:t>
+      </w:r>
+      <w:r>
+        <w:rPr>
+          <w:rFonts w:ascii="Aptos" w:hAnsi="Aptos" w:eastAsia="Aptos" w:cs="Aptos"/>
+          <w:noProof w:val="0"/>
+          <w:sz w:val="24"/>
+          <w:szCs w:val="24"/>
+          <w:lang w:val="es-ES"/>
+        </w:rPr>
+        <w:t xml:space="preserve"> con todos los métodos organizados (</w:t>
+      </w:r>
+      <w:r>
+        <w:rPr>
+          <w:rFonts w:ascii="Consolas" w:hAnsi="Consolas" w:eastAsia="Consolas" w:cs="Consolas"/>
+          <w:noProof w:val="0"/>
+          <w:sz w:val="24"/>
+          <w:szCs w:val="24"/>
+          <w:lang w:val="es-ES"/>
+        </w:rPr>
+        <w:t>categoriasApi</w:t>
+      </w:r>
+      <w:r>
+        <w:rPr>
+          <w:rFonts w:ascii="Aptos" w:hAnsi="Aptos" w:eastAsia="Aptos" w:cs="Aptos"/>
+          <w:noProof w:val="0"/>
+          <w:sz w:val="24"/>
+          <w:szCs w:val="24"/>
+          <w:lang w:val="es-ES"/>
+        </w:rPr>
+        <w:t xml:space="preserve">, </w:t>
+      </w:r>
+      <w:r>
+        <w:rPr>
+          <w:rFonts w:ascii="Consolas" w:hAnsi="Consolas" w:eastAsia="Consolas" w:cs="Consolas"/>
+          <w:noProof w:val="0"/>
+          <w:sz w:val="24"/>
+          <w:szCs w:val="24"/>
+          <w:lang w:val="es-ES"/>
+        </w:rPr>
+        <w:t>articulosApi</w:t>
+      </w:r>
+      <w:r>
+        <w:rPr>
+          <w:rFonts w:ascii="Aptos" w:hAnsi="Aptos" w:eastAsia="Aptos" w:cs="Aptos"/>
+          <w:noProof w:val="0"/>
+          <w:sz w:val="24"/>
+          <w:szCs w:val="24"/>
+          <w:lang w:val="es-ES"/>
+        </w:rPr>
+        <w:t xml:space="preserve">, </w:t>
+      </w:r>
+      <w:r>
+        <w:rPr>
+          <w:rFonts w:ascii="Consolas" w:hAnsi="Consolas" w:eastAsia="Consolas" w:cs="Consolas"/>
+          <w:noProof w:val="0"/>
+          <w:sz w:val="24"/>
+          <w:szCs w:val="24"/>
+          <w:lang w:val="es-ES"/>
+        </w:rPr>
+        <w:t>adminApi</w:t>
+      </w:r>
+      <w:r>
+        <w:rPr>
+          <w:rFonts w:ascii="Aptos" w:hAnsi="Aptos" w:eastAsia="Aptos" w:cs="Aptos"/>
+          <w:noProof w:val="0"/>
+          <w:sz w:val="24"/>
+          <w:szCs w:val="24"/>
+          <w:lang w:val="es-ES"/>
+        </w:rPr>
+        <w:t xml:space="preserve">) y la URL base leyendo de variables de entorno Vite. He añadido también un wrapper </w:t>
+      </w:r>
+      <w:r>
+        <w:rPr>
+          <w:rFonts w:ascii="Consolas" w:hAnsi="Consolas" w:eastAsia="Consolas" w:cs="Consolas"/>
+          <w:noProof w:val="0"/>
+          <w:sz w:val="24"/>
+          <w:szCs w:val="24"/>
+          <w:lang w:val="es-ES"/>
+        </w:rPr>
+        <w:t>fetchConAuth</w:t>
+      </w:r>
+      <w:r>
+        <w:rPr>
+          <w:rFonts w:ascii="Aptos" w:hAnsi="Aptos" w:eastAsia="Aptos" w:cs="Aptos"/>
+          <w:noProof w:val="0"/>
+          <w:sz w:val="24"/>
+          <w:szCs w:val="24"/>
+          <w:lang w:val="es-ES"/>
+        </w:rPr>
+        <w:t xml:space="preserve"> que intercepta cualquier 401 o 403, limpia el </w:t>
+      </w:r>
+      <w:r>
+        <w:rPr>
+          <w:rFonts w:ascii="Consolas" w:hAnsi="Consolas" w:eastAsia="Consolas" w:cs="Consolas"/>
+          <w:noProof w:val="0"/>
+          <w:sz w:val="24"/>
+          <w:szCs w:val="24"/>
+          <w:lang w:val="es-ES"/>
+        </w:rPr>
+        <w:t>localStorage</w:t>
+      </w:r>
+      <w:r>
+        <w:rPr>
+          <w:rFonts w:ascii="Aptos" w:hAnsi="Aptos" w:eastAsia="Aptos" w:cs="Aptos"/>
+          <w:noProof w:val="0"/>
+          <w:sz w:val="24"/>
+          <w:szCs w:val="24"/>
+          <w:lang w:val="es-ES"/>
+        </w:rPr>
+        <w:t xml:space="preserve"> y redirige automáticamente al login con un mensaje explicativo, en vez de dejar al usuario con errores sin sentido.</w:t>
+      </w:r>
+    </w:p>
+    <w:p>
+      <w:pPr>
+        <w:pStyle w:val="Heading3"/>
+        <w:spacing w:before="281" w:beforeAutospacing="off" w:after="281" w:afterAutospacing="off"/>
+      </w:pPr>
+      <w:r>
+        <w:rPr>
+          <w:rFonts w:ascii="Aptos" w:hAnsi="Aptos" w:eastAsia="Aptos" w:cs="Aptos"/>
+          <w:b w:val="1"/>
+          <w:bCs w:val="1"/>
+          <w:noProof w:val="0"/>
+          <w:sz w:val="28"/>
+          <w:szCs w:val="28"/>
+          <w:lang w:val="es-ES"/>
+        </w:rPr>
+        <w:t>4. Mejoras de UX y corrección de bugs</w:t>
+      </w:r>
+    </w:p>
+    <w:p>
+      <w:pPr>
+        <w:spacing w:before="240" w:beforeAutospacing="off" w:after="240" w:afterAutospacing="off"/>
+      </w:pPr>
+      <w:r>
+        <w:rPr>
+          <w:rFonts w:ascii="Aptos" w:hAnsi="Aptos" w:eastAsia="Aptos" w:cs="Aptos"/>
+          <w:noProof w:val="0"/>
+          <w:sz w:val="24"/>
+          <w:szCs w:val="24"/>
+          <w:lang w:val="es-ES"/>
+        </w:rPr>
+        <w:t>He resuelto varios problemas de experiencia de usuario: el input de subida de imágenes tenía el estilo feo nativo del navegador y lo he sustituido por un botón personalizado. El botón de registro no se bloqueaba mientras esperaba respuesta del servidor, lo que con Render frío provocaba que se crearan cuentas duplicadas al hacer varios clics; ahora se deshabilita y muestra "Registrando..." durante la petición.</w:t>
+      </w:r>
+    </w:p>
+    <w:p>
+      <w:pPr>
+        <w:pStyle w:val="Heading3"/>
+        <w:spacing w:before="281" w:beforeAutospacing="off" w:after="281" w:afterAutospacing="off"/>
+      </w:pPr>
+      <w:r>
+        <w:rPr>
+          <w:rFonts w:ascii="Aptos" w:hAnsi="Aptos" w:eastAsia="Aptos" w:cs="Aptos"/>
+          <w:b w:val="1"/>
+          <w:bCs w:val="1"/>
+          <w:noProof w:val="0"/>
+          <w:sz w:val="28"/>
+          <w:szCs w:val="28"/>
+          <w:lang w:val="es-ES"/>
+        </w:rPr>
+        <w:t>5. Incidencias y cosas aprendidas</w:t>
+      </w:r>
+    </w:p>
+    <w:p>
+      <w:pPr>
+        <w:spacing w:before="240" w:beforeAutospacing="off" w:after="240" w:afterAutospacing="off"/>
+      </w:pPr>
+      <w:r>
+        <w:rPr>
+          <w:rFonts w:ascii="Aptos" w:hAnsi="Aptos" w:eastAsia="Aptos" w:cs="Aptos"/>
+          <w:noProof w:val="0"/>
+          <w:sz w:val="24"/>
+          <w:szCs w:val="24"/>
+          <w:lang w:val="es-ES"/>
+        </w:rPr>
+        <w:t xml:space="preserve">Durante la sesión me topé con varios quebraderos de cabeza. El más molesto fue el problema de tipos genéricos de Java al usar </w:t>
+      </w:r>
+      <w:r>
+        <w:rPr>
+          <w:rFonts w:ascii="Consolas" w:hAnsi="Consolas" w:eastAsia="Consolas" w:cs="Consolas"/>
+          <w:noProof w:val="0"/>
+          <w:sz w:val="24"/>
+          <w:szCs w:val="24"/>
+          <w:lang w:val="es-ES"/>
+        </w:rPr>
+        <w:t>.map()</w:t>
+      </w:r>
+      <w:r>
+        <w:rPr>
+          <w:rFonts w:ascii="Aptos" w:hAnsi="Aptos" w:eastAsia="Aptos" w:cs="Aptos"/>
+          <w:noProof w:val="0"/>
+          <w:sz w:val="24"/>
+          <w:szCs w:val="24"/>
+          <w:lang w:val="es-ES"/>
+        </w:rPr>
+        <w:t xml:space="preserve"> con lambdas en los métodos DELETE: Java no conseguía inferir </w:t>
+      </w:r>
+      <w:r>
+        <w:rPr>
+          <w:rFonts w:ascii="Consolas" w:hAnsi="Consolas" w:eastAsia="Consolas" w:cs="Consolas"/>
+          <w:noProof w:val="0"/>
+          <w:sz w:val="24"/>
+          <w:szCs w:val="24"/>
+          <w:lang w:val="es-ES"/>
+        </w:rPr>
+        <w:t>ResponseEntity&lt;Void&gt;</w:t>
+      </w:r>
+      <w:r>
+        <w:rPr>
+          <w:rFonts w:ascii="Aptos" w:hAnsi="Aptos" w:eastAsia="Aptos" w:cs="Aptos"/>
+          <w:noProof w:val="0"/>
+          <w:sz w:val="24"/>
+          <w:szCs w:val="24"/>
+          <w:lang w:val="es-ES"/>
+        </w:rPr>
+        <w:t xml:space="preserve"> correctamente y daba error de compilación. Lo resolví reescribiendo esos métodos con </w:t>
+      </w:r>
+      <w:r>
+        <w:rPr>
+          <w:rFonts w:ascii="Consolas" w:hAnsi="Consolas" w:eastAsia="Consolas" w:cs="Consolas"/>
+          <w:noProof w:val="0"/>
+          <w:sz w:val="24"/>
+          <w:szCs w:val="24"/>
+          <w:lang w:val="es-ES"/>
+        </w:rPr>
+        <w:t>if/return</w:t>
+      </w:r>
+      <w:r>
+        <w:rPr>
+          <w:rFonts w:ascii="Aptos" w:hAnsi="Aptos" w:eastAsia="Aptos" w:cs="Aptos"/>
+          <w:noProof w:val="0"/>
+          <w:sz w:val="24"/>
+          <w:szCs w:val="24"/>
+          <w:lang w:val="es-ES"/>
+        </w:rPr>
+        <w:t xml:space="preserve"> directo en vez de encadenamiento funcional, lo que además quedó más legible. También aprendí a diferenciar bien cuándo usar </w:t>
+      </w:r>
+      <w:r>
+        <w:rPr>
+          <w:rFonts w:ascii="Consolas" w:hAnsi="Consolas" w:eastAsia="Consolas" w:cs="Consolas"/>
+          <w:noProof w:val="0"/>
+          <w:sz w:val="24"/>
+          <w:szCs w:val="24"/>
+          <w:lang w:val="es-ES"/>
+        </w:rPr>
+        <w:t>@NotBlank</w:t>
+      </w:r>
+      <w:r>
+        <w:rPr>
+          <w:rFonts w:ascii="Aptos" w:hAnsi="Aptos" w:eastAsia="Aptos" w:cs="Aptos"/>
+          <w:noProof w:val="0"/>
+          <w:sz w:val="24"/>
+          <w:szCs w:val="24"/>
+          <w:lang w:val="es-ES"/>
+        </w:rPr>
+        <w:t xml:space="preserve"> frente a </w:t>
+      </w:r>
+      <w:r>
+        <w:rPr>
+          <w:rFonts w:ascii="Consolas" w:hAnsi="Consolas" w:eastAsia="Consolas" w:cs="Consolas"/>
+          <w:noProof w:val="0"/>
+          <w:sz w:val="24"/>
+          <w:szCs w:val="24"/>
+          <w:lang w:val="es-ES"/>
+        </w:rPr>
+        <w:t>@NotNull</w:t>
+      </w:r>
+      <w:r>
+        <w:rPr>
+          <w:rFonts w:ascii="Aptos" w:hAnsi="Aptos" w:eastAsia="Aptos" w:cs="Aptos"/>
+          <w:noProof w:val="0"/>
+          <w:sz w:val="24"/>
+          <w:szCs w:val="24"/>
+          <w:lang w:val="es-ES"/>
+        </w:rPr>
+        <w:t xml:space="preserve"> en los DTOs, ya que </w:t>
+      </w:r>
+      <w:r>
+        <w:rPr>
+          <w:rFonts w:ascii="Consolas" w:hAnsi="Consolas" w:eastAsia="Consolas" w:cs="Consolas"/>
+          <w:noProof w:val="0"/>
+          <w:sz w:val="24"/>
+          <w:szCs w:val="24"/>
+          <w:lang w:val="es-ES"/>
+        </w:rPr>
+        <w:t>@NotBlank</w:t>
+      </w:r>
+      <w:r>
+        <w:rPr>
+          <w:rFonts w:ascii="Aptos" w:hAnsi="Aptos" w:eastAsia="Aptos" w:cs="Aptos"/>
+          <w:noProof w:val="0"/>
+          <w:sz w:val="24"/>
+          <w:szCs w:val="24"/>
+          <w:lang w:val="es-ES"/>
+        </w:rPr>
+        <w:t xml:space="preserve"> solo aplica a Strings y rechaza también cadenas vacías o con solo espacios, mientras que </w:t>
+      </w:r>
+      <w:r>
+        <w:rPr>
+          <w:rFonts w:ascii="Consolas" w:hAnsi="Consolas" w:eastAsia="Consolas" w:cs="Consolas"/>
+          <w:noProof w:val="0"/>
+          <w:sz w:val="24"/>
+          <w:szCs w:val="24"/>
+          <w:lang w:val="es-ES"/>
+        </w:rPr>
+        <w:t>@NotNull</w:t>
+      </w:r>
+      <w:r>
+        <w:rPr>
+          <w:rFonts w:ascii="Aptos" w:hAnsi="Aptos" w:eastAsia="Aptos" w:cs="Aptos"/>
+          <w:noProof w:val="0"/>
+          <w:sz w:val="24"/>
+          <w:szCs w:val="24"/>
+          <w:lang w:val="es-ES"/>
+        </w:rPr>
+        <w:t xml:space="preserve"> simplemente comprueba que el campo no sea nulo. Cosas que parecen pequeñas pero que si las confundes te dan validaciones que no funcionan como esperas.</w:t>
+      </w:r>
+    </w:p>
+    <w:p>
+      <w:pPr>
+        <w:pStyle w:val="Normal"/>
+        <w:spacing w:before="240" w:beforeAutospacing="off" w:after="240" w:afterAutospacing="off"/>
+        <w:rPr>
+          <w:rFonts w:ascii="Aptos" w:hAnsi="Aptos" w:eastAsia="Aptos" w:cs="Aptos"/>
+          <w:noProof w:val="0"/>
+          <w:sz w:val="24"/>
+          <w:szCs w:val="24"/>
+          <w:lang w:val="es-ES"/>
+        </w:rPr>
+      </w:pPr>
+    </w:p>
+    <w:p>
+      <w:pPr>
+        <w:pStyle w:val="Normal"/>
       </w:pPr>
     </w:p>
     <w:sectPr>

</xml_diff>

<commit_message>
cambios de comentarios javadoc
</commit_message>
<xml_diff>
--- a/Documentacion/Bitacora_Joaquin.docx
+++ b/Documentacion/Bitacora_Joaquin.docx
@@ -6861,44 +6861,6 @@
     <w:p>
       <w:pPr>
         <w:spacing w:before="240" w:beforeAutospacing="off" w:after="240" w:afterAutospacing="off"/>
-        <w:rPr>
-          <w:rFonts w:ascii="Aptos" w:hAnsi="Aptos" w:eastAsia="Aptos" w:cs="Aptos"/>
-          <w:noProof w:val="0"/>
-          <w:sz w:val="24"/>
-          <w:szCs w:val="24"/>
-          <w:lang w:val="es-ES"/>
-        </w:rPr>
-      </w:pPr>
-    </w:p>
-    <w:p>
-      <w:pPr>
-        <w:pStyle w:val="Normal"/>
-        <w:spacing w:before="240" w:beforeAutospacing="off" w:after="240" w:afterAutospacing="off"/>
-        <w:rPr>
-          <w:rFonts w:ascii="Aptos" w:hAnsi="Aptos" w:eastAsia="Aptos" w:cs="Aptos"/>
-          <w:noProof w:val="0"/>
-          <w:sz w:val="24"/>
-          <w:szCs w:val="24"/>
-          <w:lang w:val="es-ES"/>
-        </w:rPr>
-      </w:pPr>
-    </w:p>
-    <w:p>
-      <w:pPr>
-        <w:pStyle w:val="Normal"/>
-        <w:spacing w:before="240" w:beforeAutospacing="off" w:after="240" w:afterAutospacing="off"/>
-        <w:rPr>
-          <w:rFonts w:ascii="Aptos" w:hAnsi="Aptos" w:eastAsia="Aptos" w:cs="Aptos"/>
-          <w:noProof w:val="0"/>
-          <w:sz w:val="24"/>
-          <w:szCs w:val="24"/>
-          <w:lang w:val="es-ES"/>
-        </w:rPr>
-      </w:pPr>
-    </w:p>
-    <w:p>
-      <w:pPr>
-        <w:spacing w:before="240" w:beforeAutospacing="off" w:after="240" w:afterAutospacing="off"/>
       </w:pPr>
       <w:r>
         <w:rPr>
@@ -8357,6 +8319,540 @@
           <w:lang w:val="es-ES"/>
         </w:rPr>
       </w:pPr>
+    </w:p>
+    <w:p>
+      <w:pPr>
+        <w:pStyle w:val="Normal"/>
+      </w:pPr>
+    </w:p>
+    <w:p>
+      <w:r>
+        <w:br w:type="page"/>
+      </w:r>
+    </w:p>
+    <w:p>
+      <w:pPr>
+        <w:spacing w:before="240" w:beforeAutospacing="off" w:after="240" w:afterAutospacing="off"/>
+      </w:pPr>
+      <w:r>
+        <w:rPr>
+          <w:rFonts w:ascii="Aptos" w:hAnsi="Aptos" w:eastAsia="Aptos" w:cs="Aptos"/>
+          <w:b w:val="1"/>
+          <w:bCs w:val="1"/>
+          <w:noProof w:val="0"/>
+          <w:sz w:val="24"/>
+          <w:szCs w:val="24"/>
+          <w:lang w:val="es-ES"/>
+        </w:rPr>
+        <w:t xml:space="preserve">Fecha: </w:t>
+      </w:r>
+      <w:r>
+        <w:rPr>
+          <w:rFonts w:ascii="Aptos" w:hAnsi="Aptos" w:eastAsia="Aptos" w:cs="Aptos"/>
+          <w:noProof w:val="0"/>
+          <w:sz w:val="24"/>
+          <w:szCs w:val="24"/>
+          <w:lang w:val="es-ES"/>
+        </w:rPr>
+        <w:t xml:space="preserve">13 de mayo de 2026 </w:t>
+      </w:r>
+    </w:p>
+    <w:p>
+      <w:pPr>
+        <w:spacing w:before="240" w:beforeAutospacing="off" w:after="240" w:afterAutospacing="off"/>
+      </w:pPr>
+      <w:r>
+        <w:rPr>
+          <w:rFonts w:ascii="Aptos" w:hAnsi="Aptos" w:eastAsia="Aptos" w:cs="Aptos"/>
+          <w:b w:val="1"/>
+          <w:bCs w:val="1"/>
+          <w:noProof w:val="0"/>
+          <w:sz w:val="24"/>
+          <w:szCs w:val="24"/>
+          <w:lang w:val="es-ES"/>
+        </w:rPr>
+        <w:t xml:space="preserve">Objetivo: </w:t>
+      </w:r>
+      <w:r>
+        <w:rPr>
+          <w:rFonts w:ascii="Aptos" w:hAnsi="Aptos" w:eastAsia="Aptos" w:cs="Aptos"/>
+          <w:noProof w:val="0"/>
+          <w:sz w:val="24"/>
+          <w:szCs w:val="24"/>
+          <w:lang w:val="es-ES"/>
+        </w:rPr>
+        <w:t>Implementación de funcionalidades pendientes de la planificación original, refactorización del código frontend, corrección de pruebas automatizadas y mejoras generales de calidad y usabilidad.</w:t>
+      </w:r>
+    </w:p>
+    <w:p>
+      <w:pPr>
+        <w:pStyle w:val="Heading3"/>
+        <w:suppressLineNumbers w:val="0"/>
+        <w:bidi w:val="0"/>
+        <w:spacing w:before="281" w:beforeAutospacing="off" w:after="281" w:afterAutospacing="off" w:line="279" w:lineRule="auto"/>
+        <w:ind w:left="0" w:right="0"/>
+        <w:jc w:val="left"/>
+        <w:rPr>
+          <w:rFonts w:ascii="Aptos" w:hAnsi="Aptos" w:eastAsia="Aptos" w:cs="Aptos"/>
+          <w:noProof w:val="0"/>
+          <w:sz w:val="24"/>
+          <w:szCs w:val="24"/>
+          <w:lang w:val="es-ES"/>
+        </w:rPr>
+      </w:pPr>
+      <w:r>
+        <w:rPr>
+          <w:rFonts w:ascii="Aptos" w:hAnsi="Aptos" w:eastAsia="Aptos" w:cs="Aptos"/>
+          <w:b w:val="1"/>
+          <w:bCs w:val="1"/>
+          <w:noProof w:val="0"/>
+          <w:sz w:val="28"/>
+          <w:szCs w:val="28"/>
+          <w:lang w:val="es-ES"/>
+        </w:rPr>
+        <w:t xml:space="preserve">1. </w:t>
+      </w:r>
+      <w:r>
+        <w:rPr>
+          <w:rFonts w:ascii="Aptos" w:hAnsi="Aptos" w:eastAsia="Aptos" w:cs="Aptos"/>
+          <w:b w:val="1"/>
+          <w:bCs w:val="1"/>
+          <w:noProof w:val="0"/>
+          <w:sz w:val="28"/>
+          <w:szCs w:val="28"/>
+          <w:lang w:val="es-ES"/>
+        </w:rPr>
+        <w:t xml:space="preserve">Exportación e Importación de Datos (CSV y JSON) </w:t>
+      </w:r>
+    </w:p>
+    <w:p>
+      <w:pPr>
+        <w:pStyle w:val="Normal"/>
+        <w:spacing w:before="0" w:beforeAutospacing="off" w:after="0" w:afterAutospacing="off"/>
+      </w:pPr>
+      <w:r>
+        <w:rPr>
+          <w:rFonts w:ascii="Aptos" w:hAnsi="Aptos" w:eastAsia="Aptos" w:cs="Aptos"/>
+          <w:noProof w:val="0"/>
+          <w:sz w:val="24"/>
+          <w:szCs w:val="24"/>
+          <w:lang w:val="es-ES"/>
+        </w:rPr>
+        <w:t>He desarrollado los endpoints de exportación en el backend para permitir la descarga de la colección de una categoría en formato CSV y JSON. He implementado la funcionalidad simétrica de importación, incluyendo detección de conflictos que avisa al usuario cuando los artículos del fichero ya existen, solicitando confirmación antes de sobreescribirlos. He añadido validación en el backend para rechazar ficheros con formato incorrecto. En el frontend he agrupado ambas funcionalidades en un único desplegable "Datos ▾" para no saturar la cabecera.</w:t>
+      </w:r>
+    </w:p>
+    <w:p>
+      <w:pPr>
+        <w:pStyle w:val="Normal"/>
+        <w:spacing w:before="0" w:beforeAutospacing="off" w:after="0" w:afterAutospacing="off"/>
+        <w:rPr>
+          <w:rFonts w:ascii="Aptos" w:hAnsi="Aptos" w:eastAsia="Aptos" w:cs="Aptos"/>
+          <w:noProof w:val="0"/>
+          <w:sz w:val="24"/>
+          <w:szCs w:val="24"/>
+          <w:lang w:val="es-ES"/>
+        </w:rPr>
+      </w:pPr>
+    </w:p>
+    <w:p>
+      <w:pPr>
+        <w:pStyle w:val="Normal"/>
+        <w:spacing w:before="0" w:beforeAutospacing="off" w:after="0" w:afterAutospacing="off"/>
+        <w:rPr>
+          <w:rFonts w:ascii="Aptos" w:hAnsi="Aptos" w:eastAsia="Aptos" w:cs="Aptos"/>
+          <w:noProof w:val="0"/>
+          <w:sz w:val="24"/>
+          <w:szCs w:val="24"/>
+          <w:lang w:val="es-ES"/>
+        </w:rPr>
+      </w:pPr>
+      <w:r>
+        <w:rPr>
+          <w:rFonts w:ascii="Aptos" w:hAnsi="Aptos" w:eastAsia="Aptos" w:cs="Aptos" w:asciiTheme="minorAscii" w:hAnsiTheme="minorAscii" w:eastAsiaTheme="majorEastAsia" w:cstheme="majorBidi"/>
+          <w:b w:val="1"/>
+          <w:bCs w:val="1"/>
+          <w:noProof w:val="0"/>
+          <w:color w:val="0F4761" w:themeColor="accent1" w:themeTint="FF" w:themeShade="BF"/>
+          <w:sz w:val="28"/>
+          <w:szCs w:val="28"/>
+          <w:lang w:val="es-ES" w:eastAsia="en-US" w:bidi="ar-SA"/>
+        </w:rPr>
+        <w:t xml:space="preserve">2. </w:t>
+      </w:r>
+      <w:r>
+        <w:rPr>
+          <w:rFonts w:ascii="Aptos" w:hAnsi="Aptos" w:eastAsia="Aptos" w:cs="Aptos" w:asciiTheme="minorAscii" w:hAnsiTheme="minorAscii" w:eastAsiaTheme="majorEastAsia" w:cstheme="majorBidi"/>
+          <w:b w:val="1"/>
+          <w:bCs w:val="1"/>
+          <w:noProof w:val="0"/>
+          <w:color w:val="0F4761" w:themeColor="accent1" w:themeTint="FF" w:themeShade="BF"/>
+          <w:sz w:val="28"/>
+          <w:szCs w:val="28"/>
+          <w:lang w:val="es-ES" w:eastAsia="en-US" w:bidi="ar-SA"/>
+        </w:rPr>
+        <w:t>Wishlist</w:t>
+      </w:r>
+      <w:r>
+        <w:rPr>
+          <w:rFonts w:ascii="Aptos" w:hAnsi="Aptos" w:eastAsia="Aptos" w:cs="Aptos" w:asciiTheme="minorAscii" w:hAnsiTheme="minorAscii" w:eastAsiaTheme="majorEastAsia" w:cstheme="majorBidi"/>
+          <w:b w:val="1"/>
+          <w:bCs w:val="1"/>
+          <w:noProof w:val="0"/>
+          <w:color w:val="0F4761" w:themeColor="accent1" w:themeTint="FF" w:themeShade="BF"/>
+          <w:sz w:val="28"/>
+          <w:szCs w:val="28"/>
+          <w:lang w:val="es-ES" w:eastAsia="en-US" w:bidi="ar-SA"/>
+        </w:rPr>
+        <w:t xml:space="preserve"> y Panel de Estadísticas</w:t>
+      </w:r>
+      <w:r>
+        <w:rPr>
+          <w:rFonts w:ascii="Aptos" w:hAnsi="Aptos" w:eastAsia="Aptos" w:cs="Aptos"/>
+          <w:noProof w:val="0"/>
+          <w:sz w:val="24"/>
+          <w:szCs w:val="24"/>
+          <w:lang w:val="es-ES"/>
+        </w:rPr>
+        <w:t xml:space="preserve"> </w:t>
+      </w:r>
+    </w:p>
+    <w:p>
+      <w:pPr>
+        <w:pStyle w:val="Normal"/>
+        <w:spacing w:before="0" w:beforeAutospacing="off" w:after="0" w:afterAutospacing="off"/>
+        <w:rPr>
+          <w:rFonts w:ascii="Aptos" w:hAnsi="Aptos" w:eastAsia="Aptos" w:cs="Aptos"/>
+          <w:noProof w:val="0"/>
+          <w:sz w:val="24"/>
+          <w:szCs w:val="24"/>
+          <w:lang w:val="es-ES"/>
+        </w:rPr>
+      </w:pPr>
+    </w:p>
+    <w:p>
+      <w:pPr>
+        <w:pStyle w:val="Normal"/>
+        <w:spacing w:before="0" w:beforeAutospacing="off" w:after="0" w:afterAutospacing="off"/>
+      </w:pPr>
+      <w:r>
+        <w:rPr>
+          <w:rFonts w:ascii="Aptos" w:hAnsi="Aptos" w:eastAsia="Aptos" w:cs="Aptos"/>
+          <w:noProof w:val="0"/>
+          <w:sz w:val="24"/>
+          <w:szCs w:val="24"/>
+          <w:lang w:val="es-ES"/>
+        </w:rPr>
+        <w:t>He añadido el campo estado a la entidad Articulo (COLECCION / WISHLIST) con su correspondiente actualización en el SQL, DTO y servicio. En el frontend he implementado dos pestañas que filtran los artículos por estado. Paralelamente he añadido un panel lateral de estadísticas que muestra en tiempo real el conteo de artículos, la suma o media de campos numéricos con toggle entre ambos modos, y el conteo de valores Sí/No para campos booleanos, todo calculado en el cliente sin peticiones adicionales al servidor.</w:t>
+      </w:r>
+    </w:p>
+    <w:p>
+      <w:pPr>
+        <w:pStyle w:val="Normal"/>
+        <w:spacing w:before="0" w:beforeAutospacing="off" w:after="0" w:afterAutospacing="off"/>
+        <w:rPr>
+          <w:rFonts w:ascii="Aptos" w:hAnsi="Aptos" w:eastAsia="Aptos" w:cs="Aptos"/>
+          <w:noProof w:val="0"/>
+          <w:sz w:val="24"/>
+          <w:szCs w:val="24"/>
+          <w:lang w:val="es-ES"/>
+        </w:rPr>
+      </w:pPr>
+    </w:p>
+    <w:p>
+      <w:pPr>
+        <w:pStyle w:val="Normal"/>
+        <w:spacing w:before="0" w:beforeAutospacing="off" w:after="0" w:afterAutospacing="off"/>
+        <w:rPr>
+          <w:rFonts w:ascii="Aptos" w:hAnsi="Aptos" w:eastAsia="Aptos" w:cs="Aptos" w:asciiTheme="minorAscii" w:hAnsiTheme="minorAscii" w:eastAsiaTheme="majorEastAsia" w:cstheme="majorBidi"/>
+          <w:b w:val="1"/>
+          <w:bCs w:val="1"/>
+          <w:noProof w:val="0"/>
+          <w:color w:val="0F4761" w:themeColor="accent1" w:themeTint="FF" w:themeShade="BF"/>
+          <w:sz w:val="28"/>
+          <w:szCs w:val="28"/>
+          <w:lang w:val="es-ES" w:eastAsia="en-US" w:bidi="ar-SA"/>
+        </w:rPr>
+      </w:pPr>
+      <w:r>
+        <w:rPr>
+          <w:rFonts w:ascii="Aptos" w:hAnsi="Aptos" w:eastAsia="Aptos" w:cs="Aptos" w:asciiTheme="minorAscii" w:hAnsiTheme="minorAscii" w:eastAsiaTheme="majorEastAsia" w:cstheme="majorBidi"/>
+          <w:b w:val="1"/>
+          <w:bCs w:val="1"/>
+          <w:noProof w:val="0"/>
+          <w:color w:val="0F4761" w:themeColor="accent1" w:themeTint="FF" w:themeShade="BF"/>
+          <w:sz w:val="28"/>
+          <w:szCs w:val="28"/>
+          <w:lang w:val="es-ES" w:eastAsia="en-US" w:bidi="ar-SA"/>
+        </w:rPr>
+        <w:t xml:space="preserve">3. </w:t>
+      </w:r>
+      <w:r>
+        <w:rPr>
+          <w:rFonts w:ascii="Aptos" w:hAnsi="Aptos" w:eastAsia="Aptos" w:cs="Aptos" w:asciiTheme="minorAscii" w:hAnsiTheme="minorAscii" w:eastAsiaTheme="majorEastAsia" w:cstheme="majorBidi"/>
+          <w:b w:val="1"/>
+          <w:bCs w:val="1"/>
+          <w:noProof w:val="0"/>
+          <w:color w:val="0F4761" w:themeColor="accent1" w:themeTint="FF" w:themeShade="BF"/>
+          <w:sz w:val="28"/>
+          <w:szCs w:val="28"/>
+          <w:lang w:val="es-ES" w:eastAsia="en-US" w:bidi="ar-SA"/>
+        </w:rPr>
+        <w:t xml:space="preserve">Borrado Completo de Cuenta (RGPD) </w:t>
+      </w:r>
+    </w:p>
+    <w:p>
+      <w:pPr>
+        <w:pStyle w:val="Normal"/>
+        <w:spacing w:before="0" w:beforeAutospacing="off" w:after="0" w:afterAutospacing="off"/>
+        <w:rPr>
+          <w:rFonts w:ascii="Aptos" w:hAnsi="Aptos" w:eastAsia="Aptos" w:cs="Aptos"/>
+          <w:noProof w:val="0"/>
+          <w:sz w:val="24"/>
+          <w:szCs w:val="24"/>
+          <w:lang w:val="es-ES"/>
+        </w:rPr>
+      </w:pPr>
+    </w:p>
+    <w:p>
+      <w:pPr>
+        <w:pStyle w:val="Normal"/>
+        <w:spacing w:before="0" w:beforeAutospacing="off" w:after="0" w:afterAutospacing="off"/>
+      </w:pPr>
+      <w:r>
+        <w:rPr>
+          <w:rFonts w:ascii="Aptos" w:hAnsi="Aptos" w:eastAsia="Aptos" w:cs="Aptos"/>
+          <w:noProof w:val="0"/>
+          <w:sz w:val="24"/>
+          <w:szCs w:val="24"/>
+          <w:lang w:val="es-ES"/>
+        </w:rPr>
+        <w:t>He implementado el endpoint DELETE /api/usuario/cuenta en un nuevo UsuarioController. Gracias a las restricciones ON DELETE CASCADE del esquema SQL, el borrado elimina en cascada todas las categorías y artículos del usuario. En el frontend he añadido un botón discreto con doble confirmación y limpieza automática del localStorage tras el borrado.</w:t>
+      </w:r>
+    </w:p>
+    <w:p>
+      <w:pPr>
+        <w:pStyle w:val="Normal"/>
+      </w:pPr>
+    </w:p>
+    <w:p>
+      <w:r>
+        <w:br w:type="page"/>
+      </w:r>
+    </w:p>
+    <w:p>
+      <w:pPr>
+        <w:pStyle w:val="Normal"/>
+      </w:pPr>
+    </w:p>
+    <w:p>
+      <w:pPr>
+        <w:pStyle w:val="Normal"/>
+        <w:suppressLineNumbers w:val="0"/>
+        <w:bidi w:val="0"/>
+        <w:spacing w:before="0" w:beforeAutospacing="off" w:after="0" w:afterAutospacing="off" w:line="279" w:lineRule="auto"/>
+        <w:ind w:left="0" w:right="0"/>
+        <w:jc w:val="left"/>
+        <w:rPr>
+          <w:rFonts w:ascii="Aptos" w:hAnsi="Aptos" w:eastAsia="Aptos" w:cs="Aptos" w:asciiTheme="minorAscii" w:hAnsiTheme="minorAscii" w:eastAsiaTheme="majorEastAsia" w:cstheme="majorBidi"/>
+          <w:b w:val="1"/>
+          <w:bCs w:val="1"/>
+          <w:noProof w:val="0"/>
+          <w:color w:val="0F4761" w:themeColor="accent1" w:themeTint="FF" w:themeShade="BF"/>
+          <w:sz w:val="28"/>
+          <w:szCs w:val="28"/>
+          <w:lang w:val="es-ES" w:eastAsia="en-US" w:bidi="ar-SA"/>
+        </w:rPr>
+      </w:pPr>
+      <w:r>
+        <w:rPr>
+          <w:rFonts w:ascii="Aptos" w:hAnsi="Aptos" w:eastAsia="Aptos" w:cs="Aptos" w:asciiTheme="minorAscii" w:hAnsiTheme="minorAscii" w:eastAsiaTheme="majorEastAsia" w:cstheme="majorBidi"/>
+          <w:b w:val="1"/>
+          <w:bCs w:val="1"/>
+          <w:noProof w:val="0"/>
+          <w:color w:val="0F4761" w:themeColor="accent1" w:themeTint="FF" w:themeShade="BF"/>
+          <w:sz w:val="28"/>
+          <w:szCs w:val="28"/>
+          <w:lang w:val="es-ES" w:eastAsia="en-US" w:bidi="ar-SA"/>
+        </w:rPr>
+        <w:t xml:space="preserve">4. </w:t>
+      </w:r>
+      <w:r>
+        <w:rPr>
+          <w:rFonts w:ascii="Aptos" w:hAnsi="Aptos" w:eastAsia="Aptos" w:cs="Aptos" w:asciiTheme="minorAscii" w:hAnsiTheme="minorAscii" w:eastAsiaTheme="majorEastAsia" w:cstheme="majorBidi"/>
+          <w:b w:val="1"/>
+          <w:bCs w:val="1"/>
+          <w:noProof w:val="0"/>
+          <w:color w:val="0F4761" w:themeColor="accent1" w:themeTint="FF" w:themeShade="BF"/>
+          <w:sz w:val="28"/>
+          <w:szCs w:val="28"/>
+          <w:lang w:val="es-ES" w:eastAsia="en-US" w:bidi="ar-SA"/>
+        </w:rPr>
+        <w:t xml:space="preserve">Refactorización del CSS y Variables de Entorno </w:t>
+      </w:r>
+    </w:p>
+    <w:p>
+      <w:pPr>
+        <w:pStyle w:val="Normal"/>
+        <w:spacing w:before="0" w:beforeAutospacing="off" w:after="0" w:afterAutospacing="off"/>
+        <w:rPr>
+          <w:rFonts w:ascii="Aptos" w:hAnsi="Aptos" w:eastAsia="Aptos" w:cs="Aptos"/>
+          <w:noProof w:val="0"/>
+          <w:sz w:val="24"/>
+          <w:szCs w:val="24"/>
+          <w:lang w:val="es-ES"/>
+        </w:rPr>
+      </w:pPr>
+    </w:p>
+    <w:p>
+      <w:pPr>
+        <w:pStyle w:val="Normal"/>
+        <w:spacing w:before="0" w:beforeAutospacing="off" w:after="0" w:afterAutospacing="off"/>
+        <w:rPr>
+          <w:rFonts w:ascii="Aptos" w:hAnsi="Aptos" w:eastAsia="Aptos" w:cs="Aptos"/>
+          <w:noProof w:val="0"/>
+          <w:sz w:val="24"/>
+          <w:szCs w:val="24"/>
+          <w:lang w:val="es-ES"/>
+        </w:rPr>
+      </w:pPr>
+      <w:r>
+        <w:rPr>
+          <w:rFonts w:ascii="Aptos" w:hAnsi="Aptos" w:eastAsia="Aptos" w:cs="Aptos"/>
+          <w:noProof w:val="0"/>
+          <w:sz w:val="24"/>
+          <w:szCs w:val="24"/>
+          <w:lang w:val="es-ES"/>
+        </w:rPr>
+        <w:t>He dividido el fichero Categorias.css en cuatro ficheros independientes: Categorias.css, Articulos.css, Admin.css y Responsive.css, de forma que cada componente importa únicamente sus estilos correspondientes. He centralizado la URL del backend en la variable de entorno VITE_API_URL configurada en Vercel, eliminando la URL hardcodeada del código fuente.</w:t>
+      </w:r>
+    </w:p>
+    <w:p>
+      <w:pPr>
+        <w:pStyle w:val="Normal"/>
+        <w:suppressLineNumbers w:val="0"/>
+        <w:bidi w:val="0"/>
+        <w:spacing w:before="0" w:beforeAutospacing="off" w:after="0" w:afterAutospacing="off" w:line="279" w:lineRule="auto"/>
+        <w:ind w:left="0" w:right="0"/>
+        <w:jc w:val="left"/>
+        <w:rPr>
+          <w:rFonts w:ascii="Aptos" w:hAnsi="Aptos" w:eastAsia="Aptos" w:cs="Aptos" w:asciiTheme="minorAscii" w:hAnsiTheme="minorAscii" w:eastAsiaTheme="majorEastAsia" w:cstheme="majorBidi"/>
+          <w:b w:val="1"/>
+          <w:bCs w:val="1"/>
+          <w:noProof w:val="0"/>
+          <w:color w:val="0F4761" w:themeColor="accent1" w:themeTint="FF" w:themeShade="BF"/>
+          <w:sz w:val="28"/>
+          <w:szCs w:val="28"/>
+          <w:lang w:val="es-ES" w:eastAsia="en-US" w:bidi="ar-SA"/>
+        </w:rPr>
+      </w:pPr>
+    </w:p>
+    <w:p>
+      <w:pPr>
+        <w:pStyle w:val="Normal"/>
+        <w:suppressLineNumbers w:val="0"/>
+        <w:bidi w:val="0"/>
+        <w:spacing w:before="0" w:beforeAutospacing="off" w:after="0" w:afterAutospacing="off" w:line="279" w:lineRule="auto"/>
+        <w:ind w:left="0" w:right="0"/>
+        <w:jc w:val="left"/>
+        <w:rPr>
+          <w:rFonts w:ascii="Aptos" w:hAnsi="Aptos" w:eastAsia="Aptos" w:cs="Aptos" w:asciiTheme="minorAscii" w:hAnsiTheme="minorAscii" w:eastAsiaTheme="majorEastAsia" w:cstheme="majorBidi"/>
+          <w:b w:val="1"/>
+          <w:bCs w:val="1"/>
+          <w:noProof w:val="0"/>
+          <w:color w:val="0F4761" w:themeColor="accent1" w:themeTint="FF" w:themeShade="BF"/>
+          <w:sz w:val="28"/>
+          <w:szCs w:val="28"/>
+          <w:lang w:val="es-ES" w:eastAsia="en-US" w:bidi="ar-SA"/>
+        </w:rPr>
+      </w:pPr>
+      <w:r>
+        <w:rPr>
+          <w:rFonts w:ascii="Aptos" w:hAnsi="Aptos" w:eastAsia="Aptos" w:cs="Aptos" w:asciiTheme="minorAscii" w:hAnsiTheme="minorAscii" w:eastAsiaTheme="majorEastAsia" w:cstheme="majorBidi"/>
+          <w:b w:val="1"/>
+          <w:bCs w:val="1"/>
+          <w:noProof w:val="0"/>
+          <w:color w:val="0F4761" w:themeColor="accent1" w:themeTint="FF" w:themeShade="BF"/>
+          <w:sz w:val="28"/>
+          <w:szCs w:val="28"/>
+          <w:lang w:val="es-ES" w:eastAsia="en-US" w:bidi="ar-SA"/>
+        </w:rPr>
+        <w:t xml:space="preserve">5. </w:t>
+      </w:r>
+      <w:r>
+        <w:rPr>
+          <w:rFonts w:ascii="Aptos" w:hAnsi="Aptos" w:eastAsia="Aptos" w:cs="Aptos" w:asciiTheme="minorAscii" w:hAnsiTheme="minorAscii" w:eastAsiaTheme="majorEastAsia" w:cstheme="majorBidi"/>
+          <w:b w:val="1"/>
+          <w:bCs w:val="1"/>
+          <w:noProof w:val="0"/>
+          <w:color w:val="0F4761" w:themeColor="accent1" w:themeTint="FF" w:themeShade="BF"/>
+          <w:sz w:val="28"/>
+          <w:szCs w:val="28"/>
+          <w:lang w:val="es-ES" w:eastAsia="en-US" w:bidi="ar-SA"/>
+        </w:rPr>
+        <w:t xml:space="preserve">Corrección de </w:t>
+      </w:r>
+      <w:r>
+        <w:rPr>
+          <w:rFonts w:ascii="Aptos" w:hAnsi="Aptos" w:eastAsia="Aptos" w:cs="Aptos" w:asciiTheme="minorAscii" w:hAnsiTheme="minorAscii" w:eastAsiaTheme="majorEastAsia" w:cstheme="majorBidi"/>
+          <w:b w:val="1"/>
+          <w:bCs w:val="1"/>
+          <w:noProof w:val="0"/>
+          <w:color w:val="0F4761" w:themeColor="accent1" w:themeTint="FF" w:themeShade="BF"/>
+          <w:sz w:val="28"/>
+          <w:szCs w:val="28"/>
+          <w:lang w:val="es-ES" w:eastAsia="en-US" w:bidi="ar-SA"/>
+        </w:rPr>
+        <w:t>Tests</w:t>
+      </w:r>
+      <w:r>
+        <w:rPr>
+          <w:rFonts w:ascii="Aptos" w:hAnsi="Aptos" w:eastAsia="Aptos" w:cs="Aptos" w:asciiTheme="minorAscii" w:hAnsiTheme="minorAscii" w:eastAsiaTheme="majorEastAsia" w:cstheme="majorBidi"/>
+          <w:b w:val="1"/>
+          <w:bCs w:val="1"/>
+          <w:noProof w:val="0"/>
+          <w:color w:val="0F4761" w:themeColor="accent1" w:themeTint="FF" w:themeShade="BF"/>
+          <w:sz w:val="28"/>
+          <w:szCs w:val="28"/>
+          <w:lang w:val="es-ES" w:eastAsia="en-US" w:bidi="ar-SA"/>
+        </w:rPr>
+        <w:t xml:space="preserve"> y Mejoras de Usabilidad </w:t>
+      </w:r>
+    </w:p>
+    <w:p>
+      <w:pPr>
+        <w:pStyle w:val="Normal"/>
+        <w:spacing w:before="0" w:beforeAutospacing="off" w:after="0" w:afterAutospacing="off"/>
+        <w:rPr>
+          <w:rFonts w:ascii="Aptos" w:hAnsi="Aptos" w:eastAsia="Aptos" w:cs="Aptos"/>
+          <w:noProof w:val="0"/>
+          <w:sz w:val="24"/>
+          <w:szCs w:val="24"/>
+          <w:lang w:val="es-ES"/>
+        </w:rPr>
+      </w:pPr>
+    </w:p>
+    <w:p>
+      <w:pPr>
+        <w:pStyle w:val="Normal"/>
+        <w:spacing w:before="0" w:beforeAutospacing="off" w:after="0" w:afterAutospacing="off"/>
+        <w:rPr>
+          <w:rFonts w:ascii="Aptos" w:hAnsi="Aptos" w:eastAsia="Aptos" w:cs="Aptos"/>
+          <w:noProof w:val="0"/>
+          <w:sz w:val="24"/>
+          <w:szCs w:val="24"/>
+          <w:lang w:val="es-ES"/>
+        </w:rPr>
+      </w:pPr>
+      <w:r>
+        <w:rPr>
+          <w:rFonts w:ascii="Aptos" w:hAnsi="Aptos" w:eastAsia="Aptos" w:cs="Aptos"/>
+          <w:noProof w:val="0"/>
+          <w:sz w:val="24"/>
+          <w:szCs w:val="24"/>
+          <w:lang w:val="es-ES"/>
+        </w:rPr>
+        <w:t>He corregido los tests de AuthControllerTest y ArticuloControllerTest que fallaban por incompatibilidad entre el formato de respuesta del backend y las aserciones del test, añadiendo además la dependencia spring-security-test para inyectar correctamente el usuario autenticado. He mejorado los mensajes de error del login para mostrar textos específicos según el código HTTP. He limitado con maxLength los campos del esquema para evitar desbordamientos visuales y corregido el scroll horizontal en el modal de edición de artículos.</w:t>
+      </w:r>
     </w:p>
     <w:p>
       <w:pPr>
@@ -8550,6 +9046,176 @@
 
 <file path=word/numbering.xml><?xml version="1.0" encoding="utf-8"?>
 <w:numbering xmlns:w="http://schemas.openxmlformats.org/wordprocessingml/2006/main">
+  <w:abstractNum xmlns:w="http://schemas.openxmlformats.org/wordprocessingml/2006/main" w:abstractNumId="29">
+    <w:nsid w:val="4194b6b9"/>
+    <w:multiLevelType xmlns:w="http://schemas.openxmlformats.org/wordprocessingml/2006/main" w:val="hybridMultilevel"/>
+    <w:lvl xmlns:w="http://schemas.openxmlformats.org/wordprocessingml/2006/main" w:ilvl="0">
+      <w:start w:val="1"/>
+      <w:numFmt w:val="decimal"/>
+      <w:lvlText w:val="%1."/>
+      <w:lvlJc w:val="left"/>
+      <w:pPr>
+        <w:ind w:left="720" w:hanging="360"/>
+      </w:pPr>
+    </w:lvl>
+    <w:lvl xmlns:w="http://schemas.openxmlformats.org/wordprocessingml/2006/main" w:ilvl="1">
+      <w:start w:val="1"/>
+      <w:numFmt w:val="lowerLetter"/>
+      <w:lvlText w:val="%2."/>
+      <w:lvlJc w:val="left"/>
+      <w:pPr>
+        <w:ind w:left="1440" w:hanging="360"/>
+      </w:pPr>
+    </w:lvl>
+    <w:lvl xmlns:w="http://schemas.openxmlformats.org/wordprocessingml/2006/main" w:ilvl="2">
+      <w:start w:val="1"/>
+      <w:numFmt w:val="lowerRoman"/>
+      <w:lvlText w:val="%3."/>
+      <w:lvlJc w:val="right"/>
+      <w:pPr>
+        <w:ind w:left="2160" w:hanging="180"/>
+      </w:pPr>
+    </w:lvl>
+    <w:lvl xmlns:w="http://schemas.openxmlformats.org/wordprocessingml/2006/main" w:ilvl="3">
+      <w:start w:val="1"/>
+      <w:numFmt w:val="decimal"/>
+      <w:lvlText w:val="%4."/>
+      <w:lvlJc w:val="left"/>
+      <w:pPr>
+        <w:ind w:left="2880" w:hanging="360"/>
+      </w:pPr>
+    </w:lvl>
+    <w:lvl xmlns:w="http://schemas.openxmlformats.org/wordprocessingml/2006/main" w:ilvl="4">
+      <w:start w:val="1"/>
+      <w:numFmt w:val="lowerLetter"/>
+      <w:lvlText w:val="%5."/>
+      <w:lvlJc w:val="left"/>
+      <w:pPr>
+        <w:ind w:left="3600" w:hanging="360"/>
+      </w:pPr>
+    </w:lvl>
+    <w:lvl xmlns:w="http://schemas.openxmlformats.org/wordprocessingml/2006/main" w:ilvl="5">
+      <w:start w:val="1"/>
+      <w:numFmt w:val="lowerRoman"/>
+      <w:lvlText w:val="%6."/>
+      <w:lvlJc w:val="right"/>
+      <w:pPr>
+        <w:ind w:left="4320" w:hanging="180"/>
+      </w:pPr>
+    </w:lvl>
+    <w:lvl xmlns:w="http://schemas.openxmlformats.org/wordprocessingml/2006/main" w:ilvl="6">
+      <w:start w:val="1"/>
+      <w:numFmt w:val="decimal"/>
+      <w:lvlText w:val="%7."/>
+      <w:lvlJc w:val="left"/>
+      <w:pPr>
+        <w:ind w:left="5040" w:hanging="360"/>
+      </w:pPr>
+    </w:lvl>
+    <w:lvl xmlns:w="http://schemas.openxmlformats.org/wordprocessingml/2006/main" w:ilvl="7">
+      <w:start w:val="1"/>
+      <w:numFmt w:val="lowerLetter"/>
+      <w:lvlText w:val="%8."/>
+      <w:lvlJc w:val="left"/>
+      <w:pPr>
+        <w:ind w:left="5760" w:hanging="360"/>
+      </w:pPr>
+    </w:lvl>
+    <w:lvl xmlns:w="http://schemas.openxmlformats.org/wordprocessingml/2006/main" w:ilvl="8">
+      <w:start w:val="1"/>
+      <w:numFmt w:val="lowerRoman"/>
+      <w:lvlText w:val="%9."/>
+      <w:lvlJc w:val="right"/>
+      <w:pPr>
+        <w:ind w:left="6480" w:hanging="180"/>
+      </w:pPr>
+    </w:lvl>
+  </w:abstractNum>
+  <w:abstractNum xmlns:w="http://schemas.openxmlformats.org/wordprocessingml/2006/main" w:abstractNumId="28">
+    <w:nsid w:val="4732f970"/>
+    <w:multiLevelType xmlns:w="http://schemas.openxmlformats.org/wordprocessingml/2006/main" w:val="hybridMultilevel"/>
+    <w:lvl xmlns:w="http://schemas.openxmlformats.org/wordprocessingml/2006/main" w:ilvl="0">
+      <w:start w:val="1"/>
+      <w:numFmt w:val="decimal"/>
+      <w:lvlText w:val="%1."/>
+      <w:lvlJc w:val="left"/>
+      <w:pPr>
+        <w:ind w:left="720" w:hanging="360"/>
+      </w:pPr>
+    </w:lvl>
+    <w:lvl xmlns:w="http://schemas.openxmlformats.org/wordprocessingml/2006/main" w:ilvl="1">
+      <w:start w:val="1"/>
+      <w:numFmt w:val="lowerLetter"/>
+      <w:lvlText w:val="%2."/>
+      <w:lvlJc w:val="left"/>
+      <w:pPr>
+        <w:ind w:left="1440" w:hanging="360"/>
+      </w:pPr>
+    </w:lvl>
+    <w:lvl xmlns:w="http://schemas.openxmlformats.org/wordprocessingml/2006/main" w:ilvl="2">
+      <w:start w:val="1"/>
+      <w:numFmt w:val="lowerRoman"/>
+      <w:lvlText w:val="%3."/>
+      <w:lvlJc w:val="right"/>
+      <w:pPr>
+        <w:ind w:left="2160" w:hanging="180"/>
+      </w:pPr>
+    </w:lvl>
+    <w:lvl xmlns:w="http://schemas.openxmlformats.org/wordprocessingml/2006/main" w:ilvl="3">
+      <w:start w:val="1"/>
+      <w:numFmt w:val="decimal"/>
+      <w:lvlText w:val="%4."/>
+      <w:lvlJc w:val="left"/>
+      <w:pPr>
+        <w:ind w:left="2880" w:hanging="360"/>
+      </w:pPr>
+    </w:lvl>
+    <w:lvl xmlns:w="http://schemas.openxmlformats.org/wordprocessingml/2006/main" w:ilvl="4">
+      <w:start w:val="1"/>
+      <w:numFmt w:val="lowerLetter"/>
+      <w:lvlText w:val="%5."/>
+      <w:lvlJc w:val="left"/>
+      <w:pPr>
+        <w:ind w:left="3600" w:hanging="360"/>
+      </w:pPr>
+    </w:lvl>
+    <w:lvl xmlns:w="http://schemas.openxmlformats.org/wordprocessingml/2006/main" w:ilvl="5">
+      <w:start w:val="1"/>
+      <w:numFmt w:val="lowerRoman"/>
+      <w:lvlText w:val="%6."/>
+      <w:lvlJc w:val="right"/>
+      <w:pPr>
+        <w:ind w:left="4320" w:hanging="180"/>
+      </w:pPr>
+    </w:lvl>
+    <w:lvl xmlns:w="http://schemas.openxmlformats.org/wordprocessingml/2006/main" w:ilvl="6">
+      <w:start w:val="1"/>
+      <w:numFmt w:val="decimal"/>
+      <w:lvlText w:val="%7."/>
+      <w:lvlJc w:val="left"/>
+      <w:pPr>
+        <w:ind w:left="5040" w:hanging="360"/>
+      </w:pPr>
+    </w:lvl>
+    <w:lvl xmlns:w="http://schemas.openxmlformats.org/wordprocessingml/2006/main" w:ilvl="7">
+      <w:start w:val="1"/>
+      <w:numFmt w:val="lowerLetter"/>
+      <w:lvlText w:val="%8."/>
+      <w:lvlJc w:val="left"/>
+      <w:pPr>
+        <w:ind w:left="5760" w:hanging="360"/>
+      </w:pPr>
+    </w:lvl>
+    <w:lvl xmlns:w="http://schemas.openxmlformats.org/wordprocessingml/2006/main" w:ilvl="8">
+      <w:start w:val="1"/>
+      <w:numFmt w:val="lowerRoman"/>
+      <w:lvlText w:val="%9."/>
+      <w:lvlJc w:val="right"/>
+      <w:pPr>
+        <w:ind w:left="6480" w:hanging="180"/>
+      </w:pPr>
+    </w:lvl>
+  </w:abstractNum>
   <w:abstractNum xmlns:w="http://schemas.openxmlformats.org/wordprocessingml/2006/main" w:abstractNumId="27">
     <w:nsid w:val="309b128a"/>
     <w:multiLevelType xmlns:w="http://schemas.openxmlformats.org/wordprocessingml/2006/main" w:val="hybridMultilevel"/>
@@ -11277,6 +11943,12 @@
       </w:rPr>
     </w:lvl>
   </w:abstractNum>
+  <w:num w:numId="29">
+    <w:abstractNumId w:val="29"/>
+  </w:num>
+  <w:num w:numId="28">
+    <w:abstractNumId w:val="28"/>
+  </w:num>
   <w:num w:numId="27">
     <w:abstractNumId w:val="27"/>
   </w:num>

</xml_diff>